<commit_message>
Make all templates context-specific with worked examples and workflows
</commit_message>
<xml_diff>
--- a/docs/templates/docx/business.docx
+++ b/docs/templates/docx/business.docx
@@ -9,7 +9,7 @@
           <w:color w:val="185849"/>
           <w:sz w:val="18"/>
         </w:rPr>
-        <w:t>PROPOSAL</w:t>
+        <w:t>NORTHSTAR DESIGN • PROPOSAL 027  /  1</w:t>
       </w:r>
     </w:p>
     <w:p>
@@ -17,7 +17,7 @@
         <w:pStyle w:val="Title"/>
       </w:pPr>
       <w:r>
-        <w:t>Business proposal</w:t>
+        <w:t>Customer onboarding redesign</w:t>
       </w:r>
     </w:p>
     <w:p>
@@ -25,12 +25,31 @@
         <w:pStyle w:val="Subtitle"/>
       </w:pPr>
       <w:r>
-        <w:t>A practical path from opportunity to delivery</w:t>
+        <w:t>Proposal for Alder Studio</w:t>
       </w:r>
     </w:p>
     <w:p>
+      <w:pPr/>
       <w:r>
-        <w:t>[Describe the customer problem, proposed outcome, and the value of addressing it now.]</w:t>
+        <w:t>Prepared for Alder Studio     •     Prepared by Northstar Design</w:t>
+        <w:br/>
+        <w:t>Issued 18 June 2027     •     Proposal valid through 2 July 2027</w:t>
+      </w:r>
+    </w:p>
+    <w:p>
+      <w:pPr>
+        <w:spacing w:before="160" w:after="200"/>
+        <w:shd w:fill="EAF3EE"/>
+      </w:pPr>
+      <w:r>
+        <w:rPr>
+          <w:b/>
+        </w:rPr>
+        <w:t>THE OUTCOME</w:t>
+        <w:br/>
+      </w:r>
+      <w:r>
+        <w:t>A clearer first-week experience: one welcome journey, one account checklist and fewer handoffs between sales and customer success.</w:t>
       </w:r>
     </w:p>
     <w:p>
@@ -38,12 +57,13 @@
         <w:pStyle w:val="Heading1"/>
       </w:pPr>
       <w:r>
-        <w:t>The opportunity</w:t>
+        <w:t>What we heard</w:t>
       </w:r>
     </w:p>
     <w:p>
+      <w:pPr/>
       <w:r>
-        <w:t>[Describe the current situation using verified information.]</w:t>
+        <w:t>New customers receive setup instructions in three separate emails. The proposed work consolidates those steps, clarifies ownership and gives the service team a reusable launch checklist.</w:t>
       </w:r>
     </w:p>
     <w:p>
@@ -51,25 +71,7 @@
         <w:pStyle w:val="Heading1"/>
       </w:pPr>
       <w:r>
-        <w:t>Proposed approach</w:t>
-      </w:r>
-    </w:p>
-    <w:p>
-      <w:r>
-        <w:t>[Explain what you will deliver, how it will work, and what is outside scope.]</w:t>
-      </w:r>
-    </w:p>
-    <w:p>
-      <w:pPr>
-        <w:pStyle w:val="Heading1"/>
-      </w:pPr>
-      <w:r>
-        <w:t>Commercial terms and next step</w:t>
-      </w:r>
-    </w:p>
-    <w:p>
-      <w:r>
-        <w:t>[Insert approved fees, assumptions, validity period, and the requested next step.]</w:t>
+        <w:t>Scope and delivery</w:t>
       </w:r>
     </w:p>
     <w:tbl>
@@ -79,23 +81,24 @@
         <w:tblLook w:firstColumn="1" w:firstRow="1" w:lastColumn="0" w:lastRow="0" w:noHBand="0" w:noVBand="1" w:val="04A0"/>
       </w:tblPr>
       <w:tblGrid>
-        <w:gridCol w:w="3312"/>
-        <w:gridCol w:w="3312"/>
-        <w:gridCol w:w="3312"/>
+        <w:gridCol w:w="1830"/>
+        <w:gridCol w:w="6201"/>
+        <w:gridCol w:w="2135"/>
       </w:tblGrid>
       <w:tr>
         <w:trPr>
+          <w:cantSplit/>
           <w:tblHeader/>
         </w:trPr>
         <w:tc>
           <w:tcPr>
-            <w:tcW w:type="dxa" w:w="3312"/>
+            <w:tcW w:type="dxa" w:w="1830"/>
             <w:shd w:fill="EAF3EE"/>
             <w:tcMar>
-              <w:top w:w="110" w:type="dxa"/>
-              <w:left w:w="110" w:type="dxa"/>
-              <w:bottom w:w="110" w:type="dxa"/>
-              <w:right w:w="110" w:type="dxa"/>
+              <w:top w:w="80" w:type="dxa"/>
+              <w:left w:w="80" w:type="dxa"/>
+              <w:bottom w:w="80" w:type="dxa"/>
+              <w:right w:w="80" w:type="dxa"/>
             </w:tcMar>
           </w:tcPr>
           <w:p>
@@ -105,7 +108,7 @@
             <w:r>
               <w:rPr>
                 <w:b/>
-                <w:sz w:val="19"/>
+                <w:sz w:val="18"/>
               </w:rPr>
               <w:t>Phase</w:t>
             </w:r>
@@ -113,13 +116,13 @@
         </w:tc>
         <w:tc>
           <w:tcPr>
-            <w:tcW w:type="dxa" w:w="3312"/>
+            <w:tcW w:type="dxa" w:w="6201"/>
             <w:shd w:fill="EAF3EE"/>
             <w:tcMar>
-              <w:top w:w="110" w:type="dxa"/>
-              <w:left w:w="110" w:type="dxa"/>
-              <w:bottom w:w="110" w:type="dxa"/>
-              <w:right w:w="110" w:type="dxa"/>
+              <w:top w:w="80" w:type="dxa"/>
+              <w:left w:w="80" w:type="dxa"/>
+              <w:bottom w:w="80" w:type="dxa"/>
+              <w:right w:w="80" w:type="dxa"/>
             </w:tcMar>
           </w:tcPr>
           <w:p>
@@ -129,21 +132,21 @@
             <w:r>
               <w:rPr>
                 <w:b/>
-                <w:sz w:val="19"/>
+                <w:sz w:val="18"/>
               </w:rPr>
-              <w:t>Deliverable</w:t>
+              <w:t>Deliverables</w:t>
             </w:r>
           </w:p>
         </w:tc>
         <w:tc>
           <w:tcPr>
-            <w:tcW w:type="dxa" w:w="3312"/>
+            <w:tcW w:type="dxa" w:w="2135"/>
             <w:shd w:fill="EAF3EE"/>
             <w:tcMar>
-              <w:top w:w="110" w:type="dxa"/>
-              <w:left w:w="110" w:type="dxa"/>
-              <w:bottom w:w="110" w:type="dxa"/>
-              <w:right w:w="110" w:type="dxa"/>
+              <w:top w:w="80" w:type="dxa"/>
+              <w:left w:w="80" w:type="dxa"/>
+              <w:bottom w:w="80" w:type="dxa"/>
+              <w:right w:w="80" w:type="dxa"/>
             </w:tcMar>
           </w:tcPr>
           <w:p>
@@ -153,23 +156,26 @@
             <w:r>
               <w:rPr>
                 <w:b/>
-                <w:sz w:val="19"/>
+                <w:sz w:val="18"/>
               </w:rPr>
-              <w:t>Timing</w:t>
+              <w:t>Schedule</w:t>
             </w:r>
           </w:p>
         </w:tc>
       </w:tr>
       <w:tr>
+        <w:trPr>
+          <w:cantSplit/>
+        </w:trPr>
         <w:tc>
           <w:tcPr>
-            <w:tcW w:type="dxa" w:w="3312"/>
+            <w:tcW w:type="dxa" w:w="1830"/>
             <w:shd w:fill="FFFFFF"/>
             <w:tcMar>
-              <w:top w:w="110" w:type="dxa"/>
-              <w:left w:w="110" w:type="dxa"/>
-              <w:bottom w:w="110" w:type="dxa"/>
-              <w:right w:w="110" w:type="dxa"/>
+              <w:top w:w="80" w:type="dxa"/>
+              <w:left w:w="80" w:type="dxa"/>
+              <w:bottom w:w="80" w:type="dxa"/>
+              <w:right w:w="80" w:type="dxa"/>
             </w:tcMar>
           </w:tcPr>
           <w:p>
@@ -179,7 +185,7 @@
             <w:r>
               <w:rPr>
                 <w:b w:val="0"/>
-                <w:sz w:val="19"/>
+                <w:sz w:val="18"/>
               </w:rPr>
               <w:t>Discover</w:t>
             </w:r>
@@ -187,13 +193,13 @@
         </w:tc>
         <w:tc>
           <w:tcPr>
-            <w:tcW w:type="dxa" w:w="3312"/>
+            <w:tcW w:type="dxa" w:w="6201"/>
             <w:shd w:fill="FFFFFF"/>
             <w:tcMar>
-              <w:top w:w="110" w:type="dxa"/>
-              <w:left w:w="110" w:type="dxa"/>
-              <w:bottom w:w="110" w:type="dxa"/>
-              <w:right w:w="110" w:type="dxa"/>
+              <w:top w:w="80" w:type="dxa"/>
+              <w:left w:w="80" w:type="dxa"/>
+              <w:bottom w:w="80" w:type="dxa"/>
+              <w:right w:w="80" w:type="dxa"/>
             </w:tcMar>
           </w:tcPr>
           <w:p>
@@ -203,21 +209,21 @@
             <w:r>
               <w:rPr>
                 <w:b w:val="0"/>
-                <w:sz w:val="19"/>
+                <w:sz w:val="18"/>
               </w:rPr>
-              <w:t>[Brief]</w:t>
+              <w:t>Five staff interviews; journey map; agreed problem statement</w:t>
             </w:r>
           </w:p>
         </w:tc>
         <w:tc>
           <w:tcPr>
-            <w:tcW w:type="dxa" w:w="3312"/>
+            <w:tcW w:type="dxa" w:w="2135"/>
             <w:shd w:fill="FFFFFF"/>
             <w:tcMar>
-              <w:top w:w="110" w:type="dxa"/>
-              <w:left w:w="110" w:type="dxa"/>
-              <w:bottom w:w="110" w:type="dxa"/>
-              <w:right w:w="110" w:type="dxa"/>
+              <w:top w:w="80" w:type="dxa"/>
+              <w:left w:w="80" w:type="dxa"/>
+              <w:bottom w:w="80" w:type="dxa"/>
+              <w:right w:w="80" w:type="dxa"/>
             </w:tcMar>
           </w:tcPr>
           <w:p>
@@ -227,23 +233,26 @@
             <w:r>
               <w:rPr>
                 <w:b w:val="0"/>
-                <w:sz w:val="19"/>
+                <w:sz w:val="18"/>
               </w:rPr>
-              <w:t>[Date]</w:t>
+              <w:t>Week 1</w:t>
             </w:r>
           </w:p>
         </w:tc>
       </w:tr>
       <w:tr>
+        <w:trPr>
+          <w:cantSplit/>
+        </w:trPr>
         <w:tc>
           <w:tcPr>
-            <w:tcW w:type="dxa" w:w="3312"/>
+            <w:tcW w:type="dxa" w:w="1830"/>
             <w:shd w:fill="EAF3EE"/>
             <w:tcMar>
-              <w:top w:w="110" w:type="dxa"/>
-              <w:left w:w="110" w:type="dxa"/>
-              <w:bottom w:w="110" w:type="dxa"/>
-              <w:right w:w="110" w:type="dxa"/>
+              <w:top w:w="80" w:type="dxa"/>
+              <w:left w:w="80" w:type="dxa"/>
+              <w:bottom w:w="80" w:type="dxa"/>
+              <w:right w:w="80" w:type="dxa"/>
             </w:tcMar>
           </w:tcPr>
           <w:p>
@@ -253,21 +262,21 @@
             <w:r>
               <w:rPr>
                 <w:b w:val="0"/>
-                <w:sz w:val="19"/>
+                <w:sz w:val="18"/>
               </w:rPr>
-              <w:t>Build</w:t>
+              <w:t>Design</w:t>
             </w:r>
           </w:p>
         </w:tc>
         <w:tc>
           <w:tcPr>
-            <w:tcW w:type="dxa" w:w="3312"/>
+            <w:tcW w:type="dxa" w:w="6201"/>
             <w:shd w:fill="EAF3EE"/>
             <w:tcMar>
-              <w:top w:w="110" w:type="dxa"/>
-              <w:left w:w="110" w:type="dxa"/>
-              <w:bottom w:w="110" w:type="dxa"/>
-              <w:right w:w="110" w:type="dxa"/>
+              <w:top w:w="80" w:type="dxa"/>
+              <w:left w:w="80" w:type="dxa"/>
+              <w:bottom w:w="80" w:type="dxa"/>
+              <w:right w:w="80" w:type="dxa"/>
             </w:tcMar>
           </w:tcPr>
           <w:p>
@@ -277,21 +286,21 @@
             <w:r>
               <w:rPr>
                 <w:b w:val="0"/>
-                <w:sz w:val="19"/>
+                <w:sz w:val="18"/>
               </w:rPr>
-              <w:t>[Deliverable]</w:t>
+              <w:t>Welcome flow; six screen designs; email copy outline</w:t>
             </w:r>
           </w:p>
         </w:tc>
         <w:tc>
           <w:tcPr>
-            <w:tcW w:type="dxa" w:w="3312"/>
+            <w:tcW w:type="dxa" w:w="2135"/>
             <w:shd w:fill="EAF3EE"/>
             <w:tcMar>
-              <w:top w:w="110" w:type="dxa"/>
-              <w:left w:w="110" w:type="dxa"/>
-              <w:bottom w:w="110" w:type="dxa"/>
-              <w:right w:w="110" w:type="dxa"/>
+              <w:top w:w="80" w:type="dxa"/>
+              <w:left w:w="80" w:type="dxa"/>
+              <w:bottom w:w="80" w:type="dxa"/>
+              <w:right w:w="80" w:type="dxa"/>
             </w:tcMar>
           </w:tcPr>
           <w:p>
@@ -301,23 +310,26 @@
             <w:r>
               <w:rPr>
                 <w:b w:val="0"/>
-                <w:sz w:val="19"/>
+                <w:sz w:val="18"/>
               </w:rPr>
-              <w:t>[Date]</w:t>
+              <w:t>Weeks 2–3</w:t>
             </w:r>
           </w:p>
         </w:tc>
       </w:tr>
       <w:tr>
+        <w:trPr>
+          <w:cantSplit/>
+        </w:trPr>
         <w:tc>
           <w:tcPr>
-            <w:tcW w:type="dxa" w:w="3312"/>
+            <w:tcW w:type="dxa" w:w="1830"/>
             <w:shd w:fill="FFFFFF"/>
             <w:tcMar>
-              <w:top w:w="110" w:type="dxa"/>
-              <w:left w:w="110" w:type="dxa"/>
-              <w:bottom w:w="110" w:type="dxa"/>
-              <w:right w:w="110" w:type="dxa"/>
+              <w:top w:w="80" w:type="dxa"/>
+              <w:left w:w="80" w:type="dxa"/>
+              <w:bottom w:w="80" w:type="dxa"/>
+              <w:right w:w="80" w:type="dxa"/>
             </w:tcMar>
           </w:tcPr>
           <w:p>
@@ -327,21 +339,21 @@
             <w:r>
               <w:rPr>
                 <w:b w:val="0"/>
-                <w:sz w:val="19"/>
+                <w:sz w:val="18"/>
               </w:rPr>
-              <w:t>Review</w:t>
+              <w:t>Handover</w:t>
             </w:r>
           </w:p>
         </w:tc>
         <w:tc>
           <w:tcPr>
-            <w:tcW w:type="dxa" w:w="3312"/>
+            <w:tcW w:type="dxa" w:w="6201"/>
             <w:shd w:fill="FFFFFF"/>
             <w:tcMar>
-              <w:top w:w="110" w:type="dxa"/>
-              <w:left w:w="110" w:type="dxa"/>
-              <w:bottom w:w="110" w:type="dxa"/>
-              <w:right w:w="110" w:type="dxa"/>
+              <w:top w:w="80" w:type="dxa"/>
+              <w:left w:w="80" w:type="dxa"/>
+              <w:bottom w:w="80" w:type="dxa"/>
+              <w:right w:w="80" w:type="dxa"/>
             </w:tcMar>
           </w:tcPr>
           <w:p>
@@ -351,21 +363,21 @@
             <w:r>
               <w:rPr>
                 <w:b w:val="0"/>
-                <w:sz w:val="19"/>
+                <w:sz w:val="18"/>
               </w:rPr>
-              <w:t>[Acceptance criteria]</w:t>
+              <w:t>Annotated prototype; component notes; two training sessions</w:t>
             </w:r>
           </w:p>
         </w:tc>
         <w:tc>
           <w:tcPr>
-            <w:tcW w:type="dxa" w:w="3312"/>
+            <w:tcW w:type="dxa" w:w="2135"/>
             <w:shd w:fill="FFFFFF"/>
             <w:tcMar>
-              <w:top w:w="110" w:type="dxa"/>
-              <w:left w:w="110" w:type="dxa"/>
-              <w:bottom w:w="110" w:type="dxa"/>
-              <w:right w:w="110" w:type="dxa"/>
+              <w:top w:w="80" w:type="dxa"/>
+              <w:left w:w="80" w:type="dxa"/>
+              <w:bottom w:w="80" w:type="dxa"/>
+              <w:right w:w="80" w:type="dxa"/>
             </w:tcMar>
           </w:tcPr>
           <w:p>
@@ -375,22 +387,602 @@
             <w:r>
               <w:rPr>
                 <w:b w:val="0"/>
-                <w:sz w:val="19"/>
+                <w:sz w:val="18"/>
               </w:rPr>
-              <w:t>[Date]</w:t>
+              <w:t>Week 4</w:t>
             </w:r>
           </w:p>
         </w:tc>
       </w:tr>
     </w:tbl>
+    <w:p>
+      <w:pPr>
+        <w:spacing w:after="0"/>
+      </w:pPr>
+    </w:p>
+    <w:p>
+      <w:pPr>
+        <w:pStyle w:val="Heading1"/>
+      </w:pPr>
+      <w:r>
+        <w:t>How we will work</w:t>
+      </w:r>
+    </w:p>
+    <w:p>
+      <w:pPr>
+        <w:pStyle w:val="ListBullet"/>
+      </w:pPr>
+      <w:r>
+        <w:t>One 30-minute review each Tuesday, with a named client decision-maker.</w:t>
+      </w:r>
+    </w:p>
+    <w:p>
+      <w:pPr>
+        <w:pStyle w:val="ListBullet"/>
+      </w:pPr>
+      <w:r>
+        <w:t>Two consolidated feedback rounds on the prototype.</w:t>
+      </w:r>
+    </w:p>
+    <w:p>
+      <w:pPr>
+        <w:pStyle w:val="ListBullet"/>
+      </w:pPr>
+      <w:r>
+        <w:t>Shared decision log and weekly written delivery update.</w:t>
+      </w:r>
+    </w:p>
+    <w:p>
+      <w:pPr>
+        <w:pStyle w:val="Heading1"/>
+      </w:pPr>
+      <w:r>
+        <w:t>Outside this scope</w:t>
+      </w:r>
+    </w:p>
+    <w:p>
+      <w:pPr/>
+      <w:r>
+        <w:t>Production code, system migration, translation and new brand identity work are excluded. Any added scope requires a written change agreement.</w:t>
+      </w:r>
+    </w:p>
+    <w:p>
+      <w:r>
+        <w:br w:type="page"/>
+      </w:r>
+    </w:p>
+    <w:p>
+      <w:r>
+        <w:rPr>
+          <w:b/>
+          <w:color w:val="185849"/>
+          <w:sz w:val="18"/>
+        </w:rPr>
+        <w:t>NORTHSTAR DESIGN • PROPOSAL 027  /  2</w:t>
+      </w:r>
+    </w:p>
+    <w:p>
+      <w:pPr>
+        <w:pStyle w:val="Title"/>
+      </w:pPr>
+      <w:r>
+        <w:t>Investment and approval</w:t>
+      </w:r>
+    </w:p>
+    <w:tbl>
+      <w:tblPr>
+        <w:tblW w:type="auto" w:w="0"/>
+        <w:tblLayout w:type="fixed"/>
+        <w:tblLook w:firstColumn="1" w:firstRow="1" w:lastColumn="0" w:lastRow="0" w:noHBand="0" w:noVBand="1" w:val="04A0"/>
+      </w:tblPr>
+      <w:tblGrid>
+        <w:gridCol w:w="7320"/>
+        <w:gridCol w:w="2846"/>
+      </w:tblGrid>
+      <w:tr>
+        <w:trPr>
+          <w:cantSplit/>
+          <w:tblHeader/>
+        </w:trPr>
+        <w:tc>
+          <w:tcPr>
+            <w:tcW w:type="dxa" w:w="7320"/>
+            <w:shd w:fill="EAF3EE"/>
+            <w:tcMar>
+              <w:top w:w="80" w:type="dxa"/>
+              <w:left w:w="80" w:type="dxa"/>
+              <w:bottom w:w="80" w:type="dxa"/>
+              <w:right w:w="80" w:type="dxa"/>
+            </w:tcMar>
+          </w:tcPr>
+          <w:p>
+            <w:pPr>
+              <w:spacing w:after="20"/>
+            </w:pPr>
+            <w:r>
+              <w:rPr>
+                <w:b/>
+                <w:sz w:val="18"/>
+              </w:rPr>
+              <w:t>Work package</w:t>
+            </w:r>
+          </w:p>
+        </w:tc>
+        <w:tc>
+          <w:tcPr>
+            <w:tcW w:type="dxa" w:w="2846"/>
+            <w:shd w:fill="EAF3EE"/>
+            <w:tcMar>
+              <w:top w:w="80" w:type="dxa"/>
+              <w:left w:w="80" w:type="dxa"/>
+              <w:bottom w:w="80" w:type="dxa"/>
+              <w:right w:w="80" w:type="dxa"/>
+            </w:tcMar>
+          </w:tcPr>
+          <w:p>
+            <w:pPr>
+              <w:spacing w:after="20"/>
+            </w:pPr>
+            <w:r>
+              <w:rPr>
+                <w:b/>
+                <w:sz w:val="18"/>
+              </w:rPr>
+              <w:t>Fee in USD</w:t>
+            </w:r>
+          </w:p>
+        </w:tc>
+      </w:tr>
+      <w:tr>
+        <w:trPr>
+          <w:cantSplit/>
+        </w:trPr>
+        <w:tc>
+          <w:tcPr>
+            <w:tcW w:type="dxa" w:w="7320"/>
+            <w:shd w:fill="FFFFFF"/>
+            <w:tcMar>
+              <w:top w:w="80" w:type="dxa"/>
+              <w:left w:w="80" w:type="dxa"/>
+              <w:bottom w:w="80" w:type="dxa"/>
+              <w:right w:w="80" w:type="dxa"/>
+            </w:tcMar>
+          </w:tcPr>
+          <w:p>
+            <w:pPr>
+              <w:spacing w:after="20"/>
+            </w:pPr>
+            <w:r>
+              <w:rPr>
+                <w:b w:val="0"/>
+                <w:sz w:val="18"/>
+              </w:rPr>
+              <w:t>Research and journey mapping</w:t>
+            </w:r>
+          </w:p>
+        </w:tc>
+        <w:tc>
+          <w:tcPr>
+            <w:tcW w:type="dxa" w:w="2846"/>
+            <w:shd w:fill="FFFFFF"/>
+            <w:tcMar>
+              <w:top w:w="80" w:type="dxa"/>
+              <w:left w:w="80" w:type="dxa"/>
+              <w:bottom w:w="80" w:type="dxa"/>
+              <w:right w:w="80" w:type="dxa"/>
+            </w:tcMar>
+          </w:tcPr>
+          <w:p>
+            <w:pPr>
+              <w:spacing w:after="20"/>
+            </w:pPr>
+            <w:r>
+              <w:rPr>
+                <w:b w:val="0"/>
+                <w:sz w:val="18"/>
+              </w:rPr>
+              <w:t>$3,000</w:t>
+            </w:r>
+          </w:p>
+        </w:tc>
+      </w:tr>
+      <w:tr>
+        <w:trPr>
+          <w:cantSplit/>
+        </w:trPr>
+        <w:tc>
+          <w:tcPr>
+            <w:tcW w:type="dxa" w:w="7320"/>
+            <w:shd w:fill="EAF3EE"/>
+            <w:tcMar>
+              <w:top w:w="80" w:type="dxa"/>
+              <w:left w:w="80" w:type="dxa"/>
+              <w:bottom w:w="80" w:type="dxa"/>
+              <w:right w:w="80" w:type="dxa"/>
+            </w:tcMar>
+          </w:tcPr>
+          <w:p>
+            <w:pPr>
+              <w:spacing w:after="20"/>
+            </w:pPr>
+            <w:r>
+              <w:rPr>
+                <w:b w:val="0"/>
+                <w:sz w:val="18"/>
+              </w:rPr>
+              <w:t>Experience design and prototype</w:t>
+            </w:r>
+          </w:p>
+        </w:tc>
+        <w:tc>
+          <w:tcPr>
+            <w:tcW w:type="dxa" w:w="2846"/>
+            <w:shd w:fill="EAF3EE"/>
+            <w:tcMar>
+              <w:top w:w="80" w:type="dxa"/>
+              <w:left w:w="80" w:type="dxa"/>
+              <w:bottom w:w="80" w:type="dxa"/>
+              <w:right w:w="80" w:type="dxa"/>
+            </w:tcMar>
+          </w:tcPr>
+          <w:p>
+            <w:pPr>
+              <w:spacing w:after="20"/>
+            </w:pPr>
+            <w:r>
+              <w:rPr>
+                <w:b w:val="0"/>
+                <w:sz w:val="18"/>
+              </w:rPr>
+              <w:t>$7,500</w:t>
+            </w:r>
+          </w:p>
+        </w:tc>
+      </w:tr>
+      <w:tr>
+        <w:trPr>
+          <w:cantSplit/>
+        </w:trPr>
+        <w:tc>
+          <w:tcPr>
+            <w:tcW w:type="dxa" w:w="7320"/>
+            <w:shd w:fill="FFFFFF"/>
+            <w:tcMar>
+              <w:top w:w="80" w:type="dxa"/>
+              <w:left w:w="80" w:type="dxa"/>
+              <w:bottom w:w="80" w:type="dxa"/>
+              <w:right w:w="80" w:type="dxa"/>
+            </w:tcMar>
+          </w:tcPr>
+          <w:p>
+            <w:pPr>
+              <w:spacing w:after="20"/>
+            </w:pPr>
+            <w:r>
+              <w:rPr>
+                <w:b w:val="0"/>
+                <w:sz w:val="18"/>
+              </w:rPr>
+              <w:t>Handover and training</w:t>
+            </w:r>
+          </w:p>
+        </w:tc>
+        <w:tc>
+          <w:tcPr>
+            <w:tcW w:type="dxa" w:w="2846"/>
+            <w:shd w:fill="FFFFFF"/>
+            <w:tcMar>
+              <w:top w:w="80" w:type="dxa"/>
+              <w:left w:w="80" w:type="dxa"/>
+              <w:bottom w:w="80" w:type="dxa"/>
+              <w:right w:w="80" w:type="dxa"/>
+            </w:tcMar>
+          </w:tcPr>
+          <w:p>
+            <w:pPr>
+              <w:spacing w:after="20"/>
+            </w:pPr>
+            <w:r>
+              <w:rPr>
+                <w:b w:val="0"/>
+                <w:sz w:val="18"/>
+              </w:rPr>
+              <w:t>$1,500</w:t>
+            </w:r>
+          </w:p>
+        </w:tc>
+      </w:tr>
+      <w:tr>
+        <w:trPr>
+          <w:cantSplit/>
+        </w:trPr>
+        <w:tc>
+          <w:tcPr>
+            <w:tcW w:type="dxa" w:w="7320"/>
+            <w:shd w:fill="EAF3EE"/>
+            <w:tcMar>
+              <w:top w:w="80" w:type="dxa"/>
+              <w:left w:w="80" w:type="dxa"/>
+              <w:bottom w:w="80" w:type="dxa"/>
+              <w:right w:w="80" w:type="dxa"/>
+            </w:tcMar>
+          </w:tcPr>
+          <w:p>
+            <w:pPr>
+              <w:spacing w:after="20"/>
+            </w:pPr>
+            <w:r>
+              <w:rPr>
+                <w:b w:val="0"/>
+                <w:sz w:val="18"/>
+              </w:rPr>
+              <w:t>Total project fee</w:t>
+            </w:r>
+          </w:p>
+        </w:tc>
+        <w:tc>
+          <w:tcPr>
+            <w:tcW w:type="dxa" w:w="2846"/>
+            <w:shd w:fill="EAF3EE"/>
+            <w:tcMar>
+              <w:top w:w="80" w:type="dxa"/>
+              <w:left w:w="80" w:type="dxa"/>
+              <w:bottom w:w="80" w:type="dxa"/>
+              <w:right w:w="80" w:type="dxa"/>
+            </w:tcMar>
+          </w:tcPr>
+          <w:p>
+            <w:pPr>
+              <w:spacing w:after="20"/>
+            </w:pPr>
+            <w:r>
+              <w:rPr>
+                <w:b w:val="0"/>
+                <w:sz w:val="18"/>
+              </w:rPr>
+              <w:t>$12,000</w:t>
+            </w:r>
+          </w:p>
+        </w:tc>
+      </w:tr>
+    </w:tbl>
+    <w:p>
+      <w:pPr>
+        <w:spacing w:after="0"/>
+      </w:pPr>
+    </w:p>
+    <w:p>
+      <w:pPr>
+        <w:pStyle w:val="Heading1"/>
+      </w:pPr>
+      <w:r>
+        <w:t>Payment schedule</w:t>
+      </w:r>
+    </w:p>
+    <w:p>
+      <w:pPr/>
+      <w:r>
+        <w:t>40% at kickoff ($4,800), 40% at prototype review ($4,800), and 20% at handover ($2,400). This illustrative price excludes applicable taxes and third-party expenses.</w:t>
+      </w:r>
+    </w:p>
+    <w:p>
+      <w:pPr>
+        <w:pStyle w:val="Heading1"/>
+      </w:pPr>
+      <w:r>
+        <w:t>Client responsibilities</w:t>
+      </w:r>
+    </w:p>
+    <w:p>
+      <w:pPr>
+        <w:pStyle w:val="ListBullet"/>
+      </w:pPr>
+      <w:r>
+        <w:t>Provide current onboarding material and access to five interview participants.</w:t>
+      </w:r>
+    </w:p>
+    <w:p>
+      <w:pPr>
+        <w:pStyle w:val="ListBullet"/>
+      </w:pPr>
+      <w:r>
+        <w:t>Return consolidated feedback within two working days.</w:t>
+      </w:r>
+    </w:p>
+    <w:p>
+      <w:pPr>
+        <w:pStyle w:val="ListBullet"/>
+      </w:pPr>
+      <w:r>
+        <w:t>Confirm content accuracy and nominate an approver before kickoff.</w:t>
+      </w:r>
+    </w:p>
+    <w:p>
+      <w:pPr>
+        <w:pStyle w:val="Heading1"/>
+      </w:pPr>
+      <w:r>
+        <w:t>Acceptance criteria</w:t>
+      </w:r>
+    </w:p>
+    <w:p>
+      <w:pPr/>
+      <w:r>
+        <w:t>Handover is complete when the agreed six screens, email outline, annotated prototype and training sessions have been delivered. The project lead records acceptance or a specific list of scope-related corrections.</w:t>
+      </w:r>
+    </w:p>
+    <w:p>
+      <w:pPr>
+        <w:pStyle w:val="Heading1"/>
+      </w:pPr>
+      <w:r>
+        <w:t>Proposed next step</w:t>
+      </w:r>
+    </w:p>
+    <w:p>
+      <w:pPr/>
+      <w:r>
+        <w:t>Confirm the scope and proposed 5 July kickoff. The parties should finalize their service agreement before work begins.</w:t>
+      </w:r>
+    </w:p>
+    <w:tbl>
+      <w:tblPr>
+        <w:tblW w:type="auto" w:w="0"/>
+        <w:tblLayout w:type="fixed"/>
+        <w:tblLook w:firstColumn="1" w:firstRow="1" w:lastColumn="0" w:lastRow="0" w:noHBand="0" w:noVBand="1" w:val="04A0"/>
+      </w:tblPr>
+      <w:tblGrid>
+        <w:gridCol w:w="5083"/>
+        <w:gridCol w:w="5083"/>
+      </w:tblGrid>
+      <w:tr>
+        <w:trPr>
+          <w:cantSplit/>
+          <w:tblHeader/>
+        </w:trPr>
+        <w:tc>
+          <w:tcPr>
+            <w:tcW w:type="dxa" w:w="5083"/>
+            <w:shd w:fill="EAF3EE"/>
+            <w:tcMar>
+              <w:top w:w="80" w:type="dxa"/>
+              <w:left w:w="80" w:type="dxa"/>
+              <w:bottom w:w="80" w:type="dxa"/>
+              <w:right w:w="80" w:type="dxa"/>
+            </w:tcMar>
+          </w:tcPr>
+          <w:p>
+            <w:pPr>
+              <w:spacing w:after="20"/>
+            </w:pPr>
+            <w:r>
+              <w:rPr>
+                <w:b/>
+                <w:sz w:val="18"/>
+              </w:rPr>
+              <w:t>Client approver</w:t>
+            </w:r>
+          </w:p>
+        </w:tc>
+        <w:tc>
+          <w:tcPr>
+            <w:tcW w:type="dxa" w:w="5083"/>
+            <w:shd w:fill="EAF3EE"/>
+            <w:tcMar>
+              <w:top w:w="80" w:type="dxa"/>
+              <w:left w:w="80" w:type="dxa"/>
+              <w:bottom w:w="80" w:type="dxa"/>
+              <w:right w:w="80" w:type="dxa"/>
+            </w:tcMar>
+          </w:tcPr>
+          <w:p>
+            <w:pPr>
+              <w:spacing w:after="20"/>
+            </w:pPr>
+            <w:r>
+              <w:rPr>
+                <w:b/>
+                <w:sz w:val="18"/>
+              </w:rPr>
+              <w:t>Provider approver</w:t>
+            </w:r>
+          </w:p>
+        </w:tc>
+      </w:tr>
+      <w:tr>
+        <w:trPr>
+          <w:cantSplit/>
+        </w:trPr>
+        <w:tc>
+          <w:tcPr>
+            <w:tcW w:type="dxa" w:w="5083"/>
+            <w:shd w:fill="FFFFFF"/>
+            <w:tcMar>
+              <w:top w:w="80" w:type="dxa"/>
+              <w:left w:w="80" w:type="dxa"/>
+              <w:bottom w:w="80" w:type="dxa"/>
+              <w:right w:w="80" w:type="dxa"/>
+            </w:tcMar>
+          </w:tcPr>
+          <w:p>
+            <w:pPr>
+              <w:spacing w:after="20"/>
+            </w:pPr>
+            <w:r>
+              <w:rPr>
+                <w:b w:val="0"/>
+                <w:sz w:val="18"/>
+              </w:rPr>
+              <w:t>[Name and role]</w:t>
+              <w:br/>
+              <w:t>[Signature and date]</w:t>
+            </w:r>
+          </w:p>
+        </w:tc>
+        <w:tc>
+          <w:tcPr>
+            <w:tcW w:type="dxa" w:w="5083"/>
+            <w:shd w:fill="FFFFFF"/>
+            <w:tcMar>
+              <w:top w:w="80" w:type="dxa"/>
+              <w:left w:w="80" w:type="dxa"/>
+              <w:bottom w:w="80" w:type="dxa"/>
+              <w:right w:w="80" w:type="dxa"/>
+            </w:tcMar>
+          </w:tcPr>
+          <w:p>
+            <w:pPr>
+              <w:spacing w:after="20"/>
+            </w:pPr>
+            <w:r>
+              <w:rPr>
+                <w:b w:val="0"/>
+                <w:sz w:val="18"/>
+              </w:rPr>
+              <w:t>[Name and role]</w:t>
+              <w:br/>
+              <w:t>[Signature and date]</w:t>
+            </w:r>
+          </w:p>
+        </w:tc>
+      </w:tr>
+    </w:tbl>
+    <w:p>
+      <w:pPr>
+        <w:spacing w:after="0"/>
+      </w:pPr>
+    </w:p>
+    <w:p>
+      <w:pPr/>
+      <w:r>
+        <w:t>Sample proposal. Replace the fictional parties, dates, pricing and terms with approved project details.</w:t>
+      </w:r>
+    </w:p>
     <w:sectPr>
+      <w:footerReference w:type="default" r:id="rId9"/>
       <w:pgSz w:w="12240" w:h="15840"/>
-      <w:pgMar w:top="1008" w:right="1152" w:bottom="1008" w:left="1152" w:header="720" w:footer="720" w:gutter="0"/>
+      <w:pgMar w:top="864" w:right="1037" w:bottom="864" w:left="1037" w:header="720" w:footer="720" w:gutter="0"/>
       <w:cols w:space="720"/>
       <w:docGrid w:linePitch="360"/>
     </w:sectPr>
   </w:body>
 </w:document>
+</file>
+
+<file path=word/footer1.xml><?xml version="1.0" encoding="utf-8"?>
+<w:ftr xmlns:m="http://schemas.openxmlformats.org/officeDocument/2006/math" xmlns:mc="http://schemas.openxmlformats.org/markup-compatibility/2006" xmlns:mo="http://schemas.microsoft.com/office/mac/office/2008/main" xmlns:mv="urn:schemas-microsoft-com:mac:vml" xmlns:o="urn:schemas-microsoft-com:office:office" xmlns:r="http://schemas.openxmlformats.org/officeDocument/2006/relationships" xmlns:v="urn:schemas-microsoft-com:vml" xmlns:w10="urn:schemas-microsoft-com:office:word" xmlns:w14="http://schemas.microsoft.com/office/word/2010/wordml" xmlns:w="http://schemas.openxmlformats.org/wordprocessingml/2006/main" xmlns:wne="http://schemas.microsoft.com/office/word/2006/wordml" xmlns:wp14="http://schemas.microsoft.com/office/word/2010/wordprocessingDrawing" xmlns:wp="http://schemas.openxmlformats.org/drawingml/2006/wordprocessingDrawing" xmlns:wpc="http://schemas.microsoft.com/office/word/2010/wordprocessingCanvas" xmlns:wpg="http://schemas.microsoft.com/office/word/2010/wordprocessingGroup" xmlns:wpi="http://schemas.microsoft.com/office/word/2010/wordprocessingInk" xmlns:wps="http://schemas.microsoft.com/office/word/2010/wordprocessingShape" mc:Ignorable="w14 wp14">
+  <w:p>
+    <w:pPr>
+      <w:pStyle w:val="Footer"/>
+    </w:pPr>
+    <w:r>
+      <w:rPr>
+        <w:sz w:val="16"/>
+      </w:rPr>
+      <w:t>Dazzler sample template • business • Replace fictional details before use</w:t>
+    </w:r>
+  </w:p>
+</w:ftr>
 </file>
 
 <file path=word/numbering.xml><?xml version="1.0" encoding="utf-8"?>
@@ -757,12 +1349,12 @@
     <w:qFormat/>
     <w:rsid w:val="00FC693F"/>
     <w:pPr>
-      <w:spacing w:after="140" w:line="276" w:lineRule="auto"/>
+      <w:spacing w:line="259" w:lineRule="auto" w:after="120"/>
     </w:pPr>
     <w:rPr>
-      <w:rFonts w:ascii="Arial" w:hAnsi="Arial" w:eastAsia="Arial" w:cs="Arial"/>
+      <w:rFonts w:ascii="Arial" w:hAnsi="Arial"/>
       <w:color w:val="000000"/>
-      <w:sz w:val="21"/>
+      <w:sz w:val="20"/>
     </w:rPr>
   </w:style>
   <w:style w:type="paragraph" w:styleId="Header">
@@ -820,15 +1412,15 @@
     <w:pPr>
       <w:keepNext/>
       <w:keepLines/>
-      <w:spacing w:before="320" w:after="140"/>
+      <w:spacing w:before="240" w:after="120" w:line="259" w:lineRule="auto"/>
       <w:outlineLvl w:val="0"/>
     </w:pPr>
     <w:rPr>
-      <w:rFonts w:cstheme="majorBidi" w:ascii="Arial" w:hAnsi="Arial" w:eastAsia="Arial" w:cs="Arial"/>
+      <w:rFonts w:cstheme="majorBidi" w:ascii="Arial" w:hAnsi="Arial"/>
       <w:b/>
       <w:bCs/>
       <w:color w:val="000000"/>
-      <w:sz w:val="28"/>
+      <w:sz w:val="26"/>
       <w:szCs w:val="28"/>
     </w:rPr>
   </w:style>
@@ -844,15 +1436,15 @@
     <w:pPr>
       <w:keepNext/>
       <w:keepLines/>
-      <w:spacing w:before="200" w:after="140"/>
+      <w:spacing w:before="200" w:after="120" w:line="259" w:lineRule="auto"/>
       <w:outlineLvl w:val="1"/>
     </w:pPr>
     <w:rPr>
-      <w:rFonts w:cstheme="majorBidi" w:ascii="Arial" w:hAnsi="Arial" w:eastAsia="Arial" w:cs="Arial"/>
+      <w:rFonts w:cstheme="majorBidi" w:ascii="Arial" w:hAnsi="Arial"/>
       <w:b/>
       <w:bCs/>
       <w:color w:val="000000"/>
-      <w:sz w:val="26"/>
+      <w:sz w:val="22"/>
       <w:szCs w:val="26"/>
     </w:rPr>
   </w:style>
@@ -1106,15 +1698,15 @@
     <w:qFormat/>
     <w:rsid w:val="00FC693F"/>
     <w:pPr>
-      <w:spacing w:after="200" w:line="240" w:lineRule="auto"/>
+      <w:spacing w:after="120" w:line="259" w:lineRule="auto"/>
       <w:contextualSpacing/>
     </w:pPr>
     <w:rPr>
-      <w:rFonts w:cstheme="majorBidi" w:ascii="Arial" w:hAnsi="Arial" w:eastAsia="Arial" w:cs="Arial"/>
+      <w:rFonts w:cstheme="majorBidi" w:ascii="Arial" w:hAnsi="Arial"/>
       <w:color w:val="000000"/>
       <w:spacing w:val="5"/>
       <w:kern w:val="28"/>
-      <w:sz w:val="58"/>
+      <w:sz w:val="56"/>
       <w:szCs w:val="52"/>
     </w:rPr>
   </w:style>
@@ -1145,10 +1737,10 @@
       <w:numPr>
         <w:ilvl w:val="1"/>
       </w:numPr>
-      <w:spacing w:after="140"/>
+      <w:spacing w:line="259" w:lineRule="auto" w:after="120"/>
     </w:pPr>
     <w:rPr>
-      <w:rFonts w:cstheme="majorBidi" w:ascii="Arial" w:hAnsi="Arial" w:eastAsia="Arial" w:cs="Arial"/>
+      <w:rFonts w:cstheme="majorBidi" w:ascii="Arial" w:hAnsi="Arial"/>
       <w:i/>
       <w:iCs/>
       <w:color w:val="000000"/>
@@ -1289,8 +1881,14 @@
       <w:numPr>
         <w:numId w:val="1"/>
       </w:numPr>
+      <w:spacing w:line="259" w:lineRule="auto" w:after="120"/>
       <w:contextualSpacing/>
     </w:pPr>
+    <w:rPr>
+      <w:rFonts w:ascii="Arial" w:hAnsi="Arial"/>
+      <w:color w:val="000000"/>
+      <w:sz w:val="20"/>
+    </w:rPr>
   </w:style>
   <w:style w:type="paragraph" w:styleId="ListBullet2">
     <w:name w:val="List Bullet 2"/>

</xml_diff>

<commit_message>
Rebuild thirty expressive template showcases with synthetic data and galleries
</commit_message>
<xml_diff>
--- a/docs/templates/docx/business.docx
+++ b/docs/templates/docx/business.docx
@@ -6,10 +6,10 @@
       <w:r>
         <w:rPr>
           <w:b/>
-          <w:color w:val="185849"/>
-          <w:sz w:val="18"/>
+          <w:color w:val="3C36B5"/>
+          <w:sz w:val="16"/>
         </w:rPr>
-        <w:t>NORTHSTAR DESIGN • PROPOSAL 027  /  1</w:t>
+        <w:t>NORTHSTAR DESIGN • PROPOSAL 027   /   01</w:t>
       </w:r>
     </w:p>
     <w:p>
@@ -25,53 +25,21 @@
         <w:pStyle w:val="Subtitle"/>
       </w:pPr>
       <w:r>
+        <w:rPr>
+          <w:i/>
+        </w:rPr>
         <w:t>Proposal for Alder Studio</w:t>
       </w:r>
     </w:p>
     <w:p>
       <w:pPr/>
       <w:r>
+        <w:rPr>
+          <w:b w:val="0"/>
+        </w:rPr>
         <w:t>Prepared for Alder Studio     •     Prepared by Northstar Design</w:t>
         <w:br/>
         <w:t>Issued 18 June 2027     •     Proposal valid through 2 July 2027</w:t>
-      </w:r>
-    </w:p>
-    <w:p>
-      <w:pPr>
-        <w:spacing w:before="160" w:after="200"/>
-        <w:shd w:fill="EAF3EE"/>
-      </w:pPr>
-      <w:r>
-        <w:rPr>
-          <w:b/>
-        </w:rPr>
-        <w:t>THE OUTCOME</w:t>
-        <w:br/>
-      </w:r>
-      <w:r>
-        <w:t>A clearer first-week experience: one welcome journey, one account checklist and fewer handoffs between sales and customer success.</w:t>
-      </w:r>
-    </w:p>
-    <w:p>
-      <w:pPr>
-        <w:pStyle w:val="Heading1"/>
-      </w:pPr>
-      <w:r>
-        <w:t>What we heard</w:t>
-      </w:r>
-    </w:p>
-    <w:p>
-      <w:pPr/>
-      <w:r>
-        <w:t>New customers receive setup instructions in three separate emails. The proposed work consolidates those steps, clarifies ownership and gives the service team a reusable launch checklist.</w:t>
-      </w:r>
-    </w:p>
-    <w:p>
-      <w:pPr>
-        <w:pStyle w:val="Heading1"/>
-      </w:pPr>
-      <w:r>
-        <w:t>Scope and delivery</w:t>
       </w:r>
     </w:p>
     <w:tbl>
@@ -81,9 +49,9 @@
         <w:tblLook w:firstColumn="1" w:firstRow="1" w:lastColumn="0" w:lastRow="0" w:noHBand="0" w:noVBand="1" w:val="04A0"/>
       </w:tblPr>
       <w:tblGrid>
-        <w:gridCol w:w="1830"/>
-        <w:gridCol w:w="6201"/>
-        <w:gridCol w:w="2135"/>
+        <w:gridCol w:w="3485"/>
+        <w:gridCol w:w="3485"/>
+        <w:gridCol w:w="3485"/>
       </w:tblGrid>
       <w:tr>
         <w:trPr>
@@ -92,22 +60,278 @@
         </w:trPr>
         <w:tc>
           <w:tcPr>
-            <w:tcW w:type="dxa" w:w="1830"/>
-            <w:shd w:fill="EAF3EE"/>
+            <w:tcW w:type="dxa" w:w="3485"/>
+            <w:shd w:fill="3C36B5"/>
             <w:tcMar>
-              <w:top w:w="80" w:type="dxa"/>
-              <w:left w:w="80" w:type="dxa"/>
-              <w:bottom w:w="80" w:type="dxa"/>
-              <w:right w:w="80" w:type="dxa"/>
+              <w:top w:w="85" w:type="dxa"/>
+              <w:left w:w="85" w:type="dxa"/>
+              <w:bottom w:w="85" w:type="dxa"/>
+              <w:right w:w="85" w:type="dxa"/>
             </w:tcMar>
           </w:tcPr>
           <w:p>
             <w:pPr>
-              <w:spacing w:after="20"/>
+              <w:spacing w:after="0"/>
             </w:pPr>
             <w:r>
               <w:rPr>
+                <w:rFonts w:ascii="Arial" w:hAnsi="Arial"/>
                 <w:b/>
+                <w:color w:val="FFFFFF"/>
+                <w:sz w:val="58"/>
+              </w:rPr>
+              <w:t>4 weeks</w:t>
+            </w:r>
+          </w:p>
+        </w:tc>
+        <w:tc>
+          <w:tcPr>
+            <w:tcW w:type="dxa" w:w="3485"/>
+            <w:shd w:fill="3C36B5"/>
+            <w:tcMar>
+              <w:top w:w="85" w:type="dxa"/>
+              <w:left w:w="85" w:type="dxa"/>
+              <w:bottom w:w="85" w:type="dxa"/>
+              <w:right w:w="85" w:type="dxa"/>
+            </w:tcMar>
+            <w:shd w:fill="AA352B"/>
+          </w:tcPr>
+          <w:p>
+            <w:pPr>
+              <w:spacing w:after="0"/>
+            </w:pPr>
+            <w:r>
+              <w:rPr>
+                <w:rFonts w:ascii="Arial" w:hAnsi="Arial"/>
+                <w:b/>
+                <w:color w:val="FFFFFF"/>
+                <w:sz w:val="58"/>
+              </w:rPr>
+              <w:t>6 screens</w:t>
+            </w:r>
+          </w:p>
+        </w:tc>
+        <w:tc>
+          <w:tcPr>
+            <w:tcW w:type="dxa" w:w="3485"/>
+            <w:shd w:fill="3C36B5"/>
+            <w:tcMar>
+              <w:top w:w="85" w:type="dxa"/>
+              <w:left w:w="85" w:type="dxa"/>
+              <w:bottom w:w="85" w:type="dxa"/>
+              <w:right w:w="85" w:type="dxa"/>
+            </w:tcMar>
+          </w:tcPr>
+          <w:p>
+            <w:pPr>
+              <w:spacing w:after="0"/>
+            </w:pPr>
+            <w:r>
+              <w:rPr>
+                <w:rFonts w:ascii="Arial" w:hAnsi="Arial"/>
+                <w:b/>
+                <w:color w:val="FFFFFF"/>
+                <w:sz w:val="58"/>
+              </w:rPr>
+              <w:t>$12,000</w:t>
+            </w:r>
+          </w:p>
+        </w:tc>
+      </w:tr>
+      <w:tr>
+        <w:trPr>
+          <w:cantSplit/>
+        </w:trPr>
+        <w:tc>
+          <w:tcPr>
+            <w:tcW w:type="dxa" w:w="3485"/>
+            <w:shd w:fill="F0F2F6"/>
+            <w:tcMar>
+              <w:top w:w="85" w:type="dxa"/>
+              <w:left w:w="85" w:type="dxa"/>
+              <w:bottom w:w="85" w:type="dxa"/>
+              <w:right w:w="85" w:type="dxa"/>
+            </w:tcMar>
+          </w:tcPr>
+          <w:p>
+            <w:pPr>
+              <w:spacing w:after="0"/>
+            </w:pPr>
+            <w:r>
+              <w:rPr>
+                <w:rFonts w:ascii="Arial" w:hAnsi="Arial"/>
+                <w:b w:val="0"/>
+                <w:color w:val="172033"/>
+                <w:sz w:val="18"/>
+              </w:rPr>
+              <w:t>engagement</w:t>
+            </w:r>
+          </w:p>
+        </w:tc>
+        <w:tc>
+          <w:tcPr>
+            <w:tcW w:type="dxa" w:w="3485"/>
+            <w:shd w:fill="F0F2F6"/>
+            <w:tcMar>
+              <w:top w:w="85" w:type="dxa"/>
+              <w:left w:w="85" w:type="dxa"/>
+              <w:bottom w:w="85" w:type="dxa"/>
+              <w:right w:w="85" w:type="dxa"/>
+            </w:tcMar>
+          </w:tcPr>
+          <w:p>
+            <w:pPr>
+              <w:spacing w:after="0"/>
+            </w:pPr>
+            <w:r>
+              <w:rPr>
+                <w:rFonts w:ascii="Arial" w:hAnsi="Arial"/>
+                <w:b w:val="0"/>
+                <w:color w:val="172033"/>
+                <w:sz w:val="18"/>
+              </w:rPr>
+              <w:t>annotated prototype</w:t>
+            </w:r>
+          </w:p>
+        </w:tc>
+        <w:tc>
+          <w:tcPr>
+            <w:tcW w:type="dxa" w:w="3485"/>
+            <w:shd w:fill="F0F2F6"/>
+            <w:tcMar>
+              <w:top w:w="85" w:type="dxa"/>
+              <w:left w:w="85" w:type="dxa"/>
+              <w:bottom w:w="85" w:type="dxa"/>
+              <w:right w:w="85" w:type="dxa"/>
+            </w:tcMar>
+          </w:tcPr>
+          <w:p>
+            <w:pPr>
+              <w:spacing w:after="0"/>
+            </w:pPr>
+            <w:r>
+              <w:rPr>
+                <w:rFonts w:ascii="Arial" w:hAnsi="Arial"/>
+                <w:b w:val="0"/>
+                <w:color w:val="172033"/>
+                <w:sz w:val="18"/>
+              </w:rPr>
+              <w:t>fixed sample fee</w:t>
+            </w:r>
+          </w:p>
+        </w:tc>
+      </w:tr>
+    </w:tbl>
+    <w:p>
+      <w:pPr>
+        <w:spacing w:after="0" w:before="0" w:line="60" w:lineRule="exact"/>
+      </w:pPr>
+      <w:r>
+        <w:rPr>
+          <w:sz w:val="6"/>
+        </w:rPr>
+      </w:r>
+    </w:p>
+    <w:p>
+      <w:pPr>
+        <w:shd w:fill="EDF2F9"/>
+        <w:spacing w:before="120" w:after="160"/>
+      </w:pPr>
+      <w:r>
+        <w:rPr>
+          <w:b/>
+          <w:color w:val="3C36B5"/>
+          <w:sz w:val="18"/>
+        </w:rPr>
+        <w:t>THE OUTCOME</w:t>
+        <w:br/>
+      </w:r>
+      <w:r>
+        <w:rPr>
+          <w:b w:val="0"/>
+        </w:rPr>
+        <w:t>A clearer first-week experience: one welcome journey, one account checklist and fewer handoffs between sales and customer success.</w:t>
+      </w:r>
+    </w:p>
+    <w:p>
+      <w:pPr>
+        <w:pStyle w:val="Heading1"/>
+      </w:pPr>
+      <w:r>
+        <w:rPr>
+          <w:b w:val="0"/>
+        </w:rPr>
+        <w:t>What we heard</w:t>
+      </w:r>
+    </w:p>
+    <w:p>
+      <w:pPr/>
+      <w:r>
+        <w:rPr>
+          <w:b w:val="0"/>
+        </w:rPr>
+        <w:t>New customers receive setup instructions in three separate emails. The proposed work consolidates those steps, clarifies ownership and gives the service team a reusable launch checklist.</w:t>
+      </w:r>
+    </w:p>
+    <w:p>
+      <w:pPr>
+        <w:pStyle w:val="Heading1"/>
+      </w:pPr>
+      <w:r>
+        <w:rPr>
+          <w:b w:val="0"/>
+        </w:rPr>
+      </w:r>
+      <w:r>
+        <w:rPr>
+          <w:b/>
+          <w:color w:val="3C36B5"/>
+        </w:rPr>
+        <w:t>Scope</w:t>
+      </w:r>
+      <w:r>
+        <w:rPr>
+          <w:b w:val="0"/>
+        </w:rPr>
+        <w:t xml:space="preserve"> and delivery</w:t>
+      </w:r>
+    </w:p>
+    <w:tbl>
+      <w:tblPr>
+        <w:tblW w:type="auto" w:w="0"/>
+        <w:tblLayout w:type="fixed"/>
+        <w:tblLook w:firstColumn="1" w:firstRow="1" w:lastColumn="0" w:lastRow="0" w:noHBand="0" w:noVBand="1" w:val="04A0"/>
+      </w:tblPr>
+      <w:tblGrid>
+        <w:gridCol w:w="1882"/>
+        <w:gridCol w:w="6377"/>
+        <w:gridCol w:w="2195"/>
+      </w:tblGrid>
+      <w:tr>
+        <w:trPr>
+          <w:cantSplit/>
+          <w:tblHeader/>
+        </w:trPr>
+        <w:tc>
+          <w:tcPr>
+            <w:tcW w:type="dxa" w:w="1882"/>
+            <w:shd w:fill="3C36B5"/>
+            <w:tcMar>
+              <w:top w:w="85" w:type="dxa"/>
+              <w:left w:w="85" w:type="dxa"/>
+              <w:bottom w:w="85" w:type="dxa"/>
+              <w:right w:w="85" w:type="dxa"/>
+            </w:tcMar>
+          </w:tcPr>
+          <w:p>
+            <w:pPr>
+              <w:spacing w:after="0"/>
+            </w:pPr>
+            <w:r>
+              <w:rPr>
+                <w:rFonts w:ascii="Arial" w:hAnsi="Arial"/>
+                <w:b/>
+                <w:color w:val="FFFFFF"/>
                 <w:sz w:val="18"/>
               </w:rPr>
               <w:t>Phase</w:t>
@@ -116,22 +340,24 @@
         </w:tc>
         <w:tc>
           <w:tcPr>
-            <w:tcW w:type="dxa" w:w="6201"/>
-            <w:shd w:fill="EAF3EE"/>
+            <w:tcW w:type="dxa" w:w="6377"/>
+            <w:shd w:fill="3C36B5"/>
             <w:tcMar>
-              <w:top w:w="80" w:type="dxa"/>
-              <w:left w:w="80" w:type="dxa"/>
-              <w:bottom w:w="80" w:type="dxa"/>
-              <w:right w:w="80" w:type="dxa"/>
+              <w:top w:w="85" w:type="dxa"/>
+              <w:left w:w="85" w:type="dxa"/>
+              <w:bottom w:w="85" w:type="dxa"/>
+              <w:right w:w="85" w:type="dxa"/>
             </w:tcMar>
           </w:tcPr>
           <w:p>
             <w:pPr>
-              <w:spacing w:after="20"/>
+              <w:spacing w:after="0"/>
             </w:pPr>
             <w:r>
               <w:rPr>
+                <w:rFonts w:ascii="Arial" w:hAnsi="Arial"/>
                 <w:b/>
+                <w:color w:val="FFFFFF"/>
                 <w:sz w:val="18"/>
               </w:rPr>
               <w:t>Deliverables</w:t>
@@ -140,22 +366,24 @@
         </w:tc>
         <w:tc>
           <w:tcPr>
-            <w:tcW w:type="dxa" w:w="2135"/>
-            <w:shd w:fill="EAF3EE"/>
+            <w:tcW w:type="dxa" w:w="2195"/>
+            <w:shd w:fill="3C36B5"/>
             <w:tcMar>
-              <w:top w:w="80" w:type="dxa"/>
-              <w:left w:w="80" w:type="dxa"/>
-              <w:bottom w:w="80" w:type="dxa"/>
-              <w:right w:w="80" w:type="dxa"/>
+              <w:top w:w="85" w:type="dxa"/>
+              <w:left w:w="85" w:type="dxa"/>
+              <w:bottom w:w="85" w:type="dxa"/>
+              <w:right w:w="85" w:type="dxa"/>
             </w:tcMar>
           </w:tcPr>
           <w:p>
             <w:pPr>
-              <w:spacing w:after="20"/>
+              <w:spacing w:after="0"/>
             </w:pPr>
             <w:r>
               <w:rPr>
+                <w:rFonts w:ascii="Arial" w:hAnsi="Arial"/>
                 <w:b/>
+                <w:color w:val="FFFFFF"/>
                 <w:sz w:val="18"/>
               </w:rPr>
               <w:t>Schedule</w:t>
@@ -169,22 +397,24 @@
         </w:trPr>
         <w:tc>
           <w:tcPr>
-            <w:tcW w:type="dxa" w:w="1830"/>
-            <w:shd w:fill="FFFFFF"/>
+            <w:tcW w:type="dxa" w:w="1882"/>
+            <w:shd w:fill="F0F2F6"/>
             <w:tcMar>
-              <w:top w:w="80" w:type="dxa"/>
-              <w:left w:w="80" w:type="dxa"/>
-              <w:bottom w:w="80" w:type="dxa"/>
-              <w:right w:w="80" w:type="dxa"/>
+              <w:top w:w="85" w:type="dxa"/>
+              <w:left w:w="85" w:type="dxa"/>
+              <w:bottom w:w="85" w:type="dxa"/>
+              <w:right w:w="85" w:type="dxa"/>
             </w:tcMar>
           </w:tcPr>
           <w:p>
             <w:pPr>
-              <w:spacing w:after="20"/>
+              <w:spacing w:after="0"/>
             </w:pPr>
             <w:r>
               <w:rPr>
+                <w:rFonts w:ascii="Arial" w:hAnsi="Arial"/>
                 <w:b w:val="0"/>
+                <w:color w:val="172033"/>
                 <w:sz w:val="18"/>
               </w:rPr>
               <w:t>Discover</w:t>
@@ -193,22 +423,24 @@
         </w:tc>
         <w:tc>
           <w:tcPr>
-            <w:tcW w:type="dxa" w:w="6201"/>
-            <w:shd w:fill="FFFFFF"/>
+            <w:tcW w:type="dxa" w:w="6377"/>
+            <w:shd w:fill="F0F2F6"/>
             <w:tcMar>
-              <w:top w:w="80" w:type="dxa"/>
-              <w:left w:w="80" w:type="dxa"/>
-              <w:bottom w:w="80" w:type="dxa"/>
-              <w:right w:w="80" w:type="dxa"/>
+              <w:top w:w="85" w:type="dxa"/>
+              <w:left w:w="85" w:type="dxa"/>
+              <w:bottom w:w="85" w:type="dxa"/>
+              <w:right w:w="85" w:type="dxa"/>
             </w:tcMar>
           </w:tcPr>
           <w:p>
             <w:pPr>
-              <w:spacing w:after="20"/>
+              <w:spacing w:after="0"/>
             </w:pPr>
             <w:r>
               <w:rPr>
+                <w:rFonts w:ascii="Arial" w:hAnsi="Arial"/>
                 <w:b w:val="0"/>
+                <w:color w:val="172033"/>
                 <w:sz w:val="18"/>
               </w:rPr>
               <w:t>Five staff interviews; journey map; agreed problem statement</w:t>
@@ -217,22 +449,24 @@
         </w:tc>
         <w:tc>
           <w:tcPr>
-            <w:tcW w:type="dxa" w:w="2135"/>
-            <w:shd w:fill="FFFFFF"/>
+            <w:tcW w:type="dxa" w:w="2195"/>
+            <w:shd w:fill="F0F2F6"/>
             <w:tcMar>
-              <w:top w:w="80" w:type="dxa"/>
-              <w:left w:w="80" w:type="dxa"/>
-              <w:bottom w:w="80" w:type="dxa"/>
-              <w:right w:w="80" w:type="dxa"/>
+              <w:top w:w="85" w:type="dxa"/>
+              <w:left w:w="85" w:type="dxa"/>
+              <w:bottom w:w="85" w:type="dxa"/>
+              <w:right w:w="85" w:type="dxa"/>
             </w:tcMar>
           </w:tcPr>
           <w:p>
             <w:pPr>
-              <w:spacing w:after="20"/>
+              <w:spacing w:after="0"/>
             </w:pPr>
             <w:r>
               <w:rPr>
+                <w:rFonts w:ascii="Arial" w:hAnsi="Arial"/>
                 <w:b w:val="0"/>
+                <w:color w:val="172033"/>
                 <w:sz w:val="18"/>
               </w:rPr>
               <w:t>Week 1</w:t>
@@ -246,22 +480,24 @@
         </w:trPr>
         <w:tc>
           <w:tcPr>
-            <w:tcW w:type="dxa" w:w="1830"/>
-            <w:shd w:fill="EAF3EE"/>
+            <w:tcW w:type="dxa" w:w="1882"/>
+            <w:shd w:fill="FFFFFF"/>
             <w:tcMar>
-              <w:top w:w="80" w:type="dxa"/>
-              <w:left w:w="80" w:type="dxa"/>
-              <w:bottom w:w="80" w:type="dxa"/>
-              <w:right w:w="80" w:type="dxa"/>
+              <w:top w:w="85" w:type="dxa"/>
+              <w:left w:w="85" w:type="dxa"/>
+              <w:bottom w:w="85" w:type="dxa"/>
+              <w:right w:w="85" w:type="dxa"/>
             </w:tcMar>
           </w:tcPr>
           <w:p>
             <w:pPr>
-              <w:spacing w:after="20"/>
+              <w:spacing w:after="0"/>
             </w:pPr>
             <w:r>
               <w:rPr>
+                <w:rFonts w:ascii="Arial" w:hAnsi="Arial"/>
                 <w:b w:val="0"/>
+                <w:color w:val="172033"/>
                 <w:sz w:val="18"/>
               </w:rPr>
               <w:t>Design</w:t>
@@ -270,22 +506,24 @@
         </w:tc>
         <w:tc>
           <w:tcPr>
-            <w:tcW w:type="dxa" w:w="6201"/>
-            <w:shd w:fill="EAF3EE"/>
+            <w:tcW w:type="dxa" w:w="6377"/>
+            <w:shd w:fill="FFFFFF"/>
             <w:tcMar>
-              <w:top w:w="80" w:type="dxa"/>
-              <w:left w:w="80" w:type="dxa"/>
-              <w:bottom w:w="80" w:type="dxa"/>
-              <w:right w:w="80" w:type="dxa"/>
+              <w:top w:w="85" w:type="dxa"/>
+              <w:left w:w="85" w:type="dxa"/>
+              <w:bottom w:w="85" w:type="dxa"/>
+              <w:right w:w="85" w:type="dxa"/>
             </w:tcMar>
           </w:tcPr>
           <w:p>
             <w:pPr>
-              <w:spacing w:after="20"/>
+              <w:spacing w:after="0"/>
             </w:pPr>
             <w:r>
               <w:rPr>
+                <w:rFonts w:ascii="Arial" w:hAnsi="Arial"/>
                 <w:b w:val="0"/>
+                <w:color w:val="172033"/>
                 <w:sz w:val="18"/>
               </w:rPr>
               <w:t>Welcome flow; six screen designs; email copy outline</w:t>
@@ -294,22 +532,24 @@
         </w:tc>
         <w:tc>
           <w:tcPr>
-            <w:tcW w:type="dxa" w:w="2135"/>
-            <w:shd w:fill="EAF3EE"/>
+            <w:tcW w:type="dxa" w:w="2195"/>
+            <w:shd w:fill="FFFFFF"/>
             <w:tcMar>
-              <w:top w:w="80" w:type="dxa"/>
-              <w:left w:w="80" w:type="dxa"/>
-              <w:bottom w:w="80" w:type="dxa"/>
-              <w:right w:w="80" w:type="dxa"/>
+              <w:top w:w="85" w:type="dxa"/>
+              <w:left w:w="85" w:type="dxa"/>
+              <w:bottom w:w="85" w:type="dxa"/>
+              <w:right w:w="85" w:type="dxa"/>
             </w:tcMar>
           </w:tcPr>
           <w:p>
             <w:pPr>
-              <w:spacing w:after="20"/>
+              <w:spacing w:after="0"/>
             </w:pPr>
             <w:r>
               <w:rPr>
+                <w:rFonts w:ascii="Arial" w:hAnsi="Arial"/>
                 <w:b w:val="0"/>
+                <w:color w:val="172033"/>
                 <w:sz w:val="18"/>
               </w:rPr>
               <w:t>Weeks 2–3</w:t>
@@ -323,22 +563,24 @@
         </w:trPr>
         <w:tc>
           <w:tcPr>
-            <w:tcW w:type="dxa" w:w="1830"/>
-            <w:shd w:fill="FFFFFF"/>
+            <w:tcW w:type="dxa" w:w="1882"/>
+            <w:shd w:fill="F0F2F6"/>
             <w:tcMar>
-              <w:top w:w="80" w:type="dxa"/>
-              <w:left w:w="80" w:type="dxa"/>
-              <w:bottom w:w="80" w:type="dxa"/>
-              <w:right w:w="80" w:type="dxa"/>
+              <w:top w:w="85" w:type="dxa"/>
+              <w:left w:w="85" w:type="dxa"/>
+              <w:bottom w:w="85" w:type="dxa"/>
+              <w:right w:w="85" w:type="dxa"/>
             </w:tcMar>
           </w:tcPr>
           <w:p>
             <w:pPr>
-              <w:spacing w:after="20"/>
+              <w:spacing w:after="0"/>
             </w:pPr>
             <w:r>
               <w:rPr>
+                <w:rFonts w:ascii="Arial" w:hAnsi="Arial"/>
                 <w:b w:val="0"/>
+                <w:color w:val="172033"/>
                 <w:sz w:val="18"/>
               </w:rPr>
               <w:t>Handover</w:t>
@@ -347,22 +589,24 @@
         </w:tc>
         <w:tc>
           <w:tcPr>
-            <w:tcW w:type="dxa" w:w="6201"/>
-            <w:shd w:fill="FFFFFF"/>
+            <w:tcW w:type="dxa" w:w="6377"/>
+            <w:shd w:fill="F0F2F6"/>
             <w:tcMar>
-              <w:top w:w="80" w:type="dxa"/>
-              <w:left w:w="80" w:type="dxa"/>
-              <w:bottom w:w="80" w:type="dxa"/>
-              <w:right w:w="80" w:type="dxa"/>
+              <w:top w:w="85" w:type="dxa"/>
+              <w:left w:w="85" w:type="dxa"/>
+              <w:bottom w:w="85" w:type="dxa"/>
+              <w:right w:w="85" w:type="dxa"/>
             </w:tcMar>
           </w:tcPr>
           <w:p>
             <w:pPr>
-              <w:spacing w:after="20"/>
+              <w:spacing w:after="0"/>
             </w:pPr>
             <w:r>
               <w:rPr>
+                <w:rFonts w:ascii="Arial" w:hAnsi="Arial"/>
                 <w:b w:val="0"/>
+                <w:color w:val="172033"/>
                 <w:sz w:val="18"/>
               </w:rPr>
               <w:t>Annotated prototype; component notes; two training sessions</w:t>
@@ -371,22 +615,24 @@
         </w:tc>
         <w:tc>
           <w:tcPr>
-            <w:tcW w:type="dxa" w:w="2135"/>
-            <w:shd w:fill="FFFFFF"/>
+            <w:tcW w:type="dxa" w:w="2195"/>
+            <w:shd w:fill="F0F2F6"/>
             <w:tcMar>
-              <w:top w:w="80" w:type="dxa"/>
-              <w:left w:w="80" w:type="dxa"/>
-              <w:bottom w:w="80" w:type="dxa"/>
-              <w:right w:w="80" w:type="dxa"/>
+              <w:top w:w="85" w:type="dxa"/>
+              <w:left w:w="85" w:type="dxa"/>
+              <w:bottom w:w="85" w:type="dxa"/>
+              <w:right w:w="85" w:type="dxa"/>
             </w:tcMar>
           </w:tcPr>
           <w:p>
             <w:pPr>
-              <w:spacing w:after="20"/>
+              <w:spacing w:after="0"/>
             </w:pPr>
             <w:r>
               <w:rPr>
+                <w:rFonts w:ascii="Arial" w:hAnsi="Arial"/>
                 <w:b w:val="0"/>
+                <w:color w:val="172033"/>
                 <w:sz w:val="18"/>
               </w:rPr>
               <w:t>Week 4</w:t>
@@ -397,14 +643,22 @@
     </w:tbl>
     <w:p>
       <w:pPr>
-        <w:spacing w:after="0"/>
+        <w:spacing w:after="0" w:before="0" w:line="60" w:lineRule="exact"/>
       </w:pPr>
+      <w:r>
+        <w:rPr>
+          <w:sz w:val="6"/>
+        </w:rPr>
+      </w:r>
     </w:p>
     <w:p>
       <w:pPr>
         <w:pStyle w:val="Heading1"/>
       </w:pPr>
       <w:r>
+        <w:rPr>
+          <w:b w:val="0"/>
+        </w:rPr>
         <w:t>How we will work</w:t>
       </w:r>
     </w:p>
@@ -413,7 +667,36 @@
         <w:pStyle w:val="ListBullet"/>
       </w:pPr>
       <w:r>
-        <w:t>One 30-minute review each Tuesday, with a named client decision-maker.</w:t>
+        <w:rPr>
+          <w:b w:val="0"/>
+        </w:rPr>
+        <w:t xml:space="preserve">One 30-minute </w:t>
+      </w:r>
+      <w:r>
+        <w:rPr>
+          <w:b/>
+          <w:color w:val="3C36B5"/>
+        </w:rPr>
+        <w:t>review</w:t>
+      </w:r>
+      <w:r>
+        <w:rPr>
+          <w:b w:val="0"/>
+        </w:rPr>
+        <w:t xml:space="preserve"> each Tuesday, with a named client </w:t>
+      </w:r>
+      <w:r>
+        <w:rPr>
+          <w:b/>
+          <w:color w:val="3C36B5"/>
+        </w:rPr>
+        <w:t>decision</w:t>
+      </w:r>
+      <w:r>
+        <w:rPr>
+          <w:b w:val="0"/>
+        </w:rPr>
+        <w:t>-maker.</w:t>
       </w:r>
     </w:p>
     <w:p>
@@ -421,6 +704,9 @@
         <w:pStyle w:val="ListBullet"/>
       </w:pPr>
       <w:r>
+        <w:rPr>
+          <w:b w:val="0"/>
+        </w:rPr>
         <w:t>Two consolidated feedback rounds on the prototype.</w:t>
       </w:r>
     </w:p>
@@ -429,7 +715,23 @@
         <w:pStyle w:val="ListBullet"/>
       </w:pPr>
       <w:r>
-        <w:t>Shared decision log and weekly written delivery update.</w:t>
+        <w:rPr>
+          <w:b w:val="0"/>
+        </w:rPr>
+        <w:t xml:space="preserve">Shared </w:t>
+      </w:r>
+      <w:r>
+        <w:rPr>
+          <w:b/>
+          <w:color w:val="3C36B5"/>
+        </w:rPr>
+        <w:t>decision</w:t>
+      </w:r>
+      <w:r>
+        <w:rPr>
+          <w:b w:val="0"/>
+        </w:rPr>
+        <w:t xml:space="preserve"> log and weekly written delivery update.</w:t>
       </w:r>
     </w:p>
     <w:p>
@@ -437,13 +739,44 @@
         <w:pStyle w:val="Heading1"/>
       </w:pPr>
       <w:r>
-        <w:t>Outside this scope</w:t>
+        <w:rPr>
+          <w:b w:val="0"/>
+        </w:rPr>
+        <w:t xml:space="preserve">Outside this </w:t>
+      </w:r>
+      <w:r>
+        <w:rPr>
+          <w:b/>
+          <w:color w:val="3C36B5"/>
+        </w:rPr>
+        <w:t>scope</w:t>
+      </w:r>
+      <w:r>
+        <w:rPr>
+          <w:b w:val="0"/>
+        </w:rPr>
       </w:r>
     </w:p>
     <w:p>
       <w:pPr/>
       <w:r>
-        <w:t>Production code, system migration, translation and new brand identity work are excluded. Any added scope requires a written change agreement.</w:t>
+        <w:rPr>
+          <w:b w:val="0"/>
+        </w:rPr>
+        <w:t xml:space="preserve">Production code, system migration, translation and new brand identity work are excluded. Any added </w:t>
+      </w:r>
+      <w:r>
+        <w:rPr>
+          <w:b/>
+          <w:color w:val="3C36B5"/>
+        </w:rPr>
+        <w:t>scope</w:t>
+      </w:r>
+      <w:r>
+        <w:rPr>
+          <w:b w:val="0"/>
+        </w:rPr>
+        <w:t xml:space="preserve"> requires a written change agreement.</w:t>
       </w:r>
     </w:p>
     <w:p>
@@ -455,10 +788,10 @@
       <w:r>
         <w:rPr>
           <w:b/>
-          <w:color w:val="185849"/>
-          <w:sz w:val="18"/>
+          <w:color w:val="3C36B5"/>
+          <w:sz w:val="16"/>
         </w:rPr>
-        <w:t>NORTHSTAR DESIGN • PROPOSAL 027  /  2</w:t>
+        <w:t>NORTHSTAR DESIGN • PROPOSAL 027   /   02</w:t>
       </w:r>
     </w:p>
     <w:p>
@@ -469,6 +802,51 @@
         <w:t>Investment and approval</w:t>
       </w:r>
     </w:p>
+    <w:p>
+      <w:pPr>
+        <w:pStyle w:val="Heading2"/>
+        <w:keepNext/>
+      </w:pPr>
+      <w:r>
+        <w:t>Payment follows delivery</w:t>
+      </w:r>
+    </w:p>
+    <w:p>
+      <w:r>
+        <w:drawing>
+          <wp:inline xmlns:a="http://schemas.openxmlformats.org/drawingml/2006/main" xmlns:pic="http://schemas.openxmlformats.org/drawingml/2006/picture">
+            <wp:extent cx="6080760" cy="1903081"/>
+            <wp:docPr id="1" name="Picture 1"/>
+            <wp:cNvGraphicFramePr>
+              <a:graphicFrameLocks noChangeAspect="1"/>
+            </wp:cNvGraphicFramePr>
+            <a:graphic>
+              <a:graphicData uri="http://schemas.openxmlformats.org/drawingml/2006/picture">
+                <pic:pic>
+                  <pic:nvPicPr>
+                    <pic:cNvPr id="0" name="business-1.png"/>
+                    <pic:cNvPicPr/>
+                  </pic:nvPicPr>
+                  <pic:blipFill>
+                    <a:blip r:embed="rId10"/>
+                    <a:stretch>
+                      <a:fillRect/>
+                    </a:stretch>
+                  </pic:blipFill>
+                  <pic:spPr>
+                    <a:xfrm>
+                      <a:off x="0" y="0"/>
+                      <a:ext cx="6080760" cy="1903081"/>
+                    </a:xfrm>
+                    <a:prstGeom prst="rect"/>
+                  </pic:spPr>
+                </pic:pic>
+              </a:graphicData>
+            </a:graphic>
+          </wp:inline>
+        </w:drawing>
+      </w:r>
+    </w:p>
     <w:tbl>
       <w:tblPr>
         <w:tblW w:type="auto" w:w="0"/>
@@ -476,8 +854,8 @@
         <w:tblLook w:firstColumn="1" w:firstRow="1" w:lastColumn="0" w:lastRow="0" w:noHBand="0" w:noVBand="1" w:val="04A0"/>
       </w:tblPr>
       <w:tblGrid>
-        <w:gridCol w:w="7320"/>
-        <w:gridCol w:w="2846"/>
+        <w:gridCol w:w="7527"/>
+        <w:gridCol w:w="2927"/>
       </w:tblGrid>
       <w:tr>
         <w:trPr>
@@ -486,22 +864,24 @@
         </w:trPr>
         <w:tc>
           <w:tcPr>
-            <w:tcW w:type="dxa" w:w="7320"/>
-            <w:shd w:fill="EAF3EE"/>
+            <w:tcW w:type="dxa" w:w="7527"/>
+            <w:shd w:fill="3C36B5"/>
             <w:tcMar>
-              <w:top w:w="80" w:type="dxa"/>
-              <w:left w:w="80" w:type="dxa"/>
-              <w:bottom w:w="80" w:type="dxa"/>
-              <w:right w:w="80" w:type="dxa"/>
+              <w:top w:w="85" w:type="dxa"/>
+              <w:left w:w="85" w:type="dxa"/>
+              <w:bottom w:w="85" w:type="dxa"/>
+              <w:right w:w="85" w:type="dxa"/>
             </w:tcMar>
           </w:tcPr>
           <w:p>
             <w:pPr>
-              <w:spacing w:after="20"/>
+              <w:spacing w:after="0"/>
             </w:pPr>
             <w:r>
               <w:rPr>
+                <w:rFonts w:ascii="Arial" w:hAnsi="Arial"/>
                 <w:b/>
+                <w:color w:val="FFFFFF"/>
                 <w:sz w:val="18"/>
               </w:rPr>
               <w:t>Work package</w:t>
@@ -510,22 +890,24 @@
         </w:tc>
         <w:tc>
           <w:tcPr>
-            <w:tcW w:type="dxa" w:w="2846"/>
-            <w:shd w:fill="EAF3EE"/>
+            <w:tcW w:type="dxa" w:w="2927"/>
+            <w:shd w:fill="3C36B5"/>
             <w:tcMar>
-              <w:top w:w="80" w:type="dxa"/>
-              <w:left w:w="80" w:type="dxa"/>
-              <w:bottom w:w="80" w:type="dxa"/>
-              <w:right w:w="80" w:type="dxa"/>
+              <w:top w:w="85" w:type="dxa"/>
+              <w:left w:w="85" w:type="dxa"/>
+              <w:bottom w:w="85" w:type="dxa"/>
+              <w:right w:w="85" w:type="dxa"/>
             </w:tcMar>
           </w:tcPr>
           <w:p>
             <w:pPr>
-              <w:spacing w:after="20"/>
+              <w:spacing w:after="0"/>
             </w:pPr>
             <w:r>
               <w:rPr>
+                <w:rFonts w:ascii="Arial" w:hAnsi="Arial"/>
                 <w:b/>
+                <w:color w:val="FFFFFF"/>
                 <w:sz w:val="18"/>
               </w:rPr>
               <w:t>Fee in USD</w:t>
@@ -539,22 +921,24 @@
         </w:trPr>
         <w:tc>
           <w:tcPr>
-            <w:tcW w:type="dxa" w:w="7320"/>
-            <w:shd w:fill="FFFFFF"/>
+            <w:tcW w:type="dxa" w:w="7527"/>
+            <w:shd w:fill="F0F2F6"/>
             <w:tcMar>
-              <w:top w:w="80" w:type="dxa"/>
-              <w:left w:w="80" w:type="dxa"/>
-              <w:bottom w:w="80" w:type="dxa"/>
-              <w:right w:w="80" w:type="dxa"/>
+              <w:top w:w="85" w:type="dxa"/>
+              <w:left w:w="85" w:type="dxa"/>
+              <w:bottom w:w="85" w:type="dxa"/>
+              <w:right w:w="85" w:type="dxa"/>
             </w:tcMar>
           </w:tcPr>
           <w:p>
             <w:pPr>
-              <w:spacing w:after="20"/>
+              <w:spacing w:after="0"/>
             </w:pPr>
             <w:r>
               <w:rPr>
+                <w:rFonts w:ascii="Arial" w:hAnsi="Arial"/>
                 <w:b w:val="0"/>
+                <w:color w:val="172033"/>
                 <w:sz w:val="18"/>
               </w:rPr>
               <w:t>Research and journey mapping</w:t>
@@ -563,22 +947,24 @@
         </w:tc>
         <w:tc>
           <w:tcPr>
-            <w:tcW w:type="dxa" w:w="2846"/>
-            <w:shd w:fill="FFFFFF"/>
+            <w:tcW w:type="dxa" w:w="2927"/>
+            <w:shd w:fill="F0F2F6"/>
             <w:tcMar>
-              <w:top w:w="80" w:type="dxa"/>
-              <w:left w:w="80" w:type="dxa"/>
-              <w:bottom w:w="80" w:type="dxa"/>
-              <w:right w:w="80" w:type="dxa"/>
+              <w:top w:w="85" w:type="dxa"/>
+              <w:left w:w="85" w:type="dxa"/>
+              <w:bottom w:w="85" w:type="dxa"/>
+              <w:right w:w="85" w:type="dxa"/>
             </w:tcMar>
           </w:tcPr>
           <w:p>
             <w:pPr>
-              <w:spacing w:after="20"/>
+              <w:spacing w:after="0"/>
             </w:pPr>
             <w:r>
               <w:rPr>
+                <w:rFonts w:ascii="Arial" w:hAnsi="Arial"/>
                 <w:b w:val="0"/>
+                <w:color w:val="172033"/>
                 <w:sz w:val="18"/>
               </w:rPr>
               <w:t>$3,000</w:t>
@@ -592,22 +978,24 @@
         </w:trPr>
         <w:tc>
           <w:tcPr>
-            <w:tcW w:type="dxa" w:w="7320"/>
-            <w:shd w:fill="EAF3EE"/>
+            <w:tcW w:type="dxa" w:w="7527"/>
+            <w:shd w:fill="FFFFFF"/>
             <w:tcMar>
-              <w:top w:w="80" w:type="dxa"/>
-              <w:left w:w="80" w:type="dxa"/>
-              <w:bottom w:w="80" w:type="dxa"/>
-              <w:right w:w="80" w:type="dxa"/>
+              <w:top w:w="85" w:type="dxa"/>
+              <w:left w:w="85" w:type="dxa"/>
+              <w:bottom w:w="85" w:type="dxa"/>
+              <w:right w:w="85" w:type="dxa"/>
             </w:tcMar>
           </w:tcPr>
           <w:p>
             <w:pPr>
-              <w:spacing w:after="20"/>
+              <w:spacing w:after="0"/>
             </w:pPr>
             <w:r>
               <w:rPr>
+                <w:rFonts w:ascii="Arial" w:hAnsi="Arial"/>
                 <w:b w:val="0"/>
+                <w:color w:val="172033"/>
                 <w:sz w:val="18"/>
               </w:rPr>
               <w:t>Experience design and prototype</w:t>
@@ -616,22 +1004,24 @@
         </w:tc>
         <w:tc>
           <w:tcPr>
-            <w:tcW w:type="dxa" w:w="2846"/>
-            <w:shd w:fill="EAF3EE"/>
+            <w:tcW w:type="dxa" w:w="2927"/>
+            <w:shd w:fill="FFFFFF"/>
             <w:tcMar>
-              <w:top w:w="80" w:type="dxa"/>
-              <w:left w:w="80" w:type="dxa"/>
-              <w:bottom w:w="80" w:type="dxa"/>
-              <w:right w:w="80" w:type="dxa"/>
+              <w:top w:w="85" w:type="dxa"/>
+              <w:left w:w="85" w:type="dxa"/>
+              <w:bottom w:w="85" w:type="dxa"/>
+              <w:right w:w="85" w:type="dxa"/>
             </w:tcMar>
           </w:tcPr>
           <w:p>
             <w:pPr>
-              <w:spacing w:after="20"/>
+              <w:spacing w:after="0"/>
             </w:pPr>
             <w:r>
               <w:rPr>
+                <w:rFonts w:ascii="Arial" w:hAnsi="Arial"/>
                 <w:b w:val="0"/>
+                <w:color w:val="172033"/>
                 <w:sz w:val="18"/>
               </w:rPr>
               <w:t>$7,500</w:t>
@@ -645,22 +1035,24 @@
         </w:trPr>
         <w:tc>
           <w:tcPr>
-            <w:tcW w:type="dxa" w:w="7320"/>
-            <w:shd w:fill="FFFFFF"/>
+            <w:tcW w:type="dxa" w:w="7527"/>
+            <w:shd w:fill="F0F2F6"/>
             <w:tcMar>
-              <w:top w:w="80" w:type="dxa"/>
-              <w:left w:w="80" w:type="dxa"/>
-              <w:bottom w:w="80" w:type="dxa"/>
-              <w:right w:w="80" w:type="dxa"/>
+              <w:top w:w="85" w:type="dxa"/>
+              <w:left w:w="85" w:type="dxa"/>
+              <w:bottom w:w="85" w:type="dxa"/>
+              <w:right w:w="85" w:type="dxa"/>
             </w:tcMar>
           </w:tcPr>
           <w:p>
             <w:pPr>
-              <w:spacing w:after="20"/>
+              <w:spacing w:after="0"/>
             </w:pPr>
             <w:r>
               <w:rPr>
+                <w:rFonts w:ascii="Arial" w:hAnsi="Arial"/>
                 <w:b w:val="0"/>
+                <w:color w:val="172033"/>
                 <w:sz w:val="18"/>
               </w:rPr>
               <w:t>Handover and training</w:t>
@@ -669,22 +1061,24 @@
         </w:tc>
         <w:tc>
           <w:tcPr>
-            <w:tcW w:type="dxa" w:w="2846"/>
-            <w:shd w:fill="FFFFFF"/>
+            <w:tcW w:type="dxa" w:w="2927"/>
+            <w:shd w:fill="F0F2F6"/>
             <w:tcMar>
-              <w:top w:w="80" w:type="dxa"/>
-              <w:left w:w="80" w:type="dxa"/>
-              <w:bottom w:w="80" w:type="dxa"/>
-              <w:right w:w="80" w:type="dxa"/>
+              <w:top w:w="85" w:type="dxa"/>
+              <w:left w:w="85" w:type="dxa"/>
+              <w:bottom w:w="85" w:type="dxa"/>
+              <w:right w:w="85" w:type="dxa"/>
             </w:tcMar>
           </w:tcPr>
           <w:p>
             <w:pPr>
-              <w:spacing w:after="20"/>
+              <w:spacing w:after="0"/>
             </w:pPr>
             <w:r>
               <w:rPr>
+                <w:rFonts w:ascii="Arial" w:hAnsi="Arial"/>
                 <w:b w:val="0"/>
+                <w:color w:val="172033"/>
                 <w:sz w:val="18"/>
               </w:rPr>
               <w:t>$1,500</w:t>
@@ -698,22 +1092,24 @@
         </w:trPr>
         <w:tc>
           <w:tcPr>
-            <w:tcW w:type="dxa" w:w="7320"/>
-            <w:shd w:fill="EAF3EE"/>
+            <w:tcW w:type="dxa" w:w="7527"/>
+            <w:shd w:fill="FFFFFF"/>
             <w:tcMar>
-              <w:top w:w="80" w:type="dxa"/>
-              <w:left w:w="80" w:type="dxa"/>
-              <w:bottom w:w="80" w:type="dxa"/>
-              <w:right w:w="80" w:type="dxa"/>
+              <w:top w:w="85" w:type="dxa"/>
+              <w:left w:w="85" w:type="dxa"/>
+              <w:bottom w:w="85" w:type="dxa"/>
+              <w:right w:w="85" w:type="dxa"/>
             </w:tcMar>
           </w:tcPr>
           <w:p>
             <w:pPr>
-              <w:spacing w:after="20"/>
+              <w:spacing w:after="0"/>
             </w:pPr>
             <w:r>
               <w:rPr>
+                <w:rFonts w:ascii="Arial" w:hAnsi="Arial"/>
                 <w:b w:val="0"/>
+                <w:color w:val="172033"/>
                 <w:sz w:val="18"/>
               </w:rPr>
               <w:t>Total project fee</w:t>
@@ -722,22 +1118,24 @@
         </w:tc>
         <w:tc>
           <w:tcPr>
-            <w:tcW w:type="dxa" w:w="2846"/>
-            <w:shd w:fill="EAF3EE"/>
+            <w:tcW w:type="dxa" w:w="2927"/>
+            <w:shd w:fill="FFFFFF"/>
             <w:tcMar>
-              <w:top w:w="80" w:type="dxa"/>
-              <w:left w:w="80" w:type="dxa"/>
-              <w:bottom w:w="80" w:type="dxa"/>
-              <w:right w:w="80" w:type="dxa"/>
+              <w:top w:w="85" w:type="dxa"/>
+              <w:left w:w="85" w:type="dxa"/>
+              <w:bottom w:w="85" w:type="dxa"/>
+              <w:right w:w="85" w:type="dxa"/>
             </w:tcMar>
           </w:tcPr>
           <w:p>
             <w:pPr>
-              <w:spacing w:after="20"/>
+              <w:spacing w:after="0"/>
             </w:pPr>
             <w:r>
               <w:rPr>
+                <w:rFonts w:ascii="Arial" w:hAnsi="Arial"/>
                 <w:b w:val="0"/>
+                <w:color w:val="172033"/>
                 <w:sz w:val="18"/>
               </w:rPr>
               <w:t>$12,000</w:t>
@@ -748,21 +1146,12 @@
     </w:tbl>
     <w:p>
       <w:pPr>
-        <w:spacing w:after="0"/>
-      </w:pPr>
-    </w:p>
-    <w:p>
-      <w:pPr>
-        <w:pStyle w:val="Heading1"/>
+        <w:spacing w:after="0" w:before="0" w:line="60" w:lineRule="exact"/>
       </w:pPr>
       <w:r>
-        <w:t>Payment schedule</w:t>
-      </w:r>
-    </w:p>
-    <w:p>
-      <w:pPr/>
-      <w:r>
-        <w:t>40% at kickoff ($4,800), 40% at prototype review ($4,800), and 20% at handover ($2,400). This illustrative price excludes applicable taxes and third-party expenses.</w:t>
+        <w:rPr>
+          <w:sz w:val="6"/>
+        </w:rPr>
       </w:r>
     </w:p>
     <w:p>
@@ -770,6 +1159,42 @@
         <w:pStyle w:val="Heading1"/>
       </w:pPr>
       <w:r>
+        <w:rPr>
+          <w:b w:val="0"/>
+        </w:rPr>
+        <w:t>Payment schedule</w:t>
+      </w:r>
+    </w:p>
+    <w:p>
+      <w:pPr/>
+      <w:r>
+        <w:rPr>
+          <w:b w:val="0"/>
+        </w:rPr>
+        <w:t xml:space="preserve">40% at kickoff ($4,800), 40% at prototype </w:t>
+      </w:r>
+      <w:r>
+        <w:rPr>
+          <w:b/>
+          <w:color w:val="3C36B5"/>
+        </w:rPr>
+        <w:t>review</w:t>
+      </w:r>
+      <w:r>
+        <w:rPr>
+          <w:b w:val="0"/>
+        </w:rPr>
+        <w:t xml:space="preserve"> ($4,800), and 20% at handover ($2,400). This illustrative price excludes applicable taxes and third-party expenses.</w:t>
+      </w:r>
+    </w:p>
+    <w:p>
+      <w:pPr>
+        <w:pStyle w:val="Heading1"/>
+      </w:pPr>
+      <w:r>
+        <w:rPr>
+          <w:b w:val="0"/>
+        </w:rPr>
         <w:t>Client responsibilities</w:t>
       </w:r>
     </w:p>
@@ -778,6 +1203,9 @@
         <w:pStyle w:val="ListBullet"/>
       </w:pPr>
       <w:r>
+        <w:rPr>
+          <w:b w:val="0"/>
+        </w:rPr>
         <w:t>Provide current onboarding material and access to five interview participants.</w:t>
       </w:r>
     </w:p>
@@ -786,6 +1214,9 @@
         <w:pStyle w:val="ListBullet"/>
       </w:pPr>
       <w:r>
+        <w:rPr>
+          <w:b w:val="0"/>
+        </w:rPr>
         <w:t>Return consolidated feedback within two working days.</w:t>
       </w:r>
     </w:p>
@@ -794,6 +1225,9 @@
         <w:pStyle w:val="ListBullet"/>
       </w:pPr>
       <w:r>
+        <w:rPr>
+          <w:b w:val="0"/>
+        </w:rPr>
         <w:t>Confirm content accuracy and nominate an approver before kickoff.</w:t>
       </w:r>
     </w:p>
@@ -802,13 +1236,69 @@
         <w:pStyle w:val="Heading1"/>
       </w:pPr>
       <w:r>
-        <w:t>Acceptance criteria</w:t>
+        <w:rPr>
+          <w:b w:val="0"/>
+        </w:rPr>
+      </w:r>
+      <w:r>
+        <w:rPr>
+          <w:b/>
+          <w:color w:val="3C36B5"/>
+        </w:rPr>
+        <w:t>Acceptance</w:t>
+      </w:r>
+      <w:r>
+        <w:rPr>
+          <w:b w:val="0"/>
+        </w:rPr>
+        <w:t xml:space="preserve"> criteria</w:t>
       </w:r>
     </w:p>
     <w:p>
       <w:pPr/>
       <w:r>
-        <w:t>Handover is complete when the agreed six screens, email outline, annotated prototype and training sessions have been delivered. The project lead records acceptance or a specific list of scope-related corrections.</w:t>
+        <w:rPr>
+          <w:b w:val="0"/>
+        </w:rPr>
+      </w:r>
+      <w:r>
+        <w:rPr>
+          <w:b/>
+          <w:color w:val="3C36B5"/>
+        </w:rPr>
+        <w:t>Acceptance</w:t>
+      </w:r>
+      <w:r>
+        <w:rPr>
+          <w:b w:val="0"/>
+        </w:rPr>
+        <w:t xml:space="preserve"> covers six annotated screens, the welcome email outline, a working prototype and two team sessions. The lead records </w:t>
+      </w:r>
+      <w:r>
+        <w:rPr>
+          <w:b/>
+          <w:color w:val="3C36B5"/>
+        </w:rPr>
+        <w:t>acceptance</w:t>
+      </w:r>
+      <w:r>
+        <w:rPr>
+          <w:b w:val="0"/>
+        </w:rPr>
+        <w:t xml:space="preserve"> or specific </w:t>
+      </w:r>
+      <w:r>
+        <w:rPr>
+          <w:b/>
+          <w:color w:val="3C36B5"/>
+        </w:rPr>
+        <w:t>scope</w:t>
+      </w:r>
+      <w:r>
+        <w:rPr>
+          <w:b w:val="0"/>
+        </w:rPr>
+        <w:t>-related corrections.</w:t>
       </w:r>
     </w:p>
     <w:p>
@@ -816,152 +1306,89 @@
         <w:pStyle w:val="Heading1"/>
       </w:pPr>
       <w:r>
-        <w:t>Proposed next step</w:t>
+        <w:rPr>
+          <w:b w:val="0"/>
+        </w:rPr>
+        <w:t xml:space="preserve">The </w:t>
+      </w:r>
+      <w:r>
+        <w:rPr>
+          <w:b/>
+          <w:color w:val="3C36B5"/>
+        </w:rPr>
+        <w:t>decision</w:t>
+      </w:r>
+      <w:r>
+        <w:rPr>
+          <w:b w:val="0"/>
+        </w:rPr>
       </w:r>
     </w:p>
     <w:p>
       <w:pPr/>
       <w:r>
-        <w:t>Confirm the scope and proposed 5 July kickoff. The parties should finalize their service agreement before work begins.</w:t>
+        <w:rPr>
+          <w:b w:val="0"/>
+        </w:rPr>
+        <w:t xml:space="preserve">Alder Studio sponsor Priya Shah and Northstar lead Maya Chen </w:t>
+      </w:r>
+      <w:r>
+        <w:rPr>
+          <w:b/>
+          <w:color w:val="3C36B5"/>
+        </w:rPr>
+        <w:t>review</w:t>
+      </w:r>
+      <w:r>
+        <w:rPr>
+          <w:b w:val="0"/>
+        </w:rPr>
+        <w:t xml:space="preserve"> </w:t>
+      </w:r>
+      <w:r>
+        <w:rPr>
+          <w:b/>
+          <w:color w:val="3C36B5"/>
+        </w:rPr>
+        <w:t>scope</w:t>
+      </w:r>
+      <w:r>
+        <w:rPr>
+          <w:b w:val="0"/>
+        </w:rPr>
+        <w:t xml:space="preserve"> on 25 June. Proposed kickoff: 5 July. </w:t>
+      </w:r>
+      <w:r>
+        <w:rPr>
+          <w:b/>
+          <w:color w:val="3C36B5"/>
+        </w:rPr>
+        <w:t>Acceptance</w:t>
+      </w:r>
+      <w:r>
+        <w:rPr>
+          <w:b w:val="0"/>
+        </w:rPr>
+        <w:t xml:space="preserve"> is a recorded review of the agreed deliverables, not an automatic consequence of payment.</w:t>
       </w:r>
     </w:p>
-    <w:tbl>
-      <w:tblPr>
-        <w:tblW w:type="auto" w:w="0"/>
-        <w:tblLayout w:type="fixed"/>
-        <w:tblLook w:firstColumn="1" w:firstRow="1" w:lastColumn="0" w:lastRow="0" w:noHBand="0" w:noVBand="1" w:val="04A0"/>
-      </w:tblPr>
-      <w:tblGrid>
-        <w:gridCol w:w="5083"/>
-        <w:gridCol w:w="5083"/>
-      </w:tblGrid>
-      <w:tr>
-        <w:trPr>
-          <w:cantSplit/>
-          <w:tblHeader/>
-        </w:trPr>
-        <w:tc>
-          <w:tcPr>
-            <w:tcW w:type="dxa" w:w="5083"/>
-            <w:shd w:fill="EAF3EE"/>
-            <w:tcMar>
-              <w:top w:w="80" w:type="dxa"/>
-              <w:left w:w="80" w:type="dxa"/>
-              <w:bottom w:w="80" w:type="dxa"/>
-              <w:right w:w="80" w:type="dxa"/>
-            </w:tcMar>
-          </w:tcPr>
-          <w:p>
-            <w:pPr>
-              <w:spacing w:after="20"/>
-            </w:pPr>
-            <w:r>
-              <w:rPr>
-                <w:b/>
-                <w:sz w:val="18"/>
-              </w:rPr>
-              <w:t>Client approver</w:t>
-            </w:r>
-          </w:p>
-        </w:tc>
-        <w:tc>
-          <w:tcPr>
-            <w:tcW w:type="dxa" w:w="5083"/>
-            <w:shd w:fill="EAF3EE"/>
-            <w:tcMar>
-              <w:top w:w="80" w:type="dxa"/>
-              <w:left w:w="80" w:type="dxa"/>
-              <w:bottom w:w="80" w:type="dxa"/>
-              <w:right w:w="80" w:type="dxa"/>
-            </w:tcMar>
-          </w:tcPr>
-          <w:p>
-            <w:pPr>
-              <w:spacing w:after="20"/>
-            </w:pPr>
-            <w:r>
-              <w:rPr>
-                <w:b/>
-                <w:sz w:val="18"/>
-              </w:rPr>
-              <w:t>Provider approver</w:t>
-            </w:r>
-          </w:p>
-        </w:tc>
-      </w:tr>
-      <w:tr>
-        <w:trPr>
-          <w:cantSplit/>
-        </w:trPr>
-        <w:tc>
-          <w:tcPr>
-            <w:tcW w:type="dxa" w:w="5083"/>
-            <w:shd w:fill="FFFFFF"/>
-            <w:tcMar>
-              <w:top w:w="80" w:type="dxa"/>
-              <w:left w:w="80" w:type="dxa"/>
-              <w:bottom w:w="80" w:type="dxa"/>
-              <w:right w:w="80" w:type="dxa"/>
-            </w:tcMar>
-          </w:tcPr>
-          <w:p>
-            <w:pPr>
-              <w:spacing w:after="20"/>
-            </w:pPr>
-            <w:r>
-              <w:rPr>
-                <w:b w:val="0"/>
-                <w:sz w:val="18"/>
-              </w:rPr>
-              <w:t>[Name and role]</w:t>
-              <w:br/>
-              <w:t>[Signature and date]</w:t>
-            </w:r>
-          </w:p>
-        </w:tc>
-        <w:tc>
-          <w:tcPr>
-            <w:tcW w:type="dxa" w:w="5083"/>
-            <w:shd w:fill="FFFFFF"/>
-            <w:tcMar>
-              <w:top w:w="80" w:type="dxa"/>
-              <w:left w:w="80" w:type="dxa"/>
-              <w:bottom w:w="80" w:type="dxa"/>
-              <w:right w:w="80" w:type="dxa"/>
-            </w:tcMar>
-          </w:tcPr>
-          <w:p>
-            <w:pPr>
-              <w:spacing w:after="20"/>
-            </w:pPr>
-            <w:r>
-              <w:rPr>
-                <w:b w:val="0"/>
-                <w:sz w:val="18"/>
-              </w:rPr>
-              <w:t>[Name and role]</w:t>
-              <w:br/>
-              <w:t>[Signature and date]</w:t>
-            </w:r>
-          </w:p>
-        </w:tc>
-      </w:tr>
-    </w:tbl>
     <w:p>
       <w:pPr>
-        <w:spacing w:after="0"/>
+        <w:spacing w:before="140"/>
       </w:pPr>
-    </w:p>
-    <w:p>
-      <w:pPr/>
       <w:r>
-        <w:t>Sample proposal. Replace the fictional parties, dates, pricing and terms with approved project details.</w:t>
+        <w:rPr>
+          <w:i/>
+          <w:color w:val="505968"/>
+          <w:sz w:val="16"/>
+        </w:rPr>
+        <w:t>Design notes: Scope narrative, pricing visualization and acceptance criteria. Original Dazzler template, Apache-2.0. All sample facts are fictional.</w:t>
       </w:r>
     </w:p>
     <w:sectPr>
       <w:footerReference w:type="default" r:id="rId9"/>
       <w:pgSz w:w="12240" w:h="15840"/>
-      <w:pgMar w:top="864" w:right="1037" w:bottom="864" w:left="1037" w:header="720" w:footer="720" w:gutter="0"/>
+      <w:pgMar w:top="749" w:right="893" w:bottom="749" w:left="893" w:header="720" w:footer="720" w:gutter="0"/>
       <w:cols w:space="720"/>
       <w:docGrid w:linePitch="360"/>
     </w:sectPr>
@@ -977,10 +1404,26 @@
     </w:pPr>
     <w:r>
       <w:rPr>
+        <w:b w:val="0"/>
         <w:sz w:val="16"/>
       </w:rPr>
-      <w:t>Dazzler sample template • business • Replace fictional details before use</w:t>
     </w:r>
+    <w:r>
+      <w:rPr>
+        <w:b/>
+        <w:color w:val="3C36B5"/>
+        <w:sz w:val="16"/>
+      </w:rPr>
+      <w:t>FICTIONAL</w:t>
+    </w:r>
+    <w:r>
+      <w:rPr>
+        <w:b w:val="0"/>
+        <w:sz w:val="16"/>
+      </w:rPr>
+      <w:t xml:space="preserve"> EXAMPLE  /  BUSINESS   •   Dazzler   /   </w:t>
+    </w:r>
+    <w:fldSimple w:instr="PAGE"/>
   </w:p>
 </w:ftr>
 </file>
@@ -1349,12 +1792,12 @@
     <w:qFormat/>
     <w:rsid w:val="00FC693F"/>
     <w:pPr>
-      <w:spacing w:line="259" w:lineRule="auto" w:after="120"/>
+      <w:spacing w:after="140" w:line="264" w:lineRule="auto"/>
     </w:pPr>
     <w:rPr>
       <w:rFonts w:ascii="Arial" w:hAnsi="Arial"/>
-      <w:color w:val="000000"/>
-      <w:sz w:val="20"/>
+      <w:color w:val="172033"/>
+      <w:sz w:val="21"/>
     </w:rPr>
   </w:style>
   <w:style w:type="paragraph" w:styleId="Header">
@@ -1412,15 +1855,15 @@
     <w:pPr>
       <w:keepNext/>
       <w:keepLines/>
-      <w:spacing w:before="240" w:after="120" w:line="259" w:lineRule="auto"/>
+      <w:spacing w:before="180" w:after="140" w:line="264" w:lineRule="auto"/>
       <w:outlineLvl w:val="0"/>
     </w:pPr>
     <w:rPr>
       <w:rFonts w:cstheme="majorBidi" w:ascii="Arial" w:hAnsi="Arial"/>
       <w:b/>
       <w:bCs/>
-      <w:color w:val="000000"/>
-      <w:sz w:val="26"/>
+      <w:color w:val="3C36B5"/>
+      <w:sz w:val="30"/>
       <w:szCs w:val="28"/>
     </w:rPr>
   </w:style>
@@ -1436,15 +1879,15 @@
     <w:pPr>
       <w:keepNext/>
       <w:keepLines/>
-      <w:spacing w:before="200" w:after="120" w:line="259" w:lineRule="auto"/>
+      <w:spacing w:before="200" w:after="140" w:line="264" w:lineRule="auto"/>
       <w:outlineLvl w:val="1"/>
     </w:pPr>
     <w:rPr>
       <w:rFonts w:cstheme="majorBidi" w:ascii="Arial" w:hAnsi="Arial"/>
       <w:b/>
       <w:bCs/>
-      <w:color w:val="000000"/>
-      <w:sz w:val="22"/>
+      <w:color w:val="172033"/>
+      <w:sz w:val="24"/>
       <w:szCs w:val="26"/>
     </w:rPr>
   </w:style>
@@ -1464,7 +1907,7 @@
       <w:outlineLvl w:val="2"/>
     </w:pPr>
     <w:rPr>
-      <w:rFonts w:asciiTheme="majorHAnsi" w:eastAsiaTheme="majorEastAsia" w:hAnsiTheme="majorHAnsi" w:cstheme="majorBidi"/>
+      <w:rFonts w:cstheme="majorBidi"/>
       <w:b/>
       <w:bCs/>
       <w:color w:val="4F81BD" w:themeColor="accent1"/>
@@ -1487,7 +1930,7 @@
       <w:outlineLvl w:val="3"/>
     </w:pPr>
     <w:rPr>
-      <w:rFonts w:asciiTheme="majorHAnsi" w:eastAsiaTheme="majorEastAsia" w:hAnsiTheme="majorHAnsi" w:cstheme="majorBidi"/>
+      <w:rFonts w:cstheme="majorBidi"/>
       <w:b/>
       <w:bCs/>
       <w:i/>
@@ -1512,7 +1955,7 @@
       <w:outlineLvl w:val="4"/>
     </w:pPr>
     <w:rPr>
-      <w:rFonts w:asciiTheme="majorHAnsi" w:eastAsiaTheme="majorEastAsia" w:hAnsiTheme="majorHAnsi" w:cstheme="majorBidi"/>
+      <w:rFonts w:cstheme="majorBidi"/>
       <w:color w:val="243F60" w:themeColor="accent1" w:themeShade="7F"/>
     </w:rPr>
   </w:style>
@@ -1533,7 +1976,7 @@
       <w:outlineLvl w:val="5"/>
     </w:pPr>
     <w:rPr>
-      <w:rFonts w:asciiTheme="majorHAnsi" w:eastAsiaTheme="majorEastAsia" w:hAnsiTheme="majorHAnsi" w:cstheme="majorBidi"/>
+      <w:rFonts w:cstheme="majorBidi"/>
       <w:i/>
       <w:iCs/>
       <w:color w:val="243F60" w:themeColor="accent1" w:themeShade="7F"/>
@@ -1556,7 +1999,7 @@
       <w:outlineLvl w:val="6"/>
     </w:pPr>
     <w:rPr>
-      <w:rFonts w:asciiTheme="majorHAnsi" w:eastAsiaTheme="majorEastAsia" w:hAnsiTheme="majorHAnsi" w:cstheme="majorBidi"/>
+      <w:rFonts w:cstheme="majorBidi"/>
       <w:i/>
       <w:iCs/>
       <w:color w:val="404040" w:themeColor="text1" w:themeTint="BF"/>
@@ -1579,7 +2022,7 @@
       <w:outlineLvl w:val="7"/>
     </w:pPr>
     <w:rPr>
-      <w:rFonts w:asciiTheme="majorHAnsi" w:eastAsiaTheme="majorEastAsia" w:hAnsiTheme="majorHAnsi" w:cstheme="majorBidi"/>
+      <w:rFonts w:cstheme="majorBidi"/>
       <w:color w:val="4F81BD" w:themeColor="accent1"/>
       <w:sz w:val="20"/>
       <w:szCs w:val="20"/>
@@ -1602,7 +2045,7 @@
       <w:outlineLvl w:val="8"/>
     </w:pPr>
     <w:rPr>
-      <w:rFonts w:asciiTheme="majorHAnsi" w:eastAsiaTheme="majorEastAsia" w:hAnsiTheme="majorHAnsi" w:cstheme="majorBidi"/>
+      <w:rFonts w:cstheme="majorBidi"/>
       <w:i/>
       <w:iCs/>
       <w:color w:val="404040" w:themeColor="text1" w:themeTint="BF"/>
@@ -1653,7 +2096,7 @@
     <w:uiPriority w:val="9"/>
     <w:rsid w:val="00FC693F"/>
     <w:rPr>
-      <w:rFonts w:asciiTheme="majorHAnsi" w:eastAsiaTheme="majorEastAsia" w:hAnsiTheme="majorHAnsi" w:cstheme="majorBidi"/>
+      <w:rFonts w:cstheme="majorBidi"/>
       <w:b/>
       <w:bCs/>
       <w:color w:val="365F91" w:themeColor="accent1" w:themeShade="BF"/>
@@ -1668,7 +2111,7 @@
     <w:uiPriority w:val="9"/>
     <w:rsid w:val="00FC693F"/>
     <w:rPr>
-      <w:rFonts w:asciiTheme="majorHAnsi" w:eastAsiaTheme="majorEastAsia" w:hAnsiTheme="majorHAnsi" w:cstheme="majorBidi"/>
+      <w:rFonts w:cstheme="majorBidi"/>
       <w:b/>
       <w:bCs/>
       <w:color w:val="4F81BD" w:themeColor="accent1"/>
@@ -1683,7 +2126,7 @@
     <w:uiPriority w:val="9"/>
     <w:rsid w:val="00FC693F"/>
     <w:rPr>
-      <w:rFonts w:asciiTheme="majorHAnsi" w:eastAsiaTheme="majorEastAsia" w:hAnsiTheme="majorHAnsi" w:cstheme="majorBidi"/>
+      <w:rFonts w:cstheme="majorBidi"/>
       <w:b/>
       <w:bCs/>
       <w:color w:val="4F81BD" w:themeColor="accent1"/>
@@ -1698,15 +2141,17 @@
     <w:qFormat/>
     <w:rsid w:val="00FC693F"/>
     <w:pPr>
-      <w:spacing w:after="120" w:line="259" w:lineRule="auto"/>
+      <w:keepNext/>
+      <w:spacing w:after="140" w:line="264" w:lineRule="auto"/>
       <w:contextualSpacing/>
     </w:pPr>
     <w:rPr>
       <w:rFonts w:cstheme="majorBidi" w:ascii="Arial" w:hAnsi="Arial"/>
-      <w:color w:val="000000"/>
+      <w:b/>
+      <w:color w:val="3C36B5"/>
       <w:spacing w:val="5"/>
       <w:kern w:val="28"/>
-      <w:sz w:val="56"/>
+      <w:sz w:val="70"/>
       <w:szCs w:val="52"/>
     </w:rPr>
   </w:style>
@@ -1717,7 +2162,7 @@
     <w:uiPriority w:val="10"/>
     <w:rsid w:val="00FC693F"/>
     <w:rPr>
-      <w:rFonts w:asciiTheme="majorHAnsi" w:eastAsiaTheme="majorEastAsia" w:hAnsiTheme="majorHAnsi" w:cstheme="majorBidi"/>
+      <w:rFonts w:cstheme="majorBidi"/>
       <w:color w:val="17365D" w:themeColor="text2" w:themeShade="BF"/>
       <w:spacing w:val="5"/>
       <w:kern w:val="28"/>
@@ -1737,13 +2182,13 @@
       <w:numPr>
         <w:ilvl w:val="1"/>
       </w:numPr>
-      <w:spacing w:line="259" w:lineRule="auto" w:after="120"/>
+      <w:spacing w:after="140" w:line="264" w:lineRule="auto"/>
     </w:pPr>
     <w:rPr>
       <w:rFonts w:cstheme="majorBidi" w:ascii="Arial" w:hAnsi="Arial"/>
       <w:i/>
       <w:iCs/>
-      <w:color w:val="000000"/>
+      <w:color w:val="172033"/>
       <w:spacing w:val="15"/>
       <w:sz w:val="24"/>
       <w:szCs w:val="24"/>
@@ -1756,7 +2201,7 @@
     <w:uiPriority w:val="11"/>
     <w:rsid w:val="00FC693F"/>
     <w:rPr>
-      <w:rFonts w:asciiTheme="majorHAnsi" w:eastAsiaTheme="majorEastAsia" w:hAnsiTheme="majorHAnsi" w:cstheme="majorBidi"/>
+      <w:rFonts w:cstheme="majorBidi"/>
       <w:i/>
       <w:iCs/>
       <w:color w:val="4F81BD" w:themeColor="accent1"/>
@@ -1881,13 +2326,13 @@
       <w:numPr>
         <w:numId w:val="1"/>
       </w:numPr>
-      <w:spacing w:line="259" w:lineRule="auto" w:after="120"/>
+      <w:spacing w:after="140" w:line="264" w:lineRule="auto"/>
       <w:contextualSpacing/>
     </w:pPr>
     <w:rPr>
       <w:rFonts w:ascii="Arial" w:hAnsi="Arial"/>
-      <w:color w:val="000000"/>
-      <w:sz w:val="20"/>
+      <w:color w:val="172033"/>
+      <w:sz w:val="21"/>
     </w:rPr>
   </w:style>
   <w:style w:type="paragraph" w:styleId="ListBullet2">
@@ -2060,7 +2505,7 @@
     <w:semiHidden/>
     <w:rsid w:val="00FC693F"/>
     <w:rPr>
-      <w:rFonts w:asciiTheme="majorHAnsi" w:eastAsiaTheme="majorEastAsia" w:hAnsiTheme="majorHAnsi" w:cstheme="majorBidi"/>
+      <w:rFonts w:cstheme="majorBidi"/>
       <w:b/>
       <w:bCs/>
       <w:i/>
@@ -2076,7 +2521,7 @@
     <w:semiHidden/>
     <w:rsid w:val="00FC693F"/>
     <w:rPr>
-      <w:rFonts w:asciiTheme="majorHAnsi" w:eastAsiaTheme="majorEastAsia" w:hAnsiTheme="majorHAnsi" w:cstheme="majorBidi"/>
+      <w:rFonts w:cstheme="majorBidi"/>
       <w:color w:val="243F60" w:themeColor="accent1" w:themeShade="7F"/>
     </w:rPr>
   </w:style>
@@ -2088,7 +2533,7 @@
     <w:semiHidden/>
     <w:rsid w:val="00FC693F"/>
     <w:rPr>
-      <w:rFonts w:asciiTheme="majorHAnsi" w:eastAsiaTheme="majorEastAsia" w:hAnsiTheme="majorHAnsi" w:cstheme="majorBidi"/>
+      <w:rFonts w:cstheme="majorBidi"/>
       <w:i/>
       <w:iCs/>
       <w:color w:val="243F60" w:themeColor="accent1" w:themeShade="7F"/>
@@ -2102,7 +2547,7 @@
     <w:semiHidden/>
     <w:rsid w:val="00FC693F"/>
     <w:rPr>
-      <w:rFonts w:asciiTheme="majorHAnsi" w:eastAsiaTheme="majorEastAsia" w:hAnsiTheme="majorHAnsi" w:cstheme="majorBidi"/>
+      <w:rFonts w:cstheme="majorBidi"/>
       <w:i/>
       <w:iCs/>
       <w:color w:val="404040" w:themeColor="text1" w:themeTint="BF"/>
@@ -2116,7 +2561,7 @@
     <w:semiHidden/>
     <w:rsid w:val="00FC693F"/>
     <w:rPr>
-      <w:rFonts w:asciiTheme="majorHAnsi" w:eastAsiaTheme="majorEastAsia" w:hAnsiTheme="majorHAnsi" w:cstheme="majorBidi"/>
+      <w:rFonts w:cstheme="majorBidi"/>
       <w:color w:val="4F81BD" w:themeColor="accent1"/>
       <w:sz w:val="20"/>
       <w:szCs w:val="20"/>
@@ -2130,7 +2575,7 @@
     <w:semiHidden/>
     <w:rsid w:val="00FC693F"/>
     <w:rPr>
-      <w:rFonts w:asciiTheme="majorHAnsi" w:eastAsiaTheme="majorEastAsia" w:hAnsiTheme="majorHAnsi" w:cstheme="majorBidi"/>
+      <w:rFonts w:cstheme="majorBidi"/>
       <w:i/>
       <w:iCs/>
       <w:color w:val="404040" w:themeColor="text1" w:themeTint="BF"/>
@@ -3716,7 +4161,7 @@
         <w:spacing w:before="0" w:after="0" w:line="240" w:lineRule="auto"/>
       </w:pPr>
       <w:rPr>
-        <w:rFonts w:asciiTheme="majorHAnsi" w:eastAsiaTheme="majorEastAsia" w:hAnsiTheme="majorHAnsi" w:cstheme="majorBidi"/>
+        <w:rFonts w:cstheme="majorBidi"/>
         <w:b/>
         <w:bCs/>
       </w:rPr>
@@ -3737,7 +4182,7 @@
         <w:spacing w:before="0" w:after="0" w:line="240" w:lineRule="auto"/>
       </w:pPr>
       <w:rPr>
-        <w:rFonts w:asciiTheme="majorHAnsi" w:eastAsiaTheme="majorEastAsia" w:hAnsiTheme="majorHAnsi" w:cstheme="majorBidi"/>
+        <w:rFonts w:cstheme="majorBidi"/>
         <w:b/>
         <w:bCs/>
       </w:rPr>
@@ -3755,14 +4200,14 @@
     </w:tblStylePr>
     <w:tblStylePr w:type="firstCol">
       <w:rPr>
-        <w:rFonts w:asciiTheme="majorHAnsi" w:eastAsiaTheme="majorEastAsia" w:hAnsiTheme="majorHAnsi" w:cstheme="majorBidi"/>
+        <w:rFonts w:cstheme="majorBidi"/>
         <w:b/>
         <w:bCs/>
       </w:rPr>
     </w:tblStylePr>
     <w:tblStylePr w:type="lastCol">
       <w:rPr>
-        <w:rFonts w:asciiTheme="majorHAnsi" w:eastAsiaTheme="majorEastAsia" w:hAnsiTheme="majorHAnsi" w:cstheme="majorBidi"/>
+        <w:rFonts w:cstheme="majorBidi"/>
         <w:b/>
         <w:bCs/>
       </w:rPr>
@@ -3846,7 +4291,7 @@
         <w:spacing w:before="0" w:after="0" w:line="240" w:lineRule="auto"/>
       </w:pPr>
       <w:rPr>
-        <w:rFonts w:asciiTheme="majorHAnsi" w:eastAsiaTheme="majorEastAsia" w:hAnsiTheme="majorHAnsi" w:cstheme="majorBidi"/>
+        <w:rFonts w:cstheme="majorBidi"/>
         <w:b/>
         <w:bCs/>
       </w:rPr>
@@ -3867,7 +4312,7 @@
         <w:spacing w:before="0" w:after="0" w:line="240" w:lineRule="auto"/>
       </w:pPr>
       <w:rPr>
-        <w:rFonts w:asciiTheme="majorHAnsi" w:eastAsiaTheme="majorEastAsia" w:hAnsiTheme="majorHAnsi" w:cstheme="majorBidi"/>
+        <w:rFonts w:cstheme="majorBidi"/>
         <w:b/>
         <w:bCs/>
       </w:rPr>
@@ -3885,14 +4330,14 @@
     </w:tblStylePr>
     <w:tblStylePr w:type="firstCol">
       <w:rPr>
-        <w:rFonts w:asciiTheme="majorHAnsi" w:eastAsiaTheme="majorEastAsia" w:hAnsiTheme="majorHAnsi" w:cstheme="majorBidi"/>
+        <w:rFonts w:cstheme="majorBidi"/>
         <w:b/>
         <w:bCs/>
       </w:rPr>
     </w:tblStylePr>
     <w:tblStylePr w:type="lastCol">
       <w:rPr>
-        <w:rFonts w:asciiTheme="majorHAnsi" w:eastAsiaTheme="majorEastAsia" w:hAnsiTheme="majorHAnsi" w:cstheme="majorBidi"/>
+        <w:rFonts w:cstheme="majorBidi"/>
         <w:b/>
         <w:bCs/>
       </w:rPr>
@@ -3976,7 +4421,7 @@
         <w:spacing w:before="0" w:after="0" w:line="240" w:lineRule="auto"/>
       </w:pPr>
       <w:rPr>
-        <w:rFonts w:asciiTheme="majorHAnsi" w:eastAsiaTheme="majorEastAsia" w:hAnsiTheme="majorHAnsi" w:cstheme="majorBidi"/>
+        <w:rFonts w:cstheme="majorBidi"/>
         <w:b/>
         <w:bCs/>
       </w:rPr>
@@ -3997,7 +4442,7 @@
         <w:spacing w:before="0" w:after="0" w:line="240" w:lineRule="auto"/>
       </w:pPr>
       <w:rPr>
-        <w:rFonts w:asciiTheme="majorHAnsi" w:eastAsiaTheme="majorEastAsia" w:hAnsiTheme="majorHAnsi" w:cstheme="majorBidi"/>
+        <w:rFonts w:cstheme="majorBidi"/>
         <w:b/>
         <w:bCs/>
       </w:rPr>
@@ -4015,14 +4460,14 @@
     </w:tblStylePr>
     <w:tblStylePr w:type="firstCol">
       <w:rPr>
-        <w:rFonts w:asciiTheme="majorHAnsi" w:eastAsiaTheme="majorEastAsia" w:hAnsiTheme="majorHAnsi" w:cstheme="majorBidi"/>
+        <w:rFonts w:cstheme="majorBidi"/>
         <w:b/>
         <w:bCs/>
       </w:rPr>
     </w:tblStylePr>
     <w:tblStylePr w:type="lastCol">
       <w:rPr>
-        <w:rFonts w:asciiTheme="majorHAnsi" w:eastAsiaTheme="majorEastAsia" w:hAnsiTheme="majorHAnsi" w:cstheme="majorBidi"/>
+        <w:rFonts w:cstheme="majorBidi"/>
         <w:b/>
         <w:bCs/>
       </w:rPr>
@@ -4106,7 +4551,7 @@
         <w:spacing w:before="0" w:after="0" w:line="240" w:lineRule="auto"/>
       </w:pPr>
       <w:rPr>
-        <w:rFonts w:asciiTheme="majorHAnsi" w:eastAsiaTheme="majorEastAsia" w:hAnsiTheme="majorHAnsi" w:cstheme="majorBidi"/>
+        <w:rFonts w:cstheme="majorBidi"/>
         <w:b/>
         <w:bCs/>
       </w:rPr>
@@ -4127,7 +4572,7 @@
         <w:spacing w:before="0" w:after="0" w:line="240" w:lineRule="auto"/>
       </w:pPr>
       <w:rPr>
-        <w:rFonts w:asciiTheme="majorHAnsi" w:eastAsiaTheme="majorEastAsia" w:hAnsiTheme="majorHAnsi" w:cstheme="majorBidi"/>
+        <w:rFonts w:cstheme="majorBidi"/>
         <w:b/>
         <w:bCs/>
       </w:rPr>
@@ -4145,14 +4590,14 @@
     </w:tblStylePr>
     <w:tblStylePr w:type="firstCol">
       <w:rPr>
-        <w:rFonts w:asciiTheme="majorHAnsi" w:eastAsiaTheme="majorEastAsia" w:hAnsiTheme="majorHAnsi" w:cstheme="majorBidi"/>
+        <w:rFonts w:cstheme="majorBidi"/>
         <w:b/>
         <w:bCs/>
       </w:rPr>
     </w:tblStylePr>
     <w:tblStylePr w:type="lastCol">
       <w:rPr>
-        <w:rFonts w:asciiTheme="majorHAnsi" w:eastAsiaTheme="majorEastAsia" w:hAnsiTheme="majorHAnsi" w:cstheme="majorBidi"/>
+        <w:rFonts w:cstheme="majorBidi"/>
         <w:b/>
         <w:bCs/>
       </w:rPr>
@@ -4236,7 +4681,7 @@
         <w:spacing w:before="0" w:after="0" w:line="240" w:lineRule="auto"/>
       </w:pPr>
       <w:rPr>
-        <w:rFonts w:asciiTheme="majorHAnsi" w:eastAsiaTheme="majorEastAsia" w:hAnsiTheme="majorHAnsi" w:cstheme="majorBidi"/>
+        <w:rFonts w:cstheme="majorBidi"/>
         <w:b/>
         <w:bCs/>
       </w:rPr>
@@ -4257,7 +4702,7 @@
         <w:spacing w:before="0" w:after="0" w:line="240" w:lineRule="auto"/>
       </w:pPr>
       <w:rPr>
-        <w:rFonts w:asciiTheme="majorHAnsi" w:eastAsiaTheme="majorEastAsia" w:hAnsiTheme="majorHAnsi" w:cstheme="majorBidi"/>
+        <w:rFonts w:cstheme="majorBidi"/>
         <w:b/>
         <w:bCs/>
       </w:rPr>
@@ -4275,14 +4720,14 @@
     </w:tblStylePr>
     <w:tblStylePr w:type="firstCol">
       <w:rPr>
-        <w:rFonts w:asciiTheme="majorHAnsi" w:eastAsiaTheme="majorEastAsia" w:hAnsiTheme="majorHAnsi" w:cstheme="majorBidi"/>
+        <w:rFonts w:cstheme="majorBidi"/>
         <w:b/>
         <w:bCs/>
       </w:rPr>
     </w:tblStylePr>
     <w:tblStylePr w:type="lastCol">
       <w:rPr>
-        <w:rFonts w:asciiTheme="majorHAnsi" w:eastAsiaTheme="majorEastAsia" w:hAnsiTheme="majorHAnsi" w:cstheme="majorBidi"/>
+        <w:rFonts w:cstheme="majorBidi"/>
         <w:b/>
         <w:bCs/>
       </w:rPr>
@@ -4366,7 +4811,7 @@
         <w:spacing w:before="0" w:after="0" w:line="240" w:lineRule="auto"/>
       </w:pPr>
       <w:rPr>
-        <w:rFonts w:asciiTheme="majorHAnsi" w:eastAsiaTheme="majorEastAsia" w:hAnsiTheme="majorHAnsi" w:cstheme="majorBidi"/>
+        <w:rFonts w:cstheme="majorBidi"/>
         <w:b/>
         <w:bCs/>
       </w:rPr>
@@ -4387,7 +4832,7 @@
         <w:spacing w:before="0" w:after="0" w:line="240" w:lineRule="auto"/>
       </w:pPr>
       <w:rPr>
-        <w:rFonts w:asciiTheme="majorHAnsi" w:eastAsiaTheme="majorEastAsia" w:hAnsiTheme="majorHAnsi" w:cstheme="majorBidi"/>
+        <w:rFonts w:cstheme="majorBidi"/>
         <w:b/>
         <w:bCs/>
       </w:rPr>
@@ -4405,14 +4850,14 @@
     </w:tblStylePr>
     <w:tblStylePr w:type="firstCol">
       <w:rPr>
-        <w:rFonts w:asciiTheme="majorHAnsi" w:eastAsiaTheme="majorEastAsia" w:hAnsiTheme="majorHAnsi" w:cstheme="majorBidi"/>
+        <w:rFonts w:cstheme="majorBidi"/>
         <w:b/>
         <w:bCs/>
       </w:rPr>
     </w:tblStylePr>
     <w:tblStylePr w:type="lastCol">
       <w:rPr>
-        <w:rFonts w:asciiTheme="majorHAnsi" w:eastAsiaTheme="majorEastAsia" w:hAnsiTheme="majorHAnsi" w:cstheme="majorBidi"/>
+        <w:rFonts w:cstheme="majorBidi"/>
         <w:b/>
         <w:bCs/>
       </w:rPr>
@@ -4496,7 +4941,7 @@
         <w:spacing w:before="0" w:after="0" w:line="240" w:lineRule="auto"/>
       </w:pPr>
       <w:rPr>
-        <w:rFonts w:asciiTheme="majorHAnsi" w:eastAsiaTheme="majorEastAsia" w:hAnsiTheme="majorHAnsi" w:cstheme="majorBidi"/>
+        <w:rFonts w:cstheme="majorBidi"/>
         <w:b/>
         <w:bCs/>
       </w:rPr>
@@ -4517,7 +4962,7 @@
         <w:spacing w:before="0" w:after="0" w:line="240" w:lineRule="auto"/>
       </w:pPr>
       <w:rPr>
-        <w:rFonts w:asciiTheme="majorHAnsi" w:eastAsiaTheme="majorEastAsia" w:hAnsiTheme="majorHAnsi" w:cstheme="majorBidi"/>
+        <w:rFonts w:cstheme="majorBidi"/>
         <w:b/>
         <w:bCs/>
       </w:rPr>
@@ -4535,14 +4980,14 @@
     </w:tblStylePr>
     <w:tblStylePr w:type="firstCol">
       <w:rPr>
-        <w:rFonts w:asciiTheme="majorHAnsi" w:eastAsiaTheme="majorEastAsia" w:hAnsiTheme="majorHAnsi" w:cstheme="majorBidi"/>
+        <w:rFonts w:cstheme="majorBidi"/>
         <w:b/>
         <w:bCs/>
       </w:rPr>
     </w:tblStylePr>
     <w:tblStylePr w:type="lastCol">
       <w:rPr>
-        <w:rFonts w:asciiTheme="majorHAnsi" w:eastAsiaTheme="majorEastAsia" w:hAnsiTheme="majorHAnsi" w:cstheme="majorBidi"/>
+        <w:rFonts w:cstheme="majorBidi"/>
         <w:b/>
         <w:bCs/>
       </w:rPr>
@@ -6407,7 +6852,7 @@
     </w:tblPr>
     <w:tblStylePr w:type="firstRow">
       <w:rPr>
-        <w:rFonts w:asciiTheme="majorHAnsi" w:eastAsiaTheme="majorEastAsia" w:hAnsiTheme="majorHAnsi" w:cstheme="majorBidi"/>
+        <w:rFonts w:cstheme="majorBidi"/>
       </w:rPr>
       <w:tblPr/>
       <w:tcPr>
@@ -6491,7 +6936,7 @@
     </w:tblPr>
     <w:tblStylePr w:type="firstRow">
       <w:rPr>
-        <w:rFonts w:asciiTheme="majorHAnsi" w:eastAsiaTheme="majorEastAsia" w:hAnsiTheme="majorHAnsi" w:cstheme="majorBidi"/>
+        <w:rFonts w:cstheme="majorBidi"/>
       </w:rPr>
       <w:tblPr/>
       <w:tcPr>
@@ -6575,7 +7020,7 @@
     </w:tblPr>
     <w:tblStylePr w:type="firstRow">
       <w:rPr>
-        <w:rFonts w:asciiTheme="majorHAnsi" w:eastAsiaTheme="majorEastAsia" w:hAnsiTheme="majorHAnsi" w:cstheme="majorBidi"/>
+        <w:rFonts w:cstheme="majorBidi"/>
       </w:rPr>
       <w:tblPr/>
       <w:tcPr>
@@ -6659,7 +7104,7 @@
     </w:tblPr>
     <w:tblStylePr w:type="firstRow">
       <w:rPr>
-        <w:rFonts w:asciiTheme="majorHAnsi" w:eastAsiaTheme="majorEastAsia" w:hAnsiTheme="majorHAnsi" w:cstheme="majorBidi"/>
+        <w:rFonts w:cstheme="majorBidi"/>
       </w:rPr>
       <w:tblPr/>
       <w:tcPr>
@@ -6743,7 +7188,7 @@
     </w:tblPr>
     <w:tblStylePr w:type="firstRow">
       <w:rPr>
-        <w:rFonts w:asciiTheme="majorHAnsi" w:eastAsiaTheme="majorEastAsia" w:hAnsiTheme="majorHAnsi" w:cstheme="majorBidi"/>
+        <w:rFonts w:cstheme="majorBidi"/>
       </w:rPr>
       <w:tblPr/>
       <w:tcPr>
@@ -6827,7 +7272,7 @@
     </w:tblPr>
     <w:tblStylePr w:type="firstRow">
       <w:rPr>
-        <w:rFonts w:asciiTheme="majorHAnsi" w:eastAsiaTheme="majorEastAsia" w:hAnsiTheme="majorHAnsi" w:cstheme="majorBidi"/>
+        <w:rFonts w:cstheme="majorBidi"/>
       </w:rPr>
       <w:tblPr/>
       <w:tcPr>
@@ -6911,7 +7356,7 @@
     </w:tblPr>
     <w:tblStylePr w:type="firstRow">
       <w:rPr>
-        <w:rFonts w:asciiTheme="majorHAnsi" w:eastAsiaTheme="majorEastAsia" w:hAnsiTheme="majorHAnsi" w:cstheme="majorBidi"/>
+        <w:rFonts w:cstheme="majorBidi"/>
       </w:rPr>
       <w:tblPr/>
       <w:tcPr>
@@ -6976,7 +7421,7 @@
       <w:spacing w:after="0" w:line="240" w:lineRule="auto"/>
     </w:pPr>
     <w:rPr>
-      <w:rFonts w:asciiTheme="majorHAnsi" w:eastAsiaTheme="majorEastAsia" w:hAnsiTheme="majorHAnsi" w:cstheme="majorBidi"/>
+      <w:rFonts w:cstheme="majorBidi"/>
       <w:color w:val="000000" w:themeColor="text1"/>
     </w:rPr>
     <w:tblPr>
@@ -7104,7 +7549,7 @@
       <w:spacing w:after="0" w:line="240" w:lineRule="auto"/>
     </w:pPr>
     <w:rPr>
-      <w:rFonts w:asciiTheme="majorHAnsi" w:eastAsiaTheme="majorEastAsia" w:hAnsiTheme="majorHAnsi" w:cstheme="majorBidi"/>
+      <w:rFonts w:cstheme="majorBidi"/>
       <w:color w:val="000000" w:themeColor="text1"/>
     </w:rPr>
     <w:tblPr>
@@ -7232,7 +7677,7 @@
       <w:spacing w:after="0" w:line="240" w:lineRule="auto"/>
     </w:pPr>
     <w:rPr>
-      <w:rFonts w:asciiTheme="majorHAnsi" w:eastAsiaTheme="majorEastAsia" w:hAnsiTheme="majorHAnsi" w:cstheme="majorBidi"/>
+      <w:rFonts w:cstheme="majorBidi"/>
       <w:color w:val="000000" w:themeColor="text1"/>
     </w:rPr>
     <w:tblPr>
@@ -7360,7 +7805,7 @@
       <w:spacing w:after="0" w:line="240" w:lineRule="auto"/>
     </w:pPr>
     <w:rPr>
-      <w:rFonts w:asciiTheme="majorHAnsi" w:eastAsiaTheme="majorEastAsia" w:hAnsiTheme="majorHAnsi" w:cstheme="majorBidi"/>
+      <w:rFonts w:cstheme="majorBidi"/>
       <w:color w:val="000000" w:themeColor="text1"/>
     </w:rPr>
     <w:tblPr>
@@ -7488,7 +7933,7 @@
       <w:spacing w:after="0" w:line="240" w:lineRule="auto"/>
     </w:pPr>
     <w:rPr>
-      <w:rFonts w:asciiTheme="majorHAnsi" w:eastAsiaTheme="majorEastAsia" w:hAnsiTheme="majorHAnsi" w:cstheme="majorBidi"/>
+      <w:rFonts w:cstheme="majorBidi"/>
       <w:color w:val="000000" w:themeColor="text1"/>
     </w:rPr>
     <w:tblPr>
@@ -7616,7 +8061,7 @@
       <w:spacing w:after="0" w:line="240" w:lineRule="auto"/>
     </w:pPr>
     <w:rPr>
-      <w:rFonts w:asciiTheme="majorHAnsi" w:eastAsiaTheme="majorEastAsia" w:hAnsiTheme="majorHAnsi" w:cstheme="majorBidi"/>
+      <w:rFonts w:cstheme="majorBidi"/>
       <w:color w:val="000000" w:themeColor="text1"/>
     </w:rPr>
     <w:tblPr>
@@ -7744,7 +8189,7 @@
       <w:spacing w:after="0" w:line="240" w:lineRule="auto"/>
     </w:pPr>
     <w:rPr>
-      <w:rFonts w:asciiTheme="majorHAnsi" w:eastAsiaTheme="majorEastAsia" w:hAnsiTheme="majorHAnsi" w:cstheme="majorBidi"/>
+      <w:rFonts w:cstheme="majorBidi"/>
       <w:color w:val="000000" w:themeColor="text1"/>
     </w:rPr>
     <w:tblPr>
@@ -8383,7 +8828,7 @@
       <w:spacing w:after="0" w:line="240" w:lineRule="auto"/>
     </w:pPr>
     <w:rPr>
-      <w:rFonts w:asciiTheme="majorHAnsi" w:eastAsiaTheme="majorEastAsia" w:hAnsiTheme="majorHAnsi" w:cstheme="majorBidi"/>
+      <w:rFonts w:cstheme="majorBidi"/>
       <w:color w:val="000000" w:themeColor="text1"/>
     </w:rPr>
     <w:tblPr>
@@ -8508,7 +8953,7 @@
       <w:spacing w:after="0" w:line="240" w:lineRule="auto"/>
     </w:pPr>
     <w:rPr>
-      <w:rFonts w:asciiTheme="majorHAnsi" w:eastAsiaTheme="majorEastAsia" w:hAnsiTheme="majorHAnsi" w:cstheme="majorBidi"/>
+      <w:rFonts w:cstheme="majorBidi"/>
       <w:color w:val="000000" w:themeColor="text1"/>
     </w:rPr>
     <w:tblPr>
@@ -8633,7 +9078,7 @@
       <w:spacing w:after="0" w:line="240" w:lineRule="auto"/>
     </w:pPr>
     <w:rPr>
-      <w:rFonts w:asciiTheme="majorHAnsi" w:eastAsiaTheme="majorEastAsia" w:hAnsiTheme="majorHAnsi" w:cstheme="majorBidi"/>
+      <w:rFonts w:cstheme="majorBidi"/>
       <w:color w:val="000000" w:themeColor="text1"/>
     </w:rPr>
     <w:tblPr>
@@ -8758,7 +9203,7 @@
       <w:spacing w:after="0" w:line="240" w:lineRule="auto"/>
     </w:pPr>
     <w:rPr>
-      <w:rFonts w:asciiTheme="majorHAnsi" w:eastAsiaTheme="majorEastAsia" w:hAnsiTheme="majorHAnsi" w:cstheme="majorBidi"/>
+      <w:rFonts w:cstheme="majorBidi"/>
       <w:color w:val="000000" w:themeColor="text1"/>
     </w:rPr>
     <w:tblPr>
@@ -8883,7 +9328,7 @@
       <w:spacing w:after="0" w:line="240" w:lineRule="auto"/>
     </w:pPr>
     <w:rPr>
-      <w:rFonts w:asciiTheme="majorHAnsi" w:eastAsiaTheme="majorEastAsia" w:hAnsiTheme="majorHAnsi" w:cstheme="majorBidi"/>
+      <w:rFonts w:cstheme="majorBidi"/>
       <w:color w:val="000000" w:themeColor="text1"/>
     </w:rPr>
     <w:tblPr>
@@ -9008,7 +9453,7 @@
       <w:spacing w:after="0" w:line="240" w:lineRule="auto"/>
     </w:pPr>
     <w:rPr>
-      <w:rFonts w:asciiTheme="majorHAnsi" w:eastAsiaTheme="majorEastAsia" w:hAnsiTheme="majorHAnsi" w:cstheme="majorBidi"/>
+      <w:rFonts w:cstheme="majorBidi"/>
       <w:color w:val="000000" w:themeColor="text1"/>
     </w:rPr>
     <w:tblPr>
@@ -9133,7 +9578,7 @@
       <w:spacing w:after="0" w:line="240" w:lineRule="auto"/>
     </w:pPr>
     <w:rPr>
-      <w:rFonts w:asciiTheme="majorHAnsi" w:eastAsiaTheme="majorEastAsia" w:hAnsiTheme="majorHAnsi" w:cstheme="majorBidi"/>
+      <w:rFonts w:cstheme="majorBidi"/>
       <w:color w:val="000000" w:themeColor="text1"/>
     </w:rPr>
     <w:tblPr>

</xml_diff>

<commit_message>
Implement Phase 6 design defaults and reconcile open issues
</commit_message>
<xml_diff>
--- a/docs/templates/docx/business.docx
+++ b/docs/templates/docx/business.docx
@@ -17,7 +17,7 @@
         <w:pStyle w:val="Title"/>
       </w:pPr>
       <w:r>
-        <w:t>Customer onboarding redesign</w:t>
+        <w:t>Customer Onboarding Redesign</w:t>
       </w:r>
     </w:p>
     <w:p>
@@ -32,7 +32,9 @@
       </w:r>
     </w:p>
     <w:p>
-      <w:pPr/>
+      <w:pPr>
+        <w:ind w:right="4154"/>
+      </w:pPr>
       <w:r>
         <w:rPr>
           <w:b w:val="0"/>
@@ -236,6 +238,7 @@
       <w:pPr>
         <w:shd w:fill="EDF2F9"/>
         <w:spacing w:before="120" w:after="160"/>
+        <w:ind w:right="4154"/>
       </w:pPr>
       <w:r>
         <w:rPr>
@@ -261,11 +264,13 @@
         <w:rPr>
           <w:b w:val="0"/>
         </w:rPr>
-        <w:t>What we heard</w:t>
+        <w:t>What We Heard</w:t>
       </w:r>
     </w:p>
     <w:p>
-      <w:pPr/>
+      <w:pPr>
+        <w:ind w:right="4154"/>
+      </w:pPr>
       <w:r>
         <w:rPr>
           <w:b w:val="0"/>
@@ -293,7 +298,7 @@
         <w:rPr>
           <w:b w:val="0"/>
         </w:rPr>
-        <w:t xml:space="preserve"> and delivery</w:t>
+        <w:t xml:space="preserve"> and Delivery</w:t>
       </w:r>
     </w:p>
     <w:tbl>
@@ -659,7 +664,7 @@
         <w:rPr>
           <w:b w:val="0"/>
         </w:rPr>
-        <w:t>How we will work</w:t>
+        <w:t>How We Will Work</w:t>
       </w:r>
     </w:p>
     <w:p>
@@ -742,14 +747,14 @@
         <w:rPr>
           <w:b w:val="0"/>
         </w:rPr>
-        <w:t xml:space="preserve">Outside this </w:t>
+        <w:t xml:space="preserve">Outside This </w:t>
       </w:r>
       <w:r>
         <w:rPr>
           <w:b/>
           <w:color w:val="3C36B5"/>
         </w:rPr>
-        <w:t>scope</w:t>
+        <w:t>Scope</w:t>
       </w:r>
       <w:r>
         <w:rPr>
@@ -758,7 +763,9 @@
       </w:r>
     </w:p>
     <w:p>
-      <w:pPr/>
+      <w:pPr>
+        <w:ind w:right="4154"/>
+      </w:pPr>
       <w:r>
         <w:rPr>
           <w:b w:val="0"/>
@@ -799,7 +806,7 @@
         <w:pStyle w:val="Title"/>
       </w:pPr>
       <w:r>
-        <w:t>Investment and approval</w:t>
+        <w:t>Investment and Approval</w:t>
       </w:r>
     </w:p>
     <w:p>
@@ -1162,11 +1169,13 @@
         <w:rPr>
           <w:b w:val="0"/>
         </w:rPr>
-        <w:t>Payment schedule</w:t>
+        <w:t>Payment Schedule</w:t>
       </w:r>
     </w:p>
     <w:p>
-      <w:pPr/>
+      <w:pPr>
+        <w:ind w:right="4154"/>
+      </w:pPr>
       <w:r>
         <w:rPr>
           <w:b w:val="0"/>
@@ -1195,7 +1204,7 @@
         <w:rPr>
           <w:b w:val="0"/>
         </w:rPr>
-        <w:t>Client responsibilities</w:t>
+        <w:t>Client Responsibilities</w:t>
       </w:r>
     </w:p>
     <w:p>
@@ -1251,11 +1260,13 @@
         <w:rPr>
           <w:b w:val="0"/>
         </w:rPr>
-        <w:t xml:space="preserve"> criteria</w:t>
+        <w:t xml:space="preserve"> Criteria</w:t>
       </w:r>
     </w:p>
     <w:p>
-      <w:pPr/>
+      <w:pPr>
+        <w:ind w:right="4154"/>
+      </w:pPr>
       <w:r>
         <w:rPr>
           <w:b w:val="0"/>
@@ -1316,7 +1327,7 @@
           <w:b/>
           <w:color w:val="3C36B5"/>
         </w:rPr>
-        <w:t>decision</w:t>
+        <w:t>Decision</w:t>
       </w:r>
       <w:r>
         <w:rPr>
@@ -1325,7 +1336,9 @@
       </w:r>
     </w:p>
     <w:p>
-      <w:pPr/>
+      <w:pPr>
+        <w:ind w:right="4154"/>
+      </w:pPr>
       <w:r>
         <w:rPr>
           <w:b w:val="0"/>
@@ -1375,6 +1388,7 @@
     <w:p>
       <w:pPr>
         <w:spacing w:before="140"/>
+        <w:ind w:right="4154"/>
       </w:pPr>
       <w:r>
         <w:rPr>

</xml_diff>

<commit_message>
Rebuild the Dazzler template collection for 0.26.0
</commit_message>
<xml_diff>
--- a/docs/templates/docx/business.docx
+++ b/docs/templates/docx/business.docx
@@ -15,8 +15,12 @@
     <w:p>
       <w:pPr>
         <w:pStyle w:val="Title"/>
+        <w:shd w:fill="3C36B5"/>
       </w:pPr>
       <w:r>
+        <w:rPr>
+          <w:color w:val="FFFFFF"/>
+        </w:rPr>
         <w:t>Customer Onboarding Redesign</w:t>
       </w:r>
     </w:p>
@@ -147,7 +151,7 @@
         <w:tc>
           <w:tcPr>
             <w:tcW w:type="dxa" w:w="3485"/>
-            <w:shd w:fill="F0F2F6"/>
+            <w:shd w:fill="EEECFA"/>
             <w:tcMar>
               <w:top w:w="85" w:type="dxa"/>
               <w:left w:w="85" w:type="dxa"/>
@@ -173,7 +177,7 @@
         <w:tc>
           <w:tcPr>
             <w:tcW w:type="dxa" w:w="3485"/>
-            <w:shd w:fill="F0F2F6"/>
+            <w:shd w:fill="EEECFA"/>
             <w:tcMar>
               <w:top w:w="85" w:type="dxa"/>
               <w:left w:w="85" w:type="dxa"/>
@@ -199,7 +203,7 @@
         <w:tc>
           <w:tcPr>
             <w:tcW w:type="dxa" w:w="3485"/>
-            <w:shd w:fill="F0F2F6"/>
+            <w:shd w:fill="EEECFA"/>
             <w:tcMar>
               <w:top w:w="85" w:type="dxa"/>
               <w:left w:w="85" w:type="dxa"/>
@@ -236,7 +240,7 @@
     </w:p>
     <w:p>
       <w:pPr>
-        <w:shd w:fill="EDF2F9"/>
+        <w:shd w:fill="EEECFA"/>
         <w:spacing w:before="120" w:after="160"/>
         <w:ind w:right="4154"/>
       </w:pPr>
@@ -286,19 +290,7 @@
         <w:rPr>
           <w:b w:val="0"/>
         </w:rPr>
-      </w:r>
-      <w:r>
-        <w:rPr>
-          <w:b/>
-          <w:color w:val="3C36B5"/>
-        </w:rPr>
-        <w:t>Scope</w:t>
-      </w:r>
-      <w:r>
-        <w:rPr>
-          <w:b w:val="0"/>
-        </w:rPr>
-        <w:t xml:space="preserve"> and Delivery</w:t>
+        <w:t>Scope and Delivery</w:t>
       </w:r>
     </w:p>
     <w:tbl>
@@ -403,7 +395,7 @@
         <w:tc>
           <w:tcPr>
             <w:tcW w:type="dxa" w:w="1882"/>
-            <w:shd w:fill="F0F2F6"/>
+            <w:shd w:fill="EEECFA"/>
             <w:tcMar>
               <w:top w:w="85" w:type="dxa"/>
               <w:left w:w="85" w:type="dxa"/>
@@ -429,7 +421,7 @@
         <w:tc>
           <w:tcPr>
             <w:tcW w:type="dxa" w:w="6377"/>
-            <w:shd w:fill="F0F2F6"/>
+            <w:shd w:fill="EEECFA"/>
             <w:tcMar>
               <w:top w:w="85" w:type="dxa"/>
               <w:left w:w="85" w:type="dxa"/>
@@ -455,7 +447,7 @@
         <w:tc>
           <w:tcPr>
             <w:tcW w:type="dxa" w:w="2195"/>
-            <w:shd w:fill="F0F2F6"/>
+            <w:shd w:fill="EEECFA"/>
             <w:tcMar>
               <w:top w:w="85" w:type="dxa"/>
               <w:left w:w="85" w:type="dxa"/>
@@ -569,7 +561,7 @@
         <w:tc>
           <w:tcPr>
             <w:tcW w:type="dxa" w:w="1882"/>
-            <w:shd w:fill="F0F2F6"/>
+            <w:shd w:fill="EEECFA"/>
             <w:tcMar>
               <w:top w:w="85" w:type="dxa"/>
               <w:left w:w="85" w:type="dxa"/>
@@ -595,7 +587,7 @@
         <w:tc>
           <w:tcPr>
             <w:tcW w:type="dxa" w:w="6377"/>
-            <w:shd w:fill="F0F2F6"/>
+            <w:shd w:fill="EEECFA"/>
             <w:tcMar>
               <w:top w:w="85" w:type="dxa"/>
               <w:left w:w="85" w:type="dxa"/>
@@ -621,7 +613,7 @@
         <w:tc>
           <w:tcPr>
             <w:tcW w:type="dxa" w:w="2195"/>
-            <w:shd w:fill="F0F2F6"/>
+            <w:shd w:fill="EEECFA"/>
             <w:tcMar>
               <w:top w:w="85" w:type="dxa"/>
               <w:left w:w="85" w:type="dxa"/>
@@ -675,33 +667,7 @@
         <w:rPr>
           <w:b w:val="0"/>
         </w:rPr>
-        <w:t xml:space="preserve">One 30-minute </w:t>
-      </w:r>
-      <w:r>
-        <w:rPr>
-          <w:b/>
-          <w:color w:val="3C36B5"/>
-        </w:rPr>
-        <w:t>review</w:t>
-      </w:r>
-      <w:r>
-        <w:rPr>
-          <w:b w:val="0"/>
-        </w:rPr>
-        <w:t xml:space="preserve"> each Tuesday, with a named client </w:t>
-      </w:r>
-      <w:r>
-        <w:rPr>
-          <w:b/>
-          <w:color w:val="3C36B5"/>
-        </w:rPr>
-        <w:t>decision</w:t>
-      </w:r>
-      <w:r>
-        <w:rPr>
-          <w:b w:val="0"/>
-        </w:rPr>
-        <w:t>-maker.</w:t>
+        <w:t>One 30-minute review each Tuesday, with a named client decision-maker.</w:t>
       </w:r>
     </w:p>
     <w:p>
@@ -723,20 +689,7 @@
         <w:rPr>
           <w:b w:val="0"/>
         </w:rPr>
-        <w:t xml:space="preserve">Shared </w:t>
-      </w:r>
-      <w:r>
-        <w:rPr>
-          <w:b/>
-          <w:color w:val="3C36B5"/>
-        </w:rPr>
-        <w:t>decision</w:t>
-      </w:r>
-      <w:r>
-        <w:rPr>
-          <w:b w:val="0"/>
-        </w:rPr>
-        <w:t xml:space="preserve"> log and weekly written delivery update.</w:t>
+        <w:t>Shared decision log and weekly written delivery update.</w:t>
       </w:r>
     </w:p>
     <w:p>
@@ -747,19 +700,7 @@
         <w:rPr>
           <w:b w:val="0"/>
         </w:rPr>
-        <w:t xml:space="preserve">Outside This </w:t>
-      </w:r>
-      <w:r>
-        <w:rPr>
-          <w:b/>
-          <w:color w:val="3C36B5"/>
-        </w:rPr>
-        <w:t>Scope</w:t>
-      </w:r>
-      <w:r>
-        <w:rPr>
-          <w:b w:val="0"/>
-        </w:rPr>
+        <w:t>Outside This Scope</w:t>
       </w:r>
     </w:p>
     <w:p>
@@ -770,20 +711,7 @@
         <w:rPr>
           <w:b w:val="0"/>
         </w:rPr>
-        <w:t xml:space="preserve">Production code, system migration, translation and new brand identity work are excluded. Any added </w:t>
-      </w:r>
-      <w:r>
-        <w:rPr>
-          <w:b/>
-          <w:color w:val="3C36B5"/>
-        </w:rPr>
-        <w:t>scope</w:t>
-      </w:r>
-      <w:r>
-        <w:rPr>
-          <w:b w:val="0"/>
-        </w:rPr>
-        <w:t xml:space="preserve"> requires a written change agreement.</w:t>
+        <w:t>Production code, system migration, translation and new brand identity work are excluded. Any added scope requires a written change agreement.</w:t>
       </w:r>
     </w:p>
     <w:p>
@@ -804,8 +732,12 @@
     <w:p>
       <w:pPr>
         <w:pStyle w:val="Title"/>
+        <w:shd w:fill="3C36B5"/>
       </w:pPr>
       <w:r>
+        <w:rPr>
+          <w:color w:val="FFFFFF"/>
+        </w:rPr>
         <w:t>Investment and Approval</w:t>
       </w:r>
     </w:p>
@@ -815,7 +747,7 @@
         <w:keepNext/>
       </w:pPr>
       <w:r>
-        <w:t>Payment follows delivery</w:t>
+        <w:t>Payment Follows Delivery</w:t>
       </w:r>
     </w:p>
     <w:p>
@@ -929,7 +861,7 @@
         <w:tc>
           <w:tcPr>
             <w:tcW w:type="dxa" w:w="7527"/>
-            <w:shd w:fill="F0F2F6"/>
+            <w:shd w:fill="EEECFA"/>
             <w:tcMar>
               <w:top w:w="85" w:type="dxa"/>
               <w:left w:w="85" w:type="dxa"/>
@@ -955,7 +887,7 @@
         <w:tc>
           <w:tcPr>
             <w:tcW w:type="dxa" w:w="2927"/>
-            <w:shd w:fill="F0F2F6"/>
+            <w:shd w:fill="EEECFA"/>
             <w:tcMar>
               <w:top w:w="85" w:type="dxa"/>
               <w:left w:w="85" w:type="dxa"/>
@@ -1043,7 +975,7 @@
         <w:tc>
           <w:tcPr>
             <w:tcW w:type="dxa" w:w="7527"/>
-            <w:shd w:fill="F0F2F6"/>
+            <w:shd w:fill="EEECFA"/>
             <w:tcMar>
               <w:top w:w="85" w:type="dxa"/>
               <w:left w:w="85" w:type="dxa"/>
@@ -1069,7 +1001,7 @@
         <w:tc>
           <w:tcPr>
             <w:tcW w:type="dxa" w:w="2927"/>
-            <w:shd w:fill="F0F2F6"/>
+            <w:shd w:fill="EEECFA"/>
             <w:tcMar>
               <w:top w:w="85" w:type="dxa"/>
               <w:left w:w="85" w:type="dxa"/>
@@ -1180,20 +1112,7 @@
         <w:rPr>
           <w:b w:val="0"/>
         </w:rPr>
-        <w:t xml:space="preserve">40% at kickoff ($4,800), 40% at prototype </w:t>
-      </w:r>
-      <w:r>
-        <w:rPr>
-          <w:b/>
-          <w:color w:val="3C36B5"/>
-        </w:rPr>
-        <w:t>review</w:t>
-      </w:r>
-      <w:r>
-        <w:rPr>
-          <w:b w:val="0"/>
-        </w:rPr>
-        <w:t xml:space="preserve"> ($4,800), and 20% at handover ($2,400). This illustrative price excludes applicable taxes and third-party expenses.</w:t>
+        <w:t>40% at kickoff ($4,800), 40% at prototype review ($4,800), and 20% at handover ($2,400). This illustrative price excludes applicable taxes and third-party expenses.</w:t>
       </w:r>
     </w:p>
     <w:p>
@@ -1254,80 +1173,7 @@
           <w:b/>
           <w:color w:val="3C36B5"/>
         </w:rPr>
-        <w:t>Acceptance</w:t>
-      </w:r>
-      <w:r>
-        <w:rPr>
-          <w:b w:val="0"/>
-        </w:rPr>
-        <w:t xml:space="preserve"> Criteria</w:t>
-      </w:r>
-    </w:p>
-    <w:p>
-      <w:pPr>
-        <w:ind w:right="4154"/>
-      </w:pPr>
-      <w:r>
-        <w:rPr>
-          <w:b w:val="0"/>
-        </w:rPr>
-      </w:r>
-      <w:r>
-        <w:rPr>
-          <w:b/>
-          <w:color w:val="3C36B5"/>
-        </w:rPr>
-        <w:t>Acceptance</w:t>
-      </w:r>
-      <w:r>
-        <w:rPr>
-          <w:b w:val="0"/>
-        </w:rPr>
-        <w:t xml:space="preserve"> covers six annotated screens, the welcome email outline, a working prototype and two team sessions. The lead records </w:t>
-      </w:r>
-      <w:r>
-        <w:rPr>
-          <w:b/>
-          <w:color w:val="3C36B5"/>
-        </w:rPr>
-        <w:t>acceptance</w:t>
-      </w:r>
-      <w:r>
-        <w:rPr>
-          <w:b w:val="0"/>
-        </w:rPr>
-        <w:t xml:space="preserve"> or specific </w:t>
-      </w:r>
-      <w:r>
-        <w:rPr>
-          <w:b/>
-          <w:color w:val="3C36B5"/>
-        </w:rPr>
-        <w:t>scope</w:t>
-      </w:r>
-      <w:r>
-        <w:rPr>
-          <w:b w:val="0"/>
-        </w:rPr>
-        <w:t>-related corrections.</w:t>
-      </w:r>
-    </w:p>
-    <w:p>
-      <w:pPr>
-        <w:pStyle w:val="Heading1"/>
-      </w:pPr>
-      <w:r>
-        <w:rPr>
-          <w:b w:val="0"/>
-        </w:rPr>
-        <w:t xml:space="preserve">The </w:t>
-      </w:r>
-      <w:r>
-        <w:rPr>
-          <w:b/>
-          <w:color w:val="3C36B5"/>
-        </w:rPr>
-        <w:t>Decision</w:t>
+        <w:t>Acceptance Criteria</w:t>
       </w:r>
       <w:r>
         <w:rPr>
@@ -1343,46 +1189,29 @@
         <w:rPr>
           <w:b w:val="0"/>
         </w:rPr>
-        <w:t xml:space="preserve">Alder Studio sponsor Priya Shah and Northstar lead Maya Chen </w:t>
+        <w:t>Acceptance covers six annotated screens, the welcome email outline, a working prototype and two team sessions. The lead records acceptance or specific scope-related corrections.</w:t>
       </w:r>
-      <w:r>
-        <w:rPr>
-          <w:b/>
-          <w:color w:val="3C36B5"/>
-        </w:rPr>
-        <w:t>review</w:t>
-      </w:r>
+    </w:p>
+    <w:p>
+      <w:pPr>
+        <w:pStyle w:val="Heading1"/>
+      </w:pPr>
       <w:r>
         <w:rPr>
           <w:b w:val="0"/>
         </w:rPr>
-        <w:t xml:space="preserve"> </w:t>
+        <w:t>The Decision</w:t>
       </w:r>
-      <w:r>
-        <w:rPr>
-          <w:b/>
-          <w:color w:val="3C36B5"/>
-        </w:rPr>
-        <w:t>scope</w:t>
-      </w:r>
+    </w:p>
+    <w:p>
+      <w:pPr>
+        <w:ind w:right="4154"/>
+      </w:pPr>
       <w:r>
         <w:rPr>
           <w:b w:val="0"/>
         </w:rPr>
-        <w:t xml:space="preserve"> on 25 June. Proposed kickoff: 5 July. </w:t>
-      </w:r>
-      <w:r>
-        <w:rPr>
-          <w:b/>
-          <w:color w:val="3C36B5"/>
-        </w:rPr>
-        <w:t>Acceptance</w:t>
-      </w:r>
-      <w:r>
-        <w:rPr>
-          <w:b w:val="0"/>
-        </w:rPr>
-        <w:t xml:space="preserve"> is a recorded review of the agreed deliverables, not an automatic consequence of payment.</w:t>
+        <w:t>Alder Studio sponsor Priya Shah and Northstar lead Maya Chen review scope on 25 June. Proposed kickoff: 5 July. Acceptance is a recorded review of the agreed deliverables, not an automatic consequence of payment.</w:t>
       </w:r>
     </w:p>
     <w:p>
@@ -1421,21 +1250,7 @@
         <w:b w:val="0"/>
         <w:sz w:val="16"/>
       </w:rPr>
-    </w:r>
-    <w:r>
-      <w:rPr>
-        <w:b/>
-        <w:color w:val="3C36B5"/>
-        <w:sz w:val="16"/>
-      </w:rPr>
-      <w:t>FICTIONAL</w:t>
-    </w:r>
-    <w:r>
-      <w:rPr>
-        <w:b w:val="0"/>
-        <w:sz w:val="16"/>
-      </w:rPr>
-      <w:t xml:space="preserve"> EXAMPLE  /  BUSINESS   •   Dazzler   /   </w:t>
+      <w:t xml:space="preserve">FICTIONAL EXAMPLE  /  BUSINESS   •   Dazzler   /   </w:t>
     </w:r>
     <w:fldSimple w:instr="PAGE"/>
   </w:p>

</xml_diff>

<commit_message>
Release 0.27.0 with design-led templates and verified gallery
</commit_message>
<xml_diff>
--- a/docs/templates/docx/business.docx
+++ b/docs/templates/docx/business.docx
@@ -3,49 +3,221 @@
 <w:document xmlns:wpc="http://schemas.microsoft.com/office/word/2010/wordprocessingCanvas" xmlns:mo="http://schemas.microsoft.com/office/mac/office/2008/main" xmlns:mc="http://schemas.openxmlformats.org/markup-compatibility/2006" xmlns:mv="urn:schemas-microsoft-com:mac:vml" xmlns:o="urn:schemas-microsoft-com:office:office" xmlns:r="http://schemas.openxmlformats.org/officeDocument/2006/relationships" xmlns:m="http://schemas.openxmlformats.org/officeDocument/2006/math" xmlns:v="urn:schemas-microsoft-com:vml" xmlns:wp14="http://schemas.microsoft.com/office/word/2010/wordprocessingDrawing" xmlns:wp="http://schemas.openxmlformats.org/drawingml/2006/wordprocessingDrawing" xmlns:w10="urn:schemas-microsoft-com:office:word" xmlns:w="http://schemas.openxmlformats.org/wordprocessingml/2006/main" xmlns:w14="http://schemas.microsoft.com/office/word/2010/wordml" xmlns:wpg="http://schemas.microsoft.com/office/word/2010/wordprocessingGroup" xmlns:wpi="http://schemas.microsoft.com/office/word/2010/wordprocessingInk" xmlns:wne="http://schemas.microsoft.com/office/word/2006/wordml" xmlns:wps="http://schemas.microsoft.com/office/word/2010/wordprocessingShape" mc:Ignorable="w14 wp14">
   <w:body>
     <w:p>
+      <w:pPr>
+        <w:spacing w:after="280" w:line="269" w:lineRule="auto"/>
+      </w:pPr>
       <w:r>
         <w:rPr>
+          <w:rFonts w:ascii="Arial" w:hAnsi="Arial"/>
           <w:b/>
-          <w:color w:val="3C36B5"/>
-          <w:sz w:val="16"/>
+          <w:i w:val="0"/>
+          <w:color w:val="145A45"/>
+          <w:sz w:val="18"/>
         </w:rPr>
-        <w:t>NORTHSTAR DESIGN • PROPOSAL 027   /   01</w:t>
+        <w:t>JUNIPER / SCOPE 014</w:t>
       </w:r>
     </w:p>
     <w:p>
       <w:pPr>
         <w:pStyle w:val="Title"/>
-        <w:shd w:fill="3C36B5"/>
+        <w:spacing w:after="160" w:line="269" w:lineRule="auto"/>
       </w:pPr>
       <w:r>
         <w:rPr>
-          <w:color w:val="FFFFFF"/>
+          <w:rFonts w:ascii="Georgia" w:hAnsi="Georgia"/>
+          <w:b/>
+          <w:i w:val="0"/>
+          <w:color w:val="145A45"/>
+          <w:sz w:val="68"/>
         </w:rPr>
-        <w:t>Customer Onboarding Redesign</w:t>
+        <w:t>Juniper Studio Service Proposal</w:t>
       </w:r>
     </w:p>
     <w:p>
       <w:pPr>
-        <w:pStyle w:val="Subtitle"/>
+        <w:spacing w:after="280" w:line="269" w:lineRule="auto"/>
       </w:pPr>
       <w:r>
         <w:rPr>
-          <w:i/>
+          <w:rFonts w:ascii="Georgia" w:hAnsi="Georgia"/>
+          <w:b w:val="0"/>
+          <w:i w:val="0"/>
+          <w:color w:val="17252B"/>
+          <w:sz w:val="26"/>
         </w:rPr>
-        <w:t>Proposal for Alder Studio</w:t>
+        <w:t>Replace the fragmented booking journey with one accessible flow, delivered in three reviewable stages.</w:t>
+      </w:r>
+    </w:p>
+    <w:tbl>
+      <w:tblPr>
+        <w:tblW w:type="auto" w:w="0"/>
+        <w:tblLook w:firstColumn="1" w:firstRow="1" w:lastColumn="0" w:lastRow="0" w:noHBand="0" w:noVBand="1" w:val="04A0"/>
+      </w:tblPr>
+      <w:tblGrid>
+        <w:gridCol w:w="3024"/>
+        <w:gridCol w:w="6984"/>
+      </w:tblGrid>
+      <w:tr>
+        <w:tc>
+          <w:tcPr>
+            <w:tcW w:type="dxa" w:w="6984"/>
+            <w:shd w:fill="145A45"/>
+          </w:tcPr>
+          <w:p>
+            <w:pPr>
+              <w:spacing w:after="160" w:line="269" w:lineRule="auto"/>
+            </w:pPr>
+            <w:r>
+              <w:rPr>
+                <w:rFonts w:ascii="Georgia" w:hAnsi="Georgia"/>
+                <w:b/>
+                <w:color w:val="FFFFFF"/>
+                <w:sz w:val="64"/>
+              </w:rPr>
+              <w:t>$24,000</w:t>
+            </w:r>
+          </w:p>
+          <w:p>
+            <w:pPr>
+              <w:spacing w:after="160" w:line="269" w:lineRule="auto"/>
+            </w:pPr>
+            <w:r>
+              <w:rPr>
+                <w:rFonts w:ascii="Arial" w:hAnsi="Arial"/>
+                <w:b w:val="0"/>
+                <w:color w:val="FFFFFF"/>
+                <w:sz w:val="20"/>
+              </w:rPr>
+              <w:t>fixed fee for the defined scope</w:t>
+            </w:r>
+          </w:p>
+        </w:tc>
+        <w:tc>
+          <w:tcPr>
+            <w:tcW w:type="dxa" w:w="6984"/>
+          </w:tcPr>
+          <w:p>
+            <w:pPr>
+              <w:spacing w:after="160" w:line="269" w:lineRule="auto"/>
+            </w:pPr>
+            <w:r>
+              <w:rPr>
+                <w:rFonts w:ascii="Arial" w:hAnsi="Arial"/>
+                <w:b w:val="0"/>
+                <w:color w:val="17252B"/>
+                <w:sz w:val="22"/>
+              </w:rPr>
+              <w:t>The fictional engagement covers research synthesis, interaction design and a tested frontend prototype for a neighborhood arts venue. Production integration is a separate engagement.</w:t>
+            </w:r>
+          </w:p>
+        </w:tc>
+      </w:tr>
+    </w:tbl>
+    <w:p>
+      <w:pPr>
+        <w:spacing w:after="40" w:line="269" w:lineRule="auto"/>
+      </w:pPr>
+      <w:r>
+        <w:rPr>
+          <w:rFonts w:ascii="Arial" w:hAnsi="Arial"/>
+          <w:b w:val="0"/>
+          <w:i w:val="0"/>
+          <w:color w:val="17252B"/>
+          <w:sz w:val="6"/>
+        </w:rPr>
       </w:r>
     </w:p>
     <w:p>
       <w:pPr>
-        <w:ind w:right="4154"/>
+        <w:pStyle w:val="Heading1"/>
+        <w:spacing w:after="80" w:line="269" w:lineRule="auto"/>
       </w:pPr>
       <w:r>
         <w:rPr>
+          <w:rFonts w:ascii="Georgia" w:hAnsi="Georgia"/>
+          <w:b/>
+          <w:i w:val="0"/>
+          <w:color w:val="145A45"/>
+          <w:sz w:val="26"/>
+        </w:rPr>
+        <w:t>Included</w:t>
+      </w:r>
+    </w:p>
+    <w:p>
+      <w:pPr>
+        <w:spacing w:after="100" w:line="269" w:lineRule="auto"/>
+      </w:pPr>
+      <w:r>
+        <w:rPr>
+          <w:rFonts w:ascii="Arial" w:hAnsi="Arial"/>
           <w:b w:val="0"/>
+          <w:i w:val="0"/>
+          <w:color w:val="17252B"/>
+          <w:sz w:val="21"/>
         </w:rPr>
-        <w:t>Prepared for Alder Studio     •     Prepared by Northstar Design</w:t>
-        <w:br/>
-        <w:t>Issued 18 June 2027     •     Proposal valid through 2 July 2027</w:t>
+        <w:t>Two stakeholder workshops, six core screens, responsive specifications, accessible component states and a documented prototype handoff.</w:t>
+      </w:r>
+    </w:p>
+    <w:p>
+      <w:pPr>
+        <w:pStyle w:val="Heading1"/>
+        <w:spacing w:after="80" w:line="269" w:lineRule="auto"/>
+      </w:pPr>
+      <w:r>
+        <w:rPr>
+          <w:rFonts w:ascii="Georgia" w:hAnsi="Georgia"/>
+          <w:b/>
+          <w:i w:val="0"/>
+          <w:color w:val="145A45"/>
+          <w:sz w:val="26"/>
+        </w:rPr>
+        <w:t>Working Together</w:t>
+      </w:r>
+    </w:p>
+    <w:p>
+      <w:pPr>
+        <w:spacing w:after="100" w:line="269" w:lineRule="auto"/>
+      </w:pPr>
+      <w:r>
+        <w:rPr>
+          <w:rFonts w:ascii="Arial" w:hAnsi="Arial"/>
+          <w:b w:val="0"/>
+          <w:i w:val="0"/>
+          <w:color w:val="17252B"/>
+          <w:sz w:val="21"/>
+        </w:rPr>
+        <w:t>One named decision owner consolidates feedback within three working days. Each stage ends with a review, not an implied approval.</w:t>
+      </w:r>
+    </w:p>
+    <w:p>
+      <w:pPr>
+        <w:pStyle w:val="Heading1"/>
+        <w:spacing w:after="80" w:line="269" w:lineRule="auto"/>
+      </w:pPr>
+      <w:r>
+        <w:rPr>
+          <w:rFonts w:ascii="Georgia" w:hAnsi="Georgia"/>
+          <w:b/>
+          <w:i w:val="0"/>
+          <w:color w:val="145A45"/>
+          <w:sz w:val="26"/>
+        </w:rPr>
+        <w:t>Commercial Terms</w:t>
+      </w:r>
+    </w:p>
+    <w:p>
+      <w:pPr>
+        <w:spacing w:after="100" w:line="269" w:lineRule="auto"/>
+      </w:pPr>
+      <w:r>
+        <w:rPr>
+          <w:rFonts w:ascii="Arial" w:hAnsi="Arial"/>
+          <w:b w:val="0"/>
+          <w:i w:val="0"/>
+          <w:color w:val="17252B"/>
+          <w:sz w:val="21"/>
+        </w:rPr>
+        <w:t>Invoices follow the milestones below. The estimate excludes taxes, third-party subscriptions, production hosting and changes outside the agreed six screens.</w:t>
       </w:r>
     </w:p>
     <w:tbl>
@@ -53,11 +225,17 @@
         <w:tblW w:type="auto" w:w="0"/>
         <w:tblLayout w:type="fixed"/>
         <w:tblLook w:firstColumn="1" w:firstRow="1" w:lastColumn="0" w:lastRow="0" w:noHBand="0" w:noVBand="1" w:val="04A0"/>
+        <w:tblCellMar>
+          <w:top w:w="90" w:type="dxa"/>
+          <w:left w:w="90" w:type="dxa"/>
+          <w:bottom w:w="90" w:type="dxa"/>
+          <w:right w:w="90" w:type="dxa"/>
+        </w:tblCellMar>
       </w:tblPr>
       <w:tblGrid>
-        <w:gridCol w:w="3485"/>
-        <w:gridCol w:w="3485"/>
-        <w:gridCol w:w="3485"/>
+        <w:gridCol w:w="3492"/>
+        <w:gridCol w:w="5587"/>
+        <w:gridCol w:w="4889"/>
       </w:tblGrid>
       <w:tr>
         <w:trPr>
@@ -66,80 +244,61 @@
         </w:trPr>
         <w:tc>
           <w:tcPr>
-            <w:tcW w:type="dxa" w:w="3485"/>
-            <w:shd w:fill="3C36B5"/>
-            <w:tcMar>
-              <w:top w:w="85" w:type="dxa"/>
-              <w:left w:w="85" w:type="dxa"/>
-              <w:bottom w:w="85" w:type="dxa"/>
-              <w:right w:w="85" w:type="dxa"/>
-            </w:tcMar>
+            <w:tcW w:type="dxa" w:w="4656"/>
+            <w:shd w:fill="145A45"/>
           </w:tcPr>
           <w:p>
             <w:pPr>
-              <w:spacing w:after="0"/>
+              <w:spacing w:after="160" w:line="269" w:lineRule="auto"/>
             </w:pPr>
             <w:r>
               <w:rPr>
                 <w:rFonts w:ascii="Arial" w:hAnsi="Arial"/>
                 <w:b/>
                 <w:color w:val="FFFFFF"/>
-                <w:sz w:val="58"/>
+                <w:sz w:val="20"/>
               </w:rPr>
-              <w:t>4 weeks</w:t>
+              <w:t>Stage</w:t>
             </w:r>
           </w:p>
         </w:tc>
         <w:tc>
           <w:tcPr>
-            <w:tcW w:type="dxa" w:w="3485"/>
-            <w:shd w:fill="3C36B5"/>
-            <w:tcMar>
-              <w:top w:w="85" w:type="dxa"/>
-              <w:left w:w="85" w:type="dxa"/>
-              <w:bottom w:w="85" w:type="dxa"/>
-              <w:right w:w="85" w:type="dxa"/>
-            </w:tcMar>
-            <w:shd w:fill="AA352B"/>
+            <w:tcW w:type="dxa" w:w="4656"/>
+            <w:shd w:fill="145A45"/>
           </w:tcPr>
           <w:p>
             <w:pPr>
-              <w:spacing w:after="0"/>
+              <w:spacing w:after="160" w:line="269" w:lineRule="auto"/>
             </w:pPr>
             <w:r>
               <w:rPr>
                 <w:rFonts w:ascii="Arial" w:hAnsi="Arial"/>
                 <w:b/>
                 <w:color w:val="FFFFFF"/>
-                <w:sz w:val="58"/>
+                <w:sz w:val="20"/>
               </w:rPr>
-              <w:t>6 screens</w:t>
+              <w:t>Deliverable</w:t>
             </w:r>
           </w:p>
         </w:tc>
         <w:tc>
           <w:tcPr>
-            <w:tcW w:type="dxa" w:w="3485"/>
-            <w:shd w:fill="3C36B5"/>
-            <w:tcMar>
-              <w:top w:w="85" w:type="dxa"/>
-              <w:left w:w="85" w:type="dxa"/>
-              <w:bottom w:w="85" w:type="dxa"/>
-              <w:right w:w="85" w:type="dxa"/>
-            </w:tcMar>
+            <w:tcW w:type="dxa" w:w="4656"/>
+            <w:shd w:fill="145A45"/>
           </w:tcPr>
           <w:p>
             <w:pPr>
-              <w:spacing w:after="0"/>
+              <w:spacing w:after="160" w:line="269" w:lineRule="auto"/>
             </w:pPr>
             <w:r>
               <w:rPr>
                 <w:rFonts w:ascii="Arial" w:hAnsi="Arial"/>
                 <w:b/>
                 <w:color w:val="FFFFFF"/>
-                <w:sz w:val="58"/>
+                <w:sz w:val="20"/>
               </w:rPr>
-              <w:t>$12,000</w:t>
+              <w:t>Fee</w:t>
             </w:r>
           </w:p>
         </w:tc>
@@ -150,240 +309,61 @@
         </w:trPr>
         <w:tc>
           <w:tcPr>
-            <w:tcW w:type="dxa" w:w="3485"/>
-            <w:shd w:fill="EEECFA"/>
-            <w:tcMar>
-              <w:top w:w="85" w:type="dxa"/>
-              <w:left w:w="85" w:type="dxa"/>
-              <w:bottom w:w="85" w:type="dxa"/>
-              <w:right w:w="85" w:type="dxa"/>
-            </w:tcMar>
+            <w:tcW w:type="dxa" w:w="3492"/>
+            <w:shd w:fill="F1F6E9"/>
           </w:tcPr>
           <w:p>
             <w:pPr>
-              <w:spacing w:after="0"/>
+              <w:spacing w:after="160" w:line="269" w:lineRule="auto"/>
+            </w:pPr>
+            <w:r>
+              <w:rPr>
+                <w:rFonts w:ascii="Arial" w:hAnsi="Arial"/>
+                <w:b/>
+                <w:color w:val="17252B"/>
+                <w:sz w:val="20"/>
+              </w:rPr>
+              <w:t>01 Discover</w:t>
+            </w:r>
+          </w:p>
+        </w:tc>
+        <w:tc>
+          <w:tcPr>
+            <w:tcW w:type="dxa" w:w="5587"/>
+            <w:shd w:fill="F1F6E9"/>
+          </w:tcPr>
+          <w:p>
+            <w:pPr>
+              <w:spacing w:after="160" w:line="269" w:lineRule="auto"/>
             </w:pPr>
             <w:r>
               <w:rPr>
                 <w:rFonts w:ascii="Arial" w:hAnsi="Arial"/>
                 <w:b w:val="0"/>
-                <w:color w:val="172033"/>
-                <w:sz w:val="18"/>
+                <w:color w:val="17252B"/>
+                <w:sz w:val="20"/>
               </w:rPr>
-              <w:t>engagement</w:t>
+              <w:t>Journey and success measures</w:t>
             </w:r>
           </w:p>
         </w:tc>
         <w:tc>
           <w:tcPr>
-            <w:tcW w:type="dxa" w:w="3485"/>
-            <w:shd w:fill="EEECFA"/>
-            <w:tcMar>
-              <w:top w:w="85" w:type="dxa"/>
-              <w:left w:w="85" w:type="dxa"/>
-              <w:bottom w:w="85" w:type="dxa"/>
-              <w:right w:w="85" w:type="dxa"/>
-            </w:tcMar>
+            <w:tcW w:type="dxa" w:w="4889"/>
+            <w:shd w:fill="F1F6E9"/>
           </w:tcPr>
           <w:p>
             <w:pPr>
-              <w:spacing w:after="0"/>
+              <w:spacing w:after="160" w:line="269" w:lineRule="auto"/>
             </w:pPr>
             <w:r>
               <w:rPr>
                 <w:rFonts w:ascii="Arial" w:hAnsi="Arial"/>
                 <w:b w:val="0"/>
-                <w:color w:val="172033"/>
-                <w:sz w:val="18"/>
+                <w:color w:val="17252B"/>
+                <w:sz w:val="20"/>
               </w:rPr>
-              <w:t>annotated prototype</w:t>
-            </w:r>
-          </w:p>
-        </w:tc>
-        <w:tc>
-          <w:tcPr>
-            <w:tcW w:type="dxa" w:w="3485"/>
-            <w:shd w:fill="EEECFA"/>
-            <w:tcMar>
-              <w:top w:w="85" w:type="dxa"/>
-              <w:left w:w="85" w:type="dxa"/>
-              <w:bottom w:w="85" w:type="dxa"/>
-              <w:right w:w="85" w:type="dxa"/>
-            </w:tcMar>
-          </w:tcPr>
-          <w:p>
-            <w:pPr>
-              <w:spacing w:after="0"/>
-            </w:pPr>
-            <w:r>
-              <w:rPr>
-                <w:rFonts w:ascii="Arial" w:hAnsi="Arial"/>
-                <w:b w:val="0"/>
-                <w:color w:val="172033"/>
-                <w:sz w:val="18"/>
-              </w:rPr>
-              <w:t>fixed sample fee</w:t>
-            </w:r>
-          </w:p>
-        </w:tc>
-      </w:tr>
-    </w:tbl>
-    <w:p>
-      <w:pPr>
-        <w:spacing w:after="0" w:before="0" w:line="60" w:lineRule="exact"/>
-      </w:pPr>
-      <w:r>
-        <w:rPr>
-          <w:sz w:val="6"/>
-        </w:rPr>
-      </w:r>
-    </w:p>
-    <w:p>
-      <w:pPr>
-        <w:shd w:fill="EEECFA"/>
-        <w:spacing w:before="120" w:after="160"/>
-        <w:ind w:right="4154"/>
-      </w:pPr>
-      <w:r>
-        <w:rPr>
-          <w:b/>
-          <w:color w:val="3C36B5"/>
-          <w:sz w:val="18"/>
-        </w:rPr>
-        <w:t>THE OUTCOME</w:t>
-        <w:br/>
-      </w:r>
-      <w:r>
-        <w:rPr>
-          <w:b w:val="0"/>
-        </w:rPr>
-        <w:t>A clearer first-week experience: one welcome journey, one account checklist and fewer handoffs between sales and customer success.</w:t>
-      </w:r>
-    </w:p>
-    <w:p>
-      <w:pPr>
-        <w:pStyle w:val="Heading1"/>
-      </w:pPr>
-      <w:r>
-        <w:rPr>
-          <w:b w:val="0"/>
-        </w:rPr>
-        <w:t>What We Heard</w:t>
-      </w:r>
-    </w:p>
-    <w:p>
-      <w:pPr>
-        <w:ind w:right="4154"/>
-      </w:pPr>
-      <w:r>
-        <w:rPr>
-          <w:b w:val="0"/>
-        </w:rPr>
-        <w:t>New customers receive setup instructions in three separate emails. The proposed work consolidates those steps, clarifies ownership and gives the service team a reusable launch checklist.</w:t>
-      </w:r>
-    </w:p>
-    <w:p>
-      <w:pPr>
-        <w:pStyle w:val="Heading1"/>
-      </w:pPr>
-      <w:r>
-        <w:rPr>
-          <w:b w:val="0"/>
-        </w:rPr>
-        <w:t>Scope and Delivery</w:t>
-      </w:r>
-    </w:p>
-    <w:tbl>
-      <w:tblPr>
-        <w:tblW w:type="auto" w:w="0"/>
-        <w:tblLayout w:type="fixed"/>
-        <w:tblLook w:firstColumn="1" w:firstRow="1" w:lastColumn="0" w:lastRow="0" w:noHBand="0" w:noVBand="1" w:val="04A0"/>
-      </w:tblPr>
-      <w:tblGrid>
-        <w:gridCol w:w="1882"/>
-        <w:gridCol w:w="6377"/>
-        <w:gridCol w:w="2195"/>
-      </w:tblGrid>
-      <w:tr>
-        <w:trPr>
-          <w:cantSplit/>
-          <w:tblHeader/>
-        </w:trPr>
-        <w:tc>
-          <w:tcPr>
-            <w:tcW w:type="dxa" w:w="1882"/>
-            <w:shd w:fill="3C36B5"/>
-            <w:tcMar>
-              <w:top w:w="85" w:type="dxa"/>
-              <w:left w:w="85" w:type="dxa"/>
-              <w:bottom w:w="85" w:type="dxa"/>
-              <w:right w:w="85" w:type="dxa"/>
-            </w:tcMar>
-          </w:tcPr>
-          <w:p>
-            <w:pPr>
-              <w:spacing w:after="0"/>
-            </w:pPr>
-            <w:r>
-              <w:rPr>
-                <w:rFonts w:ascii="Arial" w:hAnsi="Arial"/>
-                <w:b/>
-                <w:color w:val="FFFFFF"/>
-                <w:sz w:val="18"/>
-              </w:rPr>
-              <w:t>Phase</w:t>
-            </w:r>
-          </w:p>
-        </w:tc>
-        <w:tc>
-          <w:tcPr>
-            <w:tcW w:type="dxa" w:w="6377"/>
-            <w:shd w:fill="3C36B5"/>
-            <w:tcMar>
-              <w:top w:w="85" w:type="dxa"/>
-              <w:left w:w="85" w:type="dxa"/>
-              <w:bottom w:w="85" w:type="dxa"/>
-              <w:right w:w="85" w:type="dxa"/>
-            </w:tcMar>
-          </w:tcPr>
-          <w:p>
-            <w:pPr>
-              <w:spacing w:after="0"/>
-            </w:pPr>
-            <w:r>
-              <w:rPr>
-                <w:rFonts w:ascii="Arial" w:hAnsi="Arial"/>
-                <w:b/>
-                <w:color w:val="FFFFFF"/>
-                <w:sz w:val="18"/>
-              </w:rPr>
-              <w:t>Deliverables</w:t>
-            </w:r>
-          </w:p>
-        </w:tc>
-        <w:tc>
-          <w:tcPr>
-            <w:tcW w:type="dxa" w:w="2195"/>
-            <w:shd w:fill="3C36B5"/>
-            <w:tcMar>
-              <w:top w:w="85" w:type="dxa"/>
-              <w:left w:w="85" w:type="dxa"/>
-              <w:bottom w:w="85" w:type="dxa"/>
-              <w:right w:w="85" w:type="dxa"/>
-            </w:tcMar>
-          </w:tcPr>
-          <w:p>
-            <w:pPr>
-              <w:spacing w:after="0"/>
-            </w:pPr>
-            <w:r>
-              <w:rPr>
-                <w:rFonts w:ascii="Arial" w:hAnsi="Arial"/>
-                <w:b/>
-                <w:color w:val="FFFFFF"/>
-                <w:sz w:val="18"/>
-              </w:rPr>
-              <w:t>Schedule</w:t>
+              <w:t>$6,000</w:t>
             </w:r>
           </w:p>
         </w:tc>
@@ -394,79 +374,61 @@
         </w:trPr>
         <w:tc>
           <w:tcPr>
-            <w:tcW w:type="dxa" w:w="1882"/>
-            <w:shd w:fill="EEECFA"/>
-            <w:tcMar>
-              <w:top w:w="85" w:type="dxa"/>
-              <w:left w:w="85" w:type="dxa"/>
-              <w:bottom w:w="85" w:type="dxa"/>
-              <w:right w:w="85" w:type="dxa"/>
-            </w:tcMar>
+            <w:tcW w:type="dxa" w:w="3492"/>
+            <w:shd w:fill="FFFFFF"/>
           </w:tcPr>
           <w:p>
             <w:pPr>
-              <w:spacing w:after="0"/>
+              <w:spacing w:after="160" w:line="269" w:lineRule="auto"/>
+            </w:pPr>
+            <w:r>
+              <w:rPr>
+                <w:rFonts w:ascii="Arial" w:hAnsi="Arial"/>
+                <w:b/>
+                <w:color w:val="17252B"/>
+                <w:sz w:val="20"/>
+              </w:rPr>
+              <w:t>02 Design</w:t>
+            </w:r>
+          </w:p>
+        </w:tc>
+        <w:tc>
+          <w:tcPr>
+            <w:tcW w:type="dxa" w:w="5587"/>
+            <w:shd w:fill="FFFFFF"/>
+          </w:tcPr>
+          <w:p>
+            <w:pPr>
+              <w:spacing w:after="160" w:line="269" w:lineRule="auto"/>
             </w:pPr>
             <w:r>
               <w:rPr>
                 <w:rFonts w:ascii="Arial" w:hAnsi="Arial"/>
                 <w:b w:val="0"/>
-                <w:color w:val="172033"/>
-                <w:sz w:val="18"/>
+                <w:color w:val="17252B"/>
+                <w:sz w:val="20"/>
               </w:rPr>
-              <w:t>Discover</w:t>
+              <w:t>Six screens and component states</w:t>
             </w:r>
           </w:p>
         </w:tc>
         <w:tc>
           <w:tcPr>
-            <w:tcW w:type="dxa" w:w="6377"/>
-            <w:shd w:fill="EEECFA"/>
-            <w:tcMar>
-              <w:top w:w="85" w:type="dxa"/>
-              <w:left w:w="85" w:type="dxa"/>
-              <w:bottom w:w="85" w:type="dxa"/>
-              <w:right w:w="85" w:type="dxa"/>
-            </w:tcMar>
+            <w:tcW w:type="dxa" w:w="4889"/>
+            <w:shd w:fill="FFFFFF"/>
           </w:tcPr>
           <w:p>
             <w:pPr>
-              <w:spacing w:after="0"/>
+              <w:spacing w:after="160" w:line="269" w:lineRule="auto"/>
             </w:pPr>
             <w:r>
               <w:rPr>
                 <w:rFonts w:ascii="Arial" w:hAnsi="Arial"/>
                 <w:b w:val="0"/>
-                <w:color w:val="172033"/>
-                <w:sz w:val="18"/>
+                <w:color w:val="17252B"/>
+                <w:sz w:val="20"/>
               </w:rPr>
-              <w:t>Five staff interviews; journey map; agreed problem statement</w:t>
-            </w:r>
-          </w:p>
-        </w:tc>
-        <w:tc>
-          <w:tcPr>
-            <w:tcW w:type="dxa" w:w="2195"/>
-            <w:shd w:fill="EEECFA"/>
-            <w:tcMar>
-              <w:top w:w="85" w:type="dxa"/>
-              <w:left w:w="85" w:type="dxa"/>
-              <w:bottom w:w="85" w:type="dxa"/>
-              <w:right w:w="85" w:type="dxa"/>
-            </w:tcMar>
-          </w:tcPr>
-          <w:p>
-            <w:pPr>
-              <w:spacing w:after="0"/>
-            </w:pPr>
-            <w:r>
-              <w:rPr>
-                <w:rFonts w:ascii="Arial" w:hAnsi="Arial"/>
-                <w:b w:val="0"/>
-                <w:color w:val="172033"/>
-                <w:sz w:val="18"/>
-              </w:rPr>
-              <w:t>Week 1</w:t>
+              <w:t>$10,000</w:t>
             </w:r>
           </w:p>
         </w:tc>
@@ -477,162 +439,61 @@
         </w:trPr>
         <w:tc>
           <w:tcPr>
-            <w:tcW w:type="dxa" w:w="1882"/>
-            <w:shd w:fill="FFFFFF"/>
-            <w:tcMar>
-              <w:top w:w="85" w:type="dxa"/>
-              <w:left w:w="85" w:type="dxa"/>
-              <w:bottom w:w="85" w:type="dxa"/>
-              <w:right w:w="85" w:type="dxa"/>
-            </w:tcMar>
+            <w:tcW w:type="dxa" w:w="3492"/>
+            <w:shd w:fill="F1F6E9"/>
           </w:tcPr>
           <w:p>
             <w:pPr>
-              <w:spacing w:after="0"/>
+              <w:spacing w:after="160" w:line="269" w:lineRule="auto"/>
+            </w:pPr>
+            <w:r>
+              <w:rPr>
+                <w:rFonts w:ascii="Arial" w:hAnsi="Arial"/>
+                <w:b/>
+                <w:color w:val="17252B"/>
+                <w:sz w:val="20"/>
+              </w:rPr>
+              <w:t>03 Validate</w:t>
+            </w:r>
+          </w:p>
+        </w:tc>
+        <w:tc>
+          <w:tcPr>
+            <w:tcW w:type="dxa" w:w="5587"/>
+            <w:shd w:fill="F1F6E9"/>
+          </w:tcPr>
+          <w:p>
+            <w:pPr>
+              <w:spacing w:after="160" w:line="269" w:lineRule="auto"/>
             </w:pPr>
             <w:r>
               <w:rPr>
                 <w:rFonts w:ascii="Arial" w:hAnsi="Arial"/>
                 <w:b w:val="0"/>
-                <w:color w:val="172033"/>
-                <w:sz w:val="18"/>
+                <w:color w:val="17252B"/>
+                <w:sz w:val="20"/>
               </w:rPr>
-              <w:t>Design</w:t>
+              <w:t>Prototype and handoff</w:t>
             </w:r>
           </w:p>
         </w:tc>
         <w:tc>
           <w:tcPr>
-            <w:tcW w:type="dxa" w:w="6377"/>
-            <w:shd w:fill="FFFFFF"/>
-            <w:tcMar>
-              <w:top w:w="85" w:type="dxa"/>
-              <w:left w:w="85" w:type="dxa"/>
-              <w:bottom w:w="85" w:type="dxa"/>
-              <w:right w:w="85" w:type="dxa"/>
-            </w:tcMar>
+            <w:tcW w:type="dxa" w:w="4889"/>
+            <w:shd w:fill="F1F6E9"/>
           </w:tcPr>
           <w:p>
             <w:pPr>
-              <w:spacing w:after="0"/>
+              <w:spacing w:after="160" w:line="269" w:lineRule="auto"/>
             </w:pPr>
             <w:r>
               <w:rPr>
                 <w:rFonts w:ascii="Arial" w:hAnsi="Arial"/>
                 <w:b w:val="0"/>
-                <w:color w:val="172033"/>
-                <w:sz w:val="18"/>
+                <w:color w:val="17252B"/>
+                <w:sz w:val="20"/>
               </w:rPr>
-              <w:t>Welcome flow; six screen designs; email copy outline</w:t>
-            </w:r>
-          </w:p>
-        </w:tc>
-        <w:tc>
-          <w:tcPr>
-            <w:tcW w:type="dxa" w:w="2195"/>
-            <w:shd w:fill="FFFFFF"/>
-            <w:tcMar>
-              <w:top w:w="85" w:type="dxa"/>
-              <w:left w:w="85" w:type="dxa"/>
-              <w:bottom w:w="85" w:type="dxa"/>
-              <w:right w:w="85" w:type="dxa"/>
-            </w:tcMar>
-          </w:tcPr>
-          <w:p>
-            <w:pPr>
-              <w:spacing w:after="0"/>
-            </w:pPr>
-            <w:r>
-              <w:rPr>
-                <w:rFonts w:ascii="Arial" w:hAnsi="Arial"/>
-                <w:b w:val="0"/>
-                <w:color w:val="172033"/>
-                <w:sz w:val="18"/>
-              </w:rPr>
-              <w:t>Weeks 2–3</w:t>
-            </w:r>
-          </w:p>
-        </w:tc>
-      </w:tr>
-      <w:tr>
-        <w:trPr>
-          <w:cantSplit/>
-        </w:trPr>
-        <w:tc>
-          <w:tcPr>
-            <w:tcW w:type="dxa" w:w="1882"/>
-            <w:shd w:fill="EEECFA"/>
-            <w:tcMar>
-              <w:top w:w="85" w:type="dxa"/>
-              <w:left w:w="85" w:type="dxa"/>
-              <w:bottom w:w="85" w:type="dxa"/>
-              <w:right w:w="85" w:type="dxa"/>
-            </w:tcMar>
-          </w:tcPr>
-          <w:p>
-            <w:pPr>
-              <w:spacing w:after="0"/>
-            </w:pPr>
-            <w:r>
-              <w:rPr>
-                <w:rFonts w:ascii="Arial" w:hAnsi="Arial"/>
-                <w:b w:val="0"/>
-                <w:color w:val="172033"/>
-                <w:sz w:val="18"/>
-              </w:rPr>
-              <w:t>Handover</w:t>
-            </w:r>
-          </w:p>
-        </w:tc>
-        <w:tc>
-          <w:tcPr>
-            <w:tcW w:type="dxa" w:w="6377"/>
-            <w:shd w:fill="EEECFA"/>
-            <w:tcMar>
-              <w:top w:w="85" w:type="dxa"/>
-              <w:left w:w="85" w:type="dxa"/>
-              <w:bottom w:w="85" w:type="dxa"/>
-              <w:right w:w="85" w:type="dxa"/>
-            </w:tcMar>
-          </w:tcPr>
-          <w:p>
-            <w:pPr>
-              <w:spacing w:after="0"/>
-            </w:pPr>
-            <w:r>
-              <w:rPr>
-                <w:rFonts w:ascii="Arial" w:hAnsi="Arial"/>
-                <w:b w:val="0"/>
-                <w:color w:val="172033"/>
-                <w:sz w:val="18"/>
-              </w:rPr>
-              <w:t>Annotated prototype; component notes; two training sessions</w:t>
-            </w:r>
-          </w:p>
-        </w:tc>
-        <w:tc>
-          <w:tcPr>
-            <w:tcW w:type="dxa" w:w="2195"/>
-            <w:shd w:fill="EEECFA"/>
-            <w:tcMar>
-              <w:top w:w="85" w:type="dxa"/>
-              <w:left w:w="85" w:type="dxa"/>
-              <w:bottom w:w="85" w:type="dxa"/>
-              <w:right w:w="85" w:type="dxa"/>
-            </w:tcMar>
-          </w:tcPr>
-          <w:p>
-            <w:pPr>
-              <w:spacing w:after="0"/>
-            </w:pPr>
-            <w:r>
-              <w:rPr>
-                <w:rFonts w:ascii="Arial" w:hAnsi="Arial"/>
-                <w:b w:val="0"/>
-                <w:color w:val="172033"/>
-                <w:sz w:val="18"/>
-              </w:rPr>
-              <w:t>Week 4</w:t>
+              <w:t>$8,000</w:t>
             </w:r>
           </w:p>
         </w:tc>
@@ -640,598 +501,23 @@
     </w:tbl>
     <w:p>
       <w:pPr>
-        <w:spacing w:after="0" w:before="0" w:line="60" w:lineRule="exact"/>
+        <w:spacing w:after="80" w:line="269" w:lineRule="auto"/>
       </w:pPr>
       <w:r>
         <w:rPr>
-          <w:sz w:val="6"/>
+          <w:rFonts w:ascii="Arial" w:hAnsi="Arial"/>
+          <w:b/>
+          <w:i w:val="0"/>
+          <w:color w:val="145A45"/>
+          <w:sz w:val="18"/>
         </w:rPr>
-      </w:r>
-    </w:p>
-    <w:p>
-      <w:pPr>
-        <w:pStyle w:val="Heading1"/>
-      </w:pPr>
-      <w:r>
-        <w:rPr>
-          <w:b w:val="0"/>
-        </w:rPr>
-        <w:t>How We Will Work</w:t>
-      </w:r>
-    </w:p>
-    <w:p>
-      <w:pPr>
-        <w:pStyle w:val="ListBullet"/>
-      </w:pPr>
-      <w:r>
-        <w:rPr>
-          <w:b w:val="0"/>
-        </w:rPr>
-        <w:t>One 30-minute review each Tuesday, with a named client decision-maker.</w:t>
-      </w:r>
-    </w:p>
-    <w:p>
-      <w:pPr>
-        <w:pStyle w:val="ListBullet"/>
-      </w:pPr>
-      <w:r>
-        <w:rPr>
-          <w:b w:val="0"/>
-        </w:rPr>
-        <w:t>Two consolidated feedback rounds on the prototype.</w:t>
-      </w:r>
-    </w:p>
-    <w:p>
-      <w:pPr>
-        <w:pStyle w:val="ListBullet"/>
-      </w:pPr>
-      <w:r>
-        <w:rPr>
-          <w:b w:val="0"/>
-        </w:rPr>
-        <w:t>Shared decision log and weekly written delivery update.</w:t>
-      </w:r>
-    </w:p>
-    <w:p>
-      <w:pPr>
-        <w:pStyle w:val="Heading1"/>
-      </w:pPr>
-      <w:r>
-        <w:rPr>
-          <w:b w:val="0"/>
-        </w:rPr>
-        <w:t>Outside This Scope</w:t>
-      </w:r>
-    </w:p>
-    <w:p>
-      <w:pPr>
-        <w:ind w:right="4154"/>
-      </w:pPr>
-      <w:r>
-        <w:rPr>
-          <w:b w:val="0"/>
-        </w:rPr>
-        <w:t>Production code, system migration, translation and new brand identity work are excluded. Any added scope requires a written change agreement.</w:t>
-      </w:r>
-    </w:p>
-    <w:p>
-      <w:r>
-        <w:br w:type="page"/>
-      </w:r>
-    </w:p>
-    <w:p>
-      <w:r>
-        <w:rPr>
-          <w:b/>
-          <w:color w:val="3C36B5"/>
-          <w:sz w:val="16"/>
-        </w:rPr>
-        <w:t>NORTHSTAR DESIGN • PROPOSAL 027   /   02</w:t>
-      </w:r>
-    </w:p>
-    <w:p>
-      <w:pPr>
-        <w:pStyle w:val="Title"/>
-        <w:shd w:fill="3C36B5"/>
-      </w:pPr>
-      <w:r>
-        <w:rPr>
-          <w:color w:val="FFFFFF"/>
-        </w:rPr>
-        <w:t>Investment and Approval</w:t>
-      </w:r>
-    </w:p>
-    <w:p>
-      <w:pPr>
-        <w:pStyle w:val="Heading2"/>
-        <w:keepNext/>
-      </w:pPr>
-      <w:r>
-        <w:t>Payment Follows Delivery</w:t>
-      </w:r>
-    </w:p>
-    <w:p>
-      <w:r>
-        <w:drawing>
-          <wp:inline xmlns:a="http://schemas.openxmlformats.org/drawingml/2006/main" xmlns:pic="http://schemas.openxmlformats.org/drawingml/2006/picture">
-            <wp:extent cx="6080760" cy="1903081"/>
-            <wp:docPr id="1" name="Picture 1"/>
-            <wp:cNvGraphicFramePr>
-              <a:graphicFrameLocks noChangeAspect="1"/>
-            </wp:cNvGraphicFramePr>
-            <a:graphic>
-              <a:graphicData uri="http://schemas.openxmlformats.org/drawingml/2006/picture">
-                <pic:pic>
-                  <pic:nvPicPr>
-                    <pic:cNvPr id="0" name="business-1.png"/>
-                    <pic:cNvPicPr/>
-                  </pic:nvPicPr>
-                  <pic:blipFill>
-                    <a:blip r:embed="rId10"/>
-                    <a:stretch>
-                      <a:fillRect/>
-                    </a:stretch>
-                  </pic:blipFill>
-                  <pic:spPr>
-                    <a:xfrm>
-                      <a:off x="0" y="0"/>
-                      <a:ext cx="6080760" cy="1903081"/>
-                    </a:xfrm>
-                    <a:prstGeom prst="rect"/>
-                  </pic:spPr>
-                </pic:pic>
-              </a:graphicData>
-            </a:graphic>
-          </wp:inline>
-        </w:drawing>
-      </w:r>
-    </w:p>
-    <w:tbl>
-      <w:tblPr>
-        <w:tblW w:type="auto" w:w="0"/>
-        <w:tblLayout w:type="fixed"/>
-        <w:tblLook w:firstColumn="1" w:firstRow="1" w:lastColumn="0" w:lastRow="0" w:noHBand="0" w:noVBand="1" w:val="04A0"/>
-      </w:tblPr>
-      <w:tblGrid>
-        <w:gridCol w:w="7527"/>
-        <w:gridCol w:w="2927"/>
-      </w:tblGrid>
-      <w:tr>
-        <w:trPr>
-          <w:cantSplit/>
-          <w:tblHeader/>
-        </w:trPr>
-        <w:tc>
-          <w:tcPr>
-            <w:tcW w:type="dxa" w:w="7527"/>
-            <w:shd w:fill="3C36B5"/>
-            <w:tcMar>
-              <w:top w:w="85" w:type="dxa"/>
-              <w:left w:w="85" w:type="dxa"/>
-              <w:bottom w:w="85" w:type="dxa"/>
-              <w:right w:w="85" w:type="dxa"/>
-            </w:tcMar>
-          </w:tcPr>
-          <w:p>
-            <w:pPr>
-              <w:spacing w:after="0"/>
-            </w:pPr>
-            <w:r>
-              <w:rPr>
-                <w:rFonts w:ascii="Arial" w:hAnsi="Arial"/>
-                <w:b/>
-                <w:color w:val="FFFFFF"/>
-                <w:sz w:val="18"/>
-              </w:rPr>
-              <w:t>Work package</w:t>
-            </w:r>
-          </w:p>
-        </w:tc>
-        <w:tc>
-          <w:tcPr>
-            <w:tcW w:type="dxa" w:w="2927"/>
-            <w:shd w:fill="3C36B5"/>
-            <w:tcMar>
-              <w:top w:w="85" w:type="dxa"/>
-              <w:left w:w="85" w:type="dxa"/>
-              <w:bottom w:w="85" w:type="dxa"/>
-              <w:right w:w="85" w:type="dxa"/>
-            </w:tcMar>
-          </w:tcPr>
-          <w:p>
-            <w:pPr>
-              <w:spacing w:after="0"/>
-            </w:pPr>
-            <w:r>
-              <w:rPr>
-                <w:rFonts w:ascii="Arial" w:hAnsi="Arial"/>
-                <w:b/>
-                <w:color w:val="FFFFFF"/>
-                <w:sz w:val="18"/>
-              </w:rPr>
-              <w:t>Fee in USD</w:t>
-            </w:r>
-          </w:p>
-        </w:tc>
-      </w:tr>
-      <w:tr>
-        <w:trPr>
-          <w:cantSplit/>
-        </w:trPr>
-        <w:tc>
-          <w:tcPr>
-            <w:tcW w:type="dxa" w:w="7527"/>
-            <w:shd w:fill="EEECFA"/>
-            <w:tcMar>
-              <w:top w:w="85" w:type="dxa"/>
-              <w:left w:w="85" w:type="dxa"/>
-              <w:bottom w:w="85" w:type="dxa"/>
-              <w:right w:w="85" w:type="dxa"/>
-            </w:tcMar>
-          </w:tcPr>
-          <w:p>
-            <w:pPr>
-              <w:spacing w:after="0"/>
-            </w:pPr>
-            <w:r>
-              <w:rPr>
-                <w:rFonts w:ascii="Arial" w:hAnsi="Arial"/>
-                <w:b w:val="0"/>
-                <w:color w:val="172033"/>
-                <w:sz w:val="18"/>
-              </w:rPr>
-              <w:t>Research and journey mapping</w:t>
-            </w:r>
-          </w:p>
-        </w:tc>
-        <w:tc>
-          <w:tcPr>
-            <w:tcW w:type="dxa" w:w="2927"/>
-            <w:shd w:fill="EEECFA"/>
-            <w:tcMar>
-              <w:top w:w="85" w:type="dxa"/>
-              <w:left w:w="85" w:type="dxa"/>
-              <w:bottom w:w="85" w:type="dxa"/>
-              <w:right w:w="85" w:type="dxa"/>
-            </w:tcMar>
-          </w:tcPr>
-          <w:p>
-            <w:pPr>
-              <w:spacing w:after="0"/>
-            </w:pPr>
-            <w:r>
-              <w:rPr>
-                <w:rFonts w:ascii="Arial" w:hAnsi="Arial"/>
-                <w:b w:val="0"/>
-                <w:color w:val="172033"/>
-                <w:sz w:val="18"/>
-              </w:rPr>
-              <w:t>$3,000</w:t>
-            </w:r>
-          </w:p>
-        </w:tc>
-      </w:tr>
-      <w:tr>
-        <w:trPr>
-          <w:cantSplit/>
-        </w:trPr>
-        <w:tc>
-          <w:tcPr>
-            <w:tcW w:type="dxa" w:w="7527"/>
-            <w:shd w:fill="FFFFFF"/>
-            <w:tcMar>
-              <w:top w:w="85" w:type="dxa"/>
-              <w:left w:w="85" w:type="dxa"/>
-              <w:bottom w:w="85" w:type="dxa"/>
-              <w:right w:w="85" w:type="dxa"/>
-            </w:tcMar>
-          </w:tcPr>
-          <w:p>
-            <w:pPr>
-              <w:spacing w:after="0"/>
-            </w:pPr>
-            <w:r>
-              <w:rPr>
-                <w:rFonts w:ascii="Arial" w:hAnsi="Arial"/>
-                <w:b w:val="0"/>
-                <w:color w:val="172033"/>
-                <w:sz w:val="18"/>
-              </w:rPr>
-              <w:t>Experience design and prototype</w:t>
-            </w:r>
-          </w:p>
-        </w:tc>
-        <w:tc>
-          <w:tcPr>
-            <w:tcW w:type="dxa" w:w="2927"/>
-            <w:shd w:fill="FFFFFF"/>
-            <w:tcMar>
-              <w:top w:w="85" w:type="dxa"/>
-              <w:left w:w="85" w:type="dxa"/>
-              <w:bottom w:w="85" w:type="dxa"/>
-              <w:right w:w="85" w:type="dxa"/>
-            </w:tcMar>
-          </w:tcPr>
-          <w:p>
-            <w:pPr>
-              <w:spacing w:after="0"/>
-            </w:pPr>
-            <w:r>
-              <w:rPr>
-                <w:rFonts w:ascii="Arial" w:hAnsi="Arial"/>
-                <w:b w:val="0"/>
-                <w:color w:val="172033"/>
-                <w:sz w:val="18"/>
-              </w:rPr>
-              <w:t>$7,500</w:t>
-            </w:r>
-          </w:p>
-        </w:tc>
-      </w:tr>
-      <w:tr>
-        <w:trPr>
-          <w:cantSplit/>
-        </w:trPr>
-        <w:tc>
-          <w:tcPr>
-            <w:tcW w:type="dxa" w:w="7527"/>
-            <w:shd w:fill="EEECFA"/>
-            <w:tcMar>
-              <w:top w:w="85" w:type="dxa"/>
-              <w:left w:w="85" w:type="dxa"/>
-              <w:bottom w:w="85" w:type="dxa"/>
-              <w:right w:w="85" w:type="dxa"/>
-            </w:tcMar>
-          </w:tcPr>
-          <w:p>
-            <w:pPr>
-              <w:spacing w:after="0"/>
-            </w:pPr>
-            <w:r>
-              <w:rPr>
-                <w:rFonts w:ascii="Arial" w:hAnsi="Arial"/>
-                <w:b w:val="0"/>
-                <w:color w:val="172033"/>
-                <w:sz w:val="18"/>
-              </w:rPr>
-              <w:t>Handover and training</w:t>
-            </w:r>
-          </w:p>
-        </w:tc>
-        <w:tc>
-          <w:tcPr>
-            <w:tcW w:type="dxa" w:w="2927"/>
-            <w:shd w:fill="EEECFA"/>
-            <w:tcMar>
-              <w:top w:w="85" w:type="dxa"/>
-              <w:left w:w="85" w:type="dxa"/>
-              <w:bottom w:w="85" w:type="dxa"/>
-              <w:right w:w="85" w:type="dxa"/>
-            </w:tcMar>
-          </w:tcPr>
-          <w:p>
-            <w:pPr>
-              <w:spacing w:after="0"/>
-            </w:pPr>
-            <w:r>
-              <w:rPr>
-                <w:rFonts w:ascii="Arial" w:hAnsi="Arial"/>
-                <w:b w:val="0"/>
-                <w:color w:val="172033"/>
-                <w:sz w:val="18"/>
-              </w:rPr>
-              <w:t>$1,500</w:t>
-            </w:r>
-          </w:p>
-        </w:tc>
-      </w:tr>
-      <w:tr>
-        <w:trPr>
-          <w:cantSplit/>
-        </w:trPr>
-        <w:tc>
-          <w:tcPr>
-            <w:tcW w:type="dxa" w:w="7527"/>
-            <w:shd w:fill="FFFFFF"/>
-            <w:tcMar>
-              <w:top w:w="85" w:type="dxa"/>
-              <w:left w:w="85" w:type="dxa"/>
-              <w:bottom w:w="85" w:type="dxa"/>
-              <w:right w:w="85" w:type="dxa"/>
-            </w:tcMar>
-          </w:tcPr>
-          <w:p>
-            <w:pPr>
-              <w:spacing w:after="0"/>
-            </w:pPr>
-            <w:r>
-              <w:rPr>
-                <w:rFonts w:ascii="Arial" w:hAnsi="Arial"/>
-                <w:b w:val="0"/>
-                <w:color w:val="172033"/>
-                <w:sz w:val="18"/>
-              </w:rPr>
-              <w:t>Total project fee</w:t>
-            </w:r>
-          </w:p>
-        </w:tc>
-        <w:tc>
-          <w:tcPr>
-            <w:tcW w:type="dxa" w:w="2927"/>
-            <w:shd w:fill="FFFFFF"/>
-            <w:tcMar>
-              <w:top w:w="85" w:type="dxa"/>
-              <w:left w:w="85" w:type="dxa"/>
-              <w:bottom w:w="85" w:type="dxa"/>
-              <w:right w:w="85" w:type="dxa"/>
-            </w:tcMar>
-          </w:tcPr>
-          <w:p>
-            <w:pPr>
-              <w:spacing w:after="0"/>
-            </w:pPr>
-            <w:r>
-              <w:rPr>
-                <w:rFonts w:ascii="Arial" w:hAnsi="Arial"/>
-                <w:b w:val="0"/>
-                <w:color w:val="172033"/>
-                <w:sz w:val="18"/>
-              </w:rPr>
-              <w:t>$12,000</w:t>
-            </w:r>
-          </w:p>
-        </w:tc>
-      </w:tr>
-    </w:tbl>
-    <w:p>
-      <w:pPr>
-        <w:spacing w:after="0" w:before="0" w:line="60" w:lineRule="exact"/>
-      </w:pPr>
-      <w:r>
-        <w:rPr>
-          <w:sz w:val="6"/>
-        </w:rPr>
-      </w:r>
-    </w:p>
-    <w:p>
-      <w:pPr>
-        <w:pStyle w:val="Heading1"/>
-      </w:pPr>
-      <w:r>
-        <w:rPr>
-          <w:b w:val="0"/>
-        </w:rPr>
-        <w:t>Payment Schedule</w:t>
-      </w:r>
-    </w:p>
-    <w:p>
-      <w:pPr>
-        <w:ind w:right="4154"/>
-      </w:pPr>
-      <w:r>
-        <w:rPr>
-          <w:b w:val="0"/>
-        </w:rPr>
-        <w:t>40% at kickoff ($4,800), 40% at prototype review ($4,800), and 20% at handover ($2,400). This illustrative price excludes applicable taxes and third-party expenses.</w:t>
-      </w:r>
-    </w:p>
-    <w:p>
-      <w:pPr>
-        <w:pStyle w:val="Heading1"/>
-      </w:pPr>
-      <w:r>
-        <w:rPr>
-          <w:b w:val="0"/>
-        </w:rPr>
-        <w:t>Client Responsibilities</w:t>
-      </w:r>
-    </w:p>
-    <w:p>
-      <w:pPr>
-        <w:pStyle w:val="ListBullet"/>
-      </w:pPr>
-      <w:r>
-        <w:rPr>
-          <w:b w:val="0"/>
-        </w:rPr>
-        <w:t>Provide current onboarding material and access to five interview participants.</w:t>
-      </w:r>
-    </w:p>
-    <w:p>
-      <w:pPr>
-        <w:pStyle w:val="ListBullet"/>
-      </w:pPr>
-      <w:r>
-        <w:rPr>
-          <w:b w:val="0"/>
-        </w:rPr>
-        <w:t>Return consolidated feedback within two working days.</w:t>
-      </w:r>
-    </w:p>
-    <w:p>
-      <w:pPr>
-        <w:pStyle w:val="ListBullet"/>
-      </w:pPr>
-      <w:r>
-        <w:rPr>
-          <w:b w:val="0"/>
-        </w:rPr>
-        <w:t>Confirm content accuracy and nominate an approver before kickoff.</w:t>
-      </w:r>
-    </w:p>
-    <w:p>
-      <w:pPr>
-        <w:pStyle w:val="Heading1"/>
-      </w:pPr>
-      <w:r>
-        <w:rPr>
-          <w:b w:val="0"/>
-        </w:rPr>
-      </w:r>
-      <w:r>
-        <w:rPr>
-          <w:b/>
-          <w:color w:val="3C36B5"/>
-        </w:rPr>
-        <w:t>Acceptance Criteria</w:t>
-      </w:r>
-      <w:r>
-        <w:rPr>
-          <w:b w:val="0"/>
-        </w:rPr>
-      </w:r>
-    </w:p>
-    <w:p>
-      <w:pPr>
-        <w:ind w:right="4154"/>
-      </w:pPr>
-      <w:r>
-        <w:rPr>
-          <w:b w:val="0"/>
-        </w:rPr>
-        <w:t>Acceptance covers six annotated screens, the welcome email outline, a working prototype and two team sessions. The lead records acceptance or specific scope-related corrections.</w:t>
-      </w:r>
-    </w:p>
-    <w:p>
-      <w:pPr>
-        <w:pStyle w:val="Heading1"/>
-      </w:pPr>
-      <w:r>
-        <w:rPr>
-          <w:b w:val="0"/>
-        </w:rPr>
-        <w:t>The Decision</w:t>
-      </w:r>
-    </w:p>
-    <w:p>
-      <w:pPr>
-        <w:ind w:right="4154"/>
-      </w:pPr>
-      <w:r>
-        <w:rPr>
-          <w:b w:val="0"/>
-        </w:rPr>
-        <w:t>Alder Studio sponsor Priya Shah and Northstar lead Maya Chen review scope on 25 June. Proposed kickoff: 5 July. Acceptance is a recorded review of the agreed deliverables, not an automatic consequence of payment.</w:t>
-      </w:r>
-    </w:p>
-    <w:p>
-      <w:pPr>
-        <w:spacing w:before="140"/>
-        <w:ind w:right="4154"/>
-      </w:pPr>
-      <w:r>
-        <w:rPr>
-          <w:i/>
-          <w:color w:val="505968"/>
-          <w:sz w:val="16"/>
-        </w:rPr>
-        <w:t>Design notes: Scope narrative, pricing visualization and acceptance criteria. Original Dazzler template, Apache-2.0. All sample facts are fictional.</w:t>
+        <w:t>Offer valid for 30 days · Start date follows written acceptance.</w:t>
       </w:r>
     </w:p>
     <w:sectPr>
       <w:footerReference w:type="default" r:id="rId9"/>
-      <w:pgSz w:w="12240" w:h="15840"/>
-      <w:pgMar w:top="749" w:right="893" w:bottom="749" w:left="893" w:header="720" w:footer="720" w:gutter="0"/>
+      <w:pgSz w:w="15840" w:h="12240"/>
+      <w:pgMar w:top="648" w:right="936" w:bottom="648" w:left="936" w:header="720" w:footer="720" w:gutter="0"/>
       <w:cols w:space="720"/>
       <w:docGrid w:linePitch="360"/>
     </w:sectPr>
@@ -1247,12 +533,11 @@
     </w:pPr>
     <w:r>
       <w:rPr>
-        <w:b w:val="0"/>
+        <w:color w:val="145A45"/>
         <w:sz w:val="16"/>
       </w:rPr>
-      <w:t xml:space="preserve">FICTIONAL EXAMPLE  /  BUSINESS   •   Dazzler   /   </w:t>
+      <w:t>DAZZLER  /  FICTIONAL EXAMPLE  /  BUSINESS</w:t>
     </w:r>
-    <w:fldSimple w:instr="PAGE"/>
   </w:p>
 </w:ftr>
 </file>
@@ -1621,11 +906,10 @@
     <w:qFormat/>
     <w:rsid w:val="00FC693F"/>
     <w:pPr>
-      <w:spacing w:after="140" w:line="264" w:lineRule="auto"/>
+      <w:spacing w:after="160"/>
     </w:pPr>
     <w:rPr>
       <w:rFonts w:ascii="Arial" w:hAnsi="Arial"/>
-      <w:color w:val="172033"/>
       <w:sz w:val="21"/>
     </w:rPr>
   </w:style>
@@ -1684,15 +968,15 @@
     <w:pPr>
       <w:keepNext/>
       <w:keepLines/>
-      <w:spacing w:before="180" w:after="140" w:line="264" w:lineRule="auto"/>
+      <w:spacing w:before="480" w:after="0"/>
       <w:outlineLvl w:val="0"/>
     </w:pPr>
     <w:rPr>
-      <w:rFonts w:cstheme="majorBidi" w:ascii="Arial" w:hAnsi="Arial"/>
+      <w:rFonts w:asciiTheme="majorHAnsi" w:eastAsiaTheme="majorEastAsia" w:hAnsiTheme="majorHAnsi" w:cstheme="majorBidi"/>
       <w:b/>
       <w:bCs/>
-      <w:color w:val="3C36B5"/>
-      <w:sz w:val="30"/>
+      <w:color w:val="365F91" w:themeColor="accent1" w:themeShade="BF"/>
+      <w:sz w:val="28"/>
       <w:szCs w:val="28"/>
     </w:rPr>
   </w:style>
@@ -1708,15 +992,15 @@
     <w:pPr>
       <w:keepNext/>
       <w:keepLines/>
-      <w:spacing w:before="200" w:after="140" w:line="264" w:lineRule="auto"/>
+      <w:spacing w:before="200" w:after="0"/>
       <w:outlineLvl w:val="1"/>
     </w:pPr>
     <w:rPr>
-      <w:rFonts w:cstheme="majorBidi" w:ascii="Arial" w:hAnsi="Arial"/>
+      <w:rFonts w:asciiTheme="majorHAnsi" w:eastAsiaTheme="majorEastAsia" w:hAnsiTheme="majorHAnsi" w:cstheme="majorBidi"/>
       <w:b/>
       <w:bCs/>
-      <w:color w:val="172033"/>
-      <w:sz w:val="24"/>
+      <w:color w:val="4F81BD" w:themeColor="accent1"/>
+      <w:sz w:val="26"/>
       <w:szCs w:val="26"/>
     </w:rPr>
   </w:style>
@@ -1736,7 +1020,7 @@
       <w:outlineLvl w:val="2"/>
     </w:pPr>
     <w:rPr>
-      <w:rFonts w:cstheme="majorBidi"/>
+      <w:rFonts w:asciiTheme="majorHAnsi" w:eastAsiaTheme="majorEastAsia" w:hAnsiTheme="majorHAnsi" w:cstheme="majorBidi"/>
       <w:b/>
       <w:bCs/>
       <w:color w:val="4F81BD" w:themeColor="accent1"/>
@@ -1759,7 +1043,7 @@
       <w:outlineLvl w:val="3"/>
     </w:pPr>
     <w:rPr>
-      <w:rFonts w:cstheme="majorBidi"/>
+      <w:rFonts w:asciiTheme="majorHAnsi" w:eastAsiaTheme="majorEastAsia" w:hAnsiTheme="majorHAnsi" w:cstheme="majorBidi"/>
       <w:b/>
       <w:bCs/>
       <w:i/>
@@ -1784,7 +1068,7 @@
       <w:outlineLvl w:val="4"/>
     </w:pPr>
     <w:rPr>
-      <w:rFonts w:cstheme="majorBidi"/>
+      <w:rFonts w:asciiTheme="majorHAnsi" w:eastAsiaTheme="majorEastAsia" w:hAnsiTheme="majorHAnsi" w:cstheme="majorBidi"/>
       <w:color w:val="243F60" w:themeColor="accent1" w:themeShade="7F"/>
     </w:rPr>
   </w:style>
@@ -1805,7 +1089,7 @@
       <w:outlineLvl w:val="5"/>
     </w:pPr>
     <w:rPr>
-      <w:rFonts w:cstheme="majorBidi"/>
+      <w:rFonts w:asciiTheme="majorHAnsi" w:eastAsiaTheme="majorEastAsia" w:hAnsiTheme="majorHAnsi" w:cstheme="majorBidi"/>
       <w:i/>
       <w:iCs/>
       <w:color w:val="243F60" w:themeColor="accent1" w:themeShade="7F"/>
@@ -1828,7 +1112,7 @@
       <w:outlineLvl w:val="6"/>
     </w:pPr>
     <w:rPr>
-      <w:rFonts w:cstheme="majorBidi"/>
+      <w:rFonts w:asciiTheme="majorHAnsi" w:eastAsiaTheme="majorEastAsia" w:hAnsiTheme="majorHAnsi" w:cstheme="majorBidi"/>
       <w:i/>
       <w:iCs/>
       <w:color w:val="404040" w:themeColor="text1" w:themeTint="BF"/>
@@ -1851,7 +1135,7 @@
       <w:outlineLvl w:val="7"/>
     </w:pPr>
     <w:rPr>
-      <w:rFonts w:cstheme="majorBidi"/>
+      <w:rFonts w:asciiTheme="majorHAnsi" w:eastAsiaTheme="majorEastAsia" w:hAnsiTheme="majorHAnsi" w:cstheme="majorBidi"/>
       <w:color w:val="4F81BD" w:themeColor="accent1"/>
       <w:sz w:val="20"/>
       <w:szCs w:val="20"/>
@@ -1874,7 +1158,7 @@
       <w:outlineLvl w:val="8"/>
     </w:pPr>
     <w:rPr>
-      <w:rFonts w:cstheme="majorBidi"/>
+      <w:rFonts w:asciiTheme="majorHAnsi" w:eastAsiaTheme="majorEastAsia" w:hAnsiTheme="majorHAnsi" w:cstheme="majorBidi"/>
       <w:i/>
       <w:iCs/>
       <w:color w:val="404040" w:themeColor="text1" w:themeTint="BF"/>
@@ -1925,7 +1209,7 @@
     <w:uiPriority w:val="9"/>
     <w:rsid w:val="00FC693F"/>
     <w:rPr>
-      <w:rFonts w:cstheme="majorBidi"/>
+      <w:rFonts w:asciiTheme="majorHAnsi" w:eastAsiaTheme="majorEastAsia" w:hAnsiTheme="majorHAnsi" w:cstheme="majorBidi"/>
       <w:b/>
       <w:bCs/>
       <w:color w:val="365F91" w:themeColor="accent1" w:themeShade="BF"/>
@@ -1940,7 +1224,7 @@
     <w:uiPriority w:val="9"/>
     <w:rsid w:val="00FC693F"/>
     <w:rPr>
-      <w:rFonts w:cstheme="majorBidi"/>
+      <w:rFonts w:asciiTheme="majorHAnsi" w:eastAsiaTheme="majorEastAsia" w:hAnsiTheme="majorHAnsi" w:cstheme="majorBidi"/>
       <w:b/>
       <w:bCs/>
       <w:color w:val="4F81BD" w:themeColor="accent1"/>
@@ -1955,7 +1239,7 @@
     <w:uiPriority w:val="9"/>
     <w:rsid w:val="00FC693F"/>
     <w:rPr>
-      <w:rFonts w:cstheme="majorBidi"/>
+      <w:rFonts w:asciiTheme="majorHAnsi" w:eastAsiaTheme="majorEastAsia" w:hAnsiTheme="majorHAnsi" w:cstheme="majorBidi"/>
       <w:b/>
       <w:bCs/>
       <w:color w:val="4F81BD" w:themeColor="accent1"/>
@@ -1970,17 +1254,15 @@
     <w:qFormat/>
     <w:rsid w:val="00FC693F"/>
     <w:pPr>
-      <w:keepNext/>
-      <w:spacing w:after="140" w:line="264" w:lineRule="auto"/>
+      <w:spacing w:after="300" w:line="240" w:lineRule="auto"/>
       <w:contextualSpacing/>
     </w:pPr>
     <w:rPr>
-      <w:rFonts w:cstheme="majorBidi" w:ascii="Arial" w:hAnsi="Arial"/>
-      <w:b/>
-      <w:color w:val="3C36B5"/>
+      <w:rFonts w:asciiTheme="majorHAnsi" w:eastAsiaTheme="majorEastAsia" w:hAnsiTheme="majorHAnsi" w:cstheme="majorBidi"/>
+      <w:color w:val="17365D" w:themeColor="text2" w:themeShade="BF"/>
       <w:spacing w:val="5"/>
       <w:kern w:val="28"/>
-      <w:sz w:val="70"/>
+      <w:sz w:val="52"/>
       <w:szCs w:val="52"/>
     </w:rPr>
   </w:style>
@@ -1991,7 +1273,7 @@
     <w:uiPriority w:val="10"/>
     <w:rsid w:val="00FC693F"/>
     <w:rPr>
-      <w:rFonts w:cstheme="majorBidi"/>
+      <w:rFonts w:asciiTheme="majorHAnsi" w:eastAsiaTheme="majorEastAsia" w:hAnsiTheme="majorHAnsi" w:cstheme="majorBidi"/>
       <w:color w:val="17365D" w:themeColor="text2" w:themeShade="BF"/>
       <w:spacing w:val="5"/>
       <w:kern w:val="28"/>
@@ -2011,13 +1293,12 @@
       <w:numPr>
         <w:ilvl w:val="1"/>
       </w:numPr>
-      <w:spacing w:after="140" w:line="264" w:lineRule="auto"/>
     </w:pPr>
     <w:rPr>
-      <w:rFonts w:cstheme="majorBidi" w:ascii="Arial" w:hAnsi="Arial"/>
+      <w:rFonts w:asciiTheme="majorHAnsi" w:eastAsiaTheme="majorEastAsia" w:hAnsiTheme="majorHAnsi" w:cstheme="majorBidi"/>
       <w:i/>
       <w:iCs/>
-      <w:color w:val="172033"/>
+      <w:color w:val="4F81BD" w:themeColor="accent1"/>
       <w:spacing w:val="15"/>
       <w:sz w:val="24"/>
       <w:szCs w:val="24"/>
@@ -2030,7 +1311,7 @@
     <w:uiPriority w:val="11"/>
     <w:rsid w:val="00FC693F"/>
     <w:rPr>
-      <w:rFonts w:cstheme="majorBidi"/>
+      <w:rFonts w:asciiTheme="majorHAnsi" w:eastAsiaTheme="majorEastAsia" w:hAnsiTheme="majorHAnsi" w:cstheme="majorBidi"/>
       <w:i/>
       <w:iCs/>
       <w:color w:val="4F81BD" w:themeColor="accent1"/>
@@ -2155,14 +1436,8 @@
       <w:numPr>
         <w:numId w:val="1"/>
       </w:numPr>
-      <w:spacing w:after="140" w:line="264" w:lineRule="auto"/>
       <w:contextualSpacing/>
     </w:pPr>
-    <w:rPr>
-      <w:rFonts w:ascii="Arial" w:hAnsi="Arial"/>
-      <w:color w:val="172033"/>
-      <w:sz w:val="21"/>
-    </w:rPr>
   </w:style>
   <w:style w:type="paragraph" w:styleId="ListBullet2">
     <w:name w:val="List Bullet 2"/>
@@ -2334,7 +1609,7 @@
     <w:semiHidden/>
     <w:rsid w:val="00FC693F"/>
     <w:rPr>
-      <w:rFonts w:cstheme="majorBidi"/>
+      <w:rFonts w:asciiTheme="majorHAnsi" w:eastAsiaTheme="majorEastAsia" w:hAnsiTheme="majorHAnsi" w:cstheme="majorBidi"/>
       <w:b/>
       <w:bCs/>
       <w:i/>
@@ -2350,7 +1625,7 @@
     <w:semiHidden/>
     <w:rsid w:val="00FC693F"/>
     <w:rPr>
-      <w:rFonts w:cstheme="majorBidi"/>
+      <w:rFonts w:asciiTheme="majorHAnsi" w:eastAsiaTheme="majorEastAsia" w:hAnsiTheme="majorHAnsi" w:cstheme="majorBidi"/>
       <w:color w:val="243F60" w:themeColor="accent1" w:themeShade="7F"/>
     </w:rPr>
   </w:style>
@@ -2362,7 +1637,7 @@
     <w:semiHidden/>
     <w:rsid w:val="00FC693F"/>
     <w:rPr>
-      <w:rFonts w:cstheme="majorBidi"/>
+      <w:rFonts w:asciiTheme="majorHAnsi" w:eastAsiaTheme="majorEastAsia" w:hAnsiTheme="majorHAnsi" w:cstheme="majorBidi"/>
       <w:i/>
       <w:iCs/>
       <w:color w:val="243F60" w:themeColor="accent1" w:themeShade="7F"/>
@@ -2376,7 +1651,7 @@
     <w:semiHidden/>
     <w:rsid w:val="00FC693F"/>
     <w:rPr>
-      <w:rFonts w:cstheme="majorBidi"/>
+      <w:rFonts w:asciiTheme="majorHAnsi" w:eastAsiaTheme="majorEastAsia" w:hAnsiTheme="majorHAnsi" w:cstheme="majorBidi"/>
       <w:i/>
       <w:iCs/>
       <w:color w:val="404040" w:themeColor="text1" w:themeTint="BF"/>
@@ -2390,7 +1665,7 @@
     <w:semiHidden/>
     <w:rsid w:val="00FC693F"/>
     <w:rPr>
-      <w:rFonts w:cstheme="majorBidi"/>
+      <w:rFonts w:asciiTheme="majorHAnsi" w:eastAsiaTheme="majorEastAsia" w:hAnsiTheme="majorHAnsi" w:cstheme="majorBidi"/>
       <w:color w:val="4F81BD" w:themeColor="accent1"/>
       <w:sz w:val="20"/>
       <w:szCs w:val="20"/>
@@ -2404,7 +1679,7 @@
     <w:semiHidden/>
     <w:rsid w:val="00FC693F"/>
     <w:rPr>
-      <w:rFonts w:cstheme="majorBidi"/>
+      <w:rFonts w:asciiTheme="majorHAnsi" w:eastAsiaTheme="majorEastAsia" w:hAnsiTheme="majorHAnsi" w:cstheme="majorBidi"/>
       <w:i/>
       <w:iCs/>
       <w:color w:val="404040" w:themeColor="text1" w:themeTint="BF"/>
@@ -3990,7 +3265,7 @@
         <w:spacing w:before="0" w:after="0" w:line="240" w:lineRule="auto"/>
       </w:pPr>
       <w:rPr>
-        <w:rFonts w:cstheme="majorBidi"/>
+        <w:rFonts w:asciiTheme="majorHAnsi" w:eastAsiaTheme="majorEastAsia" w:hAnsiTheme="majorHAnsi" w:cstheme="majorBidi"/>
         <w:b/>
         <w:bCs/>
       </w:rPr>
@@ -4011,7 +3286,7 @@
         <w:spacing w:before="0" w:after="0" w:line="240" w:lineRule="auto"/>
       </w:pPr>
       <w:rPr>
-        <w:rFonts w:cstheme="majorBidi"/>
+        <w:rFonts w:asciiTheme="majorHAnsi" w:eastAsiaTheme="majorEastAsia" w:hAnsiTheme="majorHAnsi" w:cstheme="majorBidi"/>
         <w:b/>
         <w:bCs/>
       </w:rPr>
@@ -4029,14 +3304,14 @@
     </w:tblStylePr>
     <w:tblStylePr w:type="firstCol">
       <w:rPr>
-        <w:rFonts w:cstheme="majorBidi"/>
+        <w:rFonts w:asciiTheme="majorHAnsi" w:eastAsiaTheme="majorEastAsia" w:hAnsiTheme="majorHAnsi" w:cstheme="majorBidi"/>
         <w:b/>
         <w:bCs/>
       </w:rPr>
     </w:tblStylePr>
     <w:tblStylePr w:type="lastCol">
       <w:rPr>
-        <w:rFonts w:cstheme="majorBidi"/>
+        <w:rFonts w:asciiTheme="majorHAnsi" w:eastAsiaTheme="majorEastAsia" w:hAnsiTheme="majorHAnsi" w:cstheme="majorBidi"/>
         <w:b/>
         <w:bCs/>
       </w:rPr>
@@ -4120,7 +3395,7 @@
         <w:spacing w:before="0" w:after="0" w:line="240" w:lineRule="auto"/>
       </w:pPr>
       <w:rPr>
-        <w:rFonts w:cstheme="majorBidi"/>
+        <w:rFonts w:asciiTheme="majorHAnsi" w:eastAsiaTheme="majorEastAsia" w:hAnsiTheme="majorHAnsi" w:cstheme="majorBidi"/>
         <w:b/>
         <w:bCs/>
       </w:rPr>
@@ -4141,7 +3416,7 @@
         <w:spacing w:before="0" w:after="0" w:line="240" w:lineRule="auto"/>
       </w:pPr>
       <w:rPr>
-        <w:rFonts w:cstheme="majorBidi"/>
+        <w:rFonts w:asciiTheme="majorHAnsi" w:eastAsiaTheme="majorEastAsia" w:hAnsiTheme="majorHAnsi" w:cstheme="majorBidi"/>
         <w:b/>
         <w:bCs/>
       </w:rPr>
@@ -4159,14 +3434,14 @@
     </w:tblStylePr>
     <w:tblStylePr w:type="firstCol">
       <w:rPr>
-        <w:rFonts w:cstheme="majorBidi"/>
+        <w:rFonts w:asciiTheme="majorHAnsi" w:eastAsiaTheme="majorEastAsia" w:hAnsiTheme="majorHAnsi" w:cstheme="majorBidi"/>
         <w:b/>
         <w:bCs/>
       </w:rPr>
     </w:tblStylePr>
     <w:tblStylePr w:type="lastCol">
       <w:rPr>
-        <w:rFonts w:cstheme="majorBidi"/>
+        <w:rFonts w:asciiTheme="majorHAnsi" w:eastAsiaTheme="majorEastAsia" w:hAnsiTheme="majorHAnsi" w:cstheme="majorBidi"/>
         <w:b/>
         <w:bCs/>
       </w:rPr>
@@ -4250,7 +3525,7 @@
         <w:spacing w:before="0" w:after="0" w:line="240" w:lineRule="auto"/>
       </w:pPr>
       <w:rPr>
-        <w:rFonts w:cstheme="majorBidi"/>
+        <w:rFonts w:asciiTheme="majorHAnsi" w:eastAsiaTheme="majorEastAsia" w:hAnsiTheme="majorHAnsi" w:cstheme="majorBidi"/>
         <w:b/>
         <w:bCs/>
       </w:rPr>
@@ -4271,7 +3546,7 @@
         <w:spacing w:before="0" w:after="0" w:line="240" w:lineRule="auto"/>
       </w:pPr>
       <w:rPr>
-        <w:rFonts w:cstheme="majorBidi"/>
+        <w:rFonts w:asciiTheme="majorHAnsi" w:eastAsiaTheme="majorEastAsia" w:hAnsiTheme="majorHAnsi" w:cstheme="majorBidi"/>
         <w:b/>
         <w:bCs/>
       </w:rPr>
@@ -4289,14 +3564,14 @@
     </w:tblStylePr>
     <w:tblStylePr w:type="firstCol">
       <w:rPr>
-        <w:rFonts w:cstheme="majorBidi"/>
+        <w:rFonts w:asciiTheme="majorHAnsi" w:eastAsiaTheme="majorEastAsia" w:hAnsiTheme="majorHAnsi" w:cstheme="majorBidi"/>
         <w:b/>
         <w:bCs/>
       </w:rPr>
     </w:tblStylePr>
     <w:tblStylePr w:type="lastCol">
       <w:rPr>
-        <w:rFonts w:cstheme="majorBidi"/>
+        <w:rFonts w:asciiTheme="majorHAnsi" w:eastAsiaTheme="majorEastAsia" w:hAnsiTheme="majorHAnsi" w:cstheme="majorBidi"/>
         <w:b/>
         <w:bCs/>
       </w:rPr>
@@ -4380,7 +3655,7 @@
         <w:spacing w:before="0" w:after="0" w:line="240" w:lineRule="auto"/>
       </w:pPr>
       <w:rPr>
-        <w:rFonts w:cstheme="majorBidi"/>
+        <w:rFonts w:asciiTheme="majorHAnsi" w:eastAsiaTheme="majorEastAsia" w:hAnsiTheme="majorHAnsi" w:cstheme="majorBidi"/>
         <w:b/>
         <w:bCs/>
       </w:rPr>
@@ -4401,7 +3676,7 @@
         <w:spacing w:before="0" w:after="0" w:line="240" w:lineRule="auto"/>
       </w:pPr>
       <w:rPr>
-        <w:rFonts w:cstheme="majorBidi"/>
+        <w:rFonts w:asciiTheme="majorHAnsi" w:eastAsiaTheme="majorEastAsia" w:hAnsiTheme="majorHAnsi" w:cstheme="majorBidi"/>
         <w:b/>
         <w:bCs/>
       </w:rPr>
@@ -4419,14 +3694,14 @@
     </w:tblStylePr>
     <w:tblStylePr w:type="firstCol">
       <w:rPr>
-        <w:rFonts w:cstheme="majorBidi"/>
+        <w:rFonts w:asciiTheme="majorHAnsi" w:eastAsiaTheme="majorEastAsia" w:hAnsiTheme="majorHAnsi" w:cstheme="majorBidi"/>
         <w:b/>
         <w:bCs/>
       </w:rPr>
     </w:tblStylePr>
     <w:tblStylePr w:type="lastCol">
       <w:rPr>
-        <w:rFonts w:cstheme="majorBidi"/>
+        <w:rFonts w:asciiTheme="majorHAnsi" w:eastAsiaTheme="majorEastAsia" w:hAnsiTheme="majorHAnsi" w:cstheme="majorBidi"/>
         <w:b/>
         <w:bCs/>
       </w:rPr>
@@ -4510,7 +3785,7 @@
         <w:spacing w:before="0" w:after="0" w:line="240" w:lineRule="auto"/>
       </w:pPr>
       <w:rPr>
-        <w:rFonts w:cstheme="majorBidi"/>
+        <w:rFonts w:asciiTheme="majorHAnsi" w:eastAsiaTheme="majorEastAsia" w:hAnsiTheme="majorHAnsi" w:cstheme="majorBidi"/>
         <w:b/>
         <w:bCs/>
       </w:rPr>
@@ -4531,7 +3806,7 @@
         <w:spacing w:before="0" w:after="0" w:line="240" w:lineRule="auto"/>
       </w:pPr>
       <w:rPr>
-        <w:rFonts w:cstheme="majorBidi"/>
+        <w:rFonts w:asciiTheme="majorHAnsi" w:eastAsiaTheme="majorEastAsia" w:hAnsiTheme="majorHAnsi" w:cstheme="majorBidi"/>
         <w:b/>
         <w:bCs/>
       </w:rPr>
@@ -4549,14 +3824,14 @@
     </w:tblStylePr>
     <w:tblStylePr w:type="firstCol">
       <w:rPr>
-        <w:rFonts w:cstheme="majorBidi"/>
+        <w:rFonts w:asciiTheme="majorHAnsi" w:eastAsiaTheme="majorEastAsia" w:hAnsiTheme="majorHAnsi" w:cstheme="majorBidi"/>
         <w:b/>
         <w:bCs/>
       </w:rPr>
     </w:tblStylePr>
     <w:tblStylePr w:type="lastCol">
       <w:rPr>
-        <w:rFonts w:cstheme="majorBidi"/>
+        <w:rFonts w:asciiTheme="majorHAnsi" w:eastAsiaTheme="majorEastAsia" w:hAnsiTheme="majorHAnsi" w:cstheme="majorBidi"/>
         <w:b/>
         <w:bCs/>
       </w:rPr>
@@ -4640,7 +3915,7 @@
         <w:spacing w:before="0" w:after="0" w:line="240" w:lineRule="auto"/>
       </w:pPr>
       <w:rPr>
-        <w:rFonts w:cstheme="majorBidi"/>
+        <w:rFonts w:asciiTheme="majorHAnsi" w:eastAsiaTheme="majorEastAsia" w:hAnsiTheme="majorHAnsi" w:cstheme="majorBidi"/>
         <w:b/>
         <w:bCs/>
       </w:rPr>
@@ -4661,7 +3936,7 @@
         <w:spacing w:before="0" w:after="0" w:line="240" w:lineRule="auto"/>
       </w:pPr>
       <w:rPr>
-        <w:rFonts w:cstheme="majorBidi"/>
+        <w:rFonts w:asciiTheme="majorHAnsi" w:eastAsiaTheme="majorEastAsia" w:hAnsiTheme="majorHAnsi" w:cstheme="majorBidi"/>
         <w:b/>
         <w:bCs/>
       </w:rPr>
@@ -4679,14 +3954,14 @@
     </w:tblStylePr>
     <w:tblStylePr w:type="firstCol">
       <w:rPr>
-        <w:rFonts w:cstheme="majorBidi"/>
+        <w:rFonts w:asciiTheme="majorHAnsi" w:eastAsiaTheme="majorEastAsia" w:hAnsiTheme="majorHAnsi" w:cstheme="majorBidi"/>
         <w:b/>
         <w:bCs/>
       </w:rPr>
     </w:tblStylePr>
     <w:tblStylePr w:type="lastCol">
       <w:rPr>
-        <w:rFonts w:cstheme="majorBidi"/>
+        <w:rFonts w:asciiTheme="majorHAnsi" w:eastAsiaTheme="majorEastAsia" w:hAnsiTheme="majorHAnsi" w:cstheme="majorBidi"/>
         <w:b/>
         <w:bCs/>
       </w:rPr>
@@ -4770,7 +4045,7 @@
         <w:spacing w:before="0" w:after="0" w:line="240" w:lineRule="auto"/>
       </w:pPr>
       <w:rPr>
-        <w:rFonts w:cstheme="majorBidi"/>
+        <w:rFonts w:asciiTheme="majorHAnsi" w:eastAsiaTheme="majorEastAsia" w:hAnsiTheme="majorHAnsi" w:cstheme="majorBidi"/>
         <w:b/>
         <w:bCs/>
       </w:rPr>
@@ -4791,7 +4066,7 @@
         <w:spacing w:before="0" w:after="0" w:line="240" w:lineRule="auto"/>
       </w:pPr>
       <w:rPr>
-        <w:rFonts w:cstheme="majorBidi"/>
+        <w:rFonts w:asciiTheme="majorHAnsi" w:eastAsiaTheme="majorEastAsia" w:hAnsiTheme="majorHAnsi" w:cstheme="majorBidi"/>
         <w:b/>
         <w:bCs/>
       </w:rPr>
@@ -4809,14 +4084,14 @@
     </w:tblStylePr>
     <w:tblStylePr w:type="firstCol">
       <w:rPr>
-        <w:rFonts w:cstheme="majorBidi"/>
+        <w:rFonts w:asciiTheme="majorHAnsi" w:eastAsiaTheme="majorEastAsia" w:hAnsiTheme="majorHAnsi" w:cstheme="majorBidi"/>
         <w:b/>
         <w:bCs/>
       </w:rPr>
     </w:tblStylePr>
     <w:tblStylePr w:type="lastCol">
       <w:rPr>
-        <w:rFonts w:cstheme="majorBidi"/>
+        <w:rFonts w:asciiTheme="majorHAnsi" w:eastAsiaTheme="majorEastAsia" w:hAnsiTheme="majorHAnsi" w:cstheme="majorBidi"/>
         <w:b/>
         <w:bCs/>
       </w:rPr>
@@ -6681,7 +5956,7 @@
     </w:tblPr>
     <w:tblStylePr w:type="firstRow">
       <w:rPr>
-        <w:rFonts w:cstheme="majorBidi"/>
+        <w:rFonts w:asciiTheme="majorHAnsi" w:eastAsiaTheme="majorEastAsia" w:hAnsiTheme="majorHAnsi" w:cstheme="majorBidi"/>
       </w:rPr>
       <w:tblPr/>
       <w:tcPr>
@@ -6765,7 +6040,7 @@
     </w:tblPr>
     <w:tblStylePr w:type="firstRow">
       <w:rPr>
-        <w:rFonts w:cstheme="majorBidi"/>
+        <w:rFonts w:asciiTheme="majorHAnsi" w:eastAsiaTheme="majorEastAsia" w:hAnsiTheme="majorHAnsi" w:cstheme="majorBidi"/>
       </w:rPr>
       <w:tblPr/>
       <w:tcPr>
@@ -6849,7 +6124,7 @@
     </w:tblPr>
     <w:tblStylePr w:type="firstRow">
       <w:rPr>
-        <w:rFonts w:cstheme="majorBidi"/>
+        <w:rFonts w:asciiTheme="majorHAnsi" w:eastAsiaTheme="majorEastAsia" w:hAnsiTheme="majorHAnsi" w:cstheme="majorBidi"/>
       </w:rPr>
       <w:tblPr/>
       <w:tcPr>
@@ -6933,7 +6208,7 @@
     </w:tblPr>
     <w:tblStylePr w:type="firstRow">
       <w:rPr>
-        <w:rFonts w:cstheme="majorBidi"/>
+        <w:rFonts w:asciiTheme="majorHAnsi" w:eastAsiaTheme="majorEastAsia" w:hAnsiTheme="majorHAnsi" w:cstheme="majorBidi"/>
       </w:rPr>
       <w:tblPr/>
       <w:tcPr>
@@ -7017,7 +6292,7 @@
     </w:tblPr>
     <w:tblStylePr w:type="firstRow">
       <w:rPr>
-        <w:rFonts w:cstheme="majorBidi"/>
+        <w:rFonts w:asciiTheme="majorHAnsi" w:eastAsiaTheme="majorEastAsia" w:hAnsiTheme="majorHAnsi" w:cstheme="majorBidi"/>
       </w:rPr>
       <w:tblPr/>
       <w:tcPr>
@@ -7101,7 +6376,7 @@
     </w:tblPr>
     <w:tblStylePr w:type="firstRow">
       <w:rPr>
-        <w:rFonts w:cstheme="majorBidi"/>
+        <w:rFonts w:asciiTheme="majorHAnsi" w:eastAsiaTheme="majorEastAsia" w:hAnsiTheme="majorHAnsi" w:cstheme="majorBidi"/>
       </w:rPr>
       <w:tblPr/>
       <w:tcPr>
@@ -7185,7 +6460,7 @@
     </w:tblPr>
     <w:tblStylePr w:type="firstRow">
       <w:rPr>
-        <w:rFonts w:cstheme="majorBidi"/>
+        <w:rFonts w:asciiTheme="majorHAnsi" w:eastAsiaTheme="majorEastAsia" w:hAnsiTheme="majorHAnsi" w:cstheme="majorBidi"/>
       </w:rPr>
       <w:tblPr/>
       <w:tcPr>
@@ -7250,7 +6525,7 @@
       <w:spacing w:after="0" w:line="240" w:lineRule="auto"/>
     </w:pPr>
     <w:rPr>
-      <w:rFonts w:cstheme="majorBidi"/>
+      <w:rFonts w:asciiTheme="majorHAnsi" w:eastAsiaTheme="majorEastAsia" w:hAnsiTheme="majorHAnsi" w:cstheme="majorBidi"/>
       <w:color w:val="000000" w:themeColor="text1"/>
     </w:rPr>
     <w:tblPr>
@@ -7378,7 +6653,7 @@
       <w:spacing w:after="0" w:line="240" w:lineRule="auto"/>
     </w:pPr>
     <w:rPr>
-      <w:rFonts w:cstheme="majorBidi"/>
+      <w:rFonts w:asciiTheme="majorHAnsi" w:eastAsiaTheme="majorEastAsia" w:hAnsiTheme="majorHAnsi" w:cstheme="majorBidi"/>
       <w:color w:val="000000" w:themeColor="text1"/>
     </w:rPr>
     <w:tblPr>
@@ -7506,7 +6781,7 @@
       <w:spacing w:after="0" w:line="240" w:lineRule="auto"/>
     </w:pPr>
     <w:rPr>
-      <w:rFonts w:cstheme="majorBidi"/>
+      <w:rFonts w:asciiTheme="majorHAnsi" w:eastAsiaTheme="majorEastAsia" w:hAnsiTheme="majorHAnsi" w:cstheme="majorBidi"/>
       <w:color w:val="000000" w:themeColor="text1"/>
     </w:rPr>
     <w:tblPr>
@@ -7634,7 +6909,7 @@
       <w:spacing w:after="0" w:line="240" w:lineRule="auto"/>
     </w:pPr>
     <w:rPr>
-      <w:rFonts w:cstheme="majorBidi"/>
+      <w:rFonts w:asciiTheme="majorHAnsi" w:eastAsiaTheme="majorEastAsia" w:hAnsiTheme="majorHAnsi" w:cstheme="majorBidi"/>
       <w:color w:val="000000" w:themeColor="text1"/>
     </w:rPr>
     <w:tblPr>
@@ -7762,7 +7037,7 @@
       <w:spacing w:after="0" w:line="240" w:lineRule="auto"/>
     </w:pPr>
     <w:rPr>
-      <w:rFonts w:cstheme="majorBidi"/>
+      <w:rFonts w:asciiTheme="majorHAnsi" w:eastAsiaTheme="majorEastAsia" w:hAnsiTheme="majorHAnsi" w:cstheme="majorBidi"/>
       <w:color w:val="000000" w:themeColor="text1"/>
     </w:rPr>
     <w:tblPr>
@@ -7890,7 +7165,7 @@
       <w:spacing w:after="0" w:line="240" w:lineRule="auto"/>
     </w:pPr>
     <w:rPr>
-      <w:rFonts w:cstheme="majorBidi"/>
+      <w:rFonts w:asciiTheme="majorHAnsi" w:eastAsiaTheme="majorEastAsia" w:hAnsiTheme="majorHAnsi" w:cstheme="majorBidi"/>
       <w:color w:val="000000" w:themeColor="text1"/>
     </w:rPr>
     <w:tblPr>
@@ -8018,7 +7293,7 @@
       <w:spacing w:after="0" w:line="240" w:lineRule="auto"/>
     </w:pPr>
     <w:rPr>
-      <w:rFonts w:cstheme="majorBidi"/>
+      <w:rFonts w:asciiTheme="majorHAnsi" w:eastAsiaTheme="majorEastAsia" w:hAnsiTheme="majorHAnsi" w:cstheme="majorBidi"/>
       <w:color w:val="000000" w:themeColor="text1"/>
     </w:rPr>
     <w:tblPr>
@@ -8657,7 +7932,7 @@
       <w:spacing w:after="0" w:line="240" w:lineRule="auto"/>
     </w:pPr>
     <w:rPr>
-      <w:rFonts w:cstheme="majorBidi"/>
+      <w:rFonts w:asciiTheme="majorHAnsi" w:eastAsiaTheme="majorEastAsia" w:hAnsiTheme="majorHAnsi" w:cstheme="majorBidi"/>
       <w:color w:val="000000" w:themeColor="text1"/>
     </w:rPr>
     <w:tblPr>
@@ -8782,7 +8057,7 @@
       <w:spacing w:after="0" w:line="240" w:lineRule="auto"/>
     </w:pPr>
     <w:rPr>
-      <w:rFonts w:cstheme="majorBidi"/>
+      <w:rFonts w:asciiTheme="majorHAnsi" w:eastAsiaTheme="majorEastAsia" w:hAnsiTheme="majorHAnsi" w:cstheme="majorBidi"/>
       <w:color w:val="000000" w:themeColor="text1"/>
     </w:rPr>
     <w:tblPr>
@@ -8907,7 +8182,7 @@
       <w:spacing w:after="0" w:line="240" w:lineRule="auto"/>
     </w:pPr>
     <w:rPr>
-      <w:rFonts w:cstheme="majorBidi"/>
+      <w:rFonts w:asciiTheme="majorHAnsi" w:eastAsiaTheme="majorEastAsia" w:hAnsiTheme="majorHAnsi" w:cstheme="majorBidi"/>
       <w:color w:val="000000" w:themeColor="text1"/>
     </w:rPr>
     <w:tblPr>
@@ -9032,7 +8307,7 @@
       <w:spacing w:after="0" w:line="240" w:lineRule="auto"/>
     </w:pPr>
     <w:rPr>
-      <w:rFonts w:cstheme="majorBidi"/>
+      <w:rFonts w:asciiTheme="majorHAnsi" w:eastAsiaTheme="majorEastAsia" w:hAnsiTheme="majorHAnsi" w:cstheme="majorBidi"/>
       <w:color w:val="000000" w:themeColor="text1"/>
     </w:rPr>
     <w:tblPr>
@@ -9157,7 +8432,7 @@
       <w:spacing w:after="0" w:line="240" w:lineRule="auto"/>
     </w:pPr>
     <w:rPr>
-      <w:rFonts w:cstheme="majorBidi"/>
+      <w:rFonts w:asciiTheme="majorHAnsi" w:eastAsiaTheme="majorEastAsia" w:hAnsiTheme="majorHAnsi" w:cstheme="majorBidi"/>
       <w:color w:val="000000" w:themeColor="text1"/>
     </w:rPr>
     <w:tblPr>
@@ -9282,7 +8557,7 @@
       <w:spacing w:after="0" w:line="240" w:lineRule="auto"/>
     </w:pPr>
     <w:rPr>
-      <w:rFonts w:cstheme="majorBidi"/>
+      <w:rFonts w:asciiTheme="majorHAnsi" w:eastAsiaTheme="majorEastAsia" w:hAnsiTheme="majorHAnsi" w:cstheme="majorBidi"/>
       <w:color w:val="000000" w:themeColor="text1"/>
     </w:rPr>
     <w:tblPr>
@@ -9407,7 +8682,7 @@
       <w:spacing w:after="0" w:line="240" w:lineRule="auto"/>
     </w:pPr>
     <w:rPr>
-      <w:rFonts w:cstheme="majorBidi"/>
+      <w:rFonts w:asciiTheme="majorHAnsi" w:eastAsiaTheme="majorEastAsia" w:hAnsiTheme="majorHAnsi" w:cstheme="majorBidi"/>
       <w:color w:val="000000" w:themeColor="text1"/>
     </w:rPr>
     <w:tblPr>

</xml_diff>

<commit_message>
Release 0.28.0: contextual recipes and expressive gallery colors
</commit_message>
<xml_diff>
--- a/docs/templates/docx/business.docx
+++ b/docs/templates/docx/business.docx
@@ -11,7 +11,7 @@
           <w:rFonts w:ascii="Arial" w:hAnsi="Arial"/>
           <w:b/>
           <w:i w:val="0"/>
-          <w:color w:val="145A45"/>
+          <w:color w:val="256E00"/>
           <w:sz w:val="18"/>
         </w:rPr>
         <w:t>JUNIPER / SCOPE 014</w:t>
@@ -27,7 +27,7 @@
           <w:rFonts w:ascii="Georgia" w:hAnsi="Georgia"/>
           <w:b/>
           <w:i w:val="0"/>
-          <w:color w:val="145A45"/>
+          <w:color w:val="256E00"/>
           <w:sz w:val="68"/>
         </w:rPr>
         <w:t>Juniper Studio Service Proposal</w:t>
@@ -42,7 +42,7 @@
           <w:rFonts w:ascii="Georgia" w:hAnsi="Georgia"/>
           <w:b w:val="0"/>
           <w:i w:val="0"/>
-          <w:color w:val="17252B"/>
+          <w:color w:val="131A17"/>
           <w:sz w:val="26"/>
         </w:rPr>
         <w:t>Replace the fragmented booking journey with one accessible flow, delivered in three reviewable stages.</w:t>
@@ -61,7 +61,7 @@
         <w:tc>
           <w:tcPr>
             <w:tcW w:type="dxa" w:w="6984"/>
-            <w:shd w:fill="145A45"/>
+            <w:shd w:fill="256E00"/>
           </w:tcPr>
           <w:p>
             <w:pPr>
@@ -104,7 +104,7 @@
               <w:rPr>
                 <w:rFonts w:ascii="Arial" w:hAnsi="Arial"/>
                 <w:b w:val="0"/>
-                <w:color w:val="17252B"/>
+                <w:color w:val="131A17"/>
                 <w:sz w:val="22"/>
               </w:rPr>
               <w:t>The fictional engagement covers research synthesis, interaction design and a tested frontend prototype for a neighborhood arts venue. Production integration is a separate engagement.</w:t>
@@ -122,380 +122,405 @@
           <w:rFonts w:ascii="Arial" w:hAnsi="Arial"/>
           <w:b w:val="0"/>
           <w:i w:val="0"/>
-          <w:color w:val="17252B"/>
+          <w:color w:val="131A17"/>
           <w:sz w:val="6"/>
         </w:rPr>
-      </w:r>
-    </w:p>
-    <w:p>
-      <w:pPr>
-        <w:pStyle w:val="Heading1"/>
-        <w:spacing w:after="80" w:line="269" w:lineRule="auto"/>
-      </w:pPr>
-      <w:r>
-        <w:rPr>
-          <w:rFonts w:ascii="Georgia" w:hAnsi="Georgia"/>
-          <w:b/>
-          <w:i w:val="0"/>
-          <w:color w:val="145A45"/>
-          <w:sz w:val="26"/>
-        </w:rPr>
-        <w:t>Included</w:t>
-      </w:r>
-    </w:p>
-    <w:p>
-      <w:pPr>
-        <w:spacing w:after="100" w:line="269" w:lineRule="auto"/>
-      </w:pPr>
-      <w:r>
-        <w:rPr>
-          <w:rFonts w:ascii="Arial" w:hAnsi="Arial"/>
-          <w:b w:val="0"/>
-          <w:i w:val="0"/>
-          <w:color w:val="17252B"/>
-          <w:sz w:val="21"/>
-        </w:rPr>
-        <w:t>Two stakeholder workshops, six core screens, responsive specifications, accessible component states and a documented prototype handoff.</w:t>
-      </w:r>
-    </w:p>
-    <w:p>
-      <w:pPr>
-        <w:pStyle w:val="Heading1"/>
-        <w:spacing w:after="80" w:line="269" w:lineRule="auto"/>
-      </w:pPr>
-      <w:r>
-        <w:rPr>
-          <w:rFonts w:ascii="Georgia" w:hAnsi="Georgia"/>
-          <w:b/>
-          <w:i w:val="0"/>
-          <w:color w:val="145A45"/>
-          <w:sz w:val="26"/>
-        </w:rPr>
-        <w:t>Working Together</w:t>
-      </w:r>
-    </w:p>
-    <w:p>
-      <w:pPr>
-        <w:spacing w:after="100" w:line="269" w:lineRule="auto"/>
-      </w:pPr>
-      <w:r>
-        <w:rPr>
-          <w:rFonts w:ascii="Arial" w:hAnsi="Arial"/>
-          <w:b w:val="0"/>
-          <w:i w:val="0"/>
-          <w:color w:val="17252B"/>
-          <w:sz w:val="21"/>
-        </w:rPr>
-        <w:t>One named decision owner consolidates feedback within three working days. Each stage ends with a review, not an implied approval.</w:t>
-      </w:r>
-    </w:p>
-    <w:p>
-      <w:pPr>
-        <w:pStyle w:val="Heading1"/>
-        <w:spacing w:after="80" w:line="269" w:lineRule="auto"/>
-      </w:pPr>
-      <w:r>
-        <w:rPr>
-          <w:rFonts w:ascii="Georgia" w:hAnsi="Georgia"/>
-          <w:b/>
-          <w:i w:val="0"/>
-          <w:color w:val="145A45"/>
-          <w:sz w:val="26"/>
-        </w:rPr>
-        <w:t>Commercial Terms</w:t>
-      </w:r>
-    </w:p>
-    <w:p>
-      <w:pPr>
-        <w:spacing w:after="100" w:line="269" w:lineRule="auto"/>
-      </w:pPr>
-      <w:r>
-        <w:rPr>
-          <w:rFonts w:ascii="Arial" w:hAnsi="Arial"/>
-          <w:b w:val="0"/>
-          <w:i w:val="0"/>
-          <w:color w:val="17252B"/>
-          <w:sz w:val="21"/>
-        </w:rPr>
-        <w:t>Invoices follow the milestones below. The estimate excludes taxes, third-party subscriptions, production hosting and changes outside the agreed six screens.</w:t>
       </w:r>
     </w:p>
     <w:tbl>
       <w:tblPr>
         <w:tblW w:type="auto" w:w="0"/>
-        <w:tblLayout w:type="fixed"/>
         <w:tblLook w:firstColumn="1" w:firstRow="1" w:lastColumn="0" w:lastRow="0" w:noHBand="0" w:noVBand="1" w:val="04A0"/>
-        <w:tblCellMar>
-          <w:top w:w="90" w:type="dxa"/>
-          <w:left w:w="90" w:type="dxa"/>
-          <w:bottom w:w="90" w:type="dxa"/>
-          <w:right w:w="90" w:type="dxa"/>
-        </w:tblCellMar>
       </w:tblPr>
       <w:tblGrid>
-        <w:gridCol w:w="3492"/>
-        <w:gridCol w:w="5587"/>
-        <w:gridCol w:w="4889"/>
+        <w:gridCol w:w="6624"/>
+        <w:gridCol w:w="6912"/>
       </w:tblGrid>
       <w:tr>
-        <w:trPr>
-          <w:cantSplit/>
-          <w:tblHeader/>
-        </w:trPr>
         <w:tc>
           <w:tcPr>
-            <w:tcW w:type="dxa" w:w="4656"/>
-            <w:shd w:fill="145A45"/>
+            <w:tcW w:type="dxa" w:w="6984"/>
           </w:tcPr>
+          <w:p/>
           <w:p>
             <w:pPr>
-              <w:spacing w:after="160" w:line="269" w:lineRule="auto"/>
+              <w:pStyle w:val="Heading1"/>
+              <w:spacing w:after="80" w:line="269" w:lineRule="auto"/>
+            </w:pPr>
+            <w:r>
+              <w:rPr>
+                <w:rFonts w:ascii="Georgia" w:hAnsi="Georgia"/>
+                <w:b/>
+                <w:i w:val="0"/>
+                <w:color w:val="256E00"/>
+                <w:sz w:val="26"/>
+              </w:rPr>
+              <w:t>Included</w:t>
+            </w:r>
+          </w:p>
+          <w:p>
+            <w:pPr>
+              <w:spacing w:after="100" w:line="269" w:lineRule="auto"/>
             </w:pPr>
             <w:r>
               <w:rPr>
                 <w:rFonts w:ascii="Arial" w:hAnsi="Arial"/>
+                <w:b w:val="0"/>
+                <w:i w:val="0"/>
+                <w:color w:val="131A17"/>
+                <w:sz w:val="21"/>
+              </w:rPr>
+              <w:t>Two stakeholder workshops, six core screens, responsive specifications, accessible component states and a documented prototype handoff.</w:t>
+            </w:r>
+          </w:p>
+          <w:p>
+            <w:pPr>
+              <w:pStyle w:val="Heading1"/>
+              <w:spacing w:after="80" w:line="269" w:lineRule="auto"/>
+            </w:pPr>
+            <w:r>
+              <w:rPr>
+                <w:rFonts w:ascii="Georgia" w:hAnsi="Georgia"/>
                 <w:b/>
-                <w:color w:val="FFFFFF"/>
-                <w:sz w:val="20"/>
+                <w:i w:val="0"/>
+                <w:color w:val="256E00"/>
+                <w:sz w:val="26"/>
               </w:rPr>
-              <w:t>Stage</w:t>
+              <w:t>Working Together</w:t>
+            </w:r>
+          </w:p>
+          <w:p>
+            <w:pPr>
+              <w:spacing w:after="100" w:line="269" w:lineRule="auto"/>
+            </w:pPr>
+            <w:r>
+              <w:rPr>
+                <w:rFonts w:ascii="Arial" w:hAnsi="Arial"/>
+                <w:b w:val="0"/>
+                <w:i w:val="0"/>
+                <w:color w:val="131A17"/>
+                <w:sz w:val="21"/>
+              </w:rPr>
+              <w:t>One named decision owner consolidates feedback within three working days. Each stage ends with a review, not an implied approval.</w:t>
+            </w:r>
+          </w:p>
+          <w:p>
+            <w:pPr>
+              <w:pStyle w:val="Heading1"/>
+              <w:spacing w:after="80" w:line="269" w:lineRule="auto"/>
+            </w:pPr>
+            <w:r>
+              <w:rPr>
+                <w:rFonts w:ascii="Georgia" w:hAnsi="Georgia"/>
+                <w:b/>
+                <w:i w:val="0"/>
+                <w:color w:val="256E00"/>
+                <w:sz w:val="26"/>
+              </w:rPr>
+              <w:t>Commercial Terms</w:t>
+            </w:r>
+          </w:p>
+          <w:p>
+            <w:pPr>
+              <w:spacing w:after="100" w:line="269" w:lineRule="auto"/>
+            </w:pPr>
+            <w:r>
+              <w:rPr>
+                <w:rFonts w:ascii="Arial" w:hAnsi="Arial"/>
+                <w:b w:val="0"/>
+                <w:i w:val="0"/>
+                <w:color w:val="131A17"/>
+                <w:sz w:val="21"/>
+              </w:rPr>
+              <w:t>Invoices follow the milestones below. The estimate excludes taxes, third-party subscriptions, production hosting and changes outside the agreed six screens.</w:t>
             </w:r>
           </w:p>
         </w:tc>
         <w:tc>
           <w:tcPr>
-            <w:tcW w:type="dxa" w:w="4656"/>
-            <w:shd w:fill="145A45"/>
+            <w:tcW w:type="dxa" w:w="6984"/>
           </w:tcPr>
-          <w:p>
-            <w:pPr>
-              <w:spacing w:after="160" w:line="269" w:lineRule="auto"/>
-            </w:pPr>
-            <w:r>
-              <w:rPr>
-                <w:rFonts w:ascii="Arial" w:hAnsi="Arial"/>
-                <w:b/>
-                <w:color w:val="FFFFFF"/>
-                <w:sz w:val="20"/>
-              </w:rPr>
-              <w:t>Deliverable</w:t>
-            </w:r>
-          </w:p>
-        </w:tc>
-        <w:tc>
-          <w:tcPr>
-            <w:tcW w:type="dxa" w:w="4656"/>
-            <w:shd w:fill="145A45"/>
-          </w:tcPr>
-          <w:p>
-            <w:pPr>
-              <w:spacing w:after="160" w:line="269" w:lineRule="auto"/>
-            </w:pPr>
-            <w:r>
-              <w:rPr>
-                <w:rFonts w:ascii="Arial" w:hAnsi="Arial"/>
-                <w:b/>
-                <w:color w:val="FFFFFF"/>
-                <w:sz w:val="20"/>
-              </w:rPr>
-              <w:t>Fee</w:t>
-            </w:r>
-          </w:p>
-        </w:tc>
-      </w:tr>
-      <w:tr>
-        <w:trPr>
-          <w:cantSplit/>
-        </w:trPr>
-        <w:tc>
-          <w:tcPr>
-            <w:tcW w:type="dxa" w:w="3492"/>
-            <w:shd w:fill="F1F6E9"/>
-          </w:tcPr>
-          <w:p>
-            <w:pPr>
-              <w:spacing w:after="160" w:line="269" w:lineRule="auto"/>
-            </w:pPr>
-            <w:r>
-              <w:rPr>
-                <w:rFonts w:ascii="Arial" w:hAnsi="Arial"/>
-                <w:b/>
-                <w:color w:val="17252B"/>
-                <w:sz w:val="20"/>
-              </w:rPr>
-              <w:t>01 Discover</w:t>
-            </w:r>
-          </w:p>
-        </w:tc>
-        <w:tc>
-          <w:tcPr>
-            <w:tcW w:type="dxa" w:w="5587"/>
-            <w:shd w:fill="F1F6E9"/>
-          </w:tcPr>
-          <w:p>
-            <w:pPr>
-              <w:spacing w:after="160" w:line="269" w:lineRule="auto"/>
-            </w:pPr>
-            <w:r>
-              <w:rPr>
-                <w:rFonts w:ascii="Arial" w:hAnsi="Arial"/>
-                <w:b w:val="0"/>
-                <w:color w:val="17252B"/>
-                <w:sz w:val="20"/>
-              </w:rPr>
-              <w:t>Journey and success measures</w:t>
-            </w:r>
-          </w:p>
-        </w:tc>
-        <w:tc>
-          <w:tcPr>
-            <w:tcW w:type="dxa" w:w="4889"/>
-            <w:shd w:fill="F1F6E9"/>
-          </w:tcPr>
-          <w:p>
-            <w:pPr>
-              <w:spacing w:after="160" w:line="269" w:lineRule="auto"/>
-            </w:pPr>
-            <w:r>
-              <w:rPr>
-                <w:rFonts w:ascii="Arial" w:hAnsi="Arial"/>
-                <w:b w:val="0"/>
-                <w:color w:val="17252B"/>
-                <w:sz w:val="20"/>
-              </w:rPr>
-              <w:t>$6,000</w:t>
-            </w:r>
-          </w:p>
-        </w:tc>
-      </w:tr>
-      <w:tr>
-        <w:trPr>
-          <w:cantSplit/>
-        </w:trPr>
-        <w:tc>
-          <w:tcPr>
-            <w:tcW w:type="dxa" w:w="3492"/>
-            <w:shd w:fill="FFFFFF"/>
-          </w:tcPr>
-          <w:p>
-            <w:pPr>
-              <w:spacing w:after="160" w:line="269" w:lineRule="auto"/>
-            </w:pPr>
-            <w:r>
-              <w:rPr>
-                <w:rFonts w:ascii="Arial" w:hAnsi="Arial"/>
-                <w:b/>
-                <w:color w:val="17252B"/>
-                <w:sz w:val="20"/>
-              </w:rPr>
-              <w:t>02 Design</w:t>
-            </w:r>
-          </w:p>
-        </w:tc>
-        <w:tc>
-          <w:tcPr>
-            <w:tcW w:type="dxa" w:w="5587"/>
-            <w:shd w:fill="FFFFFF"/>
-          </w:tcPr>
-          <w:p>
-            <w:pPr>
-              <w:spacing w:after="160" w:line="269" w:lineRule="auto"/>
-            </w:pPr>
-            <w:r>
-              <w:rPr>
-                <w:rFonts w:ascii="Arial" w:hAnsi="Arial"/>
-                <w:b w:val="0"/>
-                <w:color w:val="17252B"/>
-                <w:sz w:val="20"/>
-              </w:rPr>
-              <w:t>Six screens and component states</w:t>
-            </w:r>
-          </w:p>
-        </w:tc>
-        <w:tc>
-          <w:tcPr>
-            <w:tcW w:type="dxa" w:w="4889"/>
-            <w:shd w:fill="FFFFFF"/>
-          </w:tcPr>
-          <w:p>
-            <w:pPr>
-              <w:spacing w:after="160" w:line="269" w:lineRule="auto"/>
-            </w:pPr>
-            <w:r>
-              <w:rPr>
-                <w:rFonts w:ascii="Arial" w:hAnsi="Arial"/>
-                <w:b w:val="0"/>
-                <w:color w:val="17252B"/>
-                <w:sz w:val="20"/>
-              </w:rPr>
-              <w:t>$10,000</w:t>
-            </w:r>
-          </w:p>
-        </w:tc>
-      </w:tr>
-      <w:tr>
-        <w:trPr>
-          <w:cantSplit/>
-        </w:trPr>
-        <w:tc>
-          <w:tcPr>
-            <w:tcW w:type="dxa" w:w="3492"/>
-            <w:shd w:fill="F1F6E9"/>
-          </w:tcPr>
-          <w:p>
-            <w:pPr>
-              <w:spacing w:after="160" w:line="269" w:lineRule="auto"/>
-            </w:pPr>
-            <w:r>
-              <w:rPr>
-                <w:rFonts w:ascii="Arial" w:hAnsi="Arial"/>
-                <w:b/>
-                <w:color w:val="17252B"/>
-                <w:sz w:val="20"/>
-              </w:rPr>
-              <w:t>03 Validate</w:t>
-            </w:r>
-          </w:p>
-        </w:tc>
-        <w:tc>
-          <w:tcPr>
-            <w:tcW w:type="dxa" w:w="5587"/>
-            <w:shd w:fill="F1F6E9"/>
-          </w:tcPr>
-          <w:p>
-            <w:pPr>
-              <w:spacing w:after="160" w:line="269" w:lineRule="auto"/>
-            </w:pPr>
-            <w:r>
-              <w:rPr>
-                <w:rFonts w:ascii="Arial" w:hAnsi="Arial"/>
-                <w:b w:val="0"/>
-                <w:color w:val="17252B"/>
-                <w:sz w:val="20"/>
-              </w:rPr>
-              <w:t>Prototype and handoff</w:t>
-            </w:r>
-          </w:p>
-        </w:tc>
-        <w:tc>
-          <w:tcPr>
-            <w:tcW w:type="dxa" w:w="4889"/>
-            <w:shd w:fill="F1F6E9"/>
-          </w:tcPr>
-          <w:p>
-            <w:pPr>
-              <w:spacing w:after="160" w:line="269" w:lineRule="auto"/>
-            </w:pPr>
-            <w:r>
-              <w:rPr>
-                <w:rFonts w:ascii="Arial" w:hAnsi="Arial"/>
-                <w:b w:val="0"/>
-                <w:color w:val="17252B"/>
-                <w:sz w:val="20"/>
-              </w:rPr>
-              <w:t>$8,000</w:t>
-            </w:r>
-          </w:p>
+          <w:p/>
+          <w:tbl>
+            <w:tblPr>
+              <w:tblW w:type="auto" w:w="0"/>
+              <w:tblLayout w:type="fixed"/>
+              <w:tblLook w:firstColumn="1" w:firstRow="1" w:lastColumn="0" w:lastRow="0" w:noHBand="0" w:noVBand="1" w:val="04A0"/>
+              <w:tblCellMar>
+                <w:top w:w="90" w:type="dxa"/>
+                <w:left w:w="90" w:type="dxa"/>
+                <w:bottom w:w="90" w:type="dxa"/>
+                <w:right w:w="90" w:type="dxa"/>
+              </w:tblCellMar>
+            </w:tblPr>
+            <w:tblGrid>
+              <w:gridCol w:w="1512"/>
+              <w:gridCol w:w="3240"/>
+              <w:gridCol w:w="1656"/>
+            </w:tblGrid>
+            <w:tr>
+              <w:trPr>
+                <w:cantSplit/>
+                <w:tblHeader/>
+              </w:trPr>
+              <w:tc>
+                <w:tcPr>
+                  <w:tcW w:type="dxa" w:w="1512"/>
+                  <w:shd w:fill="256E00"/>
+                </w:tcPr>
+                <w:p>
+                  <w:pPr>
+                    <w:spacing w:after="160" w:line="269" w:lineRule="auto"/>
+                  </w:pPr>
+                  <w:r>
+                    <w:rPr>
+                      <w:rFonts w:ascii="Arial" w:hAnsi="Arial"/>
+                      <w:b/>
+                      <w:color w:val="FFFFFF"/>
+                      <w:sz w:val="20"/>
+                    </w:rPr>
+                    <w:t>Stage</w:t>
+                  </w:r>
+                </w:p>
+              </w:tc>
+              <w:tc>
+                <w:tcPr>
+                  <w:tcW w:type="dxa" w:w="3240"/>
+                  <w:shd w:fill="256E00"/>
+                </w:tcPr>
+                <w:p>
+                  <w:pPr>
+                    <w:spacing w:after="160" w:line="269" w:lineRule="auto"/>
+                  </w:pPr>
+                  <w:r>
+                    <w:rPr>
+                      <w:rFonts w:ascii="Arial" w:hAnsi="Arial"/>
+                      <w:b/>
+                      <w:color w:val="FFFFFF"/>
+                      <w:sz w:val="20"/>
+                    </w:rPr>
+                    <w:t>Deliverable</w:t>
+                  </w:r>
+                </w:p>
+              </w:tc>
+              <w:tc>
+                <w:tcPr>
+                  <w:tcW w:type="dxa" w:w="1656"/>
+                  <w:shd w:fill="256E00"/>
+                </w:tcPr>
+                <w:p>
+                  <w:pPr>
+                    <w:spacing w:after="160" w:line="269" w:lineRule="auto"/>
+                  </w:pPr>
+                  <w:r>
+                    <w:rPr>
+                      <w:rFonts w:ascii="Arial" w:hAnsi="Arial"/>
+                      <w:b/>
+                      <w:color w:val="FFFFFF"/>
+                      <w:sz w:val="20"/>
+                    </w:rPr>
+                    <w:t>Fee</w:t>
+                  </w:r>
+                </w:p>
+              </w:tc>
+            </w:tr>
+            <w:tr>
+              <w:trPr>
+                <w:cantSplit/>
+              </w:trPr>
+              <w:tc>
+                <w:tcPr>
+                  <w:tcW w:type="dxa" w:w="1512"/>
+                  <w:shd w:fill="C9FF32"/>
+                </w:tcPr>
+                <w:p>
+                  <w:pPr>
+                    <w:spacing w:after="160" w:line="269" w:lineRule="auto"/>
+                  </w:pPr>
+                  <w:r>
+                    <w:rPr>
+                      <w:rFonts w:ascii="Arial" w:hAnsi="Arial"/>
+                      <w:b/>
+                      <w:color w:val="131A17"/>
+                      <w:sz w:val="20"/>
+                    </w:rPr>
+                    <w:t>01 Discover</w:t>
+                  </w:r>
+                </w:p>
+              </w:tc>
+              <w:tc>
+                <w:tcPr>
+                  <w:tcW w:type="dxa" w:w="3240"/>
+                  <w:shd w:fill="C9FF32"/>
+                </w:tcPr>
+                <w:p>
+                  <w:pPr>
+                    <w:spacing w:after="160" w:line="269" w:lineRule="auto"/>
+                  </w:pPr>
+                  <w:r>
+                    <w:rPr>
+                      <w:rFonts w:ascii="Arial" w:hAnsi="Arial"/>
+                      <w:b w:val="0"/>
+                      <w:color w:val="131A17"/>
+                      <w:sz w:val="20"/>
+                    </w:rPr>
+                    <w:t>Journey and success measures</w:t>
+                  </w:r>
+                </w:p>
+              </w:tc>
+              <w:tc>
+                <w:tcPr>
+                  <w:tcW w:type="dxa" w:w="1656"/>
+                  <w:shd w:fill="C9FF32"/>
+                </w:tcPr>
+                <w:p>
+                  <w:pPr>
+                    <w:spacing w:after="160" w:line="269" w:lineRule="auto"/>
+                  </w:pPr>
+                  <w:r>
+                    <w:rPr>
+                      <w:rFonts w:ascii="Arial" w:hAnsi="Arial"/>
+                      <w:b w:val="0"/>
+                      <w:color w:val="131A17"/>
+                      <w:sz w:val="20"/>
+                    </w:rPr>
+                    <w:t>$6,000</w:t>
+                  </w:r>
+                </w:p>
+              </w:tc>
+            </w:tr>
+            <w:tr>
+              <w:trPr>
+                <w:cantSplit/>
+              </w:trPr>
+              <w:tc>
+                <w:tcPr>
+                  <w:tcW w:type="dxa" w:w="1512"/>
+                  <w:shd w:fill="FFFFFF"/>
+                </w:tcPr>
+                <w:p>
+                  <w:pPr>
+                    <w:spacing w:after="160" w:line="269" w:lineRule="auto"/>
+                  </w:pPr>
+                  <w:r>
+                    <w:rPr>
+                      <w:rFonts w:ascii="Arial" w:hAnsi="Arial"/>
+                      <w:b/>
+                      <w:color w:val="131A17"/>
+                      <w:sz w:val="20"/>
+                    </w:rPr>
+                    <w:t>02 Design</w:t>
+                  </w:r>
+                </w:p>
+              </w:tc>
+              <w:tc>
+                <w:tcPr>
+                  <w:tcW w:type="dxa" w:w="3240"/>
+                  <w:shd w:fill="FFFFFF"/>
+                </w:tcPr>
+                <w:p>
+                  <w:pPr>
+                    <w:spacing w:after="160" w:line="269" w:lineRule="auto"/>
+                  </w:pPr>
+                  <w:r>
+                    <w:rPr>
+                      <w:rFonts w:ascii="Arial" w:hAnsi="Arial"/>
+                      <w:b w:val="0"/>
+                      <w:color w:val="131A17"/>
+                      <w:sz w:val="20"/>
+                    </w:rPr>
+                    <w:t>Six screens and component states</w:t>
+                  </w:r>
+                </w:p>
+              </w:tc>
+              <w:tc>
+                <w:tcPr>
+                  <w:tcW w:type="dxa" w:w="1656"/>
+                  <w:shd w:fill="FFFFFF"/>
+                </w:tcPr>
+                <w:p>
+                  <w:pPr>
+                    <w:spacing w:after="160" w:line="269" w:lineRule="auto"/>
+                  </w:pPr>
+                  <w:r>
+                    <w:rPr>
+                      <w:rFonts w:ascii="Arial" w:hAnsi="Arial"/>
+                      <w:b w:val="0"/>
+                      <w:color w:val="131A17"/>
+                      <w:sz w:val="20"/>
+                    </w:rPr>
+                    <w:t>$10,000</w:t>
+                  </w:r>
+                </w:p>
+              </w:tc>
+            </w:tr>
+            <w:tr>
+              <w:trPr>
+                <w:cantSplit/>
+              </w:trPr>
+              <w:tc>
+                <w:tcPr>
+                  <w:tcW w:type="dxa" w:w="1512"/>
+                  <w:shd w:fill="C9FF32"/>
+                </w:tcPr>
+                <w:p>
+                  <w:pPr>
+                    <w:spacing w:after="160" w:line="269" w:lineRule="auto"/>
+                  </w:pPr>
+                  <w:r>
+                    <w:rPr>
+                      <w:rFonts w:ascii="Arial" w:hAnsi="Arial"/>
+                      <w:b/>
+                      <w:color w:val="131A17"/>
+                      <w:sz w:val="20"/>
+                    </w:rPr>
+                    <w:t>03 Validate</w:t>
+                  </w:r>
+                </w:p>
+              </w:tc>
+              <w:tc>
+                <w:tcPr>
+                  <w:tcW w:type="dxa" w:w="3240"/>
+                  <w:shd w:fill="C9FF32"/>
+                </w:tcPr>
+                <w:p>
+                  <w:pPr>
+                    <w:spacing w:after="160" w:line="269" w:lineRule="auto"/>
+                  </w:pPr>
+                  <w:r>
+                    <w:rPr>
+                      <w:rFonts w:ascii="Arial" w:hAnsi="Arial"/>
+                      <w:b w:val="0"/>
+                      <w:color w:val="131A17"/>
+                      <w:sz w:val="20"/>
+                    </w:rPr>
+                    <w:t>Prototype and handoff</w:t>
+                  </w:r>
+                </w:p>
+              </w:tc>
+              <w:tc>
+                <w:tcPr>
+                  <w:tcW w:type="dxa" w:w="1656"/>
+                  <w:shd w:fill="C9FF32"/>
+                </w:tcPr>
+                <w:p>
+                  <w:pPr>
+                    <w:spacing w:after="160" w:line="269" w:lineRule="auto"/>
+                  </w:pPr>
+                  <w:r>
+                    <w:rPr>
+                      <w:rFonts w:ascii="Arial" w:hAnsi="Arial"/>
+                      <w:b w:val="0"/>
+                      <w:color w:val="131A17"/>
+                      <w:sz w:val="20"/>
+                    </w:rPr>
+                    <w:t>$8,000</w:t>
+                  </w:r>
+                </w:p>
+              </w:tc>
+            </w:tr>
+          </w:tbl>
+          <w:p/>
         </w:tc>
       </w:tr>
     </w:tbl>
@@ -508,7 +533,7 @@
           <w:rFonts w:ascii="Arial" w:hAnsi="Arial"/>
           <w:b/>
           <w:i w:val="0"/>
-          <w:color w:val="145A45"/>
+          <w:color w:val="256E00"/>
           <w:sz w:val="18"/>
         </w:rPr>
         <w:t>Offer valid for 30 days · Start date follows written acceptance.</w:t>
@@ -516,6 +541,7 @@
     </w:p>
     <w:sectPr>
       <w:footerReference w:type="default" r:id="rId9"/>
+      <w:headerReference w:type="default" r:id="rId10"/>
       <w:pgSz w:w="15840" w:h="12240"/>
       <w:pgMar w:top="648" w:right="936" w:bottom="648" w:left="936" w:header="720" w:footer="720" w:gutter="0"/>
       <w:cols w:space="720"/>
@@ -533,13 +559,30 @@
     </w:pPr>
     <w:r>
       <w:rPr>
-        <w:color w:val="145A45"/>
+        <w:color w:val="131A17"/>
         <w:sz w:val="16"/>
       </w:rPr>
       <w:t>DAZZLER  /  FICTIONAL EXAMPLE  /  BUSINESS</w:t>
     </w:r>
   </w:p>
 </w:ftr>
+</file>
+
+<file path=word/header1.xml><?xml version="1.0" encoding="utf-8"?>
+<w:hdr xmlns:m="http://schemas.openxmlformats.org/officeDocument/2006/math" xmlns:mc="http://schemas.openxmlformats.org/markup-compatibility/2006" xmlns:mo="http://schemas.microsoft.com/office/mac/office/2008/main" xmlns:mv="urn:schemas-microsoft-com:mac:vml" xmlns:o="urn:schemas-microsoft-com:office:office" xmlns:r="http://schemas.openxmlformats.org/officeDocument/2006/relationships" xmlns:v="urn:schemas-microsoft-com:vml" xmlns:w10="urn:schemas-microsoft-com:office:word" xmlns:w14="http://schemas.microsoft.com/office/word/2010/wordml" xmlns:w="http://schemas.openxmlformats.org/wordprocessingml/2006/main" xmlns:wne="http://schemas.microsoft.com/office/word/2006/wordml" xmlns:wp14="http://schemas.microsoft.com/office/word/2010/wordprocessingDrawing" xmlns:wp="http://schemas.openxmlformats.org/drawingml/2006/wordprocessingDrawing" xmlns:wpc="http://schemas.microsoft.com/office/word/2010/wordprocessingCanvas" xmlns:wpg="http://schemas.microsoft.com/office/word/2010/wordprocessingGroup" xmlns:wpi="http://schemas.microsoft.com/office/word/2010/wordprocessingInk" xmlns:wps="http://schemas.microsoft.com/office/word/2010/wordprocessingShape" mc:Ignorable="w14 wp14">
+  <w:p>
+    <w:pPr>
+      <w:pStyle w:val="Header"/>
+    </w:pPr>
+    <w:r>
+      <w:pict>
+        <v:rect id="DazzlerPageSurface" style="position:absolute;margin-left:0;margin-top:0;width:792.0pt;height:612.0pt;z-index:-251654144;mso-position-horizontal-relative:page;mso-position-vertical-relative:page" fillcolor="#C9FF32" stroked="f">
+          <v:fill color="#C9FF32"/>
+        </v:rect>
+      </w:pict>
+    </w:r>
+  </w:p>
+</w:hdr>
 </file>
 
 <file path=word/numbering.xml><?xml version="1.0" encoding="utf-8"?>

</xml_diff>

<commit_message>
Prepare 0.29.0 with public recipe provenance and rebuilt gallery
</commit_message>
<xml_diff>
--- a/docs/templates/docx/business.docx
+++ b/docs/templates/docx/business.docx
@@ -4,48 +4,87 @@
   <w:body>
     <w:p>
       <w:pPr>
-        <w:spacing w:after="280" w:line="269" w:lineRule="auto"/>
+        <w:spacing w:after="140" w:line="269" w:lineRule="auto"/>
       </w:pPr>
       <w:r>
         <w:rPr>
-          <w:rFonts w:ascii="Arial" w:hAnsi="Arial"/>
+          <w:rFonts w:ascii="Georgia" w:hAnsi="Georgia"/>
           <w:b/>
-          <w:i w:val="0"/>
-          <w:color w:val="256E00"/>
+          <w:color w:val="006548"/>
           <w:sz w:val="18"/>
         </w:rPr>
-        <w:t>JUNIPER / SCOPE 014</w:t>
+        <w:t>JUNIPER / SCOPE 014 / THE FEE WATERFALL</w:t>
       </w:r>
     </w:p>
     <w:p>
       <w:pPr>
         <w:pStyle w:val="Title"/>
-        <w:spacing w:after="160" w:line="269" w:lineRule="auto"/>
+        <w:spacing w:after="140" w:line="269" w:lineRule="auto"/>
       </w:pPr>
       <w:r>
         <w:rPr>
           <w:rFonts w:ascii="Georgia" w:hAnsi="Georgia"/>
           <w:b/>
-          <w:i w:val="0"/>
-          <w:color w:val="256E00"/>
-          <w:sz w:val="68"/>
+          <w:color w:val="000000"/>
+          <w:sz w:val="64"/>
         </w:rPr>
         <w:t>Juniper Studio Service Proposal</w:t>
       </w:r>
     </w:p>
     <w:p>
       <w:pPr>
-        <w:spacing w:after="280" w:line="269" w:lineRule="auto"/>
+        <w:spacing w:after="140" w:line="269" w:lineRule="auto"/>
+      </w:pPr>
+      <w:r>
+        <w:rPr>
+          <w:rFonts w:ascii="Georgia" w:hAnsi="Georgia"/>
+          <w:b/>
+          <w:color w:val="006548"/>
+          <w:sz w:val="24"/>
+        </w:rPr>
+        <w:t>Replace the fragmented booking journey with one accessible flow, delivered in three reviewable stages.</w:t>
+      </w:r>
+    </w:p>
+    <w:p>
+      <w:pPr>
+        <w:spacing w:after="140" w:line="269" w:lineRule="auto"/>
+      </w:pPr>
+      <w:r>
+        <w:rPr>
+          <w:rFonts w:ascii="Georgia" w:hAnsi="Georgia"/>
+          <w:b/>
+          <w:color w:val="006548"/>
+          <w:sz w:val="92"/>
+        </w:rPr>
+        <w:t>$24,000</w:t>
+      </w:r>
+    </w:p>
+    <w:p>
+      <w:pPr>
+        <w:spacing w:after="140" w:line="269" w:lineRule="auto"/>
       </w:pPr>
       <w:r>
         <w:rPr>
           <w:rFonts w:ascii="Georgia" w:hAnsi="Georgia"/>
           <w:b w:val="0"/>
-          <w:i w:val="0"/>
-          <w:color w:val="131A17"/>
-          <w:sz w:val="26"/>
+          <w:color w:val="17212B"/>
+          <w:sz w:val="22"/>
         </w:rPr>
-        <w:t>Replace the fragmented booking journey with one accessible flow, delivered in three reviewable stages.</w:t>
+        <w:t>fixed fee for the defined scope</w:t>
+      </w:r>
+    </w:p>
+    <w:p>
+      <w:pPr>
+        <w:spacing w:after="140" w:line="269" w:lineRule="auto"/>
+      </w:pPr>
+      <w:r>
+        <w:rPr>
+          <w:rFonts w:ascii="Georgia" w:hAnsi="Georgia"/>
+          <w:b w:val="0"/>
+          <w:color w:val="17212B"/>
+          <w:sz w:val="22"/>
+        </w:rPr>
+        <w:t>The fictional engagement covers research synthesis, interaction design and a tested frontend prototype for a neighborhood arts venue. Production integration is a separate engagement.</w:t>
       </w:r>
     </w:p>
     <w:tbl>
@@ -54,60 +93,257 @@
         <w:tblLook w:firstColumn="1" w:firstRow="1" w:lastColumn="0" w:lastRow="0" w:noHBand="0" w:noVBand="1" w:val="04A0"/>
       </w:tblPr>
       <w:tblGrid>
-        <w:gridCol w:w="3024"/>
-        <w:gridCol w:w="6984"/>
+        <w:gridCol w:w="3408"/>
+        <w:gridCol w:w="3408"/>
+        <w:gridCol w:w="3408"/>
       </w:tblGrid>
       <w:tr>
+        <w:trPr>
+          <w:tblHeader/>
+        </w:trPr>
         <w:tc>
           <w:tcPr>
-            <w:tcW w:type="dxa" w:w="6984"/>
-            <w:shd w:fill="256E00"/>
+            <w:tcW w:type="dxa" w:w="3408"/>
+            <w:shd w:fill="006548"/>
           </w:tcPr>
           <w:p>
             <w:pPr>
-              <w:spacing w:after="160" w:line="269" w:lineRule="auto"/>
+              <w:spacing w:after="160" w:before="100"/>
             </w:pPr>
             <w:r>
               <w:rPr>
                 <w:rFonts w:ascii="Georgia" w:hAnsi="Georgia"/>
                 <w:b/>
                 <w:color w:val="FFFFFF"/>
-                <w:sz w:val="64"/>
-              </w:rPr>
-              <w:t>$24,000</w:t>
-            </w:r>
-          </w:p>
-          <w:p>
-            <w:pPr>
-              <w:spacing w:after="160" w:line="269" w:lineRule="auto"/>
-            </w:pPr>
-            <w:r>
-              <w:rPr>
-                <w:rFonts w:ascii="Arial" w:hAnsi="Arial"/>
-                <w:b w:val="0"/>
-                <w:color w:val="FFFFFF"/>
                 <w:sz w:val="20"/>
               </w:rPr>
-              <w:t>fixed fee for the defined scope</w:t>
+              <w:t>Stage</w:t>
             </w:r>
           </w:p>
         </w:tc>
         <w:tc>
           <w:tcPr>
-            <w:tcW w:type="dxa" w:w="6984"/>
+            <w:tcW w:type="dxa" w:w="3408"/>
+            <w:shd w:fill="006548"/>
           </w:tcPr>
           <w:p>
             <w:pPr>
-              <w:spacing w:after="160" w:line="269" w:lineRule="auto"/>
+              <w:spacing w:after="160" w:before="100"/>
             </w:pPr>
             <w:r>
               <w:rPr>
-                <w:rFonts w:ascii="Arial" w:hAnsi="Arial"/>
+                <w:rFonts w:ascii="Georgia" w:hAnsi="Georgia"/>
+                <w:b/>
+                <w:color w:val="FFFFFF"/>
+                <w:sz w:val="20"/>
+              </w:rPr>
+              <w:t>Deliverable</w:t>
+            </w:r>
+          </w:p>
+        </w:tc>
+        <w:tc>
+          <w:tcPr>
+            <w:tcW w:type="dxa" w:w="3408"/>
+            <w:shd w:fill="006548"/>
+          </w:tcPr>
+          <w:p>
+            <w:pPr>
+              <w:spacing w:after="160" w:before="100"/>
+            </w:pPr>
+            <w:r>
+              <w:rPr>
+                <w:rFonts w:ascii="Georgia" w:hAnsi="Georgia"/>
+                <w:b/>
+                <w:color w:val="FFFFFF"/>
+                <w:sz w:val="20"/>
+              </w:rPr>
+              <w:t>Fee</w:t>
+            </w:r>
+          </w:p>
+        </w:tc>
+      </w:tr>
+      <w:tr>
+        <w:tc>
+          <w:tcPr>
+            <w:tcW w:type="dxa" w:w="3408"/>
+            <w:shd w:fill="E5FF3D"/>
+          </w:tcPr>
+          <w:p>
+            <w:pPr>
+              <w:spacing w:after="160" w:before="100"/>
+            </w:pPr>
+            <w:r>
+              <w:rPr>
+                <w:rFonts w:ascii="Georgia" w:hAnsi="Georgia"/>
                 <w:b w:val="0"/>
-                <w:color w:val="131A17"/>
-                <w:sz w:val="22"/>
+                <w:color w:val="17212B"/>
+                <w:sz w:val="20"/>
               </w:rPr>
-              <w:t>The fictional engagement covers research synthesis, interaction design and a tested frontend prototype for a neighborhood arts venue. Production integration is a separate engagement.</w:t>
+              <w:t>01 Discover</w:t>
+            </w:r>
+          </w:p>
+        </w:tc>
+        <w:tc>
+          <w:tcPr>
+            <w:tcW w:type="dxa" w:w="3408"/>
+            <w:shd w:fill="E5FF3D"/>
+          </w:tcPr>
+          <w:p>
+            <w:pPr>
+              <w:spacing w:after="160" w:before="100"/>
+            </w:pPr>
+            <w:r>
+              <w:rPr>
+                <w:rFonts w:ascii="Georgia" w:hAnsi="Georgia"/>
+                <w:b w:val="0"/>
+                <w:color w:val="17212B"/>
+                <w:sz w:val="20"/>
+              </w:rPr>
+              <w:t>Journey and success measures</w:t>
+            </w:r>
+          </w:p>
+        </w:tc>
+        <w:tc>
+          <w:tcPr>
+            <w:tcW w:type="dxa" w:w="3408"/>
+            <w:shd w:fill="E5FF3D"/>
+          </w:tcPr>
+          <w:p>
+            <w:pPr>
+              <w:spacing w:after="160" w:before="100"/>
+            </w:pPr>
+            <w:r>
+              <w:rPr>
+                <w:rFonts w:ascii="Georgia" w:hAnsi="Georgia"/>
+                <w:b w:val="0"/>
+                <w:color w:val="17212B"/>
+                <w:sz w:val="20"/>
+              </w:rPr>
+              <w:t>$6,000</w:t>
+            </w:r>
+          </w:p>
+        </w:tc>
+      </w:tr>
+      <w:tr>
+        <w:tc>
+          <w:tcPr>
+            <w:tcW w:type="dxa" w:w="3408"/>
+            <w:shd w:fill="FFFFFF"/>
+          </w:tcPr>
+          <w:p>
+            <w:pPr>
+              <w:spacing w:after="160" w:before="100"/>
+            </w:pPr>
+            <w:r>
+              <w:rPr>
+                <w:rFonts w:ascii="Georgia" w:hAnsi="Georgia"/>
+                <w:b w:val="0"/>
+                <w:color w:val="17212B"/>
+                <w:sz w:val="20"/>
+              </w:rPr>
+              <w:t>02 Design</w:t>
+            </w:r>
+          </w:p>
+        </w:tc>
+        <w:tc>
+          <w:tcPr>
+            <w:tcW w:type="dxa" w:w="3408"/>
+            <w:shd w:fill="FFFFFF"/>
+          </w:tcPr>
+          <w:p>
+            <w:pPr>
+              <w:spacing w:after="160" w:before="100"/>
+            </w:pPr>
+            <w:r>
+              <w:rPr>
+                <w:rFonts w:ascii="Georgia" w:hAnsi="Georgia"/>
+                <w:b w:val="0"/>
+                <w:color w:val="17212B"/>
+                <w:sz w:val="20"/>
+              </w:rPr>
+              <w:t>Six screens and component states</w:t>
+            </w:r>
+          </w:p>
+        </w:tc>
+        <w:tc>
+          <w:tcPr>
+            <w:tcW w:type="dxa" w:w="3408"/>
+            <w:shd w:fill="FFFFFF"/>
+          </w:tcPr>
+          <w:p>
+            <w:pPr>
+              <w:spacing w:after="160" w:before="100"/>
+            </w:pPr>
+            <w:r>
+              <w:rPr>
+                <w:rFonts w:ascii="Georgia" w:hAnsi="Georgia"/>
+                <w:b w:val="0"/>
+                <w:color w:val="17212B"/>
+                <w:sz w:val="20"/>
+              </w:rPr>
+              <w:t>$10,000</w:t>
+            </w:r>
+          </w:p>
+        </w:tc>
+      </w:tr>
+      <w:tr>
+        <w:tc>
+          <w:tcPr>
+            <w:tcW w:type="dxa" w:w="3408"/>
+            <w:shd w:fill="E5FF3D"/>
+          </w:tcPr>
+          <w:p>
+            <w:pPr>
+              <w:spacing w:after="160" w:before="100"/>
+            </w:pPr>
+            <w:r>
+              <w:rPr>
+                <w:rFonts w:ascii="Georgia" w:hAnsi="Georgia"/>
+                <w:b w:val="0"/>
+                <w:color w:val="17212B"/>
+                <w:sz w:val="20"/>
+              </w:rPr>
+              <w:t>03 Validate</w:t>
+            </w:r>
+          </w:p>
+        </w:tc>
+        <w:tc>
+          <w:tcPr>
+            <w:tcW w:type="dxa" w:w="3408"/>
+            <w:shd w:fill="E5FF3D"/>
+          </w:tcPr>
+          <w:p>
+            <w:pPr>
+              <w:spacing w:after="160" w:before="100"/>
+            </w:pPr>
+            <w:r>
+              <w:rPr>
+                <w:rFonts w:ascii="Georgia" w:hAnsi="Georgia"/>
+                <w:b w:val="0"/>
+                <w:color w:val="17212B"/>
+                <w:sz w:val="20"/>
+              </w:rPr>
+              <w:t>Prototype and handoff</w:t>
+            </w:r>
+          </w:p>
+        </w:tc>
+        <w:tc>
+          <w:tcPr>
+            <w:tcW w:type="dxa" w:w="3408"/>
+            <w:shd w:fill="E5FF3D"/>
+          </w:tcPr>
+          <w:p>
+            <w:pPr>
+              <w:spacing w:after="160" w:before="100"/>
+            </w:pPr>
+            <w:r>
+              <w:rPr>
+                <w:rFonts w:ascii="Georgia" w:hAnsi="Georgia"/>
+                <w:b w:val="0"/>
+                <w:color w:val="17212B"/>
+                <w:sz w:val="20"/>
+              </w:rPr>
+              <w:t>$8,000</w:t>
             </w:r>
           </w:p>
         </w:tc>
@@ -115,435 +351,109 @@
     </w:tbl>
     <w:p>
       <w:pPr>
-        <w:spacing w:after="40" w:line="269" w:lineRule="auto"/>
+        <w:pStyle w:val="Heading1"/>
+        <w:spacing w:after="140" w:line="269" w:lineRule="auto"/>
       </w:pPr>
       <w:r>
         <w:rPr>
-          <w:rFonts w:ascii="Arial" w:hAnsi="Arial"/>
-          <w:b w:val="0"/>
-          <w:i w:val="0"/>
-          <w:color w:val="131A17"/>
-          <w:sz w:val="6"/>
+          <w:rFonts w:ascii="Georgia" w:hAnsi="Georgia"/>
+          <w:b/>
+          <w:color w:val="006548"/>
+          <w:sz w:val="30"/>
         </w:rPr>
+        <w:t>Included</w:t>
       </w:r>
     </w:p>
-    <w:tbl>
-      <w:tblPr>
-        <w:tblW w:type="auto" w:w="0"/>
-        <w:tblLook w:firstColumn="1" w:firstRow="1" w:lastColumn="0" w:lastRow="0" w:noHBand="0" w:noVBand="1" w:val="04A0"/>
-      </w:tblPr>
-      <w:tblGrid>
-        <w:gridCol w:w="6624"/>
-        <w:gridCol w:w="6912"/>
-      </w:tblGrid>
-      <w:tr>
-        <w:tc>
-          <w:tcPr>
-            <w:tcW w:type="dxa" w:w="6984"/>
-          </w:tcPr>
-          <w:p/>
-          <w:p>
-            <w:pPr>
-              <w:pStyle w:val="Heading1"/>
-              <w:spacing w:after="80" w:line="269" w:lineRule="auto"/>
-            </w:pPr>
-            <w:r>
-              <w:rPr>
-                <w:rFonts w:ascii="Georgia" w:hAnsi="Georgia"/>
-                <w:b/>
-                <w:i w:val="0"/>
-                <w:color w:val="256E00"/>
-                <w:sz w:val="26"/>
-              </w:rPr>
-              <w:t>Included</w:t>
-            </w:r>
-          </w:p>
-          <w:p>
-            <w:pPr>
-              <w:spacing w:after="100" w:line="269" w:lineRule="auto"/>
-            </w:pPr>
-            <w:r>
-              <w:rPr>
-                <w:rFonts w:ascii="Arial" w:hAnsi="Arial"/>
-                <w:b w:val="0"/>
-                <w:i w:val="0"/>
-                <w:color w:val="131A17"/>
-                <w:sz w:val="21"/>
-              </w:rPr>
-              <w:t>Two stakeholder workshops, six core screens, responsive specifications, accessible component states and a documented prototype handoff.</w:t>
-            </w:r>
-          </w:p>
-          <w:p>
-            <w:pPr>
-              <w:pStyle w:val="Heading1"/>
-              <w:spacing w:after="80" w:line="269" w:lineRule="auto"/>
-            </w:pPr>
-            <w:r>
-              <w:rPr>
-                <w:rFonts w:ascii="Georgia" w:hAnsi="Georgia"/>
-                <w:b/>
-                <w:i w:val="0"/>
-                <w:color w:val="256E00"/>
-                <w:sz w:val="26"/>
-              </w:rPr>
-              <w:t>Working Together</w:t>
-            </w:r>
-          </w:p>
-          <w:p>
-            <w:pPr>
-              <w:spacing w:after="100" w:line="269" w:lineRule="auto"/>
-            </w:pPr>
-            <w:r>
-              <w:rPr>
-                <w:rFonts w:ascii="Arial" w:hAnsi="Arial"/>
-                <w:b w:val="0"/>
-                <w:i w:val="0"/>
-                <w:color w:val="131A17"/>
-                <w:sz w:val="21"/>
-              </w:rPr>
-              <w:t>One named decision owner consolidates feedback within three working days. Each stage ends with a review, not an implied approval.</w:t>
-            </w:r>
-          </w:p>
-          <w:p>
-            <w:pPr>
-              <w:pStyle w:val="Heading1"/>
-              <w:spacing w:after="80" w:line="269" w:lineRule="auto"/>
-            </w:pPr>
-            <w:r>
-              <w:rPr>
-                <w:rFonts w:ascii="Georgia" w:hAnsi="Georgia"/>
-                <w:b/>
-                <w:i w:val="0"/>
-                <w:color w:val="256E00"/>
-                <w:sz w:val="26"/>
-              </w:rPr>
-              <w:t>Commercial Terms</w:t>
-            </w:r>
-          </w:p>
-          <w:p>
-            <w:pPr>
-              <w:spacing w:after="100" w:line="269" w:lineRule="auto"/>
-            </w:pPr>
-            <w:r>
-              <w:rPr>
-                <w:rFonts w:ascii="Arial" w:hAnsi="Arial"/>
-                <w:b w:val="0"/>
-                <w:i w:val="0"/>
-                <w:color w:val="131A17"/>
-                <w:sz w:val="21"/>
-              </w:rPr>
-              <w:t>Invoices follow the milestones below. The estimate excludes taxes, third-party subscriptions, production hosting and changes outside the agreed six screens.</w:t>
-            </w:r>
-          </w:p>
-        </w:tc>
-        <w:tc>
-          <w:tcPr>
-            <w:tcW w:type="dxa" w:w="6984"/>
-          </w:tcPr>
-          <w:p/>
-          <w:tbl>
-            <w:tblPr>
-              <w:tblW w:type="auto" w:w="0"/>
-              <w:tblLayout w:type="fixed"/>
-              <w:tblLook w:firstColumn="1" w:firstRow="1" w:lastColumn="0" w:lastRow="0" w:noHBand="0" w:noVBand="1" w:val="04A0"/>
-              <w:tblCellMar>
-                <w:top w:w="90" w:type="dxa"/>
-                <w:left w:w="90" w:type="dxa"/>
-                <w:bottom w:w="90" w:type="dxa"/>
-                <w:right w:w="90" w:type="dxa"/>
-              </w:tblCellMar>
-            </w:tblPr>
-            <w:tblGrid>
-              <w:gridCol w:w="1512"/>
-              <w:gridCol w:w="3240"/>
-              <w:gridCol w:w="1656"/>
-            </w:tblGrid>
-            <w:tr>
-              <w:trPr>
-                <w:cantSplit/>
-                <w:tblHeader/>
-              </w:trPr>
-              <w:tc>
-                <w:tcPr>
-                  <w:tcW w:type="dxa" w:w="1512"/>
-                  <w:shd w:fill="256E00"/>
-                </w:tcPr>
-                <w:p>
-                  <w:pPr>
-                    <w:spacing w:after="160" w:line="269" w:lineRule="auto"/>
-                  </w:pPr>
-                  <w:r>
-                    <w:rPr>
-                      <w:rFonts w:ascii="Arial" w:hAnsi="Arial"/>
-                      <w:b/>
-                      <w:color w:val="FFFFFF"/>
-                      <w:sz w:val="20"/>
-                    </w:rPr>
-                    <w:t>Stage</w:t>
-                  </w:r>
-                </w:p>
-              </w:tc>
-              <w:tc>
-                <w:tcPr>
-                  <w:tcW w:type="dxa" w:w="3240"/>
-                  <w:shd w:fill="256E00"/>
-                </w:tcPr>
-                <w:p>
-                  <w:pPr>
-                    <w:spacing w:after="160" w:line="269" w:lineRule="auto"/>
-                  </w:pPr>
-                  <w:r>
-                    <w:rPr>
-                      <w:rFonts w:ascii="Arial" w:hAnsi="Arial"/>
-                      <w:b/>
-                      <w:color w:val="FFFFFF"/>
-                      <w:sz w:val="20"/>
-                    </w:rPr>
-                    <w:t>Deliverable</w:t>
-                  </w:r>
-                </w:p>
-              </w:tc>
-              <w:tc>
-                <w:tcPr>
-                  <w:tcW w:type="dxa" w:w="1656"/>
-                  <w:shd w:fill="256E00"/>
-                </w:tcPr>
-                <w:p>
-                  <w:pPr>
-                    <w:spacing w:after="160" w:line="269" w:lineRule="auto"/>
-                  </w:pPr>
-                  <w:r>
-                    <w:rPr>
-                      <w:rFonts w:ascii="Arial" w:hAnsi="Arial"/>
-                      <w:b/>
-                      <w:color w:val="FFFFFF"/>
-                      <w:sz w:val="20"/>
-                    </w:rPr>
-                    <w:t>Fee</w:t>
-                  </w:r>
-                </w:p>
-              </w:tc>
-            </w:tr>
-            <w:tr>
-              <w:trPr>
-                <w:cantSplit/>
-              </w:trPr>
-              <w:tc>
-                <w:tcPr>
-                  <w:tcW w:type="dxa" w:w="1512"/>
-                  <w:shd w:fill="C9FF32"/>
-                </w:tcPr>
-                <w:p>
-                  <w:pPr>
-                    <w:spacing w:after="160" w:line="269" w:lineRule="auto"/>
-                  </w:pPr>
-                  <w:r>
-                    <w:rPr>
-                      <w:rFonts w:ascii="Arial" w:hAnsi="Arial"/>
-                      <w:b/>
-                      <w:color w:val="131A17"/>
-                      <w:sz w:val="20"/>
-                    </w:rPr>
-                    <w:t>01 Discover</w:t>
-                  </w:r>
-                </w:p>
-              </w:tc>
-              <w:tc>
-                <w:tcPr>
-                  <w:tcW w:type="dxa" w:w="3240"/>
-                  <w:shd w:fill="C9FF32"/>
-                </w:tcPr>
-                <w:p>
-                  <w:pPr>
-                    <w:spacing w:after="160" w:line="269" w:lineRule="auto"/>
-                  </w:pPr>
-                  <w:r>
-                    <w:rPr>
-                      <w:rFonts w:ascii="Arial" w:hAnsi="Arial"/>
-                      <w:b w:val="0"/>
-                      <w:color w:val="131A17"/>
-                      <w:sz w:val="20"/>
-                    </w:rPr>
-                    <w:t>Journey and success measures</w:t>
-                  </w:r>
-                </w:p>
-              </w:tc>
-              <w:tc>
-                <w:tcPr>
-                  <w:tcW w:type="dxa" w:w="1656"/>
-                  <w:shd w:fill="C9FF32"/>
-                </w:tcPr>
-                <w:p>
-                  <w:pPr>
-                    <w:spacing w:after="160" w:line="269" w:lineRule="auto"/>
-                  </w:pPr>
-                  <w:r>
-                    <w:rPr>
-                      <w:rFonts w:ascii="Arial" w:hAnsi="Arial"/>
-                      <w:b w:val="0"/>
-                      <w:color w:val="131A17"/>
-                      <w:sz w:val="20"/>
-                    </w:rPr>
-                    <w:t>$6,000</w:t>
-                  </w:r>
-                </w:p>
-              </w:tc>
-            </w:tr>
-            <w:tr>
-              <w:trPr>
-                <w:cantSplit/>
-              </w:trPr>
-              <w:tc>
-                <w:tcPr>
-                  <w:tcW w:type="dxa" w:w="1512"/>
-                  <w:shd w:fill="FFFFFF"/>
-                </w:tcPr>
-                <w:p>
-                  <w:pPr>
-                    <w:spacing w:after="160" w:line="269" w:lineRule="auto"/>
-                  </w:pPr>
-                  <w:r>
-                    <w:rPr>
-                      <w:rFonts w:ascii="Arial" w:hAnsi="Arial"/>
-                      <w:b/>
-                      <w:color w:val="131A17"/>
-                      <w:sz w:val="20"/>
-                    </w:rPr>
-                    <w:t>02 Design</w:t>
-                  </w:r>
-                </w:p>
-              </w:tc>
-              <w:tc>
-                <w:tcPr>
-                  <w:tcW w:type="dxa" w:w="3240"/>
-                  <w:shd w:fill="FFFFFF"/>
-                </w:tcPr>
-                <w:p>
-                  <w:pPr>
-                    <w:spacing w:after="160" w:line="269" w:lineRule="auto"/>
-                  </w:pPr>
-                  <w:r>
-                    <w:rPr>
-                      <w:rFonts w:ascii="Arial" w:hAnsi="Arial"/>
-                      <w:b w:val="0"/>
-                      <w:color w:val="131A17"/>
-                      <w:sz w:val="20"/>
-                    </w:rPr>
-                    <w:t>Six screens and component states</w:t>
-                  </w:r>
-                </w:p>
-              </w:tc>
-              <w:tc>
-                <w:tcPr>
-                  <w:tcW w:type="dxa" w:w="1656"/>
-                  <w:shd w:fill="FFFFFF"/>
-                </w:tcPr>
-                <w:p>
-                  <w:pPr>
-                    <w:spacing w:after="160" w:line="269" w:lineRule="auto"/>
-                  </w:pPr>
-                  <w:r>
-                    <w:rPr>
-                      <w:rFonts w:ascii="Arial" w:hAnsi="Arial"/>
-                      <w:b w:val="0"/>
-                      <w:color w:val="131A17"/>
-                      <w:sz w:val="20"/>
-                    </w:rPr>
-                    <w:t>$10,000</w:t>
-                  </w:r>
-                </w:p>
-              </w:tc>
-            </w:tr>
-            <w:tr>
-              <w:trPr>
-                <w:cantSplit/>
-              </w:trPr>
-              <w:tc>
-                <w:tcPr>
-                  <w:tcW w:type="dxa" w:w="1512"/>
-                  <w:shd w:fill="C9FF32"/>
-                </w:tcPr>
-                <w:p>
-                  <w:pPr>
-                    <w:spacing w:after="160" w:line="269" w:lineRule="auto"/>
-                  </w:pPr>
-                  <w:r>
-                    <w:rPr>
-                      <w:rFonts w:ascii="Arial" w:hAnsi="Arial"/>
-                      <w:b/>
-                      <w:color w:val="131A17"/>
-                      <w:sz w:val="20"/>
-                    </w:rPr>
-                    <w:t>03 Validate</w:t>
-                  </w:r>
-                </w:p>
-              </w:tc>
-              <w:tc>
-                <w:tcPr>
-                  <w:tcW w:type="dxa" w:w="3240"/>
-                  <w:shd w:fill="C9FF32"/>
-                </w:tcPr>
-                <w:p>
-                  <w:pPr>
-                    <w:spacing w:after="160" w:line="269" w:lineRule="auto"/>
-                  </w:pPr>
-                  <w:r>
-                    <w:rPr>
-                      <w:rFonts w:ascii="Arial" w:hAnsi="Arial"/>
-                      <w:b w:val="0"/>
-                      <w:color w:val="131A17"/>
-                      <w:sz w:val="20"/>
-                    </w:rPr>
-                    <w:t>Prototype and handoff</w:t>
-                  </w:r>
-                </w:p>
-              </w:tc>
-              <w:tc>
-                <w:tcPr>
-                  <w:tcW w:type="dxa" w:w="1656"/>
-                  <w:shd w:fill="C9FF32"/>
-                </w:tcPr>
-                <w:p>
-                  <w:pPr>
-                    <w:spacing w:after="160" w:line="269" w:lineRule="auto"/>
-                  </w:pPr>
-                  <w:r>
-                    <w:rPr>
-                      <w:rFonts w:ascii="Arial" w:hAnsi="Arial"/>
-                      <w:b w:val="0"/>
-                      <w:color w:val="131A17"/>
-                      <w:sz w:val="20"/>
-                    </w:rPr>
-                    <w:t>$8,000</w:t>
-                  </w:r>
-                </w:p>
-              </w:tc>
-            </w:tr>
-          </w:tbl>
-          <w:p/>
-        </w:tc>
-      </w:tr>
-    </w:tbl>
     <w:p>
       <w:pPr>
-        <w:spacing w:after="80" w:line="269" w:lineRule="auto"/>
+        <w:spacing w:after="140" w:line="269" w:lineRule="auto"/>
       </w:pPr>
       <w:r>
         <w:rPr>
-          <w:rFonts w:ascii="Arial" w:hAnsi="Arial"/>
+          <w:rFonts w:ascii="Georgia" w:hAnsi="Georgia"/>
+          <w:b w:val="0"/>
+          <w:color w:val="17212B"/>
+          <w:sz w:val="22"/>
+        </w:rPr>
+        <w:t>Two stakeholder workshops, six core screens, responsive specifications, accessible component states and a documented prototype handoff.</w:t>
+      </w:r>
+    </w:p>
+    <w:p>
+      <w:pPr>
+        <w:pStyle w:val="Heading1"/>
+        <w:spacing w:after="140" w:line="269" w:lineRule="auto"/>
+      </w:pPr>
+      <w:r>
+        <w:rPr>
+          <w:rFonts w:ascii="Georgia" w:hAnsi="Georgia"/>
           <w:b/>
-          <w:i w:val="0"/>
-          <w:color w:val="256E00"/>
-          <w:sz w:val="18"/>
+          <w:color w:val="006548"/>
+          <w:sz w:val="30"/>
+        </w:rPr>
+        <w:t>Working Together</w:t>
+      </w:r>
+    </w:p>
+    <w:p>
+      <w:pPr>
+        <w:spacing w:after="140" w:line="269" w:lineRule="auto"/>
+      </w:pPr>
+      <w:r>
+        <w:rPr>
+          <w:rFonts w:ascii="Georgia" w:hAnsi="Georgia"/>
+          <w:b w:val="0"/>
+          <w:color w:val="17212B"/>
+          <w:sz w:val="22"/>
+        </w:rPr>
+        <w:t>One named decision owner consolidates feedback within three working days. Each stage ends with a review, not an implied approval.</w:t>
+      </w:r>
+    </w:p>
+    <w:p>
+      <w:pPr>
+        <w:pStyle w:val="Heading1"/>
+        <w:spacing w:after="140" w:line="269" w:lineRule="auto"/>
+      </w:pPr>
+      <w:r>
+        <w:rPr>
+          <w:rFonts w:ascii="Georgia" w:hAnsi="Georgia"/>
+          <w:b/>
+          <w:color w:val="006548"/>
+          <w:sz w:val="30"/>
+        </w:rPr>
+        <w:t>Commercial Terms</w:t>
+      </w:r>
+    </w:p>
+    <w:p>
+      <w:pPr>
+        <w:spacing w:after="140" w:line="269" w:lineRule="auto"/>
+      </w:pPr>
+      <w:r>
+        <w:rPr>
+          <w:rFonts w:ascii="Georgia" w:hAnsi="Georgia"/>
+          <w:b w:val="0"/>
+          <w:color w:val="17212B"/>
+          <w:sz w:val="22"/>
+        </w:rPr>
+        <w:t>Invoices follow the milestones below. The estimate excludes taxes, third-party subscriptions, production hosting and changes outside the agreed six screens.</w:t>
+      </w:r>
+    </w:p>
+    <w:p>
+      <w:pPr>
+        <w:spacing w:after="140" w:line="269" w:lineRule="auto"/>
+      </w:pPr>
+      <w:r>
+        <w:rPr>
+          <w:rFonts w:ascii="Georgia" w:hAnsi="Georgia"/>
+          <w:b/>
+          <w:color w:val="006548"/>
+          <w:sz w:val="20"/>
         </w:rPr>
         <w:t>Offer valid for 30 days · Start date follows written acceptance.</w:t>
       </w:r>
     </w:p>
     <w:sectPr>
       <w:footerReference w:type="default" r:id="rId9"/>
-      <w:headerReference w:type="default" r:id="rId10"/>
-      <w:pgSz w:w="15840" w:h="12240"/>
-      <w:pgMar w:top="648" w:right="936" w:bottom="648" w:left="936" w:header="720" w:footer="720" w:gutter="0"/>
+      <w:pgSz w:w="11952" w:h="16848"/>
+      <w:pgMar w:top="792" w:right="864" w:bottom="792" w:left="864" w:header="720" w:footer="720" w:gutter="0"/>
       <w:cols w:space="720"/>
       <w:docGrid w:linePitch="360"/>
     </w:sectPr>
@@ -557,32 +467,22 @@
     <w:pPr>
       <w:pStyle w:val="Footer"/>
     </w:pPr>
+  </w:p>
+  <w:p>
+    <w:pPr>
+      <w:spacing w:after="140" w:line="269" w:lineRule="auto"/>
+    </w:pPr>
     <w:r>
       <w:rPr>
-        <w:color w:val="131A17"/>
+        <w:rFonts w:ascii="Georgia" w:hAnsi="Georgia"/>
+        <w:b w:val="0"/>
+        <w:color w:val="17212B"/>
         <w:sz w:val="16"/>
       </w:rPr>
-      <w:t>DAZZLER  /  FICTIONAL EXAMPLE  /  BUSINESS</w:t>
+      <w:t>Fictional Worked Example / The Fee Waterfall / 01</w:t>
     </w:r>
   </w:p>
 </w:ftr>
-</file>
-
-<file path=word/header1.xml><?xml version="1.0" encoding="utf-8"?>
-<w:hdr xmlns:m="http://schemas.openxmlformats.org/officeDocument/2006/math" xmlns:mc="http://schemas.openxmlformats.org/markup-compatibility/2006" xmlns:mo="http://schemas.microsoft.com/office/mac/office/2008/main" xmlns:mv="urn:schemas-microsoft-com:mac:vml" xmlns:o="urn:schemas-microsoft-com:office:office" xmlns:r="http://schemas.openxmlformats.org/officeDocument/2006/relationships" xmlns:v="urn:schemas-microsoft-com:vml" xmlns:w10="urn:schemas-microsoft-com:office:word" xmlns:w14="http://schemas.microsoft.com/office/word/2010/wordml" xmlns:w="http://schemas.openxmlformats.org/wordprocessingml/2006/main" xmlns:wne="http://schemas.microsoft.com/office/word/2006/wordml" xmlns:wp14="http://schemas.microsoft.com/office/word/2010/wordprocessingDrawing" xmlns:wp="http://schemas.openxmlformats.org/drawingml/2006/wordprocessingDrawing" xmlns:wpc="http://schemas.microsoft.com/office/word/2010/wordprocessingCanvas" xmlns:wpg="http://schemas.microsoft.com/office/word/2010/wordprocessingGroup" xmlns:wpi="http://schemas.microsoft.com/office/word/2010/wordprocessingInk" xmlns:wps="http://schemas.microsoft.com/office/word/2010/wordprocessingShape" mc:Ignorable="w14 wp14">
-  <w:p>
-    <w:pPr>
-      <w:pStyle w:val="Header"/>
-    </w:pPr>
-    <w:r>
-      <w:pict>
-        <v:rect id="DazzlerPageSurface" style="position:absolute;margin-left:0;margin-top:0;width:792.0pt;height:612.0pt;z-index:-251654144;mso-position-horizontal-relative:page;mso-position-vertical-relative:page" fillcolor="#C9FF32" stroked="f">
-          <v:fill color="#C9FF32"/>
-        </v:rect>
-      </w:pict>
-    </w:r>
-  </w:p>
-</w:hdr>
 </file>
 
 <file path=word/numbering.xml><?xml version="1.0" encoding="utf-8"?>
@@ -948,12 +848,9 @@
     <w:name w:val="Normal"/>
     <w:qFormat/>
     <w:rsid w:val="00FC693F"/>
-    <w:pPr>
-      <w:spacing w:after="160"/>
-    </w:pPr>
     <w:rPr>
-      <w:rFonts w:ascii="Arial" w:hAnsi="Arial"/>
-      <w:sz w:val="21"/>
+      <w:rFonts w:ascii="Georgia" w:hAnsi="Georgia"/>
+      <w:sz w:val="22"/>
     </w:rPr>
   </w:style>
   <w:style w:type="paragraph" w:styleId="Header">
@@ -970,6 +867,10 @@
       </w:tabs>
       <w:spacing w:after="0" w:line="240" w:lineRule="auto"/>
     </w:pPr>
+    <w:rPr>
+      <w:rFonts w:ascii="Georgia" w:hAnsi="Georgia"/>
+      <w:sz w:val="22"/>
+    </w:rPr>
   </w:style>
   <w:style w:type="character" w:customStyle="1" w:styleId="HeaderChar">
     <w:name w:val="Header Char"/>
@@ -992,6 +893,10 @@
       </w:tabs>
       <w:spacing w:after="0" w:line="240" w:lineRule="auto"/>
     </w:pPr>
+    <w:rPr>
+      <w:rFonts w:ascii="Georgia" w:hAnsi="Georgia"/>
+      <w:sz w:val="22"/>
+    </w:rPr>
   </w:style>
   <w:style w:type="character" w:customStyle="1" w:styleId="FooterChar">
     <w:name w:val="Footer Char"/>
@@ -1015,11 +920,11 @@
       <w:outlineLvl w:val="0"/>
     </w:pPr>
     <w:rPr>
-      <w:rFonts w:asciiTheme="majorHAnsi" w:eastAsiaTheme="majorEastAsia" w:hAnsiTheme="majorHAnsi" w:cstheme="majorBidi"/>
+      <w:rFonts w:cstheme="majorBidi" w:ascii="Georgia" w:hAnsi="Georgia"/>
       <w:b/>
       <w:bCs/>
       <w:color w:val="365F91" w:themeColor="accent1" w:themeShade="BF"/>
-      <w:sz w:val="28"/>
+      <w:sz w:val="22"/>
       <w:szCs w:val="28"/>
     </w:rPr>
   </w:style>
@@ -1039,11 +944,11 @@
       <w:outlineLvl w:val="1"/>
     </w:pPr>
     <w:rPr>
-      <w:rFonts w:asciiTheme="majorHAnsi" w:eastAsiaTheme="majorEastAsia" w:hAnsiTheme="majorHAnsi" w:cstheme="majorBidi"/>
+      <w:rFonts w:cstheme="majorBidi" w:ascii="Georgia" w:hAnsi="Georgia"/>
       <w:b/>
       <w:bCs/>
       <w:color w:val="4F81BD" w:themeColor="accent1"/>
-      <w:sz w:val="26"/>
+      <w:sz w:val="22"/>
       <w:szCs w:val="26"/>
     </w:rPr>
   </w:style>
@@ -1063,10 +968,11 @@
       <w:outlineLvl w:val="2"/>
     </w:pPr>
     <w:rPr>
-      <w:rFonts w:asciiTheme="majorHAnsi" w:eastAsiaTheme="majorEastAsia" w:hAnsiTheme="majorHAnsi" w:cstheme="majorBidi"/>
+      <w:rFonts w:cstheme="majorBidi" w:ascii="Georgia" w:hAnsi="Georgia"/>
       <w:b/>
       <w:bCs/>
       <w:color w:val="4F81BD" w:themeColor="accent1"/>
+      <w:sz w:val="22"/>
     </w:rPr>
   </w:style>
   <w:style w:type="paragraph" w:styleId="Heading4">
@@ -1086,12 +992,13 @@
       <w:outlineLvl w:val="3"/>
     </w:pPr>
     <w:rPr>
-      <w:rFonts w:asciiTheme="majorHAnsi" w:eastAsiaTheme="majorEastAsia" w:hAnsiTheme="majorHAnsi" w:cstheme="majorBidi"/>
+      <w:rFonts w:cstheme="majorBidi" w:ascii="Georgia" w:hAnsi="Georgia"/>
       <w:b/>
       <w:bCs/>
       <w:i/>
       <w:iCs/>
       <w:color w:val="4F81BD" w:themeColor="accent1"/>
+      <w:sz w:val="22"/>
     </w:rPr>
   </w:style>
   <w:style w:type="paragraph" w:styleId="Heading5">
@@ -1111,8 +1018,9 @@
       <w:outlineLvl w:val="4"/>
     </w:pPr>
     <w:rPr>
-      <w:rFonts w:asciiTheme="majorHAnsi" w:eastAsiaTheme="majorEastAsia" w:hAnsiTheme="majorHAnsi" w:cstheme="majorBidi"/>
+      <w:rFonts w:cstheme="majorBidi" w:ascii="Georgia" w:hAnsi="Georgia"/>
       <w:color w:val="243F60" w:themeColor="accent1" w:themeShade="7F"/>
+      <w:sz w:val="22"/>
     </w:rPr>
   </w:style>
   <w:style w:type="paragraph" w:styleId="Heading6">
@@ -1132,10 +1040,11 @@
       <w:outlineLvl w:val="5"/>
     </w:pPr>
     <w:rPr>
-      <w:rFonts w:asciiTheme="majorHAnsi" w:eastAsiaTheme="majorEastAsia" w:hAnsiTheme="majorHAnsi" w:cstheme="majorBidi"/>
+      <w:rFonts w:cstheme="majorBidi" w:ascii="Georgia" w:hAnsi="Georgia"/>
       <w:i/>
       <w:iCs/>
       <w:color w:val="243F60" w:themeColor="accent1" w:themeShade="7F"/>
+      <w:sz w:val="22"/>
     </w:rPr>
   </w:style>
   <w:style w:type="paragraph" w:styleId="Heading7">
@@ -1155,10 +1064,11 @@
       <w:outlineLvl w:val="6"/>
     </w:pPr>
     <w:rPr>
-      <w:rFonts w:asciiTheme="majorHAnsi" w:eastAsiaTheme="majorEastAsia" w:hAnsiTheme="majorHAnsi" w:cstheme="majorBidi"/>
+      <w:rFonts w:cstheme="majorBidi" w:ascii="Georgia" w:hAnsi="Georgia"/>
       <w:i/>
       <w:iCs/>
       <w:color w:val="404040" w:themeColor="text1" w:themeTint="BF"/>
+      <w:sz w:val="22"/>
     </w:rPr>
   </w:style>
   <w:style w:type="paragraph" w:styleId="Heading8">
@@ -1178,9 +1088,9 @@
       <w:outlineLvl w:val="7"/>
     </w:pPr>
     <w:rPr>
-      <w:rFonts w:asciiTheme="majorHAnsi" w:eastAsiaTheme="majorEastAsia" w:hAnsiTheme="majorHAnsi" w:cstheme="majorBidi"/>
+      <w:rFonts w:cstheme="majorBidi" w:ascii="Georgia" w:hAnsi="Georgia"/>
       <w:color w:val="4F81BD" w:themeColor="accent1"/>
-      <w:sz w:val="20"/>
+      <w:sz w:val="22"/>
       <w:szCs w:val="20"/>
     </w:rPr>
   </w:style>
@@ -1201,11 +1111,11 @@
       <w:outlineLvl w:val="8"/>
     </w:pPr>
     <w:rPr>
-      <w:rFonts w:asciiTheme="majorHAnsi" w:eastAsiaTheme="majorEastAsia" w:hAnsiTheme="majorHAnsi" w:cstheme="majorBidi"/>
+      <w:rFonts w:cstheme="majorBidi" w:ascii="Georgia" w:hAnsi="Georgia"/>
       <w:i/>
       <w:iCs/>
       <w:color w:val="404040" w:themeColor="text1" w:themeTint="BF"/>
-      <w:sz w:val="20"/>
+      <w:sz w:val="22"/>
       <w:szCs w:val="20"/>
     </w:rPr>
   </w:style>
@@ -1244,6 +1154,10 @@
     <w:pPr>
       <w:spacing w:after="0" w:line="240" w:lineRule="auto"/>
     </w:pPr>
+    <w:rPr>
+      <w:rFonts w:ascii="Georgia" w:hAnsi="Georgia"/>
+      <w:sz w:val="22"/>
+    </w:rPr>
   </w:style>
   <w:style w:type="character" w:customStyle="1" w:styleId="Heading1Char">
     <w:name w:val="Heading 1 Char"/>
@@ -1301,11 +1215,11 @@
       <w:contextualSpacing/>
     </w:pPr>
     <w:rPr>
-      <w:rFonts w:asciiTheme="majorHAnsi" w:eastAsiaTheme="majorEastAsia" w:hAnsiTheme="majorHAnsi" w:cstheme="majorBidi"/>
+      <w:rFonts w:cstheme="majorBidi" w:ascii="Georgia" w:hAnsi="Georgia"/>
       <w:color w:val="17365D" w:themeColor="text2" w:themeShade="BF"/>
       <w:spacing w:val="5"/>
       <w:kern w:val="28"/>
-      <w:sz w:val="52"/>
+      <w:sz w:val="22"/>
       <w:szCs w:val="52"/>
     </w:rPr>
   </w:style>
@@ -1338,12 +1252,12 @@
       </w:numPr>
     </w:pPr>
     <w:rPr>
-      <w:rFonts w:asciiTheme="majorHAnsi" w:eastAsiaTheme="majorEastAsia" w:hAnsiTheme="majorHAnsi" w:cstheme="majorBidi"/>
+      <w:rFonts w:cstheme="majorBidi" w:ascii="Georgia" w:hAnsi="Georgia"/>
       <w:i/>
       <w:iCs/>
       <w:color w:val="4F81BD" w:themeColor="accent1"/>
       <w:spacing w:val="15"/>
-      <w:sz w:val="24"/>
+      <w:sz w:val="22"/>
       <w:szCs w:val="24"/>
     </w:rPr>
   </w:style>
@@ -1373,6 +1287,10 @@
       <w:ind w:left="720"/>
       <w:contextualSpacing/>
     </w:pPr>
+    <w:rPr>
+      <w:rFonts w:ascii="Georgia" w:hAnsi="Georgia"/>
+      <w:sz w:val="22"/>
+    </w:rPr>
   </w:style>
   <w:style w:type="paragraph" w:styleId="BodyText">
     <w:name w:val="Body Text"/>
@@ -1384,6 +1302,10 @@
     <w:pPr>
       <w:spacing w:after="120"/>
     </w:pPr>
+    <w:rPr>
+      <w:rFonts w:ascii="Georgia" w:hAnsi="Georgia"/>
+      <w:sz w:val="22"/>
+    </w:rPr>
   </w:style>
   <w:style w:type="character" w:customStyle="1" w:styleId="BodyTextChar">
     <w:name w:val="Body Text Char"/>
@@ -1402,6 +1324,10 @@
     <w:pPr>
       <w:spacing w:after="120" w:line="480" w:lineRule="auto"/>
     </w:pPr>
+    <w:rPr>
+      <w:rFonts w:ascii="Georgia" w:hAnsi="Georgia"/>
+      <w:sz w:val="22"/>
+    </w:rPr>
   </w:style>
   <w:style w:type="character" w:customStyle="1" w:styleId="BodyText2Char">
     <w:name w:val="Body Text 2 Char"/>
@@ -1421,7 +1347,8 @@
       <w:spacing w:after="120"/>
     </w:pPr>
     <w:rPr>
-      <w:sz w:val="16"/>
+      <w:rFonts w:ascii="Georgia" w:hAnsi="Georgia"/>
+      <w:sz w:val="22"/>
       <w:szCs w:val="16"/>
     </w:rPr>
   </w:style>
@@ -1446,6 +1373,10 @@
       <w:ind w:left="360" w:hanging="360"/>
       <w:contextualSpacing/>
     </w:pPr>
+    <w:rPr>
+      <w:rFonts w:ascii="Georgia" w:hAnsi="Georgia"/>
+      <w:sz w:val="22"/>
+    </w:rPr>
   </w:style>
   <w:style w:type="paragraph" w:styleId="List2">
     <w:name w:val="List 2"/>
@@ -1457,6 +1388,10 @@
       <w:ind w:left="720" w:hanging="360"/>
       <w:contextualSpacing/>
     </w:pPr>
+    <w:rPr>
+      <w:rFonts w:ascii="Georgia" w:hAnsi="Georgia"/>
+      <w:sz w:val="22"/>
+    </w:rPr>
   </w:style>
   <w:style w:type="paragraph" w:styleId="List3">
     <w:name w:val="List 3"/>
@@ -1468,6 +1403,10 @@
       <w:ind w:left="1080" w:hanging="360"/>
       <w:contextualSpacing/>
     </w:pPr>
+    <w:rPr>
+      <w:rFonts w:ascii="Georgia" w:hAnsi="Georgia"/>
+      <w:sz w:val="22"/>
+    </w:rPr>
   </w:style>
   <w:style w:type="paragraph" w:styleId="ListBullet">
     <w:name w:val="List Bullet"/>
@@ -1481,6 +1420,10 @@
       </w:numPr>
       <w:contextualSpacing/>
     </w:pPr>
+    <w:rPr>
+      <w:rFonts w:ascii="Georgia" w:hAnsi="Georgia"/>
+      <w:sz w:val="22"/>
+    </w:rPr>
   </w:style>
   <w:style w:type="paragraph" w:styleId="ListBullet2">
     <w:name w:val="List Bullet 2"/>
@@ -1494,6 +1437,10 @@
       </w:numPr>
       <w:contextualSpacing/>
     </w:pPr>
+    <w:rPr>
+      <w:rFonts w:ascii="Georgia" w:hAnsi="Georgia"/>
+      <w:sz w:val="22"/>
+    </w:rPr>
   </w:style>
   <w:style w:type="paragraph" w:styleId="ListBullet3">
     <w:name w:val="List Bullet 3"/>
@@ -1507,6 +1454,10 @@
       </w:numPr>
       <w:contextualSpacing/>
     </w:pPr>
+    <w:rPr>
+      <w:rFonts w:ascii="Georgia" w:hAnsi="Georgia"/>
+      <w:sz w:val="22"/>
+    </w:rPr>
   </w:style>
   <w:style w:type="paragraph" w:styleId="ListNumber">
     <w:name w:val="List Number"/>
@@ -1520,6 +1471,10 @@
       </w:numPr>
       <w:contextualSpacing/>
     </w:pPr>
+    <w:rPr>
+      <w:rFonts w:ascii="Georgia" w:hAnsi="Georgia"/>
+      <w:sz w:val="22"/>
+    </w:rPr>
   </w:style>
   <w:style w:type="paragraph" w:styleId="ListNumber2">
     <w:name w:val="List Number 2"/>
@@ -1533,6 +1488,10 @@
       </w:numPr>
       <w:contextualSpacing/>
     </w:pPr>
+    <w:rPr>
+      <w:rFonts w:ascii="Georgia" w:hAnsi="Georgia"/>
+      <w:sz w:val="22"/>
+    </w:rPr>
   </w:style>
   <w:style w:type="paragraph" w:styleId="ListNumber3">
     <w:name w:val="List Number 3"/>
@@ -1546,6 +1505,10 @@
       </w:numPr>
       <w:contextualSpacing/>
     </w:pPr>
+    <w:rPr>
+      <w:rFonts w:ascii="Georgia" w:hAnsi="Georgia"/>
+      <w:sz w:val="22"/>
+    </w:rPr>
   </w:style>
   <w:style w:type="paragraph" w:styleId="ListContinue">
     <w:name w:val="List Continue"/>
@@ -1558,6 +1521,10 @@
       <w:ind w:left="360"/>
       <w:contextualSpacing/>
     </w:pPr>
+    <w:rPr>
+      <w:rFonts w:ascii="Georgia" w:hAnsi="Georgia"/>
+      <w:sz w:val="22"/>
+    </w:rPr>
   </w:style>
   <w:style w:type="paragraph" w:styleId="ListContinue2">
     <w:name w:val="List Continue 2"/>
@@ -1570,6 +1537,10 @@
       <w:ind w:left="720"/>
       <w:contextualSpacing/>
     </w:pPr>
+    <w:rPr>
+      <w:rFonts w:ascii="Georgia" w:hAnsi="Georgia"/>
+      <w:sz w:val="22"/>
+    </w:rPr>
   </w:style>
   <w:style w:type="paragraph" w:styleId="ListContinue3">
     <w:name w:val="List Continue 3"/>
@@ -1582,6 +1553,10 @@
       <w:ind w:left="1080"/>
       <w:contextualSpacing/>
     </w:pPr>
+    <w:rPr>
+      <w:rFonts w:ascii="Georgia" w:hAnsi="Georgia"/>
+      <w:sz w:val="22"/>
+    </w:rPr>
   </w:style>
   <w:style w:type="paragraph" w:styleId="MacroText">
     <w:name w:val="macro"/>
@@ -1601,8 +1576,8 @@
       </w:tabs>
     </w:pPr>
     <w:rPr>
-      <w:rFonts w:ascii="Courier" w:hAnsi="Courier"/>
-      <w:sz w:val="20"/>
+      <w:rFonts w:ascii="Georgia" w:hAnsi="Georgia"/>
+      <w:sz w:val="22"/>
       <w:szCs w:val="20"/>
     </w:rPr>
   </w:style>
@@ -1627,9 +1602,11 @@
     <w:qFormat/>
     <w:rsid w:val="00FC693F"/>
     <w:rPr>
+      <w:rFonts w:ascii="Georgia" w:hAnsi="Georgia"/>
       <w:i/>
       <w:iCs/>
       <w:color w:val="000000" w:themeColor="text1"/>
+      <w:sz w:val="22"/>
     </w:rPr>
   </w:style>
   <w:style w:type="character" w:customStyle="1" w:styleId="QuoteChar">
@@ -1743,10 +1720,11 @@
       <w:spacing w:line="240" w:lineRule="auto"/>
     </w:pPr>
     <w:rPr>
+      <w:rFonts w:ascii="Georgia" w:hAnsi="Georgia"/>
       <w:b/>
       <w:bCs/>
       <w:color w:val="4F81BD" w:themeColor="accent1"/>
-      <w:sz w:val="18"/>
+      <w:sz w:val="22"/>
       <w:szCs w:val="18"/>
     </w:rPr>
   </w:style>
@@ -1785,11 +1763,13 @@
       <w:ind w:left="936" w:right="936"/>
     </w:pPr>
     <w:rPr>
+      <w:rFonts w:ascii="Georgia" w:hAnsi="Georgia"/>
       <w:b/>
       <w:bCs/>
       <w:i/>
       <w:iCs/>
       <w:color w:val="4F81BD" w:themeColor="accent1"/>
+      <w:sz w:val="22"/>
     </w:rPr>
   </w:style>
   <w:style w:type="character" w:customStyle="1" w:styleId="IntenseQuoteChar">
@@ -1884,6 +1864,10 @@
     <w:pPr>
       <w:outlineLvl w:val="9"/>
     </w:pPr>
+    <w:rPr>
+      <w:rFonts w:ascii="Georgia" w:hAnsi="Georgia"/>
+      <w:sz w:val="22"/>
+    </w:rPr>
   </w:style>
   <w:style w:type="table" w:styleId="TableGrid">
     <w:name w:val="Table Grid"/>

</xml_diff>

<commit_message>
Release Dazzler 0.30 with offline design checks and hardened exports
</commit_message>
<xml_diff>
--- a/docs/templates/docx/business.docx
+++ b/docs/templates/docx/business.docx
@@ -4,346 +4,511 @@
   <w:body>
     <w:p>
       <w:pPr>
-        <w:spacing w:after="140" w:line="269" w:lineRule="auto"/>
+        <w:spacing w:after="140" w:line="259" w:lineRule="auto"/>
       </w:pPr>
       <w:r>
         <w:rPr>
-          <w:rFonts w:ascii="Georgia" w:hAnsi="Georgia"/>
+          <w:rFonts w:ascii="Arial" w:hAnsi="Arial"/>
           <w:b/>
-          <w:color w:val="006548"/>
+          <w:color w:val="4D2298"/>
           <w:sz w:val="18"/>
         </w:rPr>
-        <w:t>JUNIPER / SCOPE 014 / THE FEE WATERFALL</w:t>
-      </w:r>
-    </w:p>
-    <w:p>
-      <w:pPr>
-        <w:pStyle w:val="Title"/>
-        <w:spacing w:after="140" w:line="269" w:lineRule="auto"/>
-      </w:pPr>
-      <w:r>
-        <w:rPr>
-          <w:rFonts w:ascii="Georgia" w:hAnsi="Georgia"/>
-          <w:b/>
-          <w:color w:val="000000"/>
-          <w:sz w:val="64"/>
-        </w:rPr>
-        <w:t>Juniper Studio Service Proposal</w:t>
-      </w:r>
-    </w:p>
-    <w:p>
-      <w:pPr>
-        <w:spacing w:after="140" w:line="269" w:lineRule="auto"/>
-      </w:pPr>
-      <w:r>
-        <w:rPr>
-          <w:rFonts w:ascii="Georgia" w:hAnsi="Georgia"/>
-          <w:b/>
-          <w:color w:val="006548"/>
-          <w:sz w:val="24"/>
-        </w:rPr>
-        <w:t>Replace the fragmented booking journey with one accessible flow, delivered in three reviewable stages.</w:t>
-      </w:r>
-    </w:p>
-    <w:p>
-      <w:pPr>
-        <w:spacing w:after="140" w:line="269" w:lineRule="auto"/>
-      </w:pPr>
-      <w:r>
-        <w:rPr>
-          <w:rFonts w:ascii="Georgia" w:hAnsi="Georgia"/>
-          <w:b/>
-          <w:color w:val="006548"/>
-          <w:sz w:val="92"/>
-        </w:rPr>
-        <w:t>$24,000</w:t>
-      </w:r>
-    </w:p>
-    <w:p>
-      <w:pPr>
-        <w:spacing w:after="140" w:line="269" w:lineRule="auto"/>
-      </w:pPr>
-      <w:r>
-        <w:rPr>
-          <w:rFonts w:ascii="Georgia" w:hAnsi="Georgia"/>
-          <w:b w:val="0"/>
-          <w:color w:val="17212B"/>
-          <w:sz w:val="22"/>
-        </w:rPr>
-        <w:t>fixed fee for the defined scope</w:t>
-      </w:r>
-    </w:p>
-    <w:p>
-      <w:pPr>
-        <w:spacing w:after="140" w:line="269" w:lineRule="auto"/>
-      </w:pPr>
-      <w:r>
-        <w:rPr>
-          <w:rFonts w:ascii="Georgia" w:hAnsi="Georgia"/>
-          <w:b w:val="0"/>
-          <w:color w:val="17212B"/>
-          <w:sz w:val="22"/>
-        </w:rPr>
-        <w:t>The fictional engagement covers research synthesis, interaction design and a tested frontend prototype for a neighborhood arts venue. Production integration is a separate engagement.</w:t>
+        <w:t>JUNIPER / SCOPE 014</w:t>
       </w:r>
     </w:p>
     <w:tbl>
       <w:tblPr>
         <w:tblW w:type="auto" w:w="0"/>
+        <w:tblLayout w:type="fixed"/>
         <w:tblLook w:firstColumn="1" w:firstRow="1" w:lastColumn="0" w:lastRow="0" w:noHBand="0" w:noVBand="1" w:val="04A0"/>
       </w:tblPr>
       <w:tblGrid>
-        <w:gridCol w:w="3408"/>
-        <w:gridCol w:w="3408"/>
-        <w:gridCol w:w="3408"/>
+        <w:gridCol w:w="4752"/>
+        <w:gridCol w:w="10224"/>
       </w:tblGrid>
       <w:tr>
-        <w:trPr>
-          <w:tblHeader/>
-        </w:trPr>
         <w:tc>
           <w:tcPr>
-            <w:tcW w:type="dxa" w:w="3408"/>
-            <w:shd w:fill="006548"/>
+            <w:tcW w:type="dxa" w:w="4752"/>
+            <w:shd w:fill="EAC7FF"/>
           </w:tcPr>
+          <w:p/>
           <w:p>
             <w:pPr>
-              <w:spacing w:after="160" w:before="100"/>
+              <w:spacing w:after="140" w:line="259" w:lineRule="auto"/>
             </w:pPr>
             <w:r>
               <w:rPr>
-                <w:rFonts w:ascii="Georgia" w:hAnsi="Georgia"/>
+                <w:rFonts w:ascii="Arial" w:hAnsi="Arial"/>
                 <w:b/>
-                <w:color w:val="FFFFFF"/>
+                <w:color w:val="4D2298"/>
+                <w:sz w:val="58"/>
+              </w:rPr>
+              <w:t>$24,000</w:t>
+            </w:r>
+          </w:p>
+          <w:p>
+            <w:pPr>
+              <w:spacing w:after="140" w:line="259" w:lineRule="auto"/>
+            </w:pPr>
+            <w:r>
+              <w:rPr>
+                <w:rFonts w:ascii="Arial" w:hAnsi="Arial"/>
+                <w:b w:val="0"/>
+                <w:color w:val="17212B"/>
                 <w:sz w:val="20"/>
               </w:rPr>
-              <w:t>Stage</w:t>
+              <w:t>fixed fee for the defined scope</w:t>
+            </w:r>
+          </w:p>
+          <w:p>
+            <w:pPr>
+              <w:pStyle w:val="Heading1"/>
+              <w:spacing w:after="140" w:line="259" w:lineRule="auto"/>
+            </w:pPr>
+            <w:r>
+              <w:rPr>
+                <w:rFonts w:ascii="Arial" w:hAnsi="Arial"/>
+                <w:b/>
+                <w:color w:val="4D2298"/>
+                <w:sz w:val="28"/>
+              </w:rPr>
+              <w:t>Commercial Terms</w:t>
+            </w:r>
+          </w:p>
+          <w:p>
+            <w:pPr>
+              <w:spacing w:after="140" w:line="259" w:lineRule="auto"/>
+              <w:ind w:right="0"/>
+            </w:pPr>
+            <w:r>
+              <w:rPr>
+                <w:rFonts w:ascii="Arial" w:hAnsi="Arial"/>
+                <w:b w:val="0"/>
+                <w:color w:val="17212B"/>
+                <w:sz w:val="21"/>
+              </w:rPr>
+              <w:t>Invoices follow the milestones below. The estimate excludes taxes, third-party subscriptions, production hosting and changes outside the agreed six screens.</w:t>
             </w:r>
           </w:p>
         </w:tc>
         <w:tc>
           <w:tcPr>
-            <w:tcW w:type="dxa" w:w="3408"/>
-            <w:shd w:fill="006548"/>
+            <w:tcW w:type="dxa" w:w="10224"/>
           </w:tcPr>
+          <w:p/>
           <w:p>
             <w:pPr>
-              <w:spacing w:after="160" w:before="100"/>
+              <w:pStyle w:val="Title"/>
+              <w:spacing w:after="140" w:line="259" w:lineRule="auto"/>
             </w:pPr>
             <w:r>
               <w:rPr>
-                <w:rFonts w:ascii="Georgia" w:hAnsi="Georgia"/>
+                <w:rFonts w:ascii="Arial" w:hAnsi="Arial"/>
                 <w:b/>
-                <w:color w:val="FFFFFF"/>
-                <w:sz w:val="20"/>
+                <w:color w:val="17212B"/>
+                <w:sz w:val="54"/>
               </w:rPr>
-              <w:t>Deliverable</w:t>
+              <w:t>Juniper Studio Service Proposal</w:t>
+            </w:r>
+          </w:p>
+          <w:p>
+            <w:pPr>
+              <w:spacing w:after="140" w:line="259" w:lineRule="auto"/>
+            </w:pPr>
+            <w:r>
+              <w:rPr>
+                <w:rFonts w:ascii="Arial" w:hAnsi="Arial"/>
+                <w:b/>
+                <w:color w:val="4D2298"/>
+                <w:sz w:val="24"/>
+              </w:rPr>
+              <w:t>Replace the fragmented booking journey with one accessible flow, delivered in three reviewable stages.</w:t>
+            </w:r>
+          </w:p>
+          <w:p>
+            <w:pPr>
+              <w:spacing w:after="140" w:line="259" w:lineRule="auto"/>
+              <w:ind w:right="4134"/>
+            </w:pPr>
+            <w:r>
+              <w:rPr>
+                <w:rFonts w:ascii="Arial" w:hAnsi="Arial"/>
+                <w:b w:val="0"/>
+                <w:color w:val="17212B"/>
+                <w:sz w:val="21"/>
+              </w:rPr>
+              <w:t>The fictional engagement covers research synthesis, interaction design and a tested frontend prototype for a neighborhood arts venue. Production integration is a separate engagement.</w:t>
+            </w:r>
+          </w:p>
+          <w:tbl>
+            <w:tblPr>
+              <w:tblW w:type="auto" w:w="0"/>
+              <w:tblLook w:firstColumn="1" w:firstRow="1" w:lastColumn="0" w:lastRow="0" w:noHBand="0" w:noVBand="1" w:val="04A0"/>
+            </w:tblPr>
+            <w:tblGrid>
+              <w:gridCol w:w="3408"/>
+              <w:gridCol w:w="3408"/>
+              <w:gridCol w:w="3408"/>
+            </w:tblGrid>
+            <w:tr>
+              <w:trPr>
+                <w:tblHeader/>
+                <w:cantSplit/>
+              </w:trPr>
+              <w:tc>
+                <w:tcPr>
+                  <w:tcW w:type="dxa" w:w="3408"/>
+                  <w:shd w:fill="4D2298"/>
+                </w:tcPr>
+                <w:p/>
+                <w:p>
+                  <w:pPr>
+                    <w:spacing w:after="140" w:line="259" w:lineRule="auto"/>
+                  </w:pPr>
+                  <w:r>
+                    <w:rPr>
+                      <w:rFonts w:ascii="Arial" w:hAnsi="Arial"/>
+                      <w:b/>
+                      <w:color w:val="FFFFFF"/>
+                      <w:sz w:val="18"/>
+                    </w:rPr>
+                    <w:t>Stage</w:t>
+                  </w:r>
+                </w:p>
+              </w:tc>
+              <w:tc>
+                <w:tcPr>
+                  <w:tcW w:type="dxa" w:w="3408"/>
+                  <w:shd w:fill="4D2298"/>
+                </w:tcPr>
+                <w:p/>
+                <w:p>
+                  <w:pPr>
+                    <w:spacing w:after="140" w:line="259" w:lineRule="auto"/>
+                  </w:pPr>
+                  <w:r>
+                    <w:rPr>
+                      <w:rFonts w:ascii="Arial" w:hAnsi="Arial"/>
+                      <w:b/>
+                      <w:color w:val="FFFFFF"/>
+                      <w:sz w:val="18"/>
+                    </w:rPr>
+                    <w:t>Deliverable</w:t>
+                  </w:r>
+                </w:p>
+              </w:tc>
+              <w:tc>
+                <w:tcPr>
+                  <w:tcW w:type="dxa" w:w="3408"/>
+                  <w:shd w:fill="4D2298"/>
+                </w:tcPr>
+                <w:p/>
+                <w:p>
+                  <w:pPr>
+                    <w:spacing w:after="140" w:line="259" w:lineRule="auto"/>
+                  </w:pPr>
+                  <w:r>
+                    <w:rPr>
+                      <w:rFonts w:ascii="Arial" w:hAnsi="Arial"/>
+                      <w:b/>
+                      <w:color w:val="FFFFFF"/>
+                      <w:sz w:val="18"/>
+                    </w:rPr>
+                    <w:t>Fee</w:t>
+                  </w:r>
+                </w:p>
+              </w:tc>
+            </w:tr>
+            <w:tr>
+              <w:trPr>
+                <w:cantSplit/>
+              </w:trPr>
+              <w:tc>
+                <w:tcPr>
+                  <w:tcW w:type="dxa" w:w="3408"/>
+                  <w:shd w:fill="FFFFFF"/>
+                </w:tcPr>
+                <w:p/>
+                <w:p>
+                  <w:pPr>
+                    <w:spacing w:after="140" w:line="259" w:lineRule="auto"/>
+                  </w:pPr>
+                  <w:r>
+                    <w:rPr>
+                      <w:rFonts w:ascii="Arial" w:hAnsi="Arial"/>
+                      <w:b w:val="0"/>
+                      <w:color w:val="17212B"/>
+                      <w:sz w:val="18"/>
+                    </w:rPr>
+                    <w:t>01 Discover</w:t>
+                  </w:r>
+                </w:p>
+              </w:tc>
+              <w:tc>
+                <w:tcPr>
+                  <w:tcW w:type="dxa" w:w="3408"/>
+                  <w:shd w:fill="FFFFFF"/>
+                </w:tcPr>
+                <w:p/>
+                <w:p>
+                  <w:pPr>
+                    <w:spacing w:after="140" w:line="259" w:lineRule="auto"/>
+                  </w:pPr>
+                  <w:r>
+                    <w:rPr>
+                      <w:rFonts w:ascii="Arial" w:hAnsi="Arial"/>
+                      <w:b w:val="0"/>
+                      <w:color w:val="17212B"/>
+                      <w:sz w:val="18"/>
+                    </w:rPr>
+                    <w:t>Journey and success measures</w:t>
+                  </w:r>
+                </w:p>
+              </w:tc>
+              <w:tc>
+                <w:tcPr>
+                  <w:tcW w:type="dxa" w:w="3408"/>
+                  <w:shd w:fill="FFFFFF"/>
+                </w:tcPr>
+                <w:p/>
+                <w:p>
+                  <w:pPr>
+                    <w:spacing w:after="140" w:line="259" w:lineRule="auto"/>
+                  </w:pPr>
+                  <w:r>
+                    <w:rPr>
+                      <w:rFonts w:ascii="Arial" w:hAnsi="Arial"/>
+                      <w:b w:val="0"/>
+                      <w:color w:val="17212B"/>
+                      <w:sz w:val="18"/>
+                    </w:rPr>
+                    <w:t>$6,000</w:t>
+                  </w:r>
+                </w:p>
+              </w:tc>
+            </w:tr>
+            <w:tr>
+              <w:trPr>
+                <w:cantSplit/>
+              </w:trPr>
+              <w:tc>
+                <w:tcPr>
+                  <w:tcW w:type="dxa" w:w="3408"/>
+                  <w:shd w:fill="FFFFFF"/>
+                </w:tcPr>
+                <w:p/>
+                <w:p>
+                  <w:pPr>
+                    <w:spacing w:after="140" w:line="259" w:lineRule="auto"/>
+                  </w:pPr>
+                  <w:r>
+                    <w:rPr>
+                      <w:rFonts w:ascii="Arial" w:hAnsi="Arial"/>
+                      <w:b w:val="0"/>
+                      <w:color w:val="17212B"/>
+                      <w:sz w:val="18"/>
+                    </w:rPr>
+                    <w:t>02 Design</w:t>
+                  </w:r>
+                </w:p>
+              </w:tc>
+              <w:tc>
+                <w:tcPr>
+                  <w:tcW w:type="dxa" w:w="3408"/>
+                  <w:shd w:fill="FFFFFF"/>
+                </w:tcPr>
+                <w:p/>
+                <w:p>
+                  <w:pPr>
+                    <w:spacing w:after="140" w:line="259" w:lineRule="auto"/>
+                  </w:pPr>
+                  <w:r>
+                    <w:rPr>
+                      <w:rFonts w:ascii="Arial" w:hAnsi="Arial"/>
+                      <w:b w:val="0"/>
+                      <w:color w:val="17212B"/>
+                      <w:sz w:val="18"/>
+                    </w:rPr>
+                    <w:t>Six screens and component states</w:t>
+                  </w:r>
+                </w:p>
+              </w:tc>
+              <w:tc>
+                <w:tcPr>
+                  <w:tcW w:type="dxa" w:w="3408"/>
+                  <w:shd w:fill="FFFFFF"/>
+                </w:tcPr>
+                <w:p/>
+                <w:p>
+                  <w:pPr>
+                    <w:spacing w:after="140" w:line="259" w:lineRule="auto"/>
+                  </w:pPr>
+                  <w:r>
+                    <w:rPr>
+                      <w:rFonts w:ascii="Arial" w:hAnsi="Arial"/>
+                      <w:b w:val="0"/>
+                      <w:color w:val="17212B"/>
+                      <w:sz w:val="18"/>
+                    </w:rPr>
+                    <w:t>$10,000</w:t>
+                  </w:r>
+                </w:p>
+              </w:tc>
+            </w:tr>
+            <w:tr>
+              <w:trPr>
+                <w:cantSplit/>
+              </w:trPr>
+              <w:tc>
+                <w:tcPr>
+                  <w:tcW w:type="dxa" w:w="3408"/>
+                  <w:shd w:fill="FFFFFF"/>
+                </w:tcPr>
+                <w:p/>
+                <w:p>
+                  <w:pPr>
+                    <w:spacing w:after="140" w:line="259" w:lineRule="auto"/>
+                  </w:pPr>
+                  <w:r>
+                    <w:rPr>
+                      <w:rFonts w:ascii="Arial" w:hAnsi="Arial"/>
+                      <w:b w:val="0"/>
+                      <w:color w:val="17212B"/>
+                      <w:sz w:val="18"/>
+                    </w:rPr>
+                    <w:t>03 Validate</w:t>
+                  </w:r>
+                </w:p>
+              </w:tc>
+              <w:tc>
+                <w:tcPr>
+                  <w:tcW w:type="dxa" w:w="3408"/>
+                  <w:shd w:fill="FFFFFF"/>
+                </w:tcPr>
+                <w:p/>
+                <w:p>
+                  <w:pPr>
+                    <w:spacing w:after="140" w:line="259" w:lineRule="auto"/>
+                  </w:pPr>
+                  <w:r>
+                    <w:rPr>
+                      <w:rFonts w:ascii="Arial" w:hAnsi="Arial"/>
+                      <w:b w:val="0"/>
+                      <w:color w:val="17212B"/>
+                      <w:sz w:val="18"/>
+                    </w:rPr>
+                    <w:t>Prototype and handoff</w:t>
+                  </w:r>
+                </w:p>
+              </w:tc>
+              <w:tc>
+                <w:tcPr>
+                  <w:tcW w:type="dxa" w:w="3408"/>
+                  <w:shd w:fill="FFFFFF"/>
+                </w:tcPr>
+                <w:p/>
+                <w:p>
+                  <w:pPr>
+                    <w:spacing w:after="140" w:line="259" w:lineRule="auto"/>
+                  </w:pPr>
+                  <w:r>
+                    <w:rPr>
+                      <w:rFonts w:ascii="Arial" w:hAnsi="Arial"/>
+                      <w:b w:val="0"/>
+                      <w:color w:val="17212B"/>
+                      <w:sz w:val="18"/>
+                    </w:rPr>
+                    <w:t>$8,000</w:t>
+                  </w:r>
+                </w:p>
+              </w:tc>
+            </w:tr>
+          </w:tbl>
+          <w:p/>
+        </w:tc>
+      </w:tr>
+    </w:tbl>
+    <w:tbl>
+      <w:tblPr>
+        <w:tblW w:type="auto" w:w="0"/>
+        <w:tblLayout w:type="fixed"/>
+        <w:tblLook w:firstColumn="1" w:firstRow="1" w:lastColumn="0" w:lastRow="0" w:noHBand="0" w:noVBand="1" w:val="04A0"/>
+      </w:tblPr>
+      <w:tblGrid>
+        <w:gridCol w:w="7488"/>
+        <w:gridCol w:w="7488"/>
+      </w:tblGrid>
+      <w:tr>
+        <w:tc>
+          <w:tcPr>
+            <w:tcW w:type="dxa" w:w="7488"/>
+          </w:tcPr>
+          <w:p/>
+          <w:p>
+            <w:pPr>
+              <w:pStyle w:val="Heading1"/>
+              <w:spacing w:after="140" w:line="259" w:lineRule="auto"/>
+            </w:pPr>
+            <w:r>
+              <w:rPr>
+                <w:rFonts w:ascii="Arial" w:hAnsi="Arial"/>
+                <w:b/>
+                <w:color w:val="4D2298"/>
+                <w:sz w:val="28"/>
+              </w:rPr>
+              <w:t>Included</w:t>
+            </w:r>
+          </w:p>
+          <w:p>
+            <w:pPr>
+              <w:spacing w:after="140" w:line="259" w:lineRule="auto"/>
+              <w:ind w:right="1398"/>
+            </w:pPr>
+            <w:r>
+              <w:rPr>
+                <w:rFonts w:ascii="Arial" w:hAnsi="Arial"/>
+                <w:b w:val="0"/>
+                <w:color w:val="17212B"/>
+                <w:sz w:val="21"/>
+              </w:rPr>
+              <w:t>Two stakeholder workshops, six core screens, responsive specifications, accessible component states and a documented prototype handoff.</w:t>
             </w:r>
           </w:p>
         </w:tc>
         <w:tc>
           <w:tcPr>
-            <w:tcW w:type="dxa" w:w="3408"/>
-            <w:shd w:fill="006548"/>
+            <w:tcW w:type="dxa" w:w="7488"/>
           </w:tcPr>
+          <w:p/>
           <w:p>
             <w:pPr>
-              <w:spacing w:after="160" w:before="100"/>
+              <w:pStyle w:val="Heading1"/>
+              <w:spacing w:after="140" w:line="259" w:lineRule="auto"/>
             </w:pPr>
             <w:r>
               <w:rPr>
-                <w:rFonts w:ascii="Georgia" w:hAnsi="Georgia"/>
+                <w:rFonts w:ascii="Arial" w:hAnsi="Arial"/>
                 <w:b/>
-                <w:color w:val="FFFFFF"/>
-                <w:sz w:val="20"/>
+                <w:color w:val="4D2298"/>
+                <w:sz w:val="28"/>
               </w:rPr>
-              <w:t>Fee</w:t>
+              <w:t>Working Together</w:t>
             </w:r>
           </w:p>
-        </w:tc>
-      </w:tr>
-      <w:tr>
-        <w:tc>
-          <w:tcPr>
-            <w:tcW w:type="dxa" w:w="3408"/>
-            <w:shd w:fill="E5FF3D"/>
-          </w:tcPr>
           <w:p>
             <w:pPr>
-              <w:spacing w:after="160" w:before="100"/>
+              <w:spacing w:after="140" w:line="259" w:lineRule="auto"/>
+              <w:ind w:right="1398"/>
             </w:pPr>
             <w:r>
               <w:rPr>
-                <w:rFonts w:ascii="Georgia" w:hAnsi="Georgia"/>
+                <w:rFonts w:ascii="Arial" w:hAnsi="Arial"/>
                 <w:b w:val="0"/>
                 <w:color w:val="17212B"/>
-                <w:sz w:val="20"/>
+                <w:sz w:val="21"/>
               </w:rPr>
-              <w:t>01 Discover</w:t>
-            </w:r>
-          </w:p>
-        </w:tc>
-        <w:tc>
-          <w:tcPr>
-            <w:tcW w:type="dxa" w:w="3408"/>
-            <w:shd w:fill="E5FF3D"/>
-          </w:tcPr>
-          <w:p>
-            <w:pPr>
-              <w:spacing w:after="160" w:before="100"/>
-            </w:pPr>
-            <w:r>
-              <w:rPr>
-                <w:rFonts w:ascii="Georgia" w:hAnsi="Georgia"/>
-                <w:b w:val="0"/>
-                <w:color w:val="17212B"/>
-                <w:sz w:val="20"/>
-              </w:rPr>
-              <w:t>Journey and success measures</w:t>
-            </w:r>
-          </w:p>
-        </w:tc>
-        <w:tc>
-          <w:tcPr>
-            <w:tcW w:type="dxa" w:w="3408"/>
-            <w:shd w:fill="E5FF3D"/>
-          </w:tcPr>
-          <w:p>
-            <w:pPr>
-              <w:spacing w:after="160" w:before="100"/>
-            </w:pPr>
-            <w:r>
-              <w:rPr>
-                <w:rFonts w:ascii="Georgia" w:hAnsi="Georgia"/>
-                <w:b w:val="0"/>
-                <w:color w:val="17212B"/>
-                <w:sz w:val="20"/>
-              </w:rPr>
-              <w:t>$6,000</w:t>
-            </w:r>
-          </w:p>
-        </w:tc>
-      </w:tr>
-      <w:tr>
-        <w:tc>
-          <w:tcPr>
-            <w:tcW w:type="dxa" w:w="3408"/>
-            <w:shd w:fill="FFFFFF"/>
-          </w:tcPr>
-          <w:p>
-            <w:pPr>
-              <w:spacing w:after="160" w:before="100"/>
-            </w:pPr>
-            <w:r>
-              <w:rPr>
-                <w:rFonts w:ascii="Georgia" w:hAnsi="Georgia"/>
-                <w:b w:val="0"/>
-                <w:color w:val="17212B"/>
-                <w:sz w:val="20"/>
-              </w:rPr>
-              <w:t>02 Design</w:t>
-            </w:r>
-          </w:p>
-        </w:tc>
-        <w:tc>
-          <w:tcPr>
-            <w:tcW w:type="dxa" w:w="3408"/>
-            <w:shd w:fill="FFFFFF"/>
-          </w:tcPr>
-          <w:p>
-            <w:pPr>
-              <w:spacing w:after="160" w:before="100"/>
-            </w:pPr>
-            <w:r>
-              <w:rPr>
-                <w:rFonts w:ascii="Georgia" w:hAnsi="Georgia"/>
-                <w:b w:val="0"/>
-                <w:color w:val="17212B"/>
-                <w:sz w:val="20"/>
-              </w:rPr>
-              <w:t>Six screens and component states</w:t>
-            </w:r>
-          </w:p>
-        </w:tc>
-        <w:tc>
-          <w:tcPr>
-            <w:tcW w:type="dxa" w:w="3408"/>
-            <w:shd w:fill="FFFFFF"/>
-          </w:tcPr>
-          <w:p>
-            <w:pPr>
-              <w:spacing w:after="160" w:before="100"/>
-            </w:pPr>
-            <w:r>
-              <w:rPr>
-                <w:rFonts w:ascii="Georgia" w:hAnsi="Georgia"/>
-                <w:b w:val="0"/>
-                <w:color w:val="17212B"/>
-                <w:sz w:val="20"/>
-              </w:rPr>
-              <w:t>$10,000</w:t>
-            </w:r>
-          </w:p>
-        </w:tc>
-      </w:tr>
-      <w:tr>
-        <w:tc>
-          <w:tcPr>
-            <w:tcW w:type="dxa" w:w="3408"/>
-            <w:shd w:fill="E5FF3D"/>
-          </w:tcPr>
-          <w:p>
-            <w:pPr>
-              <w:spacing w:after="160" w:before="100"/>
-            </w:pPr>
-            <w:r>
-              <w:rPr>
-                <w:rFonts w:ascii="Georgia" w:hAnsi="Georgia"/>
-                <w:b w:val="0"/>
-                <w:color w:val="17212B"/>
-                <w:sz w:val="20"/>
-              </w:rPr>
-              <w:t>03 Validate</w:t>
-            </w:r>
-          </w:p>
-        </w:tc>
-        <w:tc>
-          <w:tcPr>
-            <w:tcW w:type="dxa" w:w="3408"/>
-            <w:shd w:fill="E5FF3D"/>
-          </w:tcPr>
-          <w:p>
-            <w:pPr>
-              <w:spacing w:after="160" w:before="100"/>
-            </w:pPr>
-            <w:r>
-              <w:rPr>
-                <w:rFonts w:ascii="Georgia" w:hAnsi="Georgia"/>
-                <w:b w:val="0"/>
-                <w:color w:val="17212B"/>
-                <w:sz w:val="20"/>
-              </w:rPr>
-              <w:t>Prototype and handoff</w:t>
-            </w:r>
-          </w:p>
-        </w:tc>
-        <w:tc>
-          <w:tcPr>
-            <w:tcW w:type="dxa" w:w="3408"/>
-            <w:shd w:fill="E5FF3D"/>
-          </w:tcPr>
-          <w:p>
-            <w:pPr>
-              <w:spacing w:after="160" w:before="100"/>
-            </w:pPr>
-            <w:r>
-              <w:rPr>
-                <w:rFonts w:ascii="Georgia" w:hAnsi="Georgia"/>
-                <w:b w:val="0"/>
-                <w:color w:val="17212B"/>
-                <w:sz w:val="20"/>
-              </w:rPr>
-              <w:t>$8,000</w:t>
+              <w:t>One named decision owner consolidates feedback within three working days. Each stage ends with a review, not an implied approval.</w:t>
             </w:r>
           </w:p>
         </w:tc>
@@ -351,109 +516,23 @@
     </w:tbl>
     <w:p>
       <w:pPr>
-        <w:pStyle w:val="Heading1"/>
-        <w:spacing w:after="140" w:line="269" w:lineRule="auto"/>
+        <w:spacing w:after="140" w:line="259" w:lineRule="auto"/>
       </w:pPr>
       <w:r>
         <w:rPr>
-          <w:rFonts w:ascii="Georgia" w:hAnsi="Georgia"/>
+          <w:rFonts w:ascii="Arial" w:hAnsi="Arial"/>
           <w:b/>
-          <w:color w:val="006548"/>
-          <w:sz w:val="30"/>
-        </w:rPr>
-        <w:t>Included</w:t>
-      </w:r>
-    </w:p>
-    <w:p>
-      <w:pPr>
-        <w:spacing w:after="140" w:line="269" w:lineRule="auto"/>
-      </w:pPr>
-      <w:r>
-        <w:rPr>
-          <w:rFonts w:ascii="Georgia" w:hAnsi="Georgia"/>
-          <w:b w:val="0"/>
-          <w:color w:val="17212B"/>
-          <w:sz w:val="22"/>
-        </w:rPr>
-        <w:t>Two stakeholder workshops, six core screens, responsive specifications, accessible component states and a documented prototype handoff.</w:t>
-      </w:r>
-    </w:p>
-    <w:p>
-      <w:pPr>
-        <w:pStyle w:val="Heading1"/>
-        <w:spacing w:after="140" w:line="269" w:lineRule="auto"/>
-      </w:pPr>
-      <w:r>
-        <w:rPr>
-          <w:rFonts w:ascii="Georgia" w:hAnsi="Georgia"/>
-          <w:b/>
-          <w:color w:val="006548"/>
-          <w:sz w:val="30"/>
-        </w:rPr>
-        <w:t>Working Together</w:t>
-      </w:r>
-    </w:p>
-    <w:p>
-      <w:pPr>
-        <w:spacing w:after="140" w:line="269" w:lineRule="auto"/>
-      </w:pPr>
-      <w:r>
-        <w:rPr>
-          <w:rFonts w:ascii="Georgia" w:hAnsi="Georgia"/>
-          <w:b w:val="0"/>
-          <w:color w:val="17212B"/>
-          <w:sz w:val="22"/>
-        </w:rPr>
-        <w:t>One named decision owner consolidates feedback within three working days. Each stage ends with a review, not an implied approval.</w:t>
-      </w:r>
-    </w:p>
-    <w:p>
-      <w:pPr>
-        <w:pStyle w:val="Heading1"/>
-        <w:spacing w:after="140" w:line="269" w:lineRule="auto"/>
-      </w:pPr>
-      <w:r>
-        <w:rPr>
-          <w:rFonts w:ascii="Georgia" w:hAnsi="Georgia"/>
-          <w:b/>
-          <w:color w:val="006548"/>
-          <w:sz w:val="30"/>
-        </w:rPr>
-        <w:t>Commercial Terms</w:t>
-      </w:r>
-    </w:p>
-    <w:p>
-      <w:pPr>
-        <w:spacing w:after="140" w:line="269" w:lineRule="auto"/>
-      </w:pPr>
-      <w:r>
-        <w:rPr>
-          <w:rFonts w:ascii="Georgia" w:hAnsi="Georgia"/>
-          <w:b w:val="0"/>
-          <w:color w:val="17212B"/>
-          <w:sz w:val="22"/>
-        </w:rPr>
-        <w:t>Invoices follow the milestones below. The estimate excludes taxes, third-party subscriptions, production hosting and changes outside the agreed six screens.</w:t>
-      </w:r>
-    </w:p>
-    <w:p>
-      <w:pPr>
-        <w:spacing w:after="140" w:line="269" w:lineRule="auto"/>
-      </w:pPr>
-      <w:r>
-        <w:rPr>
-          <w:rFonts w:ascii="Georgia" w:hAnsi="Georgia"/>
-          <w:b/>
-          <w:color w:val="006548"/>
-          <w:sz w:val="20"/>
+          <w:color w:val="4D2298"/>
+          <w:sz w:val="18"/>
         </w:rPr>
         <w:t>Offer valid for 30 days · Start date follows written acceptance.</w:t>
       </w:r>
     </w:p>
     <w:sectPr>
       <w:footerReference w:type="default" r:id="rId9"/>
-      <w:pgSz w:w="11952" w:h="16848"/>
-      <w:pgMar w:top="792" w:right="864" w:bottom="792" w:left="864" w:header="720" w:footer="720" w:gutter="0"/>
+      <w:headerReference w:type="default" r:id="rId10"/>
+      <w:pgSz w:w="16848" w:h="11952"/>
+      <w:pgMar w:top="691" w:right="792" w:bottom="691" w:left="792" w:header="720" w:footer="720" w:gutter="0"/>
       <w:cols w:space="720"/>
       <w:docGrid w:linePitch="360"/>
     </w:sectPr>
@@ -470,19 +549,36 @@
   </w:p>
   <w:p>
     <w:pPr>
-      <w:spacing w:after="140" w:line="269" w:lineRule="auto"/>
+      <w:spacing w:after="140" w:line="259" w:lineRule="auto"/>
     </w:pPr>
     <w:r>
       <w:rPr>
-        <w:rFonts w:ascii="Georgia" w:hAnsi="Georgia"/>
+        <w:rFonts w:ascii="Arial" w:hAnsi="Arial"/>
         <w:b w:val="0"/>
         <w:color w:val="17212B"/>
         <w:sz w:val="16"/>
       </w:rPr>
-      <w:t>Fictional Worked Example / The Fee Waterfall / 01</w:t>
+      <w:t>Fictional Dazzler example / Apache-2.0 / Editable text and tables</w:t>
     </w:r>
   </w:p>
 </w:ftr>
+</file>
+
+<file path=word/header1.xml><?xml version="1.0" encoding="utf-8"?>
+<w:hdr xmlns:m="http://schemas.openxmlformats.org/officeDocument/2006/math" xmlns:mc="http://schemas.openxmlformats.org/markup-compatibility/2006" xmlns:mo="http://schemas.microsoft.com/office/mac/office/2008/main" xmlns:mv="urn:schemas-microsoft-com:mac:vml" xmlns:o="urn:schemas-microsoft-com:office:office" xmlns:r="http://schemas.openxmlformats.org/officeDocument/2006/relationships" xmlns:v="urn:schemas-microsoft-com:vml" xmlns:w10="urn:schemas-microsoft-com:office:word" xmlns:w14="http://schemas.microsoft.com/office/word/2010/wordml" xmlns:w="http://schemas.openxmlformats.org/wordprocessingml/2006/main" xmlns:wne="http://schemas.microsoft.com/office/word/2006/wordml" xmlns:wp14="http://schemas.microsoft.com/office/word/2010/wordprocessingDrawing" xmlns:wp="http://schemas.openxmlformats.org/drawingml/2006/wordprocessingDrawing" xmlns:wpc="http://schemas.microsoft.com/office/word/2010/wordprocessingCanvas" xmlns:wpg="http://schemas.microsoft.com/office/word/2010/wordprocessingGroup" xmlns:wpi="http://schemas.microsoft.com/office/word/2010/wordprocessingInk" xmlns:wps="http://schemas.microsoft.com/office/word/2010/wordprocessingShape" mc:Ignorable="w14 wp14">
+  <w:p>
+    <w:pPr>
+      <w:pStyle w:val="Header"/>
+    </w:pPr>
+    <w:r>
+      <w:pict>
+        <v:rect id="DazzlerPageSurface" style="position:absolute;margin-left:0;margin-top:0;width:842.4pt;height:597.6pt;z-index:-251654144;mso-position-horizontal-relative:page;mso-position-vertical-relative:page" fillcolor="#EAC7FF" stroked="f">
+          <v:fill color="#EAC7FF"/>
+        </v:rect>
+      </w:pict>
+    </w:r>
+  </w:p>
+</w:hdr>
 </file>
 
 <file path=word/numbering.xml><?xml version="1.0" encoding="utf-8"?>
@@ -848,9 +944,13 @@
     <w:name w:val="Normal"/>
     <w:qFormat/>
     <w:rsid w:val="00FC693F"/>
+    <w:pPr>
+      <w:spacing w:after="120"/>
+    </w:pPr>
     <w:rPr>
-      <w:rFonts w:ascii="Georgia" w:hAnsi="Georgia"/>
-      <w:sz w:val="22"/>
+      <w:rFonts w:ascii="Arial" w:hAnsi="Arial"/>
+      <w:color w:val="17212B"/>
+      <w:sz w:val="21"/>
     </w:rPr>
   </w:style>
   <w:style w:type="paragraph" w:styleId="Header">
@@ -867,10 +967,6 @@
       </w:tabs>
       <w:spacing w:after="0" w:line="240" w:lineRule="auto"/>
     </w:pPr>
-    <w:rPr>
-      <w:rFonts w:ascii="Georgia" w:hAnsi="Georgia"/>
-      <w:sz w:val="22"/>
-    </w:rPr>
   </w:style>
   <w:style w:type="character" w:customStyle="1" w:styleId="HeaderChar">
     <w:name w:val="Header Char"/>
@@ -893,10 +989,6 @@
       </w:tabs>
       <w:spacing w:after="0" w:line="240" w:lineRule="auto"/>
     </w:pPr>
-    <w:rPr>
-      <w:rFonts w:ascii="Georgia" w:hAnsi="Georgia"/>
-      <w:sz w:val="22"/>
-    </w:rPr>
   </w:style>
   <w:style w:type="character" w:customStyle="1" w:styleId="FooterChar">
     <w:name w:val="Footer Char"/>
@@ -916,15 +1008,15 @@
     <w:pPr>
       <w:keepNext/>
       <w:keepLines/>
-      <w:spacing w:before="480" w:after="0"/>
+      <w:spacing w:before="480" w:after="120"/>
       <w:outlineLvl w:val="0"/>
     </w:pPr>
     <w:rPr>
-      <w:rFonts w:cstheme="majorBidi" w:ascii="Georgia" w:hAnsi="Georgia"/>
+      <w:rFonts w:asciiTheme="majorHAnsi" w:eastAsiaTheme="majorEastAsia" w:hAnsiTheme="majorHAnsi" w:cstheme="majorBidi" w:ascii="Arial" w:hAnsi="Arial"/>
       <w:b/>
       <w:bCs/>
-      <w:color w:val="365F91" w:themeColor="accent1" w:themeShade="BF"/>
-      <w:sz w:val="22"/>
+      <w:color w:val="17212B"/>
+      <w:sz w:val="21"/>
       <w:szCs w:val="28"/>
     </w:rPr>
   </w:style>
@@ -940,15 +1032,15 @@
     <w:pPr>
       <w:keepNext/>
       <w:keepLines/>
-      <w:spacing w:before="200" w:after="0"/>
+      <w:spacing w:before="200" w:after="120"/>
       <w:outlineLvl w:val="1"/>
     </w:pPr>
     <w:rPr>
-      <w:rFonts w:cstheme="majorBidi" w:ascii="Georgia" w:hAnsi="Georgia"/>
+      <w:rFonts w:asciiTheme="majorHAnsi" w:eastAsiaTheme="majorEastAsia" w:hAnsiTheme="majorHAnsi" w:cstheme="majorBidi" w:ascii="Arial" w:hAnsi="Arial"/>
       <w:b/>
       <w:bCs/>
-      <w:color w:val="4F81BD" w:themeColor="accent1"/>
-      <w:sz w:val="22"/>
+      <w:color w:val="17212B"/>
+      <w:sz w:val="21"/>
       <w:szCs w:val="26"/>
     </w:rPr>
   </w:style>
@@ -968,11 +1060,10 @@
       <w:outlineLvl w:val="2"/>
     </w:pPr>
     <w:rPr>
-      <w:rFonts w:cstheme="majorBidi" w:ascii="Georgia" w:hAnsi="Georgia"/>
+      <w:rFonts w:asciiTheme="majorHAnsi" w:eastAsiaTheme="majorEastAsia" w:hAnsiTheme="majorHAnsi" w:cstheme="majorBidi"/>
       <w:b/>
       <w:bCs/>
       <w:color w:val="4F81BD" w:themeColor="accent1"/>
-      <w:sz w:val="22"/>
     </w:rPr>
   </w:style>
   <w:style w:type="paragraph" w:styleId="Heading4">
@@ -992,13 +1083,12 @@
       <w:outlineLvl w:val="3"/>
     </w:pPr>
     <w:rPr>
-      <w:rFonts w:cstheme="majorBidi" w:ascii="Georgia" w:hAnsi="Georgia"/>
+      <w:rFonts w:asciiTheme="majorHAnsi" w:eastAsiaTheme="majorEastAsia" w:hAnsiTheme="majorHAnsi" w:cstheme="majorBidi"/>
       <w:b/>
       <w:bCs/>
       <w:i/>
       <w:iCs/>
       <w:color w:val="4F81BD" w:themeColor="accent1"/>
-      <w:sz w:val="22"/>
     </w:rPr>
   </w:style>
   <w:style w:type="paragraph" w:styleId="Heading5">
@@ -1018,9 +1108,8 @@
       <w:outlineLvl w:val="4"/>
     </w:pPr>
     <w:rPr>
-      <w:rFonts w:cstheme="majorBidi" w:ascii="Georgia" w:hAnsi="Georgia"/>
+      <w:rFonts w:asciiTheme="majorHAnsi" w:eastAsiaTheme="majorEastAsia" w:hAnsiTheme="majorHAnsi" w:cstheme="majorBidi"/>
       <w:color w:val="243F60" w:themeColor="accent1" w:themeShade="7F"/>
-      <w:sz w:val="22"/>
     </w:rPr>
   </w:style>
   <w:style w:type="paragraph" w:styleId="Heading6">
@@ -1040,11 +1129,10 @@
       <w:outlineLvl w:val="5"/>
     </w:pPr>
     <w:rPr>
-      <w:rFonts w:cstheme="majorBidi" w:ascii="Georgia" w:hAnsi="Georgia"/>
+      <w:rFonts w:asciiTheme="majorHAnsi" w:eastAsiaTheme="majorEastAsia" w:hAnsiTheme="majorHAnsi" w:cstheme="majorBidi"/>
       <w:i/>
       <w:iCs/>
       <w:color w:val="243F60" w:themeColor="accent1" w:themeShade="7F"/>
-      <w:sz w:val="22"/>
     </w:rPr>
   </w:style>
   <w:style w:type="paragraph" w:styleId="Heading7">
@@ -1064,11 +1152,10 @@
       <w:outlineLvl w:val="6"/>
     </w:pPr>
     <w:rPr>
-      <w:rFonts w:cstheme="majorBidi" w:ascii="Georgia" w:hAnsi="Georgia"/>
+      <w:rFonts w:asciiTheme="majorHAnsi" w:eastAsiaTheme="majorEastAsia" w:hAnsiTheme="majorHAnsi" w:cstheme="majorBidi"/>
       <w:i/>
       <w:iCs/>
       <w:color w:val="404040" w:themeColor="text1" w:themeTint="BF"/>
-      <w:sz w:val="22"/>
     </w:rPr>
   </w:style>
   <w:style w:type="paragraph" w:styleId="Heading8">
@@ -1088,9 +1175,9 @@
       <w:outlineLvl w:val="7"/>
     </w:pPr>
     <w:rPr>
-      <w:rFonts w:cstheme="majorBidi" w:ascii="Georgia" w:hAnsi="Georgia"/>
+      <w:rFonts w:asciiTheme="majorHAnsi" w:eastAsiaTheme="majorEastAsia" w:hAnsiTheme="majorHAnsi" w:cstheme="majorBidi"/>
       <w:color w:val="4F81BD" w:themeColor="accent1"/>
-      <w:sz w:val="22"/>
+      <w:sz w:val="20"/>
       <w:szCs w:val="20"/>
     </w:rPr>
   </w:style>
@@ -1111,11 +1198,11 @@
       <w:outlineLvl w:val="8"/>
     </w:pPr>
     <w:rPr>
-      <w:rFonts w:cstheme="majorBidi" w:ascii="Georgia" w:hAnsi="Georgia"/>
+      <w:rFonts w:asciiTheme="majorHAnsi" w:eastAsiaTheme="majorEastAsia" w:hAnsiTheme="majorHAnsi" w:cstheme="majorBidi"/>
       <w:i/>
       <w:iCs/>
       <w:color w:val="404040" w:themeColor="text1" w:themeTint="BF"/>
-      <w:sz w:val="22"/>
+      <w:sz w:val="20"/>
       <w:szCs w:val="20"/>
     </w:rPr>
   </w:style>
@@ -1154,10 +1241,6 @@
     <w:pPr>
       <w:spacing w:after="0" w:line="240" w:lineRule="auto"/>
     </w:pPr>
-    <w:rPr>
-      <w:rFonts w:ascii="Georgia" w:hAnsi="Georgia"/>
-      <w:sz w:val="22"/>
-    </w:rPr>
   </w:style>
   <w:style w:type="character" w:customStyle="1" w:styleId="Heading1Char">
     <w:name w:val="Heading 1 Char"/>
@@ -1211,15 +1294,15 @@
     <w:qFormat/>
     <w:rsid w:val="00FC693F"/>
     <w:pPr>
-      <w:spacing w:after="300" w:line="240" w:lineRule="auto"/>
+      <w:spacing w:after="120" w:line="240" w:lineRule="auto"/>
       <w:contextualSpacing/>
     </w:pPr>
     <w:rPr>
-      <w:rFonts w:cstheme="majorBidi" w:ascii="Georgia" w:hAnsi="Georgia"/>
-      <w:color w:val="17365D" w:themeColor="text2" w:themeShade="BF"/>
+      <w:rFonts w:asciiTheme="majorHAnsi" w:eastAsiaTheme="majorEastAsia" w:hAnsiTheme="majorHAnsi" w:cstheme="majorBidi" w:ascii="Arial" w:hAnsi="Arial"/>
+      <w:color w:val="17212B"/>
       <w:spacing w:val="5"/>
       <w:kern w:val="28"/>
-      <w:sz w:val="22"/>
+      <w:sz w:val="21"/>
       <w:szCs w:val="52"/>
     </w:rPr>
   </w:style>
@@ -1252,12 +1335,12 @@
       </w:numPr>
     </w:pPr>
     <w:rPr>
-      <w:rFonts w:cstheme="majorBidi" w:ascii="Georgia" w:hAnsi="Georgia"/>
+      <w:rFonts w:asciiTheme="majorHAnsi" w:eastAsiaTheme="majorEastAsia" w:hAnsiTheme="majorHAnsi" w:cstheme="majorBidi"/>
       <w:i/>
       <w:iCs/>
       <w:color w:val="4F81BD" w:themeColor="accent1"/>
       <w:spacing w:val="15"/>
-      <w:sz w:val="22"/>
+      <w:sz w:val="24"/>
       <w:szCs w:val="24"/>
     </w:rPr>
   </w:style>
@@ -1287,10 +1370,6 @@
       <w:ind w:left="720"/>
       <w:contextualSpacing/>
     </w:pPr>
-    <w:rPr>
-      <w:rFonts w:ascii="Georgia" w:hAnsi="Georgia"/>
-      <w:sz w:val="22"/>
-    </w:rPr>
   </w:style>
   <w:style w:type="paragraph" w:styleId="BodyText">
     <w:name w:val="Body Text"/>
@@ -1302,10 +1381,6 @@
     <w:pPr>
       <w:spacing w:after="120"/>
     </w:pPr>
-    <w:rPr>
-      <w:rFonts w:ascii="Georgia" w:hAnsi="Georgia"/>
-      <w:sz w:val="22"/>
-    </w:rPr>
   </w:style>
   <w:style w:type="character" w:customStyle="1" w:styleId="BodyTextChar">
     <w:name w:val="Body Text Char"/>
@@ -1324,10 +1399,6 @@
     <w:pPr>
       <w:spacing w:after="120" w:line="480" w:lineRule="auto"/>
     </w:pPr>
-    <w:rPr>
-      <w:rFonts w:ascii="Georgia" w:hAnsi="Georgia"/>
-      <w:sz w:val="22"/>
-    </w:rPr>
   </w:style>
   <w:style w:type="character" w:customStyle="1" w:styleId="BodyText2Char">
     <w:name w:val="Body Text 2 Char"/>
@@ -1347,8 +1418,7 @@
       <w:spacing w:after="120"/>
     </w:pPr>
     <w:rPr>
-      <w:rFonts w:ascii="Georgia" w:hAnsi="Georgia"/>
-      <w:sz w:val="22"/>
+      <w:sz w:val="16"/>
       <w:szCs w:val="16"/>
     </w:rPr>
   </w:style>
@@ -1373,10 +1443,6 @@
       <w:ind w:left="360" w:hanging="360"/>
       <w:contextualSpacing/>
     </w:pPr>
-    <w:rPr>
-      <w:rFonts w:ascii="Georgia" w:hAnsi="Georgia"/>
-      <w:sz w:val="22"/>
-    </w:rPr>
   </w:style>
   <w:style w:type="paragraph" w:styleId="List2">
     <w:name w:val="List 2"/>
@@ -1388,10 +1454,6 @@
       <w:ind w:left="720" w:hanging="360"/>
       <w:contextualSpacing/>
     </w:pPr>
-    <w:rPr>
-      <w:rFonts w:ascii="Georgia" w:hAnsi="Georgia"/>
-      <w:sz w:val="22"/>
-    </w:rPr>
   </w:style>
   <w:style w:type="paragraph" w:styleId="List3">
     <w:name w:val="List 3"/>
@@ -1403,10 +1465,6 @@
       <w:ind w:left="1080" w:hanging="360"/>
       <w:contextualSpacing/>
     </w:pPr>
-    <w:rPr>
-      <w:rFonts w:ascii="Georgia" w:hAnsi="Georgia"/>
-      <w:sz w:val="22"/>
-    </w:rPr>
   </w:style>
   <w:style w:type="paragraph" w:styleId="ListBullet">
     <w:name w:val="List Bullet"/>
@@ -1420,10 +1478,6 @@
       </w:numPr>
       <w:contextualSpacing/>
     </w:pPr>
-    <w:rPr>
-      <w:rFonts w:ascii="Georgia" w:hAnsi="Georgia"/>
-      <w:sz w:val="22"/>
-    </w:rPr>
   </w:style>
   <w:style w:type="paragraph" w:styleId="ListBullet2">
     <w:name w:val="List Bullet 2"/>
@@ -1437,10 +1491,6 @@
       </w:numPr>
       <w:contextualSpacing/>
     </w:pPr>
-    <w:rPr>
-      <w:rFonts w:ascii="Georgia" w:hAnsi="Georgia"/>
-      <w:sz w:val="22"/>
-    </w:rPr>
   </w:style>
   <w:style w:type="paragraph" w:styleId="ListBullet3">
     <w:name w:val="List Bullet 3"/>
@@ -1454,10 +1504,6 @@
       </w:numPr>
       <w:contextualSpacing/>
     </w:pPr>
-    <w:rPr>
-      <w:rFonts w:ascii="Georgia" w:hAnsi="Georgia"/>
-      <w:sz w:val="22"/>
-    </w:rPr>
   </w:style>
   <w:style w:type="paragraph" w:styleId="ListNumber">
     <w:name w:val="List Number"/>
@@ -1471,10 +1517,6 @@
       </w:numPr>
       <w:contextualSpacing/>
     </w:pPr>
-    <w:rPr>
-      <w:rFonts w:ascii="Georgia" w:hAnsi="Georgia"/>
-      <w:sz w:val="22"/>
-    </w:rPr>
   </w:style>
   <w:style w:type="paragraph" w:styleId="ListNumber2">
     <w:name w:val="List Number 2"/>
@@ -1488,10 +1530,6 @@
       </w:numPr>
       <w:contextualSpacing/>
     </w:pPr>
-    <w:rPr>
-      <w:rFonts w:ascii="Georgia" w:hAnsi="Georgia"/>
-      <w:sz w:val="22"/>
-    </w:rPr>
   </w:style>
   <w:style w:type="paragraph" w:styleId="ListNumber3">
     <w:name w:val="List Number 3"/>
@@ -1505,10 +1543,6 @@
       </w:numPr>
       <w:contextualSpacing/>
     </w:pPr>
-    <w:rPr>
-      <w:rFonts w:ascii="Georgia" w:hAnsi="Georgia"/>
-      <w:sz w:val="22"/>
-    </w:rPr>
   </w:style>
   <w:style w:type="paragraph" w:styleId="ListContinue">
     <w:name w:val="List Continue"/>
@@ -1521,10 +1555,6 @@
       <w:ind w:left="360"/>
       <w:contextualSpacing/>
     </w:pPr>
-    <w:rPr>
-      <w:rFonts w:ascii="Georgia" w:hAnsi="Georgia"/>
-      <w:sz w:val="22"/>
-    </w:rPr>
   </w:style>
   <w:style w:type="paragraph" w:styleId="ListContinue2">
     <w:name w:val="List Continue 2"/>
@@ -1537,10 +1567,6 @@
       <w:ind w:left="720"/>
       <w:contextualSpacing/>
     </w:pPr>
-    <w:rPr>
-      <w:rFonts w:ascii="Georgia" w:hAnsi="Georgia"/>
-      <w:sz w:val="22"/>
-    </w:rPr>
   </w:style>
   <w:style w:type="paragraph" w:styleId="ListContinue3">
     <w:name w:val="List Continue 3"/>
@@ -1553,10 +1579,6 @@
       <w:ind w:left="1080"/>
       <w:contextualSpacing/>
     </w:pPr>
-    <w:rPr>
-      <w:rFonts w:ascii="Georgia" w:hAnsi="Georgia"/>
-      <w:sz w:val="22"/>
-    </w:rPr>
   </w:style>
   <w:style w:type="paragraph" w:styleId="MacroText">
     <w:name w:val="macro"/>
@@ -1576,8 +1598,8 @@
       </w:tabs>
     </w:pPr>
     <w:rPr>
-      <w:rFonts w:ascii="Georgia" w:hAnsi="Georgia"/>
-      <w:sz w:val="22"/>
+      <w:rFonts w:ascii="Courier" w:hAnsi="Courier"/>
+      <w:sz w:val="20"/>
       <w:szCs w:val="20"/>
     </w:rPr>
   </w:style>
@@ -1602,11 +1624,9 @@
     <w:qFormat/>
     <w:rsid w:val="00FC693F"/>
     <w:rPr>
-      <w:rFonts w:ascii="Georgia" w:hAnsi="Georgia"/>
       <w:i/>
       <w:iCs/>
       <w:color w:val="000000" w:themeColor="text1"/>
-      <w:sz w:val="22"/>
     </w:rPr>
   </w:style>
   <w:style w:type="character" w:customStyle="1" w:styleId="QuoteChar">
@@ -1720,11 +1740,10 @@
       <w:spacing w:line="240" w:lineRule="auto"/>
     </w:pPr>
     <w:rPr>
-      <w:rFonts w:ascii="Georgia" w:hAnsi="Georgia"/>
       <w:b/>
       <w:bCs/>
       <w:color w:val="4F81BD" w:themeColor="accent1"/>
-      <w:sz w:val="22"/>
+      <w:sz w:val="18"/>
       <w:szCs w:val="18"/>
     </w:rPr>
   </w:style>
@@ -1763,13 +1782,11 @@
       <w:ind w:left="936" w:right="936"/>
     </w:pPr>
     <w:rPr>
-      <w:rFonts w:ascii="Georgia" w:hAnsi="Georgia"/>
       <w:b/>
       <w:bCs/>
       <w:i/>
       <w:iCs/>
       <w:color w:val="4F81BD" w:themeColor="accent1"/>
-      <w:sz w:val="22"/>
     </w:rPr>
   </w:style>
   <w:style w:type="character" w:customStyle="1" w:styleId="IntenseQuoteChar">
@@ -1864,10 +1881,6 @@
     <w:pPr>
       <w:outlineLvl w:val="9"/>
     </w:pPr>
-    <w:rPr>
-      <w:rFonts w:ascii="Georgia" w:hAnsi="Georgia"/>
-      <w:sz w:val="22"/>
-    </w:rPr>
   </w:style>
   <w:style w:type="table" w:styleId="TableGrid">
     <w:name w:val="Table Grid"/>

</xml_diff>

<commit_message>
Refresh gallery with Hex Men review and align release evidence
</commit_message>
<xml_diff>
--- a/docs/templates/docx/business.docx
+++ b/docs/templates/docx/business.docx
@@ -8,29 +8,106 @@
       </w:pPr>
       <w:r>
         <w:rPr>
-          <w:rFonts w:ascii="Arial" w:hAnsi="Arial"/>
+          <w:rFonts w:ascii="Georgia" w:hAnsi="Georgia"/>
           <w:b/>
-          <w:color w:val="4D2298"/>
+          <w:color w:val="22573D"/>
           <w:sz w:val="18"/>
         </w:rPr>
         <w:t>JUNIPER / SCOPE 014</w:t>
       </w:r>
     </w:p>
+    <w:p>
+      <w:pPr>
+        <w:pStyle w:val="Title"/>
+        <w:spacing w:after="140" w:line="259" w:lineRule="auto"/>
+      </w:pPr>
+      <w:r>
+        <w:rPr>
+          <w:rFonts w:ascii="Georgia" w:hAnsi="Georgia"/>
+          <w:b/>
+          <w:color w:val="17212B"/>
+          <w:sz w:val="58"/>
+        </w:rPr>
+        <w:t>Juniper Studio Service Proposal</w:t>
+      </w:r>
+    </w:p>
+    <w:p>
+      <w:pPr>
+        <w:spacing w:after="140" w:line="259" w:lineRule="auto"/>
+      </w:pPr>
+      <w:r>
+        <w:rPr>
+          <w:rFonts w:ascii="Georgia" w:hAnsi="Georgia"/>
+          <w:b/>
+          <w:color w:val="22573D"/>
+          <w:sz w:val="22"/>
+        </w:rPr>
+        <w:t>Replace the fragmented booking journey with one accessible flow, delivered in three reviewable stages.</w:t>
+      </w:r>
+    </w:p>
+    <w:p>
+      <w:pPr>
+        <w:spacing w:after="140" w:line="259" w:lineRule="auto"/>
+      </w:pPr>
+      <w:r>
+        <w:rPr>
+          <w:rFonts w:ascii="Georgia" w:hAnsi="Georgia"/>
+          <w:b/>
+          <w:color w:val="22573D"/>
+          <w:sz w:val="50"/>
+        </w:rPr>
+        <w:t>$24,000</w:t>
+      </w:r>
+    </w:p>
+    <w:p>
+      <w:pPr>
+        <w:spacing w:after="140" w:line="259" w:lineRule="auto"/>
+      </w:pPr>
+      <w:r>
+        <w:rPr>
+          <w:rFonts w:ascii="Georgia" w:hAnsi="Georgia"/>
+          <w:b w:val="0"/>
+          <w:color w:val="17212B"/>
+          <w:sz w:val="22"/>
+        </w:rPr>
+        <w:t>fixed fee for the defined scope</w:t>
+      </w:r>
+    </w:p>
+    <w:p>
+      <w:pPr>
+        <w:spacing w:after="140" w:line="259" w:lineRule="auto"/>
+        <w:ind w:right="3548"/>
+      </w:pPr>
+      <w:r>
+        <w:rPr>
+          <w:rFonts w:ascii="Georgia" w:hAnsi="Georgia"/>
+          <w:b w:val="0"/>
+          <w:color w:val="17212B"/>
+          <w:sz w:val="22"/>
+        </w:rPr>
+        <w:t>The fictional engagement covers research synthesis, interaction design and a tested frontend prototype for a neighborhood arts venue. Production integration is a separate engagement.</w:t>
+      </w:r>
+    </w:p>
     <w:tbl>
       <w:tblPr>
         <w:tblW w:type="auto" w:w="0"/>
-        <w:tblLayout w:type="fixed"/>
+        <w:tblLayout w:type="autofit"/>
         <w:tblLook w:firstColumn="1" w:firstRow="1" w:lastColumn="0" w:lastRow="0" w:noHBand="0" w:noVBand="1" w:val="04A0"/>
       </w:tblPr>
       <w:tblGrid>
-        <w:gridCol w:w="4752"/>
-        <w:gridCol w:w="10224"/>
+        <w:gridCol w:w="3456"/>
+        <w:gridCol w:w="3456"/>
+        <w:gridCol w:w="3456"/>
       </w:tblGrid>
       <w:tr>
+        <w:trPr>
+          <w:tblHeader/>
+          <w:cantSplit/>
+        </w:trPr>
         <w:tc>
           <w:tcPr>
-            <w:tcW w:type="dxa" w:w="4752"/>
-            <w:shd w:fill="EAC7FF"/>
+            <w:tcW w:type="dxa" w:w="3456"/>
+            <w:shd w:fill="22573D"/>
           </w:tcPr>
           <w:p/>
           <w:p>
@@ -39,476 +116,249 @@
             </w:pPr>
             <w:r>
               <w:rPr>
-                <w:rFonts w:ascii="Arial" w:hAnsi="Arial"/>
+                <w:rFonts w:ascii="Georgia" w:hAnsi="Georgia"/>
                 <w:b/>
-                <w:color w:val="4D2298"/>
-                <w:sz w:val="58"/>
+                <w:color w:val="FFFFFF"/>
+                <w:sz w:val="20"/>
               </w:rPr>
-              <w:t>$24,000</w:t>
+              <w:t>Stage</w:t>
             </w:r>
           </w:p>
+        </w:tc>
+        <w:tc>
+          <w:tcPr>
+            <w:tcW w:type="dxa" w:w="3456"/>
+            <w:shd w:fill="22573D"/>
+          </w:tcPr>
+          <w:p/>
           <w:p>
             <w:pPr>
               <w:spacing w:after="140" w:line="259" w:lineRule="auto"/>
             </w:pPr>
             <w:r>
               <w:rPr>
-                <w:rFonts w:ascii="Arial" w:hAnsi="Arial"/>
-                <w:b w:val="0"/>
-                <w:color w:val="17212B"/>
+                <w:rFonts w:ascii="Georgia" w:hAnsi="Georgia"/>
+                <w:b/>
+                <w:color w:val="FFFFFF"/>
                 <w:sz w:val="20"/>
               </w:rPr>
-              <w:t>fixed fee for the defined scope</w:t>
-            </w:r>
-          </w:p>
-          <w:p>
-            <w:pPr>
-              <w:pStyle w:val="Heading1"/>
-              <w:spacing w:after="140" w:line="259" w:lineRule="auto"/>
-            </w:pPr>
-            <w:r>
-              <w:rPr>
-                <w:rFonts w:ascii="Arial" w:hAnsi="Arial"/>
-                <w:b/>
-                <w:color w:val="4D2298"/>
-                <w:sz w:val="28"/>
-              </w:rPr>
-              <w:t>Commercial Terms</w:t>
-            </w:r>
-          </w:p>
-          <w:p>
-            <w:pPr>
-              <w:spacing w:after="140" w:line="259" w:lineRule="auto"/>
-              <w:ind w:right="0"/>
-            </w:pPr>
-            <w:r>
-              <w:rPr>
-                <w:rFonts w:ascii="Arial" w:hAnsi="Arial"/>
-                <w:b w:val="0"/>
-                <w:color w:val="17212B"/>
-                <w:sz w:val="21"/>
-              </w:rPr>
-              <w:t>Invoices follow the milestones below. The estimate excludes taxes, third-party subscriptions, production hosting and changes outside the agreed six screens.</w:t>
+              <w:t>Deliverable</w:t>
             </w:r>
           </w:p>
         </w:tc>
         <w:tc>
           <w:tcPr>
-            <w:tcW w:type="dxa" w:w="10224"/>
+            <w:tcW w:type="dxa" w:w="3456"/>
+            <w:shd w:fill="22573D"/>
           </w:tcPr>
           <w:p/>
-          <w:p>
-            <w:pPr>
-              <w:pStyle w:val="Title"/>
-              <w:spacing w:after="140" w:line="259" w:lineRule="auto"/>
-            </w:pPr>
-            <w:r>
-              <w:rPr>
-                <w:rFonts w:ascii="Arial" w:hAnsi="Arial"/>
-                <w:b/>
-                <w:color w:val="17212B"/>
-                <w:sz w:val="54"/>
-              </w:rPr>
-              <w:t>Juniper Studio Service Proposal</w:t>
-            </w:r>
-          </w:p>
           <w:p>
             <w:pPr>
               <w:spacing w:after="140" w:line="259" w:lineRule="auto"/>
             </w:pPr>
             <w:r>
               <w:rPr>
-                <w:rFonts w:ascii="Arial" w:hAnsi="Arial"/>
+                <w:rFonts w:ascii="Georgia" w:hAnsi="Georgia"/>
                 <w:b/>
-                <w:color w:val="4D2298"/>
-                <w:sz w:val="24"/>
+                <w:color w:val="FFFFFF"/>
+                <w:sz w:val="20"/>
               </w:rPr>
-              <w:t>Replace the fragmented booking journey with one accessible flow, delivered in three reviewable stages.</w:t>
+              <w:t>Fee</w:t>
             </w:r>
           </w:p>
-          <w:p>
-            <w:pPr>
-              <w:spacing w:after="140" w:line="259" w:lineRule="auto"/>
-              <w:ind w:right="4134"/>
-            </w:pPr>
-            <w:r>
-              <w:rPr>
-                <w:rFonts w:ascii="Arial" w:hAnsi="Arial"/>
-                <w:b w:val="0"/>
-                <w:color w:val="17212B"/>
-                <w:sz w:val="21"/>
-              </w:rPr>
-              <w:t>The fictional engagement covers research synthesis, interaction design and a tested frontend prototype for a neighborhood arts venue. Production integration is a separate engagement.</w:t>
-            </w:r>
-          </w:p>
-          <w:tbl>
-            <w:tblPr>
-              <w:tblW w:type="auto" w:w="0"/>
-              <w:tblLook w:firstColumn="1" w:firstRow="1" w:lastColumn="0" w:lastRow="0" w:noHBand="0" w:noVBand="1" w:val="04A0"/>
-            </w:tblPr>
-            <w:tblGrid>
-              <w:gridCol w:w="3408"/>
-              <w:gridCol w:w="3408"/>
-              <w:gridCol w:w="3408"/>
-            </w:tblGrid>
-            <w:tr>
-              <w:trPr>
-                <w:tblHeader/>
-                <w:cantSplit/>
-              </w:trPr>
-              <w:tc>
-                <w:tcPr>
-                  <w:tcW w:type="dxa" w:w="3408"/>
-                  <w:shd w:fill="4D2298"/>
-                </w:tcPr>
-                <w:p/>
-                <w:p>
-                  <w:pPr>
-                    <w:spacing w:after="140" w:line="259" w:lineRule="auto"/>
-                  </w:pPr>
-                  <w:r>
-                    <w:rPr>
-                      <w:rFonts w:ascii="Arial" w:hAnsi="Arial"/>
-                      <w:b/>
-                      <w:color w:val="FFFFFF"/>
-                      <w:sz w:val="18"/>
-                    </w:rPr>
-                    <w:t>Stage</w:t>
-                  </w:r>
-                </w:p>
-              </w:tc>
-              <w:tc>
-                <w:tcPr>
-                  <w:tcW w:type="dxa" w:w="3408"/>
-                  <w:shd w:fill="4D2298"/>
-                </w:tcPr>
-                <w:p/>
-                <w:p>
-                  <w:pPr>
-                    <w:spacing w:after="140" w:line="259" w:lineRule="auto"/>
-                  </w:pPr>
-                  <w:r>
-                    <w:rPr>
-                      <w:rFonts w:ascii="Arial" w:hAnsi="Arial"/>
-                      <w:b/>
-                      <w:color w:val="FFFFFF"/>
-                      <w:sz w:val="18"/>
-                    </w:rPr>
-                    <w:t>Deliverable</w:t>
-                  </w:r>
-                </w:p>
-              </w:tc>
-              <w:tc>
-                <w:tcPr>
-                  <w:tcW w:type="dxa" w:w="3408"/>
-                  <w:shd w:fill="4D2298"/>
-                </w:tcPr>
-                <w:p/>
-                <w:p>
-                  <w:pPr>
-                    <w:spacing w:after="140" w:line="259" w:lineRule="auto"/>
-                  </w:pPr>
-                  <w:r>
-                    <w:rPr>
-                      <w:rFonts w:ascii="Arial" w:hAnsi="Arial"/>
-                      <w:b/>
-                      <w:color w:val="FFFFFF"/>
-                      <w:sz w:val="18"/>
-                    </w:rPr>
-                    <w:t>Fee</w:t>
-                  </w:r>
-                </w:p>
-              </w:tc>
-            </w:tr>
-            <w:tr>
-              <w:trPr>
-                <w:cantSplit/>
-              </w:trPr>
-              <w:tc>
-                <w:tcPr>
-                  <w:tcW w:type="dxa" w:w="3408"/>
-                  <w:shd w:fill="FFFFFF"/>
-                </w:tcPr>
-                <w:p/>
-                <w:p>
-                  <w:pPr>
-                    <w:spacing w:after="140" w:line="259" w:lineRule="auto"/>
-                  </w:pPr>
-                  <w:r>
-                    <w:rPr>
-                      <w:rFonts w:ascii="Arial" w:hAnsi="Arial"/>
-                      <w:b w:val="0"/>
-                      <w:color w:val="17212B"/>
-                      <w:sz w:val="18"/>
-                    </w:rPr>
-                    <w:t>01 Discover</w:t>
-                  </w:r>
-                </w:p>
-              </w:tc>
-              <w:tc>
-                <w:tcPr>
-                  <w:tcW w:type="dxa" w:w="3408"/>
-                  <w:shd w:fill="FFFFFF"/>
-                </w:tcPr>
-                <w:p/>
-                <w:p>
-                  <w:pPr>
-                    <w:spacing w:after="140" w:line="259" w:lineRule="auto"/>
-                  </w:pPr>
-                  <w:r>
-                    <w:rPr>
-                      <w:rFonts w:ascii="Arial" w:hAnsi="Arial"/>
-                      <w:b w:val="0"/>
-                      <w:color w:val="17212B"/>
-                      <w:sz w:val="18"/>
-                    </w:rPr>
-                    <w:t>Journey and success measures</w:t>
-                  </w:r>
-                </w:p>
-              </w:tc>
-              <w:tc>
-                <w:tcPr>
-                  <w:tcW w:type="dxa" w:w="3408"/>
-                  <w:shd w:fill="FFFFFF"/>
-                </w:tcPr>
-                <w:p/>
-                <w:p>
-                  <w:pPr>
-                    <w:spacing w:after="140" w:line="259" w:lineRule="auto"/>
-                  </w:pPr>
-                  <w:r>
-                    <w:rPr>
-                      <w:rFonts w:ascii="Arial" w:hAnsi="Arial"/>
-                      <w:b w:val="0"/>
-                      <w:color w:val="17212B"/>
-                      <w:sz w:val="18"/>
-                    </w:rPr>
-                    <w:t>$6,000</w:t>
-                  </w:r>
-                </w:p>
-              </w:tc>
-            </w:tr>
-            <w:tr>
-              <w:trPr>
-                <w:cantSplit/>
-              </w:trPr>
-              <w:tc>
-                <w:tcPr>
-                  <w:tcW w:type="dxa" w:w="3408"/>
-                  <w:shd w:fill="FFFFFF"/>
-                </w:tcPr>
-                <w:p/>
-                <w:p>
-                  <w:pPr>
-                    <w:spacing w:after="140" w:line="259" w:lineRule="auto"/>
-                  </w:pPr>
-                  <w:r>
-                    <w:rPr>
-                      <w:rFonts w:ascii="Arial" w:hAnsi="Arial"/>
-                      <w:b w:val="0"/>
-                      <w:color w:val="17212B"/>
-                      <w:sz w:val="18"/>
-                    </w:rPr>
-                    <w:t>02 Design</w:t>
-                  </w:r>
-                </w:p>
-              </w:tc>
-              <w:tc>
-                <w:tcPr>
-                  <w:tcW w:type="dxa" w:w="3408"/>
-                  <w:shd w:fill="FFFFFF"/>
-                </w:tcPr>
-                <w:p/>
-                <w:p>
-                  <w:pPr>
-                    <w:spacing w:after="140" w:line="259" w:lineRule="auto"/>
-                  </w:pPr>
-                  <w:r>
-                    <w:rPr>
-                      <w:rFonts w:ascii="Arial" w:hAnsi="Arial"/>
-                      <w:b w:val="0"/>
-                      <w:color w:val="17212B"/>
-                      <w:sz w:val="18"/>
-                    </w:rPr>
-                    <w:t>Six screens and component states</w:t>
-                  </w:r>
-                </w:p>
-              </w:tc>
-              <w:tc>
-                <w:tcPr>
-                  <w:tcW w:type="dxa" w:w="3408"/>
-                  <w:shd w:fill="FFFFFF"/>
-                </w:tcPr>
-                <w:p/>
-                <w:p>
-                  <w:pPr>
-                    <w:spacing w:after="140" w:line="259" w:lineRule="auto"/>
-                  </w:pPr>
-                  <w:r>
-                    <w:rPr>
-                      <w:rFonts w:ascii="Arial" w:hAnsi="Arial"/>
-                      <w:b w:val="0"/>
-                      <w:color w:val="17212B"/>
-                      <w:sz w:val="18"/>
-                    </w:rPr>
-                    <w:t>$10,000</w:t>
-                  </w:r>
-                </w:p>
-              </w:tc>
-            </w:tr>
-            <w:tr>
-              <w:trPr>
-                <w:cantSplit/>
-              </w:trPr>
-              <w:tc>
-                <w:tcPr>
-                  <w:tcW w:type="dxa" w:w="3408"/>
-                  <w:shd w:fill="FFFFFF"/>
-                </w:tcPr>
-                <w:p/>
-                <w:p>
-                  <w:pPr>
-                    <w:spacing w:after="140" w:line="259" w:lineRule="auto"/>
-                  </w:pPr>
-                  <w:r>
-                    <w:rPr>
-                      <w:rFonts w:ascii="Arial" w:hAnsi="Arial"/>
-                      <w:b w:val="0"/>
-                      <w:color w:val="17212B"/>
-                      <w:sz w:val="18"/>
-                    </w:rPr>
-                    <w:t>03 Validate</w:t>
-                  </w:r>
-                </w:p>
-              </w:tc>
-              <w:tc>
-                <w:tcPr>
-                  <w:tcW w:type="dxa" w:w="3408"/>
-                  <w:shd w:fill="FFFFFF"/>
-                </w:tcPr>
-                <w:p/>
-                <w:p>
-                  <w:pPr>
-                    <w:spacing w:after="140" w:line="259" w:lineRule="auto"/>
-                  </w:pPr>
-                  <w:r>
-                    <w:rPr>
-                      <w:rFonts w:ascii="Arial" w:hAnsi="Arial"/>
-                      <w:b w:val="0"/>
-                      <w:color w:val="17212B"/>
-                      <w:sz w:val="18"/>
-                    </w:rPr>
-                    <w:t>Prototype and handoff</w:t>
-                  </w:r>
-                </w:p>
-              </w:tc>
-              <w:tc>
-                <w:tcPr>
-                  <w:tcW w:type="dxa" w:w="3408"/>
-                  <w:shd w:fill="FFFFFF"/>
-                </w:tcPr>
-                <w:p/>
-                <w:p>
-                  <w:pPr>
-                    <w:spacing w:after="140" w:line="259" w:lineRule="auto"/>
-                  </w:pPr>
-                  <w:r>
-                    <w:rPr>
-                      <w:rFonts w:ascii="Arial" w:hAnsi="Arial"/>
-                      <w:b w:val="0"/>
-                      <w:color w:val="17212B"/>
-                      <w:sz w:val="18"/>
-                    </w:rPr>
-                    <w:t>$8,000</w:t>
-                  </w:r>
-                </w:p>
-              </w:tc>
-            </w:tr>
-          </w:tbl>
-          <w:p/>
         </w:tc>
       </w:tr>
-    </w:tbl>
-    <w:tbl>
-      <w:tblPr>
-        <w:tblW w:type="auto" w:w="0"/>
-        <w:tblLayout w:type="fixed"/>
-        <w:tblLook w:firstColumn="1" w:firstRow="1" w:lastColumn="0" w:lastRow="0" w:noHBand="0" w:noVBand="1" w:val="04A0"/>
-      </w:tblPr>
-      <w:tblGrid>
-        <w:gridCol w:w="7488"/>
-        <w:gridCol w:w="7488"/>
-      </w:tblGrid>
       <w:tr>
+        <w:trPr>
+          <w:cantSplit/>
+        </w:trPr>
         <w:tc>
           <w:tcPr>
-            <w:tcW w:type="dxa" w:w="7488"/>
+            <w:tcW w:type="dxa" w:w="3456"/>
           </w:tcPr>
           <w:p/>
           <w:p>
             <w:pPr>
-              <w:pStyle w:val="Heading1"/>
               <w:spacing w:after="140" w:line="259" w:lineRule="auto"/>
             </w:pPr>
             <w:r>
               <w:rPr>
-                <w:rFonts w:ascii="Arial" w:hAnsi="Arial"/>
-                <w:b/>
-                <w:color w:val="4D2298"/>
-                <w:sz w:val="28"/>
-              </w:rPr>
-              <w:t>Included</w:t>
-            </w:r>
-          </w:p>
-          <w:p>
-            <w:pPr>
-              <w:spacing w:after="140" w:line="259" w:lineRule="auto"/>
-              <w:ind w:right="1398"/>
-            </w:pPr>
-            <w:r>
-              <w:rPr>
-                <w:rFonts w:ascii="Arial" w:hAnsi="Arial"/>
+                <w:rFonts w:ascii="Georgia" w:hAnsi="Georgia"/>
                 <w:b w:val="0"/>
                 <w:color w:val="17212B"/>
-                <w:sz w:val="21"/>
+                <w:sz w:val="20"/>
               </w:rPr>
-              <w:t>Two stakeholder workshops, six core screens, responsive specifications, accessible component states and a documented prototype handoff.</w:t>
+              <w:t>01 Discover</w:t>
             </w:r>
           </w:p>
         </w:tc>
         <w:tc>
           <w:tcPr>
-            <w:tcW w:type="dxa" w:w="7488"/>
+            <w:tcW w:type="dxa" w:w="3456"/>
           </w:tcPr>
           <w:p/>
           <w:p>
             <w:pPr>
-              <w:pStyle w:val="Heading1"/>
               <w:spacing w:after="140" w:line="259" w:lineRule="auto"/>
             </w:pPr>
             <w:r>
               <w:rPr>
-                <w:rFonts w:ascii="Arial" w:hAnsi="Arial"/>
-                <w:b/>
-                <w:color w:val="4D2298"/>
-                <w:sz w:val="28"/>
+                <w:rFonts w:ascii="Georgia" w:hAnsi="Georgia"/>
+                <w:b w:val="0"/>
+                <w:color w:val="17212B"/>
+                <w:sz w:val="20"/>
               </w:rPr>
-              <w:t>Working Together</w:t>
+              <w:t>Journey and success measures</w:t>
             </w:r>
           </w:p>
+        </w:tc>
+        <w:tc>
+          <w:tcPr>
+            <w:tcW w:type="dxa" w:w="3456"/>
+          </w:tcPr>
+          <w:p/>
           <w:p>
             <w:pPr>
               <w:spacing w:after="140" w:line="259" w:lineRule="auto"/>
-              <w:ind w:right="1398"/>
             </w:pPr>
             <w:r>
               <w:rPr>
-                <w:rFonts w:ascii="Arial" w:hAnsi="Arial"/>
+                <w:rFonts w:ascii="Georgia" w:hAnsi="Georgia"/>
                 <w:b w:val="0"/>
                 <w:color w:val="17212B"/>
-                <w:sz w:val="21"/>
+                <w:sz w:val="20"/>
               </w:rPr>
-              <w:t>One named decision owner consolidates feedback within three working days. Each stage ends with a review, not an implied approval.</w:t>
+              <w:t>$6,000</w:t>
+            </w:r>
+          </w:p>
+        </w:tc>
+      </w:tr>
+      <w:tr>
+        <w:trPr>
+          <w:cantSplit/>
+        </w:trPr>
+        <w:tc>
+          <w:tcPr>
+            <w:tcW w:type="dxa" w:w="3456"/>
+          </w:tcPr>
+          <w:p/>
+          <w:p>
+            <w:pPr>
+              <w:spacing w:after="140" w:line="259" w:lineRule="auto"/>
+            </w:pPr>
+            <w:r>
+              <w:rPr>
+                <w:rFonts w:ascii="Georgia" w:hAnsi="Georgia"/>
+                <w:b w:val="0"/>
+                <w:color w:val="17212B"/>
+                <w:sz w:val="20"/>
+              </w:rPr>
+              <w:t>02 Design</w:t>
+            </w:r>
+          </w:p>
+        </w:tc>
+        <w:tc>
+          <w:tcPr>
+            <w:tcW w:type="dxa" w:w="3456"/>
+          </w:tcPr>
+          <w:p/>
+          <w:p>
+            <w:pPr>
+              <w:spacing w:after="140" w:line="259" w:lineRule="auto"/>
+            </w:pPr>
+            <w:r>
+              <w:rPr>
+                <w:rFonts w:ascii="Georgia" w:hAnsi="Georgia"/>
+                <w:b w:val="0"/>
+                <w:color w:val="17212B"/>
+                <w:sz w:val="20"/>
+              </w:rPr>
+              <w:t>Six screens and component states</w:t>
+            </w:r>
+          </w:p>
+        </w:tc>
+        <w:tc>
+          <w:tcPr>
+            <w:tcW w:type="dxa" w:w="3456"/>
+          </w:tcPr>
+          <w:p/>
+          <w:p>
+            <w:pPr>
+              <w:spacing w:after="140" w:line="259" w:lineRule="auto"/>
+            </w:pPr>
+            <w:r>
+              <w:rPr>
+                <w:rFonts w:ascii="Georgia" w:hAnsi="Georgia"/>
+                <w:b w:val="0"/>
+                <w:color w:val="17212B"/>
+                <w:sz w:val="20"/>
+              </w:rPr>
+              <w:t>$10,000</w:t>
+            </w:r>
+          </w:p>
+        </w:tc>
+      </w:tr>
+      <w:tr>
+        <w:trPr>
+          <w:cantSplit/>
+        </w:trPr>
+        <w:tc>
+          <w:tcPr>
+            <w:tcW w:type="dxa" w:w="3456"/>
+          </w:tcPr>
+          <w:p/>
+          <w:p>
+            <w:pPr>
+              <w:spacing w:after="140" w:line="259" w:lineRule="auto"/>
+            </w:pPr>
+            <w:r>
+              <w:rPr>
+                <w:rFonts w:ascii="Georgia" w:hAnsi="Georgia"/>
+                <w:b w:val="0"/>
+                <w:color w:val="17212B"/>
+                <w:sz w:val="20"/>
+              </w:rPr>
+              <w:t>03 Validate</w:t>
+            </w:r>
+          </w:p>
+        </w:tc>
+        <w:tc>
+          <w:tcPr>
+            <w:tcW w:type="dxa" w:w="3456"/>
+          </w:tcPr>
+          <w:p/>
+          <w:p>
+            <w:pPr>
+              <w:spacing w:after="140" w:line="259" w:lineRule="auto"/>
+            </w:pPr>
+            <w:r>
+              <w:rPr>
+                <w:rFonts w:ascii="Georgia" w:hAnsi="Georgia"/>
+                <w:b w:val="0"/>
+                <w:color w:val="17212B"/>
+                <w:sz w:val="20"/>
+              </w:rPr>
+              <w:t>Prototype and handoff</w:t>
+            </w:r>
+          </w:p>
+        </w:tc>
+        <w:tc>
+          <w:tcPr>
+            <w:tcW w:type="dxa" w:w="3456"/>
+          </w:tcPr>
+          <w:p/>
+          <w:p>
+            <w:pPr>
+              <w:spacing w:after="140" w:line="259" w:lineRule="auto"/>
+            </w:pPr>
+            <w:r>
+              <w:rPr>
+                <w:rFonts w:ascii="Georgia" w:hAnsi="Georgia"/>
+                <w:b w:val="0"/>
+                <w:color w:val="17212B"/>
+                <w:sz w:val="20"/>
+              </w:rPr>
+              <w:t>$8,000</w:t>
             </w:r>
           </w:p>
         </w:tc>
@@ -516,13 +366,103 @@
     </w:tbl>
     <w:p>
       <w:pPr>
+        <w:pStyle w:val="Heading1"/>
         <w:spacing w:after="140" w:line="259" w:lineRule="auto"/>
       </w:pPr>
       <w:r>
         <w:rPr>
-          <w:rFonts w:ascii="Arial" w:hAnsi="Arial"/>
+          <w:rFonts w:ascii="Georgia" w:hAnsi="Georgia"/>
           <w:b/>
-          <w:color w:val="4D2298"/>
+          <w:color w:val="22573D"/>
+          <w:sz w:val="26"/>
+        </w:rPr>
+        <w:t>Included</w:t>
+      </w:r>
+    </w:p>
+    <w:p>
+      <w:pPr>
+        <w:spacing w:after="140" w:line="259" w:lineRule="auto"/>
+        <w:ind w:right="3548"/>
+      </w:pPr>
+      <w:r>
+        <w:rPr>
+          <w:rFonts w:ascii="Georgia" w:hAnsi="Georgia"/>
+          <w:b w:val="0"/>
+          <w:color w:val="17212B"/>
+          <w:sz w:val="22"/>
+        </w:rPr>
+        <w:t>Two stakeholder workshops, six core screens, responsive specifications, accessible component states and a documented prototype handoff.</w:t>
+      </w:r>
+    </w:p>
+    <w:p>
+      <w:pPr>
+        <w:pStyle w:val="Heading1"/>
+        <w:spacing w:after="140" w:line="259" w:lineRule="auto"/>
+      </w:pPr>
+      <w:r>
+        <w:rPr>
+          <w:rFonts w:ascii="Georgia" w:hAnsi="Georgia"/>
+          <w:b/>
+          <w:color w:val="22573D"/>
+          <w:sz w:val="26"/>
+        </w:rPr>
+        <w:t>Working Together</w:t>
+      </w:r>
+    </w:p>
+    <w:p>
+      <w:pPr>
+        <w:spacing w:after="140" w:line="259" w:lineRule="auto"/>
+        <w:ind w:right="3548"/>
+      </w:pPr>
+      <w:r>
+        <w:rPr>
+          <w:rFonts w:ascii="Georgia" w:hAnsi="Georgia"/>
+          <w:b w:val="0"/>
+          <w:color w:val="17212B"/>
+          <w:sz w:val="22"/>
+        </w:rPr>
+        <w:t>One named decision owner consolidates feedback within three working days. Each stage ends with a review, not an implied approval.</w:t>
+      </w:r>
+    </w:p>
+    <w:p>
+      <w:pPr>
+        <w:pStyle w:val="Heading1"/>
+        <w:spacing w:after="140" w:line="259" w:lineRule="auto"/>
+      </w:pPr>
+      <w:r>
+        <w:rPr>
+          <w:rFonts w:ascii="Georgia" w:hAnsi="Georgia"/>
+          <w:b/>
+          <w:color w:val="22573D"/>
+          <w:sz w:val="26"/>
+        </w:rPr>
+        <w:t>Commercial Terms</w:t>
+      </w:r>
+    </w:p>
+    <w:p>
+      <w:pPr>
+        <w:spacing w:after="140" w:line="259" w:lineRule="auto"/>
+        <w:ind w:right="3548"/>
+      </w:pPr>
+      <w:r>
+        <w:rPr>
+          <w:rFonts w:ascii="Georgia" w:hAnsi="Georgia"/>
+          <w:b w:val="0"/>
+          <w:color w:val="17212B"/>
+          <w:sz w:val="22"/>
+        </w:rPr>
+        <w:t>Invoices follow the milestones below. The estimate excludes taxes, third-party subscriptions, production hosting and changes outside the agreed six screens.</w:t>
+      </w:r>
+    </w:p>
+    <w:p>
+      <w:pPr>
+        <w:spacing w:after="140" w:line="259" w:lineRule="auto"/>
+      </w:pPr>
+      <w:r>
+        <w:rPr>
+          <w:rFonts w:ascii="Georgia" w:hAnsi="Georgia"/>
+          <w:b/>
+          <w:color w:val="22573D"/>
           <w:sz w:val="18"/>
         </w:rPr>
         <w:t>Offer valid for 30 days · Start date follows written acceptance.</w:t>
@@ -531,7 +471,7 @@
     <w:sectPr>
       <w:footerReference w:type="default" r:id="rId9"/>
       <w:headerReference w:type="default" r:id="rId10"/>
-      <w:pgSz w:w="16848" w:h="11952"/>
+      <w:pgSz w:w="11952" w:h="16848"/>
       <w:pgMar w:top="691" w:right="792" w:bottom="691" w:left="792" w:header="720" w:footer="720" w:gutter="0"/>
       <w:cols w:space="720"/>
       <w:docGrid w:linePitch="360"/>
@@ -553,7 +493,7 @@
     </w:pPr>
     <w:r>
       <w:rPr>
-        <w:rFonts w:ascii="Arial" w:hAnsi="Arial"/>
+        <w:rFonts w:ascii="Georgia" w:hAnsi="Georgia"/>
         <w:b w:val="0"/>
         <w:color w:val="17212B"/>
         <w:sz w:val="16"/>
@@ -572,8 +512,8 @@
     </w:pPr>
     <w:r>
       <w:pict>
-        <v:rect id="DazzlerPageSurface" style="position:absolute;margin-left:0;margin-top:0;width:842.4pt;height:597.6pt;z-index:-251654144;mso-position-horizontal-relative:page;mso-position-vertical-relative:page" fillcolor="#EAC7FF" stroked="f">
-          <v:fill color="#EAC7FF"/>
+        <v:rect id="DazzlerPageSurface" style="position:absolute;margin-left:0;margin-top:0;width:597.6pt;height:842.4pt;z-index:-251654144;mso-position-horizontal-relative:page;mso-position-vertical-relative:page" fillcolor="#FFFFFF" stroked="f">
+          <v:fill color="#FFFFFF"/>
         </v:rect>
       </w:pict>
     </w:r>
@@ -944,13 +884,10 @@
     <w:name w:val="Normal"/>
     <w:qFormat/>
     <w:rsid w:val="00FC693F"/>
-    <w:pPr>
-      <w:spacing w:after="120"/>
-    </w:pPr>
     <w:rPr>
-      <w:rFonts w:ascii="Arial" w:hAnsi="Arial"/>
+      <w:rFonts w:ascii="Georgia" w:hAnsi="Georgia"/>
       <w:color w:val="17212B"/>
-      <w:sz w:val="21"/>
+      <w:sz w:val="20"/>
     </w:rPr>
   </w:style>
   <w:style w:type="paragraph" w:styleId="Header">
@@ -1008,15 +945,15 @@
     <w:pPr>
       <w:keepNext/>
       <w:keepLines/>
-      <w:spacing w:before="480" w:after="120"/>
+      <w:spacing w:before="480" w:after="0"/>
       <w:outlineLvl w:val="0"/>
     </w:pPr>
     <w:rPr>
-      <w:rFonts w:asciiTheme="majorHAnsi" w:eastAsiaTheme="majorEastAsia" w:hAnsiTheme="majorHAnsi" w:cstheme="majorBidi" w:ascii="Arial" w:hAnsi="Arial"/>
+      <w:rFonts w:asciiTheme="majorHAnsi" w:eastAsiaTheme="majorEastAsia" w:hAnsiTheme="majorHAnsi" w:cstheme="majorBidi" w:ascii="Georgia" w:hAnsi="Georgia"/>
       <w:b/>
       <w:bCs/>
       <w:color w:val="17212B"/>
-      <w:sz w:val="21"/>
+      <w:sz w:val="20"/>
       <w:szCs w:val="28"/>
     </w:rPr>
   </w:style>
@@ -1032,15 +969,15 @@
     <w:pPr>
       <w:keepNext/>
       <w:keepLines/>
-      <w:spacing w:before="200" w:after="120"/>
+      <w:spacing w:before="200" w:after="0"/>
       <w:outlineLvl w:val="1"/>
     </w:pPr>
     <w:rPr>
-      <w:rFonts w:asciiTheme="majorHAnsi" w:eastAsiaTheme="majorEastAsia" w:hAnsiTheme="majorHAnsi" w:cstheme="majorBidi" w:ascii="Arial" w:hAnsi="Arial"/>
+      <w:rFonts w:asciiTheme="majorHAnsi" w:eastAsiaTheme="majorEastAsia" w:hAnsiTheme="majorHAnsi" w:cstheme="majorBidi"/>
       <w:b/>
       <w:bCs/>
-      <w:color w:val="17212B"/>
-      <w:sz w:val="21"/>
+      <w:color w:val="4F81BD" w:themeColor="accent1"/>
+      <w:sz w:val="26"/>
       <w:szCs w:val="26"/>
     </w:rPr>
   </w:style>
@@ -1294,15 +1231,15 @@
     <w:qFormat/>
     <w:rsid w:val="00FC693F"/>
     <w:pPr>
-      <w:spacing w:after="120" w:line="240" w:lineRule="auto"/>
+      <w:spacing w:after="300" w:line="240" w:lineRule="auto"/>
       <w:contextualSpacing/>
     </w:pPr>
     <w:rPr>
-      <w:rFonts w:asciiTheme="majorHAnsi" w:eastAsiaTheme="majorEastAsia" w:hAnsiTheme="majorHAnsi" w:cstheme="majorBidi" w:ascii="Arial" w:hAnsi="Arial"/>
+      <w:rFonts w:asciiTheme="majorHAnsi" w:eastAsiaTheme="majorEastAsia" w:hAnsiTheme="majorHAnsi" w:cstheme="majorBidi" w:ascii="Georgia" w:hAnsi="Georgia"/>
       <w:color w:val="17212B"/>
       <w:spacing w:val="5"/>
       <w:kern w:val="28"/>
-      <w:sz w:val="21"/>
+      <w:sz w:val="20"/>
       <w:szCs w:val="52"/>
     </w:rPr>
   </w:style>

</xml_diff>